<commit_message>
Update CBM-EspoCRM-HowTo.docx - expand relationship type selection, add bi-directional relationships section
</commit_message>
<xml_diff>
--- a/PRDs/CBM-EspoCRM-HowTo.docx
+++ b/PRDs/CBM-EspoCRM-HowTo.docx
@@ -2339,7 +2339,228 @@
           <w:sz w:val="26"/>
           <w:szCs w:val="26"/>
         </w:rPr>
-        <w:t xml:space="preserve">2.4 Step-by-Step: Adding a Relationship</w:t>
+        <w:t xml:space="preserve">2.4 Relationships Are Always Bi-Directional</w:t>
+      </w:r>
+    </w:p>
+    <w:p>
+      <w:pPr>
+        <w:spacing w:after="120"/>
+      </w:pPr>
+      <w:r>
+        <w:rPr>
+          <w:rFonts w:ascii="Arial" w:cs="Arial" w:eastAsia="Arial" w:hAnsi="Arial"/>
+          <w:sz w:val="22"/>
+          <w:szCs w:val="22"/>
+        </w:rPr>
+        <w:t xml:space="preserve">When you create a relationship in EspoCRM, both sides are created simultaneously in the database. You do not need to define two separate relationships — one definition covers both directions automatically.</w:t>
+      </w:r>
+    </w:p>
+    <w:p>
+      <w:r>
+        <w:t xml:space="preserve"/>
+      </w:r>
+    </w:p>
+    <w:p>
+      <w:pPr>
+        <w:spacing w:after="120"/>
+      </w:pPr>
+      <w:r>
+        <w:rPr>
+          <w:rFonts w:ascii="Arial" w:cs="Arial" w:eastAsia="Arial" w:hAnsi="Arial"/>
+          <w:sz w:val="22"/>
+          <w:szCs w:val="22"/>
+        </w:rPr>
+        <w:t xml:space="preserve">For example, when you create a Many-to-One relationship from Engagement to Contact, EspoCRM creates in one step:</w:t>
+      </w:r>
+    </w:p>
+    <w:p>
+      <w:pPr>
+        <w:pStyle w:val="ListParagraph"/>
+        <w:numPr>
+          <w:ilvl w:val="0"/>
+          <w:numId w:val="2"/>
+        </w:numPr>
+        <w:spacing w:after="80"/>
+      </w:pPr>
+      <w:r>
+        <w:rPr>
+          <w:rFonts w:ascii="Arial" w:cs="Arial" w:eastAsia="Arial" w:hAnsi="Arial"/>
+          <w:sz w:val="22"/>
+          <w:szCs w:val="22"/>
+        </w:rPr>
+        <w:t xml:space="preserve">The Assigned Mentor link field on the Engagement entity (the source side)</w:t>
+      </w:r>
+    </w:p>
+    <w:p>
+      <w:pPr>
+        <w:pStyle w:val="ListParagraph"/>
+        <w:numPr>
+          <w:ilvl w:val="0"/>
+          <w:numId w:val="2"/>
+        </w:numPr>
+        <w:spacing w:after="80"/>
+      </w:pPr>
+      <w:r>
+        <w:rPr>
+          <w:rFonts w:ascii="Arial" w:cs="Arial" w:eastAsia="Arial" w:hAnsi="Arial"/>
+          <w:sz w:val="22"/>
+          <w:szCs w:val="22"/>
+        </w:rPr>
+        <w:t xml:space="preserve">The Engagements related records panel on the Contact entity (the foreign side)</w:t>
+      </w:r>
+    </w:p>
+    <w:p>
+      <w:r>
+        <w:t xml:space="preserve"/>
+      </w:r>
+    </w:p>
+    <w:p>
+      <w:pPr>
+        <w:spacing w:after="120"/>
+      </w:pPr>
+      <w:r>
+        <w:rPr>
+          <w:rFonts w:ascii="Arial" w:cs="Arial" w:eastAsia="Arial" w:hAnsi="Arial"/>
+          <w:sz w:val="22"/>
+          <w:szCs w:val="22"/>
+        </w:rPr>
+        <w:t xml:space="preserve">Both exist in the database from the moment you save. Whether either side is visible in the UI is a separate question — that is what the layout configuration controls (Detail View, Edit View, and Bottom Panels). But the underlying bi-directional link is always there, regardless of whether you have configured the layouts.</w:t>
+      </w:r>
+    </w:p>
+    <w:p>
+      <w:r>
+        <w:t xml:space="preserve"/>
+      </w:r>
+    </w:p>
+    <w:p>
+      <w:pPr>
+        <w:spacing w:after="120"/>
+      </w:pPr>
+      <w:r>
+        <w:rPr>
+          <w:rFonts w:ascii="Arial" w:cs="Arial" w:eastAsia="Arial" w:hAnsi="Arial"/>
+          <w:sz w:val="22"/>
+          <w:szCs w:val="22"/>
+        </w:rPr>
+        <w:t xml:space="preserve">This explains two important things:</w:t>
+      </w:r>
+    </w:p>
+    <w:p>
+      <w:pPr>
+        <w:pStyle w:val="ListParagraph"/>
+        <w:numPr>
+          <w:ilvl w:val="0"/>
+          <w:numId w:val="2"/>
+        </w:numPr>
+        <w:spacing w:after="80"/>
+      </w:pPr>
+      <w:r>
+        <w:rPr>
+          <w:rFonts w:ascii="Arial" w:cs="Arial" w:eastAsia="Arial" w:hAnsi="Arial"/>
+          <w:sz w:val="22"/>
+          <w:szCs w:val="22"/>
+        </w:rPr>
+        <w:t xml:space="preserve">The left-side fields in the Add Relationship dialog (Name and Label) are not just labels — they define the actual panel name that will appear on the foreign entity if you choose to enable it in Bottom Panels.</w:t>
+      </w:r>
+    </w:p>
+    <w:p>
+      <w:pPr>
+        <w:pStyle w:val="ListParagraph"/>
+        <w:numPr>
+          <w:ilvl w:val="0"/>
+          <w:numId w:val="2"/>
+        </w:numPr>
+        <w:spacing w:after="80"/>
+      </w:pPr>
+      <w:r>
+        <w:rPr>
+          <w:rFonts w:ascii="Arial" w:cs="Arial" w:eastAsia="Arial" w:hAnsi="Arial"/>
+          <w:sz w:val="22"/>
+          <w:szCs w:val="22"/>
+        </w:rPr>
+        <w:t xml:space="preserve">Scenario A and Scenario B in Section 2.5 are independent UI choices, not separate relationship definitions. You are simply choosing which side(s) of an already bi-directional relationship to make visible.</w:t>
+      </w:r>
+    </w:p>
+    <w:p>
+      <w:r>
+        <w:t xml:space="preserve"/>
+      </w:r>
+    </w:p>
+    <w:tbl>
+      <w:tblPr>
+        <w:tblW w:type="dxa" w:w="9360"/>
+        <w:tblBorders>
+          <w:top w:val="single" w:color="auto" w:sz="4"/>
+          <w:left w:val="single" w:color="auto" w:sz="4"/>
+          <w:bottom w:val="single" w:color="auto" w:sz="4"/>
+          <w:right w:val="single" w:color="auto" w:sz="4"/>
+          <w:insideH w:val="single" w:color="auto" w:sz="4"/>
+          <w:insideV w:val="single" w:color="auto" w:sz="4"/>
+        </w:tblBorders>
+      </w:tblPr>
+      <w:tblGrid>
+        <w:gridCol w:w="9360"/>
+      </w:tblGrid>
+      <w:tr>
+        <w:tc>
+          <w:tcPr>
+            <w:tcW w:type="dxa" w:w="9360"/>
+            <w:tcBorders>
+              <w:top w:val="single" w:color="FFC107" w:sz="4"/>
+              <w:left w:val="single" w:color="FFC107" w:sz="4"/>
+              <w:bottom w:val="single" w:color="FFC107" w:sz="4"/>
+              <w:right w:val="single" w:color="FFC107" w:sz="4"/>
+            </w:tcBorders>
+            <w:shd w:fill="FFF3CD" w:val="clear"/>
+            <w:tcMar>
+              <w:top w:type="dxa" w:w="100"/>
+              <w:left w:type="dxa" w:w="160"/>
+              <w:bottom w:type="dxa" w:w="100"/>
+              <w:right w:type="dxa" w:w="160"/>
+            </w:tcMar>
+          </w:tcPr>
+          <w:p>
+            <w:r>
+              <w:rPr>
+                <w:rFonts w:ascii="Arial" w:cs="Arial" w:eastAsia="Arial" w:hAnsi="Arial"/>
+                <w:b/>
+                <w:bCs/>
+                <w:sz w:val="22"/>
+                <w:szCs w:val="22"/>
+              </w:rPr>
+              <w:t xml:space="preserve">Note: </w:t>
+            </w:r>
+            <w:r>
+              <w:rPr>
+                <w:rFonts w:ascii="Arial" w:cs="Arial" w:eastAsia="Arial" w:hAnsi="Arial"/>
+                <w:sz w:val="22"/>
+                <w:szCs w:val="22"/>
+              </w:rPr>
+              <w:t xml:space="preserve">Because both sides are always created, it is worth thinking through the naming on both sides before saving — especially the left-side Label, which becomes the panel title on the foreign entity's detail page.</w:t>
+            </w:r>
+          </w:p>
+        </w:tc>
+      </w:tr>
+    </w:tbl>
+    <w:p>
+      <w:r>
+        <w:t xml:space="preserve"/>
+      </w:r>
+    </w:p>
+    <w:p>
+      <w:pPr>
+        <w:pStyle w:val="Heading2"/>
+      </w:pPr>
+      <w:r>
+        <w:rPr>
+          <w:rFonts w:ascii="Arial" w:cs="Arial" w:eastAsia="Arial" w:hAnsi="Arial"/>
+          <w:b/>
+          <w:bCs/>
+          <w:color w:val="2E75B6"/>
+          <w:sz w:val="26"/>
+          <w:szCs w:val="26"/>
+        </w:rPr>
+        <w:t xml:space="preserve">2.5 Step-by-Step: Adding a Relationship</w:t>
       </w:r>
     </w:p>
     <w:p>
@@ -2407,9 +2628,165 @@
           <w:sz w:val="22"/>
           <w:szCs w:val="22"/>
         </w:rPr>
-        <w:t xml:space="preserve">Choose the appropriate type from the Type dropdown. For a field on the source entity that links to one record in another entity, select Many-to-One.</w:t>
-      </w:r>
-    </w:p>
+        <w:t xml:space="preserve">Choose the appropriate type from the Type dropdown. The type you select determines what gets created on each side of the relationship — a single link field or a related records panel. Refer to Section 2.3 for a full breakdown of what each type produces.</w:t>
+      </w:r>
+    </w:p>
+    <w:p>
+      <w:r>
+        <w:t xml:space="preserve"/>
+      </w:r>
+    </w:p>
+    <w:p>
+      <w:pPr>
+        <w:spacing w:after="120"/>
+      </w:pPr>
+      <w:r>
+        <w:rPr>
+          <w:rFonts w:ascii="Arial" w:cs="Arial" w:eastAsia="Arial" w:hAnsi="Arial"/>
+          <w:sz w:val="22"/>
+          <w:szCs w:val="22"/>
+        </w:rPr>
+        <w:t xml:space="preserve">Use the following guidance to choose the right type:</w:t>
+      </w:r>
+    </w:p>
+    <w:p>
+      <w:r>
+        <w:t xml:space="preserve"/>
+      </w:r>
+    </w:p>
+    <w:p>
+      <w:pPr>
+        <w:pStyle w:val="ListParagraph"/>
+        <w:numPr>
+          <w:ilvl w:val="0"/>
+          <w:numId w:val="2"/>
+        </w:numPr>
+        <w:spacing w:after="80"/>
+      </w:pPr>
+      <w:r>
+        <w:rPr>
+          <w:rFonts w:ascii="Arial" w:cs="Arial" w:eastAsia="Arial" w:hAnsi="Arial"/>
+          <w:sz w:val="22"/>
+          <w:szCs w:val="22"/>
+        </w:rPr>
+        <w:t xml:space="preserve">Many-to-One — use this when many records of the source entity each point to one record in the foreign entity. For example, many Engagements each have one Assigned Mentor. This puts a single link field on the source entity (Engagement) and a related records panel on the foreign entity (Contact).</w:t>
+      </w:r>
+    </w:p>
+    <w:p>
+      <w:pPr>
+        <w:pStyle w:val="ListParagraph"/>
+        <w:numPr>
+          <w:ilvl w:val="0"/>
+          <w:numId w:val="2"/>
+        </w:numPr>
+        <w:spacing w:after="80"/>
+      </w:pPr>
+      <w:r>
+        <w:rPr>
+          <w:rFonts w:ascii="Arial" w:cs="Arial" w:eastAsia="Arial" w:hAnsi="Arial"/>
+          <w:sz w:val="22"/>
+          <w:szCs w:val="22"/>
+        </w:rPr>
+        <w:t xml:space="preserve">One-to-Many — use this when one record in the source entity is linked to many records in the foreign entity. This is the mirror of Many-to-One — the end result is identical, but you are defining it from the opposite entity's perspective.</w:t>
+      </w:r>
+    </w:p>
+    <w:p>
+      <w:pPr>
+        <w:pStyle w:val="ListParagraph"/>
+        <w:numPr>
+          <w:ilvl w:val="0"/>
+          <w:numId w:val="2"/>
+        </w:numPr>
+        <w:spacing w:after="80"/>
+      </w:pPr>
+      <w:r>
+        <w:rPr>
+          <w:rFonts w:ascii="Arial" w:cs="Arial" w:eastAsia="Arial" w:hAnsi="Arial"/>
+          <w:sz w:val="22"/>
+          <w:szCs w:val="22"/>
+        </w:rPr>
+        <w:t xml:space="preserve">Many-to-Many — use this when records on both sides can link to multiple records on the other side. For example, a Mentor can have many Skills, and a Skill can belong to many Mentors. This puts a related records panel on both sides.</w:t>
+      </w:r>
+    </w:p>
+    <w:p>
+      <w:pPr>
+        <w:pStyle w:val="ListParagraph"/>
+        <w:numPr>
+          <w:ilvl w:val="0"/>
+          <w:numId w:val="2"/>
+        </w:numPr>
+        <w:spacing w:after="80"/>
+      </w:pPr>
+      <w:r>
+        <w:rPr>
+          <w:rFonts w:ascii="Arial" w:cs="Arial" w:eastAsia="Arial" w:hAnsi="Arial"/>
+          <w:sz w:val="22"/>
+          <w:szCs w:val="22"/>
+        </w:rPr>
+        <w:t xml:space="preserve">One-to-One — use this when each record on one side links to exactly one record on the other side, and vice versa. This puts a single link field on both sides.</w:t>
+      </w:r>
+    </w:p>
+    <w:p>
+      <w:r>
+        <w:t xml:space="preserve"/>
+      </w:r>
+    </w:p>
+    <w:tbl>
+      <w:tblPr>
+        <w:tblW w:type="dxa" w:w="9360"/>
+        <w:tblBorders>
+          <w:top w:val="single" w:color="auto" w:sz="4"/>
+          <w:left w:val="single" w:color="auto" w:sz="4"/>
+          <w:bottom w:val="single" w:color="auto" w:sz="4"/>
+          <w:right w:val="single" w:color="auto" w:sz="4"/>
+          <w:insideH w:val="single" w:color="auto" w:sz="4"/>
+          <w:insideV w:val="single" w:color="auto" w:sz="4"/>
+        </w:tblBorders>
+      </w:tblPr>
+      <w:tblGrid>
+        <w:gridCol w:w="9360"/>
+      </w:tblGrid>
+      <w:tr>
+        <w:tc>
+          <w:tcPr>
+            <w:tcW w:type="dxa" w:w="9360"/>
+            <w:tcBorders>
+              <w:top w:val="single" w:color="FFC107" w:sz="4"/>
+              <w:left w:val="single" w:color="FFC107" w:sz="4"/>
+              <w:bottom w:val="single" w:color="FFC107" w:sz="4"/>
+              <w:right w:val="single" w:color="FFC107" w:sz="4"/>
+            </w:tcBorders>
+            <w:shd w:fill="FFF3CD" w:val="clear"/>
+            <w:tcMar>
+              <w:top w:type="dxa" w:w="100"/>
+              <w:left w:type="dxa" w:w="160"/>
+              <w:bottom w:type="dxa" w:w="100"/>
+              <w:right w:type="dxa" w:w="160"/>
+            </w:tcMar>
+          </w:tcPr>
+          <w:p>
+            <w:r>
+              <w:rPr>
+                <w:rFonts w:ascii="Arial" w:cs="Arial" w:eastAsia="Arial" w:hAnsi="Arial"/>
+                <w:b/>
+                <w:bCs/>
+                <w:sz w:val="22"/>
+                <w:szCs w:val="22"/>
+              </w:rPr>
+              <w:t xml:space="preserve">Note: </w:t>
+            </w:r>
+            <w:r>
+              <w:rPr>
+                <w:rFonts w:ascii="Arial" w:cs="Arial" w:eastAsia="Arial" w:hAnsi="Arial"/>
+                <w:sz w:val="22"/>
+                <w:szCs w:val="22"/>
+              </w:rPr>
+              <w:t xml:space="preserve">If you are unsure whether to use Many-to-One or One-to-Many, choose the entity you are currently configuring as the source and ask: can one of these records link to multiple records on the other side? If yes, use One-to-Many. If each record only ever points to one record on the other side, use Many-to-One.</w:t>
+            </w:r>
+          </w:p>
+        </w:tc>
+      </w:tr>
+    </w:tbl>
     <w:p>
       <w:r>
         <w:t xml:space="preserve"/>
@@ -3209,7 +3586,7 @@
           <w:sz w:val="26"/>
           <w:szCs w:val="26"/>
         </w:rPr>
-        <w:t xml:space="preserve">2.5 Making the Relationship Visible in the UI</w:t>
+        <w:t xml:space="preserve">2.6 Making the Relationship Visible in the UI</w:t>
       </w:r>
     </w:p>
     <w:p>
@@ -3967,7 +4344,7 @@
           <w:sz w:val="26"/>
           <w:szCs w:val="26"/>
         </w:rPr>
-        <w:t xml:space="preserve">2.6 Example: Assigned Mentor on Engagement</w:t>
+        <w:t xml:space="preserve">2.7 Example: Assigned Mentor on Engagement</w:t>
       </w:r>
     </w:p>
     <w:p>

</xml_diff>

<commit_message>
Update CBM-EspoCRM-HowTo.docx - add Remove and Unlink permission research questions
</commit_message>
<xml_diff>
--- a/PRDs/CBM-EspoCRM-HowTo.docx
+++ b/PRDs/CBM-EspoCRM-HowTo.docx
@@ -6165,6 +6165,42 @@
           <w:szCs w:val="22"/>
         </w:rPr>
         <w:t xml:space="preserve">How to filter by the current logged-in user — whether EspoCRM supports a dynamic 'Me' or 'Current User' token in search filters, and if so how to use it for a link field such as Assigned Mentor, in order to support a 'My Engagements' view that automatically scopes to whoever is logged in.</w:t>
+      </w:r>
+    </w:p>
+    <w:p>
+      <w:pPr>
+        <w:pStyle w:val="ListParagraph"/>
+        <w:numPr>
+          <w:ilvl w:val="0"/>
+          <w:numId w:val="2"/>
+        </w:numPr>
+        <w:spacing w:after="80"/>
+      </w:pPr>
+      <w:r>
+        <w:rPr>
+          <w:rFonts w:ascii="Arial" w:cs="Arial" w:eastAsia="Arial" w:hAnsi="Arial"/>
+          <w:sz w:val="22"/>
+          <w:szCs w:val="22"/>
+        </w:rPr>
+        <w:t xml:space="preserve">How to prevent users from using the Remove function in relationship panels — Remove permanently deletes the linked record entirely. Regular users should not have this ability. The exact Role permission that controls this needs to be identified and documented.</w:t>
+      </w:r>
+    </w:p>
+    <w:p>
+      <w:pPr>
+        <w:pStyle w:val="ListParagraph"/>
+        <w:numPr>
+          <w:ilvl w:val="0"/>
+          <w:numId w:val="2"/>
+        </w:numPr>
+        <w:spacing w:after="80"/>
+      </w:pPr>
+      <w:r>
+        <w:rPr>
+          <w:rFonts w:ascii="Arial" w:cs="Arial" w:eastAsia="Arial" w:hAnsi="Arial"/>
+          <w:sz w:val="22"/>
+          <w:szCs w:val="22"/>
+        </w:rPr>
+        <w:t xml:space="preserve">How to prevent users from using the Unlink function in relationship panels — Unlink removes the association between two records without deleting either record. Whether this should be restricted for regular users, and the Role permission that controls it, needs to be identified and documented.</w:t>
       </w:r>
     </w:p>
     <w:p>

</xml_diff>

<commit_message>
Update CBM-EspoCRM-HowTo.docx - add TOC, category sections, placeholder sections for Lists/Filter and Security
</commit_message>
<xml_diff>
--- a/PRDs/CBM-EspoCRM-HowTo.docx
+++ b/PRDs/CBM-EspoCRM-HowTo.docx
@@ -72,6 +72,48 @@
       </w:r>
     </w:p>
     <w:p>
+      <w:r>
+        <w:rPr>
+          <w:rFonts w:ascii="Arial" w:cs="Arial" w:eastAsia="Arial" w:hAnsi="Arial"/>
+          <w:b/>
+          <w:bCs/>
+          <w:color w:val="2E75B6"/>
+          <w:sz w:val="28"/>
+          <w:szCs w:val="28"/>
+        </w:rPr>
+        <w:t xml:space="preserve">Table of Contents</w:t>
+      </w:r>
+    </w:p>
+    <w:p>
+      <w:r>
+        <w:t xml:space="preserve"/>
+      </w:r>
+    </w:p>
+    <w:sdt>
+      <w:sdtPr>
+        <w:alias w:val="Table of Contents"/>
+      </w:sdtPr>
+      <w:sdtContent>
+        <w:p>
+          <w:r>
+            <w:fldChar w:fldCharType="begin" w:dirty="true"/>
+            <w:instrText xml:space="preserve">TOC \h \o "1-2"</w:instrText>
+            <w:fldChar w:fldCharType="separate"/>
+          </w:r>
+        </w:p>
+        <w:p>
+          <w:r>
+            <w:fldChar w:fldCharType="end"/>
+          </w:r>
+        </w:p>
+      </w:sdtContent>
+    </w:sdt>
+    <w:p>
+      <w:r>
+        <w:t xml:space="preserve"/>
+      </w:r>
+    </w:p>
+    <w:p>
       <w:pPr>
         <w:pStyle w:val="Heading1"/>
       </w:pPr>
@@ -84,25 +126,7 @@
           <w:sz w:val="32"/>
           <w:szCs w:val="32"/>
         </w:rPr>
-        <w:t xml:space="preserve">1. Defining an Entity</w:t>
-      </w:r>
-    </w:p>
-    <w:p>
-      <w:r>
-        <w:t xml:space="preserve"/>
-      </w:r>
-    </w:p>
-    <w:p>
-      <w:pPr>
-        <w:spacing w:after="120"/>
-      </w:pPr>
-      <w:r>
-        <w:rPr>
-          <w:rFonts w:ascii="Arial" w:cs="Arial" w:eastAsia="Arial" w:hAnsi="Arial"/>
-          <w:sz w:val="22"/>
-          <w:szCs w:val="22"/>
-        </w:rPr>
-        <w:t xml:space="preserve">An entity in EspoCRM is a data object type — essentially a database table with a corresponding UI (list view, detail view, edit form). Custom entities are created through Entity Manager and can be tailored to fit any business need.</w:t>
+        <w:t xml:space="preserve">Entity Configuration</w:t>
       </w:r>
     </w:p>
     <w:p>
@@ -123,7 +147,12 @@
           <w:sz w:val="26"/>
           <w:szCs w:val="26"/>
         </w:rPr>
-        <w:t xml:space="preserve">1.1 Overview</w:t>
+        <w:t xml:space="preserve">1. Defining an Entity</w:t>
+      </w:r>
+    </w:p>
+    <w:p>
+      <w:r>
+        <w:t xml:space="preserve"/>
       </w:r>
     </w:p>
     <w:p>
@@ -136,26 +165,60 @@
           <w:sz w:val="22"/>
           <w:szCs w:val="22"/>
         </w:rPr>
-        <w:t xml:space="preserve">EspoCRM ships with built-in entities such as Contact, Account, and Meeting. When none of the built-in entities fits your use case, you create a custom entity. For CBM, the Engagement entity is an example of a custom entity created to track mentor-client assignments.</w:t>
-      </w:r>
-    </w:p>
-    <w:p>
-      <w:r>
-        <w:t xml:space="preserve"/>
-      </w:r>
-    </w:p>
-    <w:p>
-      <w:pPr>
-        <w:pStyle w:val="Heading2"/>
+        <w:t xml:space="preserve">An entity in EspoCRM is a data object type — essentially a database table with a corresponding UI (list view, detail view, edit form). Custom entities are created through Entity Manager and can be tailored to fit any business need.</w:t>
+      </w:r>
+    </w:p>
+    <w:p>
+      <w:r>
+        <w:t xml:space="preserve"/>
+      </w:r>
+    </w:p>
+    <w:p>
+      <w:pPr>
+        <w:pStyle w:val="Heading3"/>
       </w:pPr>
       <w:r>
         <w:rPr>
           <w:rFonts w:ascii="Arial" w:cs="Arial" w:eastAsia="Arial" w:hAnsi="Arial"/>
           <w:b/>
           <w:bCs/>
-          <w:color w:val="2E75B6"/>
-          <w:sz w:val="26"/>
-          <w:szCs w:val="26"/>
+          <w:color w:val="595959"/>
+          <w:sz w:val="24"/>
+          <w:szCs w:val="24"/>
+        </w:rPr>
+        <w:t xml:space="preserve">1.1 Overview</w:t>
+      </w:r>
+    </w:p>
+    <w:p>
+      <w:pPr>
+        <w:spacing w:after="120"/>
+      </w:pPr>
+      <w:r>
+        <w:rPr>
+          <w:rFonts w:ascii="Arial" w:cs="Arial" w:eastAsia="Arial" w:hAnsi="Arial"/>
+          <w:sz w:val="22"/>
+          <w:szCs w:val="22"/>
+        </w:rPr>
+        <w:t xml:space="preserve">EspoCRM ships with built-in entities such as Contact, Account, and Meeting. When none of the built-in entities fits your use case, you create a custom entity. For CBM, the Engagement entity is an example of a custom entity created to track mentor-client assignments.</w:t>
+      </w:r>
+    </w:p>
+    <w:p>
+      <w:r>
+        <w:t xml:space="preserve"/>
+      </w:r>
+    </w:p>
+    <w:p>
+      <w:pPr>
+        <w:pStyle w:val="Heading3"/>
+      </w:pPr>
+      <w:r>
+        <w:rPr>
+          <w:rFonts w:ascii="Arial" w:cs="Arial" w:eastAsia="Arial" w:hAnsi="Arial"/>
+          <w:b/>
+          <w:bCs/>
+          <w:color w:val="595959"/>
+          <w:sz w:val="24"/>
+          <w:szCs w:val="24"/>
         </w:rPr>
         <w:t xml:space="preserve">1.2 Step-by-Step: Creating a New Entity</w:t>
       </w:r>
@@ -721,16 +784,16 @@
     </w:p>
     <w:p>
       <w:pPr>
-        <w:pStyle w:val="Heading2"/>
+        <w:pStyle w:val="Heading3"/>
       </w:pPr>
       <w:r>
         <w:rPr>
           <w:rFonts w:ascii="Arial" w:cs="Arial" w:eastAsia="Arial" w:hAnsi="Arial"/>
           <w:b/>
           <w:bCs/>
-          <w:color w:val="2E75B6"/>
-          <w:sz w:val="26"/>
-          <w:szCs w:val="26"/>
+          <w:color w:val="595959"/>
+          <w:sz w:val="24"/>
+          <w:szCs w:val="24"/>
         </w:rPr>
         <w:t xml:space="preserve">1.3 Adding Custom Fields</w:t>
       </w:r>
@@ -947,16 +1010,16 @@
     </w:p>
     <w:p>
       <w:pPr>
-        <w:pStyle w:val="Heading2"/>
+        <w:pStyle w:val="Heading3"/>
       </w:pPr>
       <w:r>
         <w:rPr>
           <w:rFonts w:ascii="Arial" w:cs="Arial" w:eastAsia="Arial" w:hAnsi="Arial"/>
           <w:b/>
           <w:bCs/>
-          <w:color w:val="2E75B6"/>
-          <w:sz w:val="26"/>
-          <w:szCs w:val="26"/>
+          <w:color w:val="595959"/>
+          <w:sz w:val="24"/>
+          <w:szCs w:val="24"/>
         </w:rPr>
         <w:t xml:space="preserve">1.4 Adding the Entity to the Left Navigation Column</w:t>
       </w:r>
@@ -1137,45 +1200,6 @@
     </w:p>
     <w:p>
       <w:pPr>
-        <w:pStyle w:val="Heading1"/>
-      </w:pPr>
-      <w:r>
-        <w:rPr>
-          <w:rFonts w:ascii="Arial" w:cs="Arial" w:eastAsia="Arial" w:hAnsi="Arial"/>
-          <w:b/>
-          <w:bCs/>
-          <w:color w:val="2E75B6"/>
-          <w:sz w:val="32"/>
-          <w:szCs w:val="32"/>
-        </w:rPr>
-        <w:t xml:space="preserve">2. Creating Relationships</w:t>
-      </w:r>
-    </w:p>
-    <w:p>
-      <w:r>
-        <w:t xml:space="preserve"/>
-      </w:r>
-    </w:p>
-    <w:p>
-      <w:pPr>
-        <w:spacing w:after="120"/>
-      </w:pPr>
-      <w:r>
-        <w:rPr>
-          <w:rFonts w:ascii="Arial" w:cs="Arial" w:eastAsia="Arial" w:hAnsi="Arial"/>
-          <w:sz w:val="22"/>
-          <w:szCs w:val="22"/>
-        </w:rPr>
-        <w:t xml:space="preserve">Relationships in EspoCRM define how one entity type links to another. Creating a relationship automatically generates the corresponding link field on the source entity and (optionally) a related records panel on the foreign entity.</w:t>
-      </w:r>
-    </w:p>
-    <w:p>
-      <w:r>
-        <w:t xml:space="preserve"/>
-      </w:r>
-    </w:p>
-    <w:p>
-      <w:pPr>
         <w:pStyle w:val="Heading2"/>
       </w:pPr>
       <w:r>
@@ -1186,6 +1210,45 @@
           <w:color w:val="2E75B6"/>
           <w:sz w:val="26"/>
           <w:szCs w:val="26"/>
+        </w:rPr>
+        <w:t xml:space="preserve">2. Creating Relationships</w:t>
+      </w:r>
+    </w:p>
+    <w:p>
+      <w:r>
+        <w:t xml:space="preserve"/>
+      </w:r>
+    </w:p>
+    <w:p>
+      <w:pPr>
+        <w:spacing w:after="120"/>
+      </w:pPr>
+      <w:r>
+        <w:rPr>
+          <w:rFonts w:ascii="Arial" w:cs="Arial" w:eastAsia="Arial" w:hAnsi="Arial"/>
+          <w:sz w:val="22"/>
+          <w:szCs w:val="22"/>
+        </w:rPr>
+        <w:t xml:space="preserve">Relationships in EspoCRM define how one entity type links to another. Creating a relationship automatically generates the corresponding link field on the source entity and (optionally) a related records panel on the foreign entity.</w:t>
+      </w:r>
+    </w:p>
+    <w:p>
+      <w:r>
+        <w:t xml:space="preserve"/>
+      </w:r>
+    </w:p>
+    <w:p>
+      <w:pPr>
+        <w:pStyle w:val="Heading3"/>
+      </w:pPr>
+      <w:r>
+        <w:rPr>
+          <w:rFonts w:ascii="Arial" w:cs="Arial" w:eastAsia="Arial" w:hAnsi="Arial"/>
+          <w:b/>
+          <w:bCs/>
+          <w:color w:val="595959"/>
+          <w:sz w:val="24"/>
+          <w:szCs w:val="24"/>
         </w:rPr>
         <w:t xml:space="preserve">2.1 Overview</w:t>
       </w:r>
@@ -1246,16 +1309,16 @@
     </w:p>
     <w:p>
       <w:pPr>
-        <w:pStyle w:val="Heading2"/>
+        <w:pStyle w:val="Heading3"/>
       </w:pPr>
       <w:r>
         <w:rPr>
           <w:rFonts w:ascii="Arial" w:cs="Arial" w:eastAsia="Arial" w:hAnsi="Arial"/>
           <w:b/>
           <w:bCs/>
-          <w:color w:val="2E75B6"/>
-          <w:sz w:val="26"/>
-          <w:szCs w:val="26"/>
+          <w:color w:val="595959"/>
+          <w:sz w:val="24"/>
+          <w:szCs w:val="24"/>
         </w:rPr>
         <w:t xml:space="preserve">2.2 Relationship Types</w:t>
       </w:r>
@@ -1727,16 +1790,16 @@
     </w:p>
     <w:p>
       <w:pPr>
-        <w:pStyle w:val="Heading2"/>
+        <w:pStyle w:val="Heading3"/>
       </w:pPr>
       <w:r>
         <w:rPr>
           <w:rFonts w:ascii="Arial" w:cs="Arial" w:eastAsia="Arial" w:hAnsi="Arial"/>
           <w:b/>
           <w:bCs/>
-          <w:color w:val="2E75B6"/>
-          <w:sz w:val="26"/>
-          <w:szCs w:val="26"/>
+          <w:color w:val="595959"/>
+          <w:sz w:val="24"/>
+          <w:szCs w:val="24"/>
         </w:rPr>
         <w:t xml:space="preserve">2.3 What Each Relationship Type Produces</w:t>
       </w:r>
@@ -2328,16 +2391,16 @@
     </w:p>
     <w:p>
       <w:pPr>
-        <w:pStyle w:val="Heading2"/>
+        <w:pStyle w:val="Heading3"/>
       </w:pPr>
       <w:r>
         <w:rPr>
           <w:rFonts w:ascii="Arial" w:cs="Arial" w:eastAsia="Arial" w:hAnsi="Arial"/>
           <w:b/>
           <w:bCs/>
-          <w:color w:val="2E75B6"/>
-          <w:sz w:val="26"/>
-          <w:szCs w:val="26"/>
+          <w:color w:val="595959"/>
+          <w:sz w:val="24"/>
+          <w:szCs w:val="24"/>
         </w:rPr>
         <w:t xml:space="preserve">2.4 Relationships Are Always Bi-Directional</w:t>
       </w:r>
@@ -2549,16 +2612,16 @@
     </w:p>
     <w:p>
       <w:pPr>
-        <w:pStyle w:val="Heading2"/>
+        <w:pStyle w:val="Heading3"/>
       </w:pPr>
       <w:r>
         <w:rPr>
           <w:rFonts w:ascii="Arial" w:cs="Arial" w:eastAsia="Arial" w:hAnsi="Arial"/>
           <w:b/>
           <w:bCs/>
-          <w:color w:val="2E75B6"/>
-          <w:sz w:val="26"/>
-          <w:szCs w:val="26"/>
+          <w:color w:val="595959"/>
+          <w:sz w:val="24"/>
+          <w:szCs w:val="24"/>
         </w:rPr>
         <w:t xml:space="preserve">2.5 Step-by-Step: Adding a Relationship</w:t>
       </w:r>
@@ -3575,16 +3638,16 @@
     </w:p>
     <w:p>
       <w:pPr>
-        <w:pStyle w:val="Heading2"/>
+        <w:pStyle w:val="Heading3"/>
       </w:pPr>
       <w:r>
         <w:rPr>
           <w:rFonts w:ascii="Arial" w:cs="Arial" w:eastAsia="Arial" w:hAnsi="Arial"/>
           <w:b/>
           <w:bCs/>
-          <w:color w:val="2E75B6"/>
-          <w:sz w:val="26"/>
-          <w:szCs w:val="26"/>
+          <w:color w:val="595959"/>
+          <w:sz w:val="24"/>
+          <w:szCs w:val="24"/>
         </w:rPr>
         <w:t xml:space="preserve">2.6 Making the Relationship Visible in the UI</w:t>
       </w:r>
@@ -4333,16 +4396,16 @@
     </w:p>
     <w:p>
       <w:pPr>
-        <w:pStyle w:val="Heading2"/>
+        <w:pStyle w:val="Heading3"/>
       </w:pPr>
       <w:r>
         <w:rPr>
           <w:rFonts w:ascii="Arial" w:cs="Arial" w:eastAsia="Arial" w:hAnsi="Arial"/>
           <w:b/>
           <w:bCs/>
-          <w:color w:val="2E75B6"/>
-          <w:sz w:val="26"/>
-          <w:szCs w:val="26"/>
+          <w:color w:val="595959"/>
+          <w:sz w:val="24"/>
+          <w:szCs w:val="24"/>
         </w:rPr>
         <w:t xml:space="preserve">2.7 Example: Assigned Mentor on Engagement</w:t>
       </w:r>
@@ -5075,43 +5138,7 @@
           <w:sz w:val="32"/>
           <w:szCs w:val="32"/>
         </w:rPr>
-        <w:t xml:space="preserve">3. Adding a Related Panel to an Entity Detail View</w:t>
-      </w:r>
-    </w:p>
-    <w:p>
-      <w:r>
-        <w:t xml:space="preserve"/>
-      </w:r>
-    </w:p>
-    <w:p>
-      <w:pPr>
-        <w:spacing w:after="120"/>
-      </w:pPr>
-      <w:r>
-        <w:rPr>
-          <w:rFonts w:ascii="Arial" w:cs="Arial" w:eastAsia="Arial" w:hAnsi="Arial"/>
-          <w:sz w:val="22"/>
-          <w:szCs w:val="22"/>
-        </w:rPr>
-        <w:t xml:space="preserve">Once a relationship exists between two entities, you can display a related records panel on the detail view of either entity. This allows users to see, add, and edit linked records without leaving the parent record's page.</w:t>
-      </w:r>
-    </w:p>
-    <w:p>
-      <w:r>
-        <w:t xml:space="preserve"/>
-      </w:r>
-    </w:p>
-    <w:p>
-      <w:pPr>
-        <w:spacing w:after="120"/>
-      </w:pPr>
-      <w:r>
-        <w:rPr>
-          <w:rFonts w:ascii="Arial" w:cs="Arial" w:eastAsia="Arial" w:hAnsi="Arial"/>
-          <w:sz w:val="22"/>
-          <w:szCs w:val="22"/>
-        </w:rPr>
-        <w:t xml:space="preserve">A common example for CBM: after defining a relationship between Account and Engagement, you can add an Engagements panel to the Account detail view so that anyone viewing a company record can immediately see all associated engagements.</w:t>
+        <w:t xml:space="preserve">UI Configuration</w:t>
       </w:r>
     </w:p>
     <w:p>
@@ -5131,6 +5158,63 @@
           <w:color w:val="2E75B6"/>
           <w:sz w:val="26"/>
           <w:szCs w:val="26"/>
+        </w:rPr>
+        <w:t xml:space="preserve">3. Adding a Related Panel to an Entity Detail View</w:t>
+      </w:r>
+    </w:p>
+    <w:p>
+      <w:r>
+        <w:t xml:space="preserve"/>
+      </w:r>
+    </w:p>
+    <w:p>
+      <w:pPr>
+        <w:spacing w:after="120"/>
+      </w:pPr>
+      <w:r>
+        <w:rPr>
+          <w:rFonts w:ascii="Arial" w:cs="Arial" w:eastAsia="Arial" w:hAnsi="Arial"/>
+          <w:sz w:val="22"/>
+          <w:szCs w:val="22"/>
+        </w:rPr>
+        <w:t xml:space="preserve">Once a relationship exists between two entities, you can display a related records panel on the detail view of either entity. This allows users to see, add, and edit linked records without leaving the parent record's page.</w:t>
+      </w:r>
+    </w:p>
+    <w:p>
+      <w:r>
+        <w:t xml:space="preserve"/>
+      </w:r>
+    </w:p>
+    <w:p>
+      <w:pPr>
+        <w:spacing w:after="120"/>
+      </w:pPr>
+      <w:r>
+        <w:rPr>
+          <w:rFonts w:ascii="Arial" w:cs="Arial" w:eastAsia="Arial" w:hAnsi="Arial"/>
+          <w:sz w:val="22"/>
+          <w:szCs w:val="22"/>
+        </w:rPr>
+        <w:t xml:space="preserve">A common example for CBM: after defining a relationship between Account and Engagement, you can add an Engagements panel to the Account detail view so that anyone viewing a company record can immediately see all associated engagements.</w:t>
+      </w:r>
+    </w:p>
+    <w:p>
+      <w:r>
+        <w:t xml:space="preserve"/>
+      </w:r>
+    </w:p>
+    <w:p>
+      <w:pPr>
+        <w:pStyle w:val="Heading3"/>
+      </w:pPr>
+      <w:r>
+        <w:rPr>
+          <w:rFonts w:ascii="Arial" w:cs="Arial" w:eastAsia="Arial" w:hAnsi="Arial"/>
+          <w:b/>
+          <w:bCs/>
+          <w:color w:val="595959"/>
+          <w:sz w:val="24"/>
+          <w:szCs w:val="24"/>
         </w:rPr>
         <w:t xml:space="preserve">3.1 Prerequisites</w:t>
       </w:r>
@@ -5196,27 +5280,6 @@
     </w:p>
     <w:p>
       <w:pPr>
-        <w:pStyle w:val="Heading2"/>
-      </w:pPr>
-      <w:r>
-        <w:rPr>
-          <w:rFonts w:ascii="Arial" w:cs="Arial" w:eastAsia="Arial" w:hAnsi="Arial"/>
-          <w:b/>
-          <w:bCs/>
-          <w:color w:val="2E75B6"/>
-          <w:sz w:val="26"/>
-          <w:szCs w:val="26"/>
-        </w:rPr>
-        <w:t xml:space="preserve">3.2 Step-by-Step: Adding the Panel</w:t>
-      </w:r>
-    </w:p>
-    <w:p>
-      <w:r>
-        <w:t xml:space="preserve"/>
-      </w:r>
-    </w:p>
-    <w:p>
-      <w:pPr>
         <w:pStyle w:val="Heading3"/>
       </w:pPr>
       <w:r>
@@ -5228,20 +5291,7 @@
           <w:sz w:val="24"/>
           <w:szCs w:val="24"/>
         </w:rPr>
-        <w:t xml:space="preserve">Step 1 — Open the Bottom Panels Layout</w:t>
-      </w:r>
-    </w:p>
-    <w:p>
-      <w:pPr>
-        <w:spacing w:after="120"/>
-      </w:pPr>
-      <w:r>
-        <w:rPr>
-          <w:rFonts w:ascii="Arial" w:cs="Arial" w:eastAsia="Arial" w:hAnsi="Arial"/>
-          <w:sz w:val="22"/>
-          <w:szCs w:val="22"/>
-        </w:rPr>
-        <w:t xml:space="preserve">Navigate to: Admin → Entity Manager → Account → Layouts → Bottom Panels</w:t>
+        <w:t xml:space="preserve">3.2 Step-by-Step: Adding the Panel</w:t>
       </w:r>
     </w:p>
     <w:p>
@@ -5262,7 +5312,7 @@
           <w:sz w:val="24"/>
           <w:szCs w:val="24"/>
         </w:rPr>
-        <w:t xml:space="preserve">Step 2 — Locate the Related Panel</w:t>
+        <w:t xml:space="preserve">Step 1 — Open the Bottom Panels Layout</w:t>
       </w:r>
     </w:p>
     <w:p>
@@ -5275,7 +5325,7 @@
           <w:sz w:val="22"/>
           <w:szCs w:val="22"/>
         </w:rPr>
-        <w:t xml:space="preserve">The Bottom Panels layout shows all available relationship panels for this entity. Find the Engagements panel in the list. If it is currently disabled, it will appear in the disabled/hidden section.</w:t>
+        <w:t xml:space="preserve">Navigate to: Admin → Entity Manager → Account → Layouts → Bottom Panels</w:t>
       </w:r>
     </w:p>
     <w:p>
@@ -5296,7 +5346,7 @@
           <w:sz w:val="24"/>
           <w:szCs w:val="24"/>
         </w:rPr>
-        <w:t xml:space="preserve">Step 3 — Enable the Panel</w:t>
+        <w:t xml:space="preserve">Step 2 — Locate the Related Panel</w:t>
       </w:r>
     </w:p>
     <w:p>
@@ -5309,7 +5359,7 @@
           <w:sz w:val="22"/>
           <w:szCs w:val="22"/>
         </w:rPr>
-        <w:t xml:space="preserve">Drag the Engagements panel into the active area, or click the enable toggle next to it. Reorder panels by dragging them to your preferred position.</w:t>
+        <w:t xml:space="preserve">The Bottom Panels layout shows all available relationship panels for this entity. Find the Engagements panel in the list. If it is currently disabled, it will appear in the disabled/hidden section.</w:t>
       </w:r>
     </w:p>
     <w:p>
@@ -5330,7 +5380,7 @@
           <w:sz w:val="24"/>
           <w:szCs w:val="24"/>
         </w:rPr>
-        <w:t xml:space="preserve">Step 4 — Save</w:t>
+        <w:t xml:space="preserve">Step 3 — Enable the Panel</w:t>
       </w:r>
     </w:p>
     <w:p>
@@ -5343,26 +5393,60 @@
           <w:sz w:val="22"/>
           <w:szCs w:val="22"/>
         </w:rPr>
-        <w:t xml:space="preserve">Click Save. Refresh the page and open any Account record — the Engagements panel will now appear on the detail view.</w:t>
-      </w:r>
-    </w:p>
-    <w:p>
-      <w:r>
-        <w:t xml:space="preserve"/>
-      </w:r>
-    </w:p>
-    <w:p>
-      <w:pPr>
-        <w:pStyle w:val="Heading2"/>
+        <w:t xml:space="preserve">Drag the Engagements panel into the active area, or click the enable toggle next to it. Reorder panels by dragging them to your preferred position.</w:t>
+      </w:r>
+    </w:p>
+    <w:p>
+      <w:r>
+        <w:t xml:space="preserve"/>
+      </w:r>
+    </w:p>
+    <w:p>
+      <w:pPr>
+        <w:pStyle w:val="Heading3"/>
       </w:pPr>
       <w:r>
         <w:rPr>
           <w:rFonts w:ascii="Arial" w:cs="Arial" w:eastAsia="Arial" w:hAnsi="Arial"/>
           <w:b/>
           <w:bCs/>
-          <w:color w:val="2E75B6"/>
-          <w:sz w:val="26"/>
-          <w:szCs w:val="26"/>
+          <w:color w:val="595959"/>
+          <w:sz w:val="24"/>
+          <w:szCs w:val="24"/>
+        </w:rPr>
+        <w:t xml:space="preserve">Step 4 — Save</w:t>
+      </w:r>
+    </w:p>
+    <w:p>
+      <w:pPr>
+        <w:spacing w:after="120"/>
+      </w:pPr>
+      <w:r>
+        <w:rPr>
+          <w:rFonts w:ascii="Arial" w:cs="Arial" w:eastAsia="Arial" w:hAnsi="Arial"/>
+          <w:sz w:val="22"/>
+          <w:szCs w:val="22"/>
+        </w:rPr>
+        <w:t xml:space="preserve">Click Save. Refresh the page and open any Account record — the Engagements panel will now appear on the detail view.</w:t>
+      </w:r>
+    </w:p>
+    <w:p>
+      <w:r>
+        <w:t xml:space="preserve"/>
+      </w:r>
+    </w:p>
+    <w:p>
+      <w:pPr>
+        <w:pStyle w:val="Heading3"/>
+      </w:pPr>
+      <w:r>
+        <w:rPr>
+          <w:rFonts w:ascii="Arial" w:cs="Arial" w:eastAsia="Arial" w:hAnsi="Arial"/>
+          <w:b/>
+          <w:bCs/>
+          <w:color w:val="595959"/>
+          <w:sz w:val="24"/>
+          <w:szCs w:val="24"/>
         </w:rPr>
         <w:t xml:space="preserve">3.3 Using the Panel</w:t>
       </w:r>
@@ -5525,45 +5609,6 @@
     </w:p>
     <w:p>
       <w:pPr>
-        <w:pStyle w:val="Heading1"/>
-      </w:pPr>
-      <w:r>
-        <w:rPr>
-          <w:rFonts w:ascii="Arial" w:cs="Arial" w:eastAsia="Arial" w:hAnsi="Arial"/>
-          <w:b/>
-          <w:bCs/>
-          <w:color w:val="2E75B6"/>
-          <w:sz w:val="32"/>
-          <w:szCs w:val="32"/>
-        </w:rPr>
-        <w:t xml:space="preserve">4. Configuring Fields Shown in a Relationship Panel</w:t>
-      </w:r>
-    </w:p>
-    <w:p>
-      <w:r>
-        <w:t xml:space="preserve"/>
-      </w:r>
-    </w:p>
-    <w:p>
-      <w:pPr>
-        <w:spacing w:after="120"/>
-      </w:pPr>
-      <w:r>
-        <w:rPr>
-          <w:rFonts w:ascii="Arial" w:cs="Arial" w:eastAsia="Arial" w:hAnsi="Arial"/>
-          <w:sz w:val="22"/>
-          <w:szCs w:val="22"/>
-        </w:rPr>
-        <w:t xml:space="preserve">When a related records panel appears on an entity detail page (e.g., the Engagements panel on an Account), it displays a summary list of linked records. The columns shown in that summary are controlled by a separate layout called List (Small) — not the regular List View and not the parent entity's layout.</w:t>
-      </w:r>
-    </w:p>
-    <w:p>
-      <w:r>
-        <w:t xml:space="preserve"/>
-      </w:r>
-    </w:p>
-    <w:p>
-      <w:pPr>
         <w:pStyle w:val="Heading2"/>
       </w:pPr>
       <w:r>
@@ -5574,6 +5619,45 @@
           <w:color w:val="2E75B6"/>
           <w:sz w:val="26"/>
           <w:szCs w:val="26"/>
+        </w:rPr>
+        <w:t xml:space="preserve">4. Configuring Fields Shown in a Relationship Panel</w:t>
+      </w:r>
+    </w:p>
+    <w:p>
+      <w:r>
+        <w:t xml:space="preserve"/>
+      </w:r>
+    </w:p>
+    <w:p>
+      <w:pPr>
+        <w:spacing w:after="120"/>
+      </w:pPr>
+      <w:r>
+        <w:rPr>
+          <w:rFonts w:ascii="Arial" w:cs="Arial" w:eastAsia="Arial" w:hAnsi="Arial"/>
+          <w:sz w:val="22"/>
+          <w:szCs w:val="22"/>
+        </w:rPr>
+        <w:t xml:space="preserve">When a related records panel appears on an entity detail page (e.g., the Engagements panel on an Account), it displays a summary list of linked records. The columns shown in that summary are controlled by a separate layout called List (Small) — not the regular List View and not the parent entity's layout.</w:t>
+      </w:r>
+    </w:p>
+    <w:p>
+      <w:r>
+        <w:t xml:space="preserve"/>
+      </w:r>
+    </w:p>
+    <w:p>
+      <w:pPr>
+        <w:pStyle w:val="Heading3"/>
+      </w:pPr>
+      <w:r>
+        <w:rPr>
+          <w:rFonts w:ascii="Arial" w:cs="Arial" w:eastAsia="Arial" w:hAnsi="Arial"/>
+          <w:b/>
+          <w:bCs/>
+          <w:color w:val="595959"/>
+          <w:sz w:val="24"/>
+          <w:szCs w:val="24"/>
         </w:rPr>
         <w:t xml:space="preserve">4.1 Understanding the Layout Types</w:t>
       </w:r>
@@ -5657,16 +5741,16 @@
     </w:p>
     <w:p>
       <w:pPr>
-        <w:pStyle w:val="Heading2"/>
+        <w:pStyle w:val="Heading3"/>
       </w:pPr>
       <w:r>
         <w:rPr>
           <w:rFonts w:ascii="Arial" w:cs="Arial" w:eastAsia="Arial" w:hAnsi="Arial"/>
           <w:b/>
           <w:bCs/>
-          <w:color w:val="2E75B6"/>
-          <w:sz w:val="26"/>
-          <w:szCs w:val="26"/>
+          <w:color w:val="595959"/>
+          <w:sz w:val="24"/>
+          <w:szCs w:val="24"/>
         </w:rPr>
         <w:t xml:space="preserve">4.2 Step-by-Step: Configuring the Panel Columns</w:t>
       </w:r>
@@ -5922,16 +6006,16 @@
     </w:p>
     <w:p>
       <w:pPr>
-        <w:pStyle w:val="Heading2"/>
+        <w:pStyle w:val="Heading3"/>
       </w:pPr>
       <w:r>
         <w:rPr>
           <w:rFonts w:ascii="Arial" w:cs="Arial" w:eastAsia="Arial" w:hAnsi="Arial"/>
           <w:b/>
           <w:bCs/>
-          <w:color w:val="2E75B6"/>
-          <w:sz w:val="26"/>
-          <w:szCs w:val="26"/>
+          <w:color w:val="595959"/>
+          <w:sz w:val="24"/>
+          <w:szCs w:val="24"/>
         </w:rPr>
         <w:t xml:space="preserve">4.3 Column Width Considerations</w:t>
       </w:r>
@@ -6075,6 +6159,11 @@
       </w:r>
     </w:p>
     <w:p>
+      <w:r>
+        <w:t xml:space="preserve"/>
+      </w:r>
+    </w:p>
+    <w:p>
       <w:pPr>
         <w:pStyle w:val="Heading1"/>
       </w:pPr>
@@ -6087,7 +6176,315 @@
           <w:sz w:val="32"/>
           <w:szCs w:val="32"/>
         </w:rPr>
-        <w:t xml:space="preserve">5. Questions for Research</w:t>
+        <w:t xml:space="preserve">Lists and Filter Configuration</w:t>
+      </w:r>
+    </w:p>
+    <w:p>
+      <w:r>
+        <w:t xml:space="preserve"/>
+      </w:r>
+    </w:p>
+    <w:p>
+      <w:pPr>
+        <w:spacing w:after="120"/>
+      </w:pPr>
+      <w:r>
+        <w:rPr>
+          <w:rFonts w:ascii="Arial" w:cs="Arial" w:eastAsia="Arial" w:hAnsi="Arial"/>
+          <w:sz w:val="22"/>
+          <w:szCs w:val="22"/>
+        </w:rPr>
+        <w:t xml:space="preserve">This section will document how to create and manage filtered list views in EspoCRM, including system-level saved searches available to all users and views that dynamically filter by the current logged-in user.</w:t>
+      </w:r>
+    </w:p>
+    <w:p>
+      <w:r>
+        <w:t xml:space="preserve"/>
+      </w:r>
+    </w:p>
+    <w:p>
+      <w:pPr>
+        <w:spacing w:after="120"/>
+      </w:pPr>
+      <w:r>
+        <w:rPr>
+          <w:rFonts w:ascii="Arial" w:cs="Arial" w:eastAsia="Arial" w:hAnsi="Arial"/>
+          <w:sz w:val="22"/>
+          <w:szCs w:val="22"/>
+        </w:rPr>
+        <w:t xml:space="preserve">Topics planned for this section — pending research:</w:t>
+      </w:r>
+    </w:p>
+    <w:p>
+      <w:pPr>
+        <w:pStyle w:val="ListParagraph"/>
+        <w:numPr>
+          <w:ilvl w:val="0"/>
+          <w:numId w:val="2"/>
+        </w:numPr>
+        <w:spacing w:after="80"/>
+      </w:pPr>
+      <w:r>
+        <w:rPr>
+          <w:rFonts w:ascii="Arial" w:cs="Arial" w:eastAsia="Arial" w:hAnsi="Arial"/>
+          <w:sz w:val="22"/>
+          <w:szCs w:val="22"/>
+        </w:rPr>
+        <w:t xml:space="preserve">5. Creating a My Engagements view — a filtered list showing only engagements where the current user is the Assigned Mentor</w:t>
+      </w:r>
+    </w:p>
+    <w:p>
+      <w:pPr>
+        <w:pStyle w:val="ListParagraph"/>
+        <w:numPr>
+          <w:ilvl w:val="0"/>
+          <w:numId w:val="2"/>
+        </w:numPr>
+        <w:spacing w:after="80"/>
+      </w:pPr>
+      <w:r>
+        <w:rPr>
+          <w:rFonts w:ascii="Arial" w:cs="Arial" w:eastAsia="Arial" w:hAnsi="Arial"/>
+          <w:sz w:val="22"/>
+          <w:szCs w:val="22"/>
+        </w:rPr>
+        <w:t xml:space="preserve">6. Creating system-level saved searches — making a saved filter available to all users, not just the creator</w:t>
+      </w:r>
+    </w:p>
+    <w:p>
+      <w:r>
+        <w:t xml:space="preserve"/>
+      </w:r>
+    </w:p>
+    <w:tbl>
+      <w:tblPr>
+        <w:tblW w:type="dxa" w:w="9360"/>
+        <w:tblBorders>
+          <w:top w:val="single" w:color="auto" w:sz="4"/>
+          <w:left w:val="single" w:color="auto" w:sz="4"/>
+          <w:bottom w:val="single" w:color="auto" w:sz="4"/>
+          <w:right w:val="single" w:color="auto" w:sz="4"/>
+          <w:insideH w:val="single" w:color="auto" w:sz="4"/>
+          <w:insideV w:val="single" w:color="auto" w:sz="4"/>
+        </w:tblBorders>
+      </w:tblPr>
+      <w:tblGrid>
+        <w:gridCol w:w="9360"/>
+      </w:tblGrid>
+      <w:tr>
+        <w:tc>
+          <w:tcPr>
+            <w:tcW w:type="dxa" w:w="9360"/>
+            <w:tcBorders>
+              <w:top w:val="single" w:color="FFC107" w:sz="4"/>
+              <w:left w:val="single" w:color="FFC107" w:sz="4"/>
+              <w:bottom w:val="single" w:color="FFC107" w:sz="4"/>
+              <w:right w:val="single" w:color="FFC107" w:sz="4"/>
+            </w:tcBorders>
+            <w:shd w:fill="FFF3CD" w:val="clear"/>
+            <w:tcMar>
+              <w:top w:type="dxa" w:w="100"/>
+              <w:left w:type="dxa" w:w="160"/>
+              <w:bottom w:type="dxa" w:w="100"/>
+              <w:right w:type="dxa" w:w="160"/>
+            </w:tcMar>
+          </w:tcPr>
+          <w:p>
+            <w:r>
+              <w:rPr>
+                <w:rFonts w:ascii="Arial" w:cs="Arial" w:eastAsia="Arial" w:hAnsi="Arial"/>
+                <w:b/>
+                <w:bCs/>
+                <w:sz w:val="22"/>
+                <w:szCs w:val="22"/>
+              </w:rPr>
+              <w:t xml:space="preserve">Note: </w:t>
+            </w:r>
+            <w:r>
+              <w:rPr>
+                <w:rFonts w:ascii="Arial" w:cs="Arial" w:eastAsia="Arial" w:hAnsi="Arial"/>
+                <w:sz w:val="22"/>
+                <w:szCs w:val="22"/>
+              </w:rPr>
+              <w:t xml:space="preserve">See the Questions for Research section for the open questions that need to be resolved before these topics can be fully documented.</w:t>
+            </w:r>
+          </w:p>
+        </w:tc>
+      </w:tr>
+    </w:tbl>
+    <w:p>
+      <w:r>
+        <w:t xml:space="preserve"/>
+      </w:r>
+    </w:p>
+    <w:p>
+      <w:pPr>
+        <w:pStyle w:val="Heading1"/>
+      </w:pPr>
+      <w:r>
+        <w:rPr>
+          <w:rFonts w:ascii="Arial" w:cs="Arial" w:eastAsia="Arial" w:hAnsi="Arial"/>
+          <w:b/>
+          <w:bCs/>
+          <w:color w:val="2E75B6"/>
+          <w:sz w:val="32"/>
+          <w:szCs w:val="32"/>
+        </w:rPr>
+        <w:t xml:space="preserve">Security Configuration</w:t>
+      </w:r>
+    </w:p>
+    <w:p>
+      <w:r>
+        <w:t xml:space="preserve"/>
+      </w:r>
+    </w:p>
+    <w:p>
+      <w:pPr>
+        <w:spacing w:after="120"/>
+      </w:pPr>
+      <w:r>
+        <w:rPr>
+          <w:rFonts w:ascii="Arial" w:cs="Arial" w:eastAsia="Arial" w:hAnsi="Arial"/>
+          <w:sz w:val="22"/>
+          <w:szCs w:val="22"/>
+        </w:rPr>
+        <w:t xml:space="preserve">This section will document how to configure user roles and permissions in EspoCRM to control what actions users can perform on records and relationship panels.</w:t>
+      </w:r>
+    </w:p>
+    <w:p>
+      <w:r>
+        <w:t xml:space="preserve"/>
+      </w:r>
+    </w:p>
+    <w:p>
+      <w:pPr>
+        <w:spacing w:after="120"/>
+      </w:pPr>
+      <w:r>
+        <w:rPr>
+          <w:rFonts w:ascii="Arial" w:cs="Arial" w:eastAsia="Arial" w:hAnsi="Arial"/>
+          <w:sz w:val="22"/>
+          <w:szCs w:val="22"/>
+        </w:rPr>
+        <w:t xml:space="preserve">Topics planned for this section — pending research:</w:t>
+      </w:r>
+    </w:p>
+    <w:p>
+      <w:pPr>
+        <w:pStyle w:val="ListParagraph"/>
+        <w:numPr>
+          <w:ilvl w:val="0"/>
+          <w:numId w:val="2"/>
+        </w:numPr>
+        <w:spacing w:after="80"/>
+      </w:pPr>
+      <w:r>
+        <w:rPr>
+          <w:rFonts w:ascii="Arial" w:cs="Arial" w:eastAsia="Arial" w:hAnsi="Arial"/>
+          <w:sz w:val="22"/>
+          <w:szCs w:val="22"/>
+        </w:rPr>
+        <w:t xml:space="preserve">7. Restricting the Remove function in relationship panels — preventing users from permanently deleting linked records via the panel</w:t>
+      </w:r>
+    </w:p>
+    <w:p>
+      <w:pPr>
+        <w:pStyle w:val="ListParagraph"/>
+        <w:numPr>
+          <w:ilvl w:val="0"/>
+          <w:numId w:val="2"/>
+        </w:numPr>
+        <w:spacing w:after="80"/>
+      </w:pPr>
+      <w:r>
+        <w:rPr>
+          <w:rFonts w:ascii="Arial" w:cs="Arial" w:eastAsia="Arial" w:hAnsi="Arial"/>
+          <w:sz w:val="22"/>
+          <w:szCs w:val="22"/>
+        </w:rPr>
+        <w:t xml:space="preserve">8. Restricting the Unlink function in relationship panels — controlling whether users can remove associations between records</w:t>
+      </w:r>
+    </w:p>
+    <w:p>
+      <w:r>
+        <w:t xml:space="preserve"/>
+      </w:r>
+    </w:p>
+    <w:tbl>
+      <w:tblPr>
+        <w:tblW w:type="dxa" w:w="9360"/>
+        <w:tblBorders>
+          <w:top w:val="single" w:color="auto" w:sz="4"/>
+          <w:left w:val="single" w:color="auto" w:sz="4"/>
+          <w:bottom w:val="single" w:color="auto" w:sz="4"/>
+          <w:right w:val="single" w:color="auto" w:sz="4"/>
+          <w:insideH w:val="single" w:color="auto" w:sz="4"/>
+          <w:insideV w:val="single" w:color="auto" w:sz="4"/>
+        </w:tblBorders>
+      </w:tblPr>
+      <w:tblGrid>
+        <w:gridCol w:w="9360"/>
+      </w:tblGrid>
+      <w:tr>
+        <w:tc>
+          <w:tcPr>
+            <w:tcW w:type="dxa" w:w="9360"/>
+            <w:tcBorders>
+              <w:top w:val="single" w:color="FFC107" w:sz="4"/>
+              <w:left w:val="single" w:color="FFC107" w:sz="4"/>
+              <w:bottom w:val="single" w:color="FFC107" w:sz="4"/>
+              <w:right w:val="single" w:color="FFC107" w:sz="4"/>
+            </w:tcBorders>
+            <w:shd w:fill="FFF3CD" w:val="clear"/>
+            <w:tcMar>
+              <w:top w:type="dxa" w:w="100"/>
+              <w:left w:type="dxa" w:w="160"/>
+              <w:bottom w:type="dxa" w:w="100"/>
+              <w:right w:type="dxa" w:w="160"/>
+            </w:tcMar>
+          </w:tcPr>
+          <w:p>
+            <w:r>
+              <w:rPr>
+                <w:rFonts w:ascii="Arial" w:cs="Arial" w:eastAsia="Arial" w:hAnsi="Arial"/>
+                <w:b/>
+                <w:bCs/>
+                <w:sz w:val="22"/>
+                <w:szCs w:val="22"/>
+              </w:rPr>
+              <w:t xml:space="preserve">Note: </w:t>
+            </w:r>
+            <w:r>
+              <w:rPr>
+                <w:rFonts w:ascii="Arial" w:cs="Arial" w:eastAsia="Arial" w:hAnsi="Arial"/>
+                <w:sz w:val="22"/>
+                <w:szCs w:val="22"/>
+              </w:rPr>
+              <w:t xml:space="preserve">See the Questions for Research section for the open questions that need to be resolved before these topics can be fully documented.</w:t>
+            </w:r>
+          </w:p>
+        </w:tc>
+      </w:tr>
+    </w:tbl>
+    <w:p>
+      <w:r>
+        <w:t xml:space="preserve"/>
+      </w:r>
+    </w:p>
+    <w:p>
+      <w:pPr>
+        <w:pStyle w:val="Heading1"/>
+      </w:pPr>
+      <w:r>
+        <w:rPr>
+          <w:rFonts w:ascii="Arial" w:cs="Arial" w:eastAsia="Arial" w:hAnsi="Arial"/>
+          <w:b/>
+          <w:bCs/>
+          <w:color w:val="2E75B6"/>
+          <w:sz w:val="32"/>
+          <w:szCs w:val="32"/>
+        </w:rPr>
+        <w:t xml:space="preserve">Questions for Research</w:t>
       </w:r>
     </w:p>
     <w:p>

</xml_diff>

<commit_message>
Update CBM-EspoCRM-HowTo.docx - add Integration Configuration category with Google Meet how-to
</commit_message>
<xml_diff>
--- a/PRDs/CBM-EspoCRM-HowTo.docx
+++ b/PRDs/CBM-EspoCRM-HowTo.docx
@@ -6484,7 +6484,28 @@
           <w:sz w:val="32"/>
           <w:szCs w:val="32"/>
         </w:rPr>
-        <w:t xml:space="preserve">Questions for Research</w:t>
+        <w:t xml:space="preserve">Integration Configuration</w:t>
+      </w:r>
+    </w:p>
+    <w:p>
+      <w:r>
+        <w:t xml:space="preserve"/>
+      </w:r>
+    </w:p>
+    <w:p>
+      <w:pPr>
+        <w:pStyle w:val="Heading2"/>
+      </w:pPr>
+      <w:r>
+        <w:rPr>
+          <w:rFonts w:ascii="Arial" w:cs="Arial" w:eastAsia="Arial" w:hAnsi="Arial"/>
+          <w:b/>
+          <w:bCs/>
+          <w:color w:val="2E75B6"/>
+          <w:sz w:val="26"/>
+          <w:szCs w:val="26"/>
+        </w:rPr>
+        <w:t xml:space="preserve">9. Integrating Google Meet with EspoCRM Meetings</w:t>
       </w:r>
     </w:p>
     <w:p>
@@ -6502,7 +6523,226 @@
           <w:sz w:val="22"/>
           <w:szCs w:val="22"/>
         </w:rPr>
-        <w:t xml:space="preserve">The following questions arose during configuration and require further research before they can be documented as How To steps.</w:t>
+        <w:t xml:space="preserve">EspoCRM does not create Google Meet links directly. Instead, it syncs meetings to Google Calendar, and Google automatically generates a Meet link as part of that calendar event — provided the user's Google Calendar is configured to do so. No manual action is needed in EspoCRM for the Meet link itself.</w:t>
+      </w:r>
+    </w:p>
+    <w:p>
+      <w:r>
+        <w:t xml:space="preserve"/>
+      </w:r>
+    </w:p>
+    <w:p>
+      <w:pPr>
+        <w:pStyle w:val="Heading3"/>
+      </w:pPr>
+      <w:r>
+        <w:rPr>
+          <w:rFonts w:ascii="Arial" w:cs="Arial" w:eastAsia="Arial" w:hAnsi="Arial"/>
+          <w:b/>
+          <w:bCs/>
+          <w:color w:val="595959"/>
+          <w:sz w:val="24"/>
+          <w:szCs w:val="24"/>
+        </w:rPr>
+        <w:t xml:space="preserve">9.1 How It Works</w:t>
+      </w:r>
+    </w:p>
+    <w:p>
+      <w:pPr>
+        <w:spacing w:after="120"/>
+      </w:pPr>
+      <w:r>
+        <w:rPr>
+          <w:rFonts w:ascii="Arial" w:cs="Arial" w:eastAsia="Arial" w:hAnsi="Arial"/>
+          <w:sz w:val="22"/>
+          <w:szCs w:val="22"/>
+        </w:rPr>
+        <w:t xml:space="preserve">When a meeting is created in EspoCRM and synced to a user's Google Calendar, Google Calendar automatically attaches a Meet link to the event if the user's calendar has Meet link generation enabled. This is standard behavior for Google Workspace accounts.</w:t>
+      </w:r>
+    </w:p>
+    <w:p>
+      <w:r>
+        <w:t xml:space="preserve"/>
+      </w:r>
+    </w:p>
+    <w:p>
+      <w:pPr>
+        <w:spacing w:after="120"/>
+      </w:pPr>
+      <w:r>
+        <w:rPr>
+          <w:rFonts w:ascii="Arial" w:cs="Arial" w:eastAsia="Arial" w:hAnsi="Arial"/>
+          <w:sz w:val="22"/>
+          <w:szCs w:val="22"/>
+        </w:rPr>
+        <w:t xml:space="preserve">The flow is:</w:t>
+      </w:r>
+    </w:p>
+    <w:p>
+      <w:pPr>
+        <w:pStyle w:val="ListParagraph"/>
+        <w:numPr>
+          <w:ilvl w:val="0"/>
+          <w:numId w:val="3"/>
+        </w:numPr>
+        <w:spacing w:after="100"/>
+      </w:pPr>
+      <w:r>
+        <w:rPr>
+          <w:rFonts w:ascii="Arial" w:cs="Arial" w:eastAsia="Arial" w:hAnsi="Arial"/>
+          <w:sz w:val="22"/>
+          <w:szCs w:val="22"/>
+        </w:rPr>
+        <w:t xml:space="preserve">A meeting is created in EspoCRM and assigned to a user.</w:t>
+      </w:r>
+    </w:p>
+    <w:p>
+      <w:pPr>
+        <w:pStyle w:val="ListParagraph"/>
+        <w:numPr>
+          <w:ilvl w:val="0"/>
+          <w:numId w:val="3"/>
+        </w:numPr>
+        <w:spacing w:after="100"/>
+      </w:pPr>
+      <w:r>
+        <w:rPr>
+          <w:rFonts w:ascii="Arial" w:cs="Arial" w:eastAsia="Arial" w:hAnsi="Arial"/>
+          <w:sz w:val="22"/>
+          <w:szCs w:val="22"/>
+        </w:rPr>
+        <w:t xml:space="preserve">EspoCRM syncs the meeting to that user's Google Calendar via the Google Calendar sync module.</w:t>
+      </w:r>
+    </w:p>
+    <w:p>
+      <w:pPr>
+        <w:pStyle w:val="ListParagraph"/>
+        <w:numPr>
+          <w:ilvl w:val="0"/>
+          <w:numId w:val="3"/>
+        </w:numPr>
+        <w:spacing w:after="100"/>
+      </w:pPr>
+      <w:r>
+        <w:rPr>
+          <w:rFonts w:ascii="Arial" w:cs="Arial" w:eastAsia="Arial" w:hAnsi="Arial"/>
+          <w:sz w:val="22"/>
+          <w:szCs w:val="22"/>
+        </w:rPr>
+        <w:t xml:space="preserve">Google Calendar automatically generates and attaches a Meet link to the event.</w:t>
+      </w:r>
+    </w:p>
+    <w:p>
+      <w:pPr>
+        <w:pStyle w:val="ListParagraph"/>
+        <w:numPr>
+          <w:ilvl w:val="0"/>
+          <w:numId w:val="3"/>
+        </w:numPr>
+        <w:spacing w:after="100"/>
+      </w:pPr>
+      <w:r>
+        <w:rPr>
+          <w:rFonts w:ascii="Arial" w:cs="Arial" w:eastAsia="Arial" w:hAnsi="Arial"/>
+          <w:sz w:val="22"/>
+          <w:szCs w:val="22"/>
+        </w:rPr>
+        <w:t xml:space="preserve">The Meet link is visible in the Google Calendar event, and attendees receive it in their calendar invitation.</w:t>
+      </w:r>
+    </w:p>
+    <w:p>
+      <w:r>
+        <w:t xml:space="preserve"/>
+      </w:r>
+    </w:p>
+    <w:tbl>
+      <w:tblPr>
+        <w:tblW w:type="dxa" w:w="9360"/>
+        <w:tblBorders>
+          <w:top w:val="single" w:color="auto" w:sz="4"/>
+          <w:left w:val="single" w:color="auto" w:sz="4"/>
+          <w:bottom w:val="single" w:color="auto" w:sz="4"/>
+          <w:right w:val="single" w:color="auto" w:sz="4"/>
+          <w:insideH w:val="single" w:color="auto" w:sz="4"/>
+          <w:insideV w:val="single" w:color="auto" w:sz="4"/>
+        </w:tblBorders>
+      </w:tblPr>
+      <w:tblGrid>
+        <w:gridCol w:w="9360"/>
+      </w:tblGrid>
+      <w:tr>
+        <w:tc>
+          <w:tcPr>
+            <w:tcW w:type="dxa" w:w="9360"/>
+            <w:tcBorders>
+              <w:top w:val="single" w:color="FFC107" w:sz="4"/>
+              <w:left w:val="single" w:color="FFC107" w:sz="4"/>
+              <w:bottom w:val="single" w:color="FFC107" w:sz="4"/>
+              <w:right w:val="single" w:color="FFC107" w:sz="4"/>
+            </w:tcBorders>
+            <w:shd w:fill="FFF3CD" w:val="clear"/>
+            <w:tcMar>
+              <w:top w:type="dxa" w:w="100"/>
+              <w:left w:type="dxa" w:w="160"/>
+              <w:bottom w:type="dxa" w:w="100"/>
+              <w:right w:type="dxa" w:w="160"/>
+            </w:tcMar>
+          </w:tcPr>
+          <w:p>
+            <w:r>
+              <w:rPr>
+                <w:rFonts w:ascii="Arial" w:cs="Arial" w:eastAsia="Arial" w:hAnsi="Arial"/>
+                <w:b/>
+                <w:bCs/>
+                <w:sz w:val="22"/>
+                <w:szCs w:val="22"/>
+              </w:rPr>
+              <w:t xml:space="preserve">Note: </w:t>
+            </w:r>
+            <w:r>
+              <w:rPr>
+                <w:rFonts w:ascii="Arial" w:cs="Arial" w:eastAsia="Arial" w:hAnsi="Arial"/>
+                <w:sz w:val="22"/>
+                <w:szCs w:val="22"/>
+              </w:rPr>
+              <w:t xml:space="preserve">EspoCRM does not currently display the Google Meet link back inside the EspoCRM meeting record. Users will need to open the event in Google Calendar to access the Meet link, or find it in their calendar invitation email.</w:t>
+            </w:r>
+          </w:p>
+        </w:tc>
+      </w:tr>
+    </w:tbl>
+    <w:p>
+      <w:r>
+        <w:t xml:space="preserve"/>
+      </w:r>
+    </w:p>
+    <w:p>
+      <w:pPr>
+        <w:pStyle w:val="Heading3"/>
+      </w:pPr>
+      <w:r>
+        <w:rPr>
+          <w:rFonts w:ascii="Arial" w:cs="Arial" w:eastAsia="Arial" w:hAnsi="Arial"/>
+          <w:b/>
+          <w:bCs/>
+          <w:color w:val="595959"/>
+          <w:sz w:val="24"/>
+          <w:szCs w:val="24"/>
+        </w:rPr>
+        <w:t xml:space="preserve">9.2 Prerequisites</w:t>
+      </w:r>
+    </w:p>
+    <w:p>
+      <w:pPr>
+        <w:spacing w:after="120"/>
+      </w:pPr>
+      <w:r>
+        <w:rPr>
+          <w:rFonts w:ascii="Arial" w:cs="Arial" w:eastAsia="Arial" w:hAnsi="Arial"/>
+          <w:sz w:val="22"/>
+          <w:szCs w:val="22"/>
+        </w:rPr>
+        <w:t xml:space="preserve">Before this integration will work, the following must be in place:</w:t>
       </w:r>
     </w:p>
     <w:p>
@@ -6525,7 +6765,7 @@
           <w:sz w:val="22"/>
           <w:szCs w:val="22"/>
         </w:rPr>
-        <w:t xml:space="preserve">How to get filters to show up in the Create Relationship filter dropdown — the Select Filter field in the Add Relationship dialog only shows metadata-level filters, not user-created saved searches. The correct approach for defining custom filters at the metadata level needs to be identified and documented.</w:t>
+        <w:t xml:space="preserve">Google Calendar sync must be configured in EspoCRM. Navigate to: Admin → Extensions → Google Calendar Sync to confirm it is set up.</w:t>
       </w:r>
     </w:p>
     <w:p>
@@ -6543,7 +6783,7 @@
           <w:sz w:val="22"/>
           <w:szCs w:val="22"/>
         </w:rPr>
-        <w:t xml:space="preserve">How to create a system-level saved search (shared view) — when saving a search/filter in EspoCRM, the path for making it available to all users rather than just the creator needs to be identified and documented.</w:t>
+        <w:t xml:space="preserve">Each user must have their personal Google account connected to EspoCRM via the Google Integration (Admin → Integrations → Google).</w:t>
       </w:r>
     </w:p>
     <w:p>
@@ -6561,7 +6801,352 @@
           <w:sz w:val="22"/>
           <w:szCs w:val="22"/>
         </w:rPr>
-        <w:t xml:space="preserve">How to filter by the current logged-in user — whether EspoCRM supports a dynamic 'Me' or 'Current User' token in search filters, and if so how to use it for a link field such as Assigned Mentor, in order to support a 'My Engagements' view that automatically scopes to whoever is logged in.</w:t>
+        <w:t xml:space="preserve">The user's Google Calendar must be configured to automatically add Meet links to events. This is a Google Calendar setting, not an EspoCRM setting — see Section 9.3 below.</w:t>
+      </w:r>
+    </w:p>
+    <w:p>
+      <w:r>
+        <w:t xml:space="preserve"/>
+      </w:r>
+    </w:p>
+    <w:p>
+      <w:pPr>
+        <w:pStyle w:val="Heading3"/>
+      </w:pPr>
+      <w:r>
+        <w:rPr>
+          <w:rFonts w:ascii="Arial" w:cs="Arial" w:eastAsia="Arial" w:hAnsi="Arial"/>
+          <w:b/>
+          <w:bCs/>
+          <w:color w:val="595959"/>
+          <w:sz w:val="24"/>
+          <w:szCs w:val="24"/>
+        </w:rPr>
+        <w:t xml:space="preserve">9.3 Enabling Automatic Meet Links in Google Calendar</w:t>
+      </w:r>
+    </w:p>
+    <w:p>
+      <w:pPr>
+        <w:spacing w:after="120"/>
+      </w:pPr>
+      <w:r>
+        <w:rPr>
+          <w:rFonts w:ascii="Arial" w:cs="Arial" w:eastAsia="Arial" w:hAnsi="Arial"/>
+          <w:sz w:val="22"/>
+          <w:szCs w:val="22"/>
+        </w:rPr>
+        <w:t xml:space="preserve">This setting is configured in Google Calendar, not in EspoCRM. Each user should confirm this is enabled in their own Google Calendar account:</w:t>
+      </w:r>
+    </w:p>
+    <w:p>
+      <w:r>
+        <w:t xml:space="preserve"/>
+      </w:r>
+    </w:p>
+    <w:p>
+      <w:pPr>
+        <w:pStyle w:val="ListParagraph"/>
+        <w:numPr>
+          <w:ilvl w:val="0"/>
+          <w:numId w:val="3"/>
+        </w:numPr>
+        <w:spacing w:after="100"/>
+      </w:pPr>
+      <w:r>
+        <w:rPr>
+          <w:rFonts w:ascii="Arial" w:cs="Arial" w:eastAsia="Arial" w:hAnsi="Arial"/>
+          <w:sz w:val="22"/>
+          <w:szCs w:val="22"/>
+        </w:rPr>
+        <w:t xml:space="preserve">Open Google Calendar in a browser and click the Settings gear icon.</w:t>
+      </w:r>
+    </w:p>
+    <w:p>
+      <w:pPr>
+        <w:pStyle w:val="ListParagraph"/>
+        <w:numPr>
+          <w:ilvl w:val="0"/>
+          <w:numId w:val="3"/>
+        </w:numPr>
+        <w:spacing w:after="100"/>
+      </w:pPr>
+      <w:r>
+        <w:rPr>
+          <w:rFonts w:ascii="Arial" w:cs="Arial" w:eastAsia="Arial" w:hAnsi="Arial"/>
+          <w:sz w:val="22"/>
+          <w:szCs w:val="22"/>
+        </w:rPr>
+        <w:t xml:space="preserve">Go to Settings → General → Event Settings.</w:t>
+      </w:r>
+    </w:p>
+    <w:p>
+      <w:pPr>
+        <w:pStyle w:val="ListParagraph"/>
+        <w:numPr>
+          <w:ilvl w:val="0"/>
+          <w:numId w:val="3"/>
+        </w:numPr>
+        <w:spacing w:after="100"/>
+      </w:pPr>
+      <w:r>
+        <w:rPr>
+          <w:rFonts w:ascii="Arial" w:cs="Arial" w:eastAsia="Arial" w:hAnsi="Arial"/>
+          <w:sz w:val="22"/>
+          <w:szCs w:val="22"/>
+        </w:rPr>
+        <w:t xml:space="preserve">Ensure the option to automatically add video conferencing to events is enabled.</w:t>
+      </w:r>
+    </w:p>
+    <w:p>
+      <w:pPr>
+        <w:pStyle w:val="ListParagraph"/>
+        <w:numPr>
+          <w:ilvl w:val="0"/>
+          <w:numId w:val="3"/>
+        </w:numPr>
+        <w:spacing w:after="100"/>
+      </w:pPr>
+      <w:r>
+        <w:rPr>
+          <w:rFonts w:ascii="Arial" w:cs="Arial" w:eastAsia="Arial" w:hAnsi="Arial"/>
+          <w:sz w:val="22"/>
+          <w:szCs w:val="22"/>
+        </w:rPr>
+        <w:t xml:space="preserve">Save settings.</w:t>
+      </w:r>
+    </w:p>
+    <w:p>
+      <w:r>
+        <w:t xml:space="preserve"/>
+      </w:r>
+    </w:p>
+    <w:p>
+      <w:pPr>
+        <w:spacing w:after="120"/>
+      </w:pPr>
+      <w:r>
+        <w:rPr>
+          <w:rFonts w:ascii="Arial" w:cs="Arial" w:eastAsia="Arial" w:hAnsi="Arial"/>
+          <w:sz w:val="22"/>
+          <w:szCs w:val="22"/>
+        </w:rPr>
+        <w:t xml:space="preserve">For Google Workspace organizations (such as CBM using Google Workspace for Nonprofits), this setting may also be controlled at the admin level via the Google Workspace Admin Console under Calendar settings.</w:t>
+      </w:r>
+    </w:p>
+    <w:p>
+      <w:r>
+        <w:t xml:space="preserve"/>
+      </w:r>
+    </w:p>
+    <w:p>
+      <w:pPr>
+        <w:pStyle w:val="Heading3"/>
+      </w:pPr>
+      <w:r>
+        <w:rPr>
+          <w:rFonts w:ascii="Arial" w:cs="Arial" w:eastAsia="Arial" w:hAnsi="Arial"/>
+          <w:b/>
+          <w:bCs/>
+          <w:color w:val="595959"/>
+          <w:sz w:val="24"/>
+          <w:szCs w:val="24"/>
+        </w:rPr>
+        <w:t xml:space="preserve">9.4 Creating a Meeting in EspoCRM</w:t>
+      </w:r>
+    </w:p>
+    <w:p>
+      <w:pPr>
+        <w:spacing w:after="120"/>
+      </w:pPr>
+      <w:r>
+        <w:rPr>
+          <w:rFonts w:ascii="Arial" w:cs="Arial" w:eastAsia="Arial" w:hAnsi="Arial"/>
+          <w:sz w:val="22"/>
+          <w:szCs w:val="22"/>
+        </w:rPr>
+        <w:t xml:space="preserve">Once the prerequisites are in place, creating a meeting that generates a Meet link requires no special steps:</w:t>
+      </w:r>
+    </w:p>
+    <w:p>
+      <w:r>
+        <w:t xml:space="preserve"/>
+      </w:r>
+    </w:p>
+    <w:p>
+      <w:pPr>
+        <w:pStyle w:val="ListParagraph"/>
+        <w:numPr>
+          <w:ilvl w:val="0"/>
+          <w:numId w:val="3"/>
+        </w:numPr>
+        <w:spacing w:after="100"/>
+      </w:pPr>
+      <w:r>
+        <w:rPr>
+          <w:rFonts w:ascii="Arial" w:cs="Arial" w:eastAsia="Arial" w:hAnsi="Arial"/>
+          <w:sz w:val="22"/>
+          <w:szCs w:val="22"/>
+        </w:rPr>
+        <w:t xml:space="preserve">Create a new Meeting record in EspoCRM (via the Meetings entity or from within a related record such as a Contact or Engagement).</w:t>
+      </w:r>
+    </w:p>
+    <w:p>
+      <w:pPr>
+        <w:pStyle w:val="ListParagraph"/>
+        <w:numPr>
+          <w:ilvl w:val="0"/>
+          <w:numId w:val="3"/>
+        </w:numPr>
+        <w:spacing w:after="100"/>
+      </w:pPr>
+      <w:r>
+        <w:rPr>
+          <w:rFonts w:ascii="Arial" w:cs="Arial" w:eastAsia="Arial" w:hAnsi="Arial"/>
+          <w:sz w:val="22"/>
+          <w:szCs w:val="22"/>
+        </w:rPr>
+        <w:t xml:space="preserve">Assign the meeting to the appropriate user and set the date and time.</w:t>
+      </w:r>
+    </w:p>
+    <w:p>
+      <w:pPr>
+        <w:pStyle w:val="ListParagraph"/>
+        <w:numPr>
+          <w:ilvl w:val="0"/>
+          <w:numId w:val="3"/>
+        </w:numPr>
+        <w:spacing w:after="100"/>
+      </w:pPr>
+      <w:r>
+        <w:rPr>
+          <w:rFonts w:ascii="Arial" w:cs="Arial" w:eastAsia="Arial" w:hAnsi="Arial"/>
+          <w:sz w:val="22"/>
+          <w:szCs w:val="22"/>
+        </w:rPr>
+        <w:t xml:space="preserve">Save the meeting. EspoCRM will sync it to Google Calendar automatically (sync may take a few minutes depending on sync frequency settings).</w:t>
+      </w:r>
+    </w:p>
+    <w:p>
+      <w:pPr>
+        <w:pStyle w:val="ListParagraph"/>
+        <w:numPr>
+          <w:ilvl w:val="0"/>
+          <w:numId w:val="3"/>
+        </w:numPr>
+        <w:spacing w:after="100"/>
+      </w:pPr>
+      <w:r>
+        <w:rPr>
+          <w:rFonts w:ascii="Arial" w:cs="Arial" w:eastAsia="Arial" w:hAnsi="Arial"/>
+          <w:sz w:val="22"/>
+          <w:szCs w:val="22"/>
+        </w:rPr>
+        <w:t xml:space="preserve">Open the event in Google Calendar to find the Meet link. Attendees listed on the EspoCRM meeting will receive a calendar invitation with the Meet link included.</w:t>
+      </w:r>
+    </w:p>
+    <w:p>
+      <w:r>
+        <w:t xml:space="preserve"/>
+      </w:r>
+    </w:p>
+    <w:tbl>
+      <w:tblPr>
+        <w:tblW w:type="dxa" w:w="9360"/>
+        <w:tblBorders>
+          <w:top w:val="single" w:color="auto" w:sz="4"/>
+          <w:left w:val="single" w:color="auto" w:sz="4"/>
+          <w:bottom w:val="single" w:color="auto" w:sz="4"/>
+          <w:right w:val="single" w:color="auto" w:sz="4"/>
+          <w:insideH w:val="single" w:color="auto" w:sz="4"/>
+          <w:insideV w:val="single" w:color="auto" w:sz="4"/>
+        </w:tblBorders>
+      </w:tblPr>
+      <w:tblGrid>
+        <w:gridCol w:w="9360"/>
+      </w:tblGrid>
+      <w:tr>
+        <w:tc>
+          <w:tcPr>
+            <w:tcW w:type="dxa" w:w="9360"/>
+            <w:tcBorders>
+              <w:top w:val="single" w:color="FFC107" w:sz="4"/>
+              <w:left w:val="single" w:color="FFC107" w:sz="4"/>
+              <w:bottom w:val="single" w:color="FFC107" w:sz="4"/>
+              <w:right w:val="single" w:color="FFC107" w:sz="4"/>
+            </w:tcBorders>
+            <w:shd w:fill="FFF3CD" w:val="clear"/>
+            <w:tcMar>
+              <w:top w:type="dxa" w:w="100"/>
+              <w:left w:type="dxa" w:w="160"/>
+              <w:bottom w:type="dxa" w:w="100"/>
+              <w:right w:type="dxa" w:w="160"/>
+            </w:tcMar>
+          </w:tcPr>
+          <w:p>
+            <w:r>
+              <w:rPr>
+                <w:rFonts w:ascii="Arial" w:cs="Arial" w:eastAsia="Arial" w:hAnsi="Arial"/>
+                <w:b/>
+                <w:bCs/>
+                <w:sz w:val="22"/>
+                <w:szCs w:val="22"/>
+              </w:rPr>
+              <w:t xml:space="preserve">Note: </w:t>
+            </w:r>
+            <w:r>
+              <w:rPr>
+                <w:rFonts w:ascii="Arial" w:cs="Arial" w:eastAsia="Arial" w:hAnsi="Arial"/>
+                <w:sz w:val="22"/>
+                <w:szCs w:val="22"/>
+              </w:rPr>
+              <w:t xml:space="preserve">Sync frequency is controlled by the Google Calendar sync configuration. If the Meet link does not appear immediately, wait a few minutes and refresh the Google Calendar event.</w:t>
+            </w:r>
+          </w:p>
+        </w:tc>
+      </w:tr>
+    </w:tbl>
+    <w:p>
+      <w:r>
+        <w:t xml:space="preserve"/>
+      </w:r>
+    </w:p>
+    <w:p>
+      <w:pPr>
+        <w:pStyle w:val="Heading1"/>
+      </w:pPr>
+      <w:r>
+        <w:rPr>
+          <w:rFonts w:ascii="Arial" w:cs="Arial" w:eastAsia="Arial" w:hAnsi="Arial"/>
+          <w:b/>
+          <w:bCs/>
+          <w:color w:val="2E75B6"/>
+          <w:sz w:val="32"/>
+          <w:szCs w:val="32"/>
+        </w:rPr>
+        <w:t xml:space="preserve">Questions for Research</w:t>
+      </w:r>
+    </w:p>
+    <w:p>
+      <w:r>
+        <w:t xml:space="preserve"/>
+      </w:r>
+    </w:p>
+    <w:p>
+      <w:pPr>
+        <w:spacing w:after="120"/>
+      </w:pPr>
+      <w:r>
+        <w:rPr>
+          <w:rFonts w:ascii="Arial" w:cs="Arial" w:eastAsia="Arial" w:hAnsi="Arial"/>
+          <w:sz w:val="22"/>
+          <w:szCs w:val="22"/>
+        </w:rPr>
+        <w:t xml:space="preserve">The following questions arose during configuration and require further research before they can be documented as How To steps.</w:t>
+      </w:r>
+    </w:p>
+    <w:p>
+      <w:r>
+        <w:t xml:space="preserve"/>
       </w:r>
     </w:p>
     <w:p>
@@ -6579,7 +7164,7 @@
           <w:sz w:val="22"/>
           <w:szCs w:val="22"/>
         </w:rPr>
-        <w:t xml:space="preserve">How to prevent users from using the Remove function in relationship panels — Remove permanently deletes the linked record entirely. Regular users should not have this ability. The exact Role permission that controls this needs to be identified and documented.</w:t>
+        <w:t xml:space="preserve">How to get filters to show up in the Create Relationship filter dropdown — the Select Filter field in the Add Relationship dialog only shows metadata-level filters, not user-created saved searches. The correct approach for defining custom filters at the metadata level needs to be identified and documented.</w:t>
       </w:r>
     </w:p>
     <w:p>
@@ -6597,7 +7182,61 @@
           <w:sz w:val="22"/>
           <w:szCs w:val="22"/>
         </w:rPr>
-        <w:t xml:space="preserve">How to integrate Google Meet with EspoCRM meetings — EspoCRM has Google Calendar integration, and Google Meet links are typically generated as part of a Google Calendar event. The exact path for creating an EspoCRM meeting that automatically generates a Meet link, and whether that link is surfaced back in the CRM record, needs to be identified and documented.</w:t>
+        <w:t xml:space="preserve">How to create a system-level saved search (shared view) — when saving a search/filter in EspoCRM, the path for making it available to all users rather than just the creator needs to be identified and documented.</w:t>
+      </w:r>
+    </w:p>
+    <w:p>
+      <w:pPr>
+        <w:pStyle w:val="ListParagraph"/>
+        <w:numPr>
+          <w:ilvl w:val="0"/>
+          <w:numId w:val="2"/>
+        </w:numPr>
+        <w:spacing w:after="80"/>
+      </w:pPr>
+      <w:r>
+        <w:rPr>
+          <w:rFonts w:ascii="Arial" w:cs="Arial" w:eastAsia="Arial" w:hAnsi="Arial"/>
+          <w:sz w:val="22"/>
+          <w:szCs w:val="22"/>
+        </w:rPr>
+        <w:t xml:space="preserve">How to filter by the current logged-in user — whether EspoCRM supports a dynamic 'Me' or 'Current User' token in search filters, and if so how to use it for a link field such as Assigned Mentor, in order to support a 'My Engagements' view that automatically scopes to whoever is logged in.</w:t>
+      </w:r>
+    </w:p>
+    <w:p>
+      <w:pPr>
+        <w:pStyle w:val="ListParagraph"/>
+        <w:numPr>
+          <w:ilvl w:val="0"/>
+          <w:numId w:val="2"/>
+        </w:numPr>
+        <w:spacing w:after="80"/>
+      </w:pPr>
+      <w:r>
+        <w:rPr>
+          <w:rFonts w:ascii="Arial" w:cs="Arial" w:eastAsia="Arial" w:hAnsi="Arial"/>
+          <w:sz w:val="22"/>
+          <w:szCs w:val="22"/>
+        </w:rPr>
+        <w:t xml:space="preserve">How to prevent users from using the Remove function in relationship panels — Remove permanently deletes the linked record entirely. Regular users should not have this ability. The exact Role permission that controls this needs to be identified and documented.</w:t>
+      </w:r>
+    </w:p>
+    <w:p>
+      <w:pPr>
+        <w:pStyle w:val="ListParagraph"/>
+        <w:numPr>
+          <w:ilvl w:val="0"/>
+          <w:numId w:val="2"/>
+        </w:numPr>
+        <w:spacing w:after="80"/>
+      </w:pPr>
+      <w:r>
+        <w:rPr>
+          <w:rFonts w:ascii="Arial" w:cs="Arial" w:eastAsia="Arial" w:hAnsi="Arial"/>
+          <w:sz w:val="22"/>
+          <w:szCs w:val="22"/>
+        </w:rPr>
+        <w:t xml:space="preserve">How to prevent users from using the Unlink function in relationship panels — Unlink removes the association between two records without deleting either record. Whether this should be restricted for regular users, and the Role permission that controls it, needs to be identified and documented.</w:t>
       </w:r>
     </w:p>
     <w:p>

</xml_diff>

<commit_message>
Update CBM-EspoCRM-HowTo.docx - add email panel research question
</commit_message>
<xml_diff>
--- a/PRDs/CBM-EspoCRM-HowTo.docx
+++ b/PRDs/CBM-EspoCRM-HowTo.docx
@@ -7237,6 +7237,24 @@
           <w:szCs w:val="22"/>
         </w:rPr>
         <w:t xml:space="preserve">How to prevent users from using the Unlink function in relationship panels — Unlink removes the association between two records without deleting either record. Whether this should be restricted for regular users, and the Role permission that controls it, needs to be identified and documented.</w:t>
+      </w:r>
+    </w:p>
+    <w:p>
+      <w:pPr>
+        <w:pStyle w:val="ListParagraph"/>
+        <w:numPr>
+          <w:ilvl w:val="0"/>
+          <w:numId w:val="2"/>
+        </w:numPr>
+        <w:spacing w:after="80"/>
+      </w:pPr>
+      <w:r>
+        <w:rPr>
+          <w:rFonts w:ascii="Arial" w:cs="Arial" w:eastAsia="Arial" w:hAnsi="Arial"/>
+          <w:sz w:val="22"/>
+          <w:szCs w:val="22"/>
+        </w:rPr>
+        <w:t xml:space="preserve">How to show all emails sent to a contact on their Contact detail page — there is no Emails panel available in the Contact entity's Bottom Panels layout, suggesting email display is handled through a different mechanism such as email archiving or the activity stream. The correct configuration path needs to be identified and documented.</w:t>
       </w:r>
     </w:p>
     <w:p>

</xml_diff>

<commit_message>
Update CBM-EspoCRM-HowTo.docx - add Email Configuration section
</commit_message>
<xml_diff>
--- a/PRDs/CBM-EspoCRM-HowTo.docx
+++ b/PRDs/CBM-EspoCRM-HowTo.docx
@@ -6156,6 +6156,1492 @@
     <w:p>
       <w:r>
         <w:t xml:space="preserve"/>
+      </w:r>
+    </w:p>
+    <w:p>
+      <w:r>
+        <w:t xml:space="preserve"/>
+      </w:r>
+    </w:p>
+    <w:p>
+      <w:pPr>
+        <w:pStyle w:val="Heading1"/>
+      </w:pPr>
+      <w:r>
+        <w:rPr>
+          <w:rFonts w:ascii="Arial" w:cs="Arial" w:eastAsia="Arial" w:hAnsi="Arial"/>
+          <w:b/>
+          <w:bCs/>
+          <w:color w:val="2E75B6"/>
+          <w:sz w:val="32"/>
+          <w:szCs w:val="32"/>
+        </w:rPr>
+        <w:t xml:space="preserve">Email Configuration</w:t>
+      </w:r>
+    </w:p>
+    <w:p>
+      <w:r>
+        <w:t xml:space="preserve"/>
+      </w:r>
+    </w:p>
+    <w:p>
+      <w:pPr>
+        <w:spacing w:after="120"/>
+      </w:pPr>
+      <w:r>
+        <w:rPr>
+          <w:rFonts w:ascii="Arial" w:cs="Arial" w:eastAsia="Arial" w:hAnsi="Arial"/>
+          <w:sz w:val="22"/>
+          <w:szCs w:val="22"/>
+        </w:rPr>
+        <w:t xml:space="preserve">EspoCRM includes a full-featured email system that serves as a central hub where emails from multiple accounts are gathered and linked to CRM records. It is not a personal email client replacement, but rather a shared communications layer that connects email activity to contacts, accounts, engagements, and other records.</w:t>
+      </w:r>
+    </w:p>
+    <w:p>
+      <w:r>
+        <w:t xml:space="preserve"/>
+      </w:r>
+    </w:p>
+    <w:p>
+      <w:pPr>
+        <w:pStyle w:val="Heading2"/>
+      </w:pPr>
+      <w:r>
+        <w:rPr>
+          <w:rFonts w:ascii="Arial" w:cs="Arial" w:eastAsia="Arial" w:hAnsi="Arial"/>
+          <w:b/>
+          <w:bCs/>
+          <w:color w:val="2E75B6"/>
+          <w:sz w:val="26"/>
+          <w:szCs w:val="26"/>
+        </w:rPr>
+        <w:t xml:space="preserve">5. Understanding How EspoCRM Handles Email</w:t>
+      </w:r>
+    </w:p>
+    <w:p>
+      <w:r>
+        <w:t xml:space="preserve"/>
+      </w:r>
+    </w:p>
+    <w:p>
+      <w:pPr>
+        <w:pStyle w:val="Heading3"/>
+      </w:pPr>
+      <w:r>
+        <w:rPr>
+          <w:rFonts w:ascii="Arial" w:cs="Arial" w:eastAsia="Arial" w:hAnsi="Arial"/>
+          <w:b/>
+          <w:bCs/>
+          <w:color w:val="595959"/>
+          <w:sz w:val="24"/>
+          <w:szCs w:val="24"/>
+        </w:rPr>
+        <w:t xml:space="preserve">5.1 Core Concept</w:t>
+      </w:r>
+    </w:p>
+    <w:p>
+      <w:pPr>
+        <w:spacing w:after="120"/>
+      </w:pPr>
+      <w:r>
+        <w:rPr>
+          <w:rFonts w:ascii="Arial" w:cs="Arial" w:eastAsia="Arial" w:hAnsi="Arial"/>
+          <w:sz w:val="22"/>
+          <w:szCs w:val="22"/>
+        </w:rPr>
+        <w:t xml:space="preserve">Unlike a personal email client, EspoCRM is designed so that the same email record can appear in the inboxes of multiple users — for example, when multiple users were recipients of the same message. When the same email is fetched from multiple email accounts, only one email record is stored in EspoCRM, identified by its Message-ID to prevent duplicates.</w:t>
+      </w:r>
+    </w:p>
+    <w:p>
+      <w:r>
+        <w:t xml:space="preserve"/>
+      </w:r>
+    </w:p>
+    <w:p>
+      <w:pPr>
+        <w:spacing w:after="120"/>
+      </w:pPr>
+      <w:r>
+        <w:rPr>
+          <w:rFonts w:ascii="Arial" w:cs="Arial" w:eastAsia="Arial" w:hAnsi="Arial"/>
+          <w:sz w:val="22"/>
+          <w:szCs w:val="22"/>
+        </w:rPr>
+        <w:t xml:space="preserve">Emails are fetched automatically by the system in the background every few minutes. The fetch interval can be configured by the administrator.</w:t>
+      </w:r>
+    </w:p>
+    <w:p>
+      <w:r>
+        <w:t xml:space="preserve"/>
+      </w:r>
+    </w:p>
+    <w:p>
+      <w:pPr>
+        <w:spacing w:after="120"/>
+      </w:pPr>
+      <w:r>
+        <w:rPr>
+          <w:rFonts w:ascii="Arial" w:cs="Arial" w:eastAsia="Arial" w:hAnsi="Arial"/>
+          <w:sz w:val="22"/>
+          <w:szCs w:val="22"/>
+        </w:rPr>
+        <w:t xml:space="preserve">A user with sufficient permissions can see emails that were not addressed directly to them, which allows administrators to monitor team communications where needed.</w:t>
+      </w:r>
+    </w:p>
+    <w:p>
+      <w:r>
+        <w:t xml:space="preserve"/>
+      </w:r>
+    </w:p>
+    <w:p>
+      <w:pPr>
+        <w:pStyle w:val="Heading3"/>
+      </w:pPr>
+      <w:r>
+        <w:rPr>
+          <w:rFonts w:ascii="Arial" w:cs="Arial" w:eastAsia="Arial" w:hAnsi="Arial"/>
+          <w:b/>
+          <w:bCs/>
+          <w:color w:val="595959"/>
+          <w:sz w:val="24"/>
+          <w:szCs w:val="24"/>
+        </w:rPr>
+        <w:t xml:space="preserve">5.2 Email Status Values</w:t>
+      </w:r>
+    </w:p>
+    <w:p>
+      <w:pPr>
+        <w:spacing w:after="120"/>
+      </w:pPr>
+      <w:r>
+        <w:rPr>
+          <w:rFonts w:ascii="Arial" w:cs="Arial" w:eastAsia="Arial" w:hAnsi="Arial"/>
+          <w:sz w:val="22"/>
+          <w:szCs w:val="22"/>
+        </w:rPr>
+        <w:t xml:space="preserve">Each email record in EspoCRM has a Status field with one of the following values:</w:t>
+      </w:r>
+    </w:p>
+    <w:p>
+      <w:r>
+        <w:t xml:space="preserve"/>
+      </w:r>
+    </w:p>
+    <w:p>
+      <w:pPr>
+        <w:pStyle w:val="ListParagraph"/>
+        <w:numPr>
+          <w:ilvl w:val="0"/>
+          <w:numId w:val="2"/>
+        </w:numPr>
+        <w:spacing w:after="80"/>
+      </w:pPr>
+      <w:r>
+        <w:rPr>
+          <w:rFonts w:ascii="Arial" w:cs="Arial" w:eastAsia="Arial" w:hAnsi="Arial"/>
+          <w:sz w:val="22"/>
+          <w:szCs w:val="22"/>
+        </w:rPr>
+        <w:t xml:space="preserve">Sent — the email was composed and sent from within EspoCRM.</w:t>
+      </w:r>
+    </w:p>
+    <w:p>
+      <w:pPr>
+        <w:pStyle w:val="ListParagraph"/>
+        <w:numPr>
+          <w:ilvl w:val="0"/>
+          <w:numId w:val="2"/>
+        </w:numPr>
+        <w:spacing w:after="80"/>
+      </w:pPr>
+      <w:r>
+        <w:rPr>
+          <w:rFonts w:ascii="Arial" w:cs="Arial" w:eastAsia="Arial" w:hAnsi="Arial"/>
+          <w:sz w:val="22"/>
+          <w:szCs w:val="22"/>
+        </w:rPr>
+        <w:t xml:space="preserve">Imported — the email was fetched from an IMAP account or imported manually.</w:t>
+      </w:r>
+    </w:p>
+    <w:p>
+      <w:pPr>
+        <w:pStyle w:val="ListParagraph"/>
+        <w:numPr>
+          <w:ilvl w:val="0"/>
+          <w:numId w:val="2"/>
+        </w:numPr>
+        <w:spacing w:after="80"/>
+      </w:pPr>
+      <w:r>
+        <w:rPr>
+          <w:rFonts w:ascii="Arial" w:cs="Arial" w:eastAsia="Arial" w:hAnsi="Arial"/>
+          <w:sz w:val="22"/>
+          <w:szCs w:val="22"/>
+        </w:rPr>
+        <w:t xml:space="preserve">Draft — the email was composed but not yet sent.</w:t>
+      </w:r>
+    </w:p>
+    <w:p>
+      <w:r>
+        <w:t xml:space="preserve"/>
+      </w:r>
+    </w:p>
+    <w:p>
+      <w:pPr>
+        <w:pStyle w:val="Heading3"/>
+      </w:pPr>
+      <w:r>
+        <w:rPr>
+          <w:rFonts w:ascii="Arial" w:cs="Arial" w:eastAsia="Arial" w:hAnsi="Arial"/>
+          <w:b/>
+          <w:bCs/>
+          <w:color w:val="595959"/>
+          <w:sz w:val="24"/>
+          <w:szCs w:val="24"/>
+        </w:rPr>
+        <w:t xml:space="preserve">5.3 How Emails Are Linked to Records</w:t>
+      </w:r>
+    </w:p>
+    <w:p>
+      <w:pPr>
+        <w:spacing w:after="120"/>
+      </w:pPr>
+      <w:r>
+        <w:rPr>
+          <w:rFonts w:ascii="Arial" w:cs="Arial" w:eastAsia="Arial" w:hAnsi="Arial"/>
+          <w:sz w:val="22"/>
+          <w:szCs w:val="22"/>
+        </w:rPr>
+        <w:t xml:space="preserve">When a new email arrives, EspoCRM attempts to automatically recognize which record it belongs to and link it accordingly. It can link to Accounts, Contacts, Leads, Opportunities, Cases, and other entities based on matching email addresses.</w:t>
+      </w:r>
+    </w:p>
+    <w:p>
+      <w:r>
+        <w:t xml:space="preserve"/>
+      </w:r>
+    </w:p>
+    <w:p>
+      <w:pPr>
+        <w:spacing w:after="120"/>
+      </w:pPr>
+      <w:r>
+        <w:rPr>
+          <w:rFonts w:ascii="Arial" w:cs="Arial" w:eastAsia="Arial" w:hAnsi="Arial"/>
+          <w:sz w:val="22"/>
+          <w:szCs w:val="22"/>
+        </w:rPr>
+        <w:t xml:space="preserve">If the system cannot automatically link an email, the user can link it manually by filling in the Parent field on the email record.</w:t>
+      </w:r>
+    </w:p>
+    <w:p>
+      <w:r>
+        <w:t xml:space="preserve"/>
+      </w:r>
+    </w:p>
+    <w:p>
+      <w:pPr>
+        <w:spacing w:after="120"/>
+      </w:pPr>
+      <w:r>
+        <w:rPr>
+          <w:rFonts w:ascii="Arial" w:cs="Arial" w:eastAsia="Arial" w:hAnsi="Arial"/>
+          <w:sz w:val="22"/>
+          <w:szCs w:val="22"/>
+        </w:rPr>
+        <w:t xml:space="preserve">All emails linked to a specific record are shown in the History panel of that record. If an email is linked to a related record (for example, an email linked to an Engagement that is itself linked to an Account), the email will appear in the History panel of both records.</w:t>
+      </w:r>
+    </w:p>
+    <w:p>
+      <w:r>
+        <w:t xml:space="preserve"/>
+      </w:r>
+    </w:p>
+    <w:tbl>
+      <w:tblPr>
+        <w:tblW w:type="dxa" w:w="9360"/>
+        <w:tblBorders>
+          <w:top w:val="single" w:color="auto" w:sz="4"/>
+          <w:left w:val="single" w:color="auto" w:sz="4"/>
+          <w:bottom w:val="single" w:color="auto" w:sz="4"/>
+          <w:right w:val="single" w:color="auto" w:sz="4"/>
+          <w:insideH w:val="single" w:color="auto" w:sz="4"/>
+          <w:insideV w:val="single" w:color="auto" w:sz="4"/>
+        </w:tblBorders>
+      </w:tblPr>
+      <w:tblGrid>
+        <w:gridCol w:w="9360"/>
+      </w:tblGrid>
+      <w:tr>
+        <w:tc>
+          <w:tcPr>
+            <w:tcW w:type="dxa" w:w="9360"/>
+            <w:tcBorders>
+              <w:top w:val="single" w:color="FFC107" w:sz="4"/>
+              <w:left w:val="single" w:color="FFC107" w:sz="4"/>
+              <w:bottom w:val="single" w:color="FFC107" w:sz="4"/>
+              <w:right w:val="single" w:color="FFC107" w:sz="4"/>
+            </w:tcBorders>
+            <w:shd w:fill="FFF3CD" w:val="clear"/>
+            <w:tcMar>
+              <w:top w:type="dxa" w:w="100"/>
+              <w:left w:type="dxa" w:w="160"/>
+              <w:bottom w:type="dxa" w:w="100"/>
+              <w:right w:type="dxa" w:w="160"/>
+            </w:tcMar>
+          </w:tcPr>
+          <w:p>
+            <w:r>
+              <w:rPr>
+                <w:rFonts w:ascii="Arial" w:cs="Arial" w:eastAsia="Arial" w:hAnsi="Arial"/>
+                <w:b/>
+                <w:bCs/>
+                <w:sz w:val="22"/>
+                <w:szCs w:val="22"/>
+              </w:rPr>
+              <w:t xml:space="preserve">Note: </w:t>
+            </w:r>
+            <w:r>
+              <w:rPr>
+                <w:rFonts w:ascii="Arial" w:cs="Arial" w:eastAsia="Arial" w:hAnsi="Arial"/>
+                <w:sz w:val="22"/>
+                <w:szCs w:val="22"/>
+              </w:rPr>
+              <w:t xml:space="preserve">If an email comes from a new potential contact, the user can convert it to a Lead from the top-right menu of the email record. It is also possible to create a Task or Case directly from an email record using the same menu.</w:t>
+            </w:r>
+          </w:p>
+        </w:tc>
+      </w:tr>
+    </w:tbl>
+    <w:p>
+      <w:r>
+        <w:t xml:space="preserve"/>
+      </w:r>
+    </w:p>
+    <w:p>
+      <w:pPr>
+        <w:pStyle w:val="Heading2"/>
+      </w:pPr>
+      <w:r>
+        <w:rPr>
+          <w:rFonts w:ascii="Arial" w:cs="Arial" w:eastAsia="Arial" w:hAnsi="Arial"/>
+          <w:b/>
+          <w:bCs/>
+          <w:color w:val="2E75B6"/>
+          <w:sz w:val="26"/>
+          <w:szCs w:val="26"/>
+        </w:rPr>
+        <w:t xml:space="preserve">6. The Emails List View</w:t>
+      </w:r>
+    </w:p>
+    <w:p>
+      <w:r>
+        <w:t xml:space="preserve"/>
+      </w:r>
+    </w:p>
+    <w:p>
+      <w:pPr>
+        <w:pStyle w:val="Heading3"/>
+      </w:pPr>
+      <w:r>
+        <w:rPr>
+          <w:rFonts w:ascii="Arial" w:cs="Arial" w:eastAsia="Arial" w:hAnsi="Arial"/>
+          <w:b/>
+          <w:bCs/>
+          <w:color w:val="595959"/>
+          <w:sz w:val="24"/>
+          <w:szCs w:val="24"/>
+        </w:rPr>
+        <w:t xml:space="preserve">6.1 Default Folders</w:t>
+      </w:r>
+    </w:p>
+    <w:p>
+      <w:pPr>
+        <w:spacing w:after="120"/>
+      </w:pPr>
+      <w:r>
+        <w:rPr>
+          <w:rFonts w:ascii="Arial" w:cs="Arial" w:eastAsia="Arial" w:hAnsi="Arial"/>
+          <w:sz w:val="22"/>
+          <w:szCs w:val="22"/>
+        </w:rPr>
+        <w:t xml:space="preserve">The Emails list view is accessed via the Emails tab in the navigation. The following default folders are available to all users:</w:t>
+      </w:r>
+    </w:p>
+    <w:p>
+      <w:r>
+        <w:t xml:space="preserve"/>
+      </w:r>
+    </w:p>
+    <w:p>
+      <w:pPr>
+        <w:pStyle w:val="ListParagraph"/>
+        <w:numPr>
+          <w:ilvl w:val="0"/>
+          <w:numId w:val="2"/>
+        </w:numPr>
+        <w:spacing w:after="80"/>
+      </w:pPr>
+      <w:r>
+        <w:rPr>
+          <w:rFonts w:ascii="Arial" w:cs="Arial" w:eastAsia="Arial" w:hAnsi="Arial"/>
+          <w:sz w:val="22"/>
+          <w:szCs w:val="22"/>
+        </w:rPr>
+        <w:t xml:space="preserve">All — all emails in the system the user has access to, including emails belonging to other users if Roles permit.</w:t>
+      </w:r>
+    </w:p>
+    <w:p>
+      <w:pPr>
+        <w:pStyle w:val="ListParagraph"/>
+        <w:numPr>
+          <w:ilvl w:val="0"/>
+          <w:numId w:val="2"/>
+        </w:numPr>
+        <w:spacing w:after="80"/>
+      </w:pPr>
+      <w:r>
+        <w:rPr>
+          <w:rFonts w:ascii="Arial" w:cs="Arial" w:eastAsia="Arial" w:hAnsi="Arial"/>
+          <w:sz w:val="22"/>
+          <w:szCs w:val="22"/>
+        </w:rPr>
+        <w:t xml:space="preserve">Inbox — incoming emails addressed to the user are automatically placed here.</w:t>
+      </w:r>
+    </w:p>
+    <w:p>
+      <w:pPr>
+        <w:pStyle w:val="ListParagraph"/>
+        <w:numPr>
+          <w:ilvl w:val="0"/>
+          <w:numId w:val="2"/>
+        </w:numPr>
+        <w:spacing w:after="80"/>
+      </w:pPr>
+      <w:r>
+        <w:rPr>
+          <w:rFonts w:ascii="Arial" w:cs="Arial" w:eastAsia="Arial" w:hAnsi="Arial"/>
+          <w:sz w:val="22"/>
+          <w:szCs w:val="22"/>
+        </w:rPr>
+        <w:t xml:space="preserve">Sent — emails sent by the user from within EspoCRM.</w:t>
+      </w:r>
+    </w:p>
+    <w:p>
+      <w:pPr>
+        <w:pStyle w:val="ListParagraph"/>
+        <w:numPr>
+          <w:ilvl w:val="0"/>
+          <w:numId w:val="2"/>
+        </w:numPr>
+        <w:spacing w:after="80"/>
+      </w:pPr>
+      <w:r>
+        <w:rPr>
+          <w:rFonts w:ascii="Arial" w:cs="Arial" w:eastAsia="Arial" w:hAnsi="Arial"/>
+          <w:sz w:val="22"/>
+          <w:szCs w:val="22"/>
+        </w:rPr>
+        <w:t xml:space="preserve">Draft — emails composed but not yet sent.</w:t>
+      </w:r>
+    </w:p>
+    <w:p>
+      <w:pPr>
+        <w:pStyle w:val="ListParagraph"/>
+        <w:numPr>
+          <w:ilvl w:val="0"/>
+          <w:numId w:val="2"/>
+        </w:numPr>
+        <w:spacing w:after="80"/>
+      </w:pPr>
+      <w:r>
+        <w:rPr>
+          <w:rFonts w:ascii="Arial" w:cs="Arial" w:eastAsia="Arial" w:hAnsi="Arial"/>
+          <w:sz w:val="22"/>
+          <w:szCs w:val="22"/>
+        </w:rPr>
+        <w:t xml:space="preserve">Archive — inbox emails that the user has explicitly moved to the Archive.</w:t>
+      </w:r>
+    </w:p>
+    <w:p>
+      <w:pPr>
+        <w:pStyle w:val="ListParagraph"/>
+        <w:numPr>
+          <w:ilvl w:val="0"/>
+          <w:numId w:val="2"/>
+        </w:numPr>
+        <w:spacing w:after="80"/>
+      </w:pPr>
+      <w:r>
+        <w:rPr>
+          <w:rFonts w:ascii="Arial" w:cs="Arial" w:eastAsia="Arial" w:hAnsi="Arial"/>
+          <w:sz w:val="22"/>
+          <w:szCs w:val="22"/>
+        </w:rPr>
+        <w:t xml:space="preserve">Trash — inbox emails that the user has explicitly moved to the Trash.</w:t>
+      </w:r>
+    </w:p>
+    <w:p>
+      <w:r>
+        <w:t xml:space="preserve"/>
+      </w:r>
+    </w:p>
+    <w:p>
+      <w:pPr>
+        <w:spacing w:after="120"/>
+      </w:pPr>
+      <w:r>
+        <w:rPr>
+          <w:rFonts w:ascii="Arial" w:cs="Arial" w:eastAsia="Arial" w:hAnsi="Arial"/>
+          <w:sz w:val="22"/>
+          <w:szCs w:val="22"/>
+        </w:rPr>
+        <w:t xml:space="preserve">In addition to the default folders, personal Email Folders and Group Email Folders created by the user or administrator will also appear in the list.</w:t>
+      </w:r>
+    </w:p>
+    <w:p>
+      <w:r>
+        <w:t xml:space="preserve"/>
+      </w:r>
+    </w:p>
+    <w:p>
+      <w:pPr>
+        <w:pStyle w:val="Heading3"/>
+      </w:pPr>
+      <w:r>
+        <w:rPr>
+          <w:rFonts w:ascii="Arial" w:cs="Arial" w:eastAsia="Arial" w:hAnsi="Arial"/>
+          <w:b/>
+          <w:bCs/>
+          <w:color w:val="595959"/>
+          <w:sz w:val="24"/>
+          <w:szCs w:val="24"/>
+        </w:rPr>
+        <w:t xml:space="preserve">6.2 Inbox Behavior</w:t>
+      </w:r>
+    </w:p>
+    <w:p>
+      <w:pPr>
+        <w:spacing w:after="120"/>
+      </w:pPr>
+      <w:r>
+        <w:rPr>
+          <w:rFonts w:ascii="Arial" w:cs="Arial" w:eastAsia="Arial" w:hAnsi="Arial"/>
+          <w:sz w:val="22"/>
+          <w:szCs w:val="22"/>
+        </w:rPr>
+        <w:t xml:space="preserve">Only emails in the Inbox can be:</w:t>
+      </w:r>
+    </w:p>
+    <w:p>
+      <w:r>
+        <w:t xml:space="preserve"/>
+      </w:r>
+    </w:p>
+    <w:p>
+      <w:pPr>
+        <w:pStyle w:val="ListParagraph"/>
+        <w:numPr>
+          <w:ilvl w:val="0"/>
+          <w:numId w:val="2"/>
+        </w:numPr>
+        <w:spacing w:after="80"/>
+      </w:pPr>
+      <w:r>
+        <w:rPr>
+          <w:rFonts w:ascii="Arial" w:cs="Arial" w:eastAsia="Arial" w:hAnsi="Arial"/>
+          <w:sz w:val="22"/>
+          <w:szCs w:val="22"/>
+        </w:rPr>
+        <w:t xml:space="preserve">Moved to Archive, Trash, or a personal Email Folder by the user.</w:t>
+      </w:r>
+    </w:p>
+    <w:p>
+      <w:pPr>
+        <w:pStyle w:val="ListParagraph"/>
+        <w:numPr>
+          <w:ilvl w:val="0"/>
+          <w:numId w:val="2"/>
+        </w:numPr>
+        <w:spacing w:after="80"/>
+      </w:pPr>
+      <w:r>
+        <w:rPr>
+          <w:rFonts w:ascii="Arial" w:cs="Arial" w:eastAsia="Arial" w:hAnsi="Arial"/>
+          <w:sz w:val="22"/>
+          <w:szCs w:val="22"/>
+        </w:rPr>
+        <w:t xml:space="preserve">Marked as read, unread, or important by the user.</w:t>
+      </w:r>
+    </w:p>
+    <w:p>
+      <w:r>
+        <w:t xml:space="preserve"/>
+      </w:r>
+    </w:p>
+    <w:p>
+      <w:pPr>
+        <w:spacing w:after="120"/>
+      </w:pPr>
+      <w:r>
+        <w:rPr>
+          <w:rFonts w:ascii="Arial" w:cs="Arial" w:eastAsia="Arial" w:hAnsi="Arial"/>
+          <w:sz w:val="22"/>
+          <w:szCs w:val="22"/>
+        </w:rPr>
+        <w:t xml:space="preserve">The same email record can appear in the Inbox of multiple users simultaneously — for example, if multiple users were recipients of the same message.</w:t>
+      </w:r>
+    </w:p>
+    <w:p>
+      <w:r>
+        <w:t xml:space="preserve"/>
+      </w:r>
+    </w:p>
+    <w:tbl>
+      <w:tblPr>
+        <w:tblW w:type="dxa" w:w="9360"/>
+        <w:tblBorders>
+          <w:top w:val="single" w:color="auto" w:sz="4"/>
+          <w:left w:val="single" w:color="auto" w:sz="4"/>
+          <w:bottom w:val="single" w:color="auto" w:sz="4"/>
+          <w:right w:val="single" w:color="auto" w:sz="4"/>
+          <w:insideH w:val="single" w:color="auto" w:sz="4"/>
+          <w:insideV w:val="single" w:color="auto" w:sz="4"/>
+        </w:tblBorders>
+      </w:tblPr>
+      <w:tblGrid>
+        <w:gridCol w:w="9360"/>
+      </w:tblGrid>
+      <w:tr>
+        <w:tc>
+          <w:tcPr>
+            <w:tcW w:type="dxa" w:w="9360"/>
+            <w:tcBorders>
+              <w:top w:val="single" w:color="FFC107" w:sz="4"/>
+              <w:left w:val="single" w:color="FFC107" w:sz="4"/>
+              <w:bottom w:val="single" w:color="FFC107" w:sz="4"/>
+              <w:right w:val="single" w:color="FFC107" w:sz="4"/>
+            </w:tcBorders>
+            <w:shd w:fill="FFF3CD" w:val="clear"/>
+            <w:tcMar>
+              <w:top w:type="dxa" w:w="100"/>
+              <w:left w:type="dxa" w:w="160"/>
+              <w:bottom w:type="dxa" w:w="100"/>
+              <w:right w:type="dxa" w:w="160"/>
+            </w:tcMar>
+          </w:tcPr>
+          <w:p>
+            <w:r>
+              <w:rPr>
+                <w:rFonts w:ascii="Arial" w:cs="Arial" w:eastAsia="Arial" w:hAnsi="Arial"/>
+                <w:b/>
+                <w:bCs/>
+                <w:sz w:val="22"/>
+                <w:szCs w:val="22"/>
+              </w:rPr>
+              <w:t xml:space="preserve">Note: </w:t>
+            </w:r>
+            <w:r>
+              <w:rPr>
+                <w:rFonts w:ascii="Arial" w:cs="Arial" w:eastAsia="Arial" w:hAnsi="Arial"/>
+                <w:sz w:val="22"/>
+                <w:szCs w:val="22"/>
+              </w:rPr>
+              <w:t xml:space="preserve">When removing an email it is removed from the system entirely and will disappear from all inboxes. To avoid permanent deletion, use Move to Trash instead. Administrators can restrict delete access for users to prevent accidental email loss.</w:t>
+            </w:r>
+          </w:p>
+        </w:tc>
+      </w:tr>
+    </w:tbl>
+    <w:p>
+      <w:r>
+        <w:t xml:space="preserve"/>
+      </w:r>
+    </w:p>
+    <w:p>
+      <w:pPr>
+        <w:pStyle w:val="Heading3"/>
+      </w:pPr>
+      <w:r>
+        <w:rPr>
+          <w:rFonts w:ascii="Arial" w:cs="Arial" w:eastAsia="Arial" w:hAnsi="Arial"/>
+          <w:b/>
+          <w:bCs/>
+          <w:color w:val="595959"/>
+          <w:sz w:val="24"/>
+          <w:szCs w:val="24"/>
+        </w:rPr>
+        <w:t xml:space="preserve">6.3 Dragging Emails to Folders</w:t>
+      </w:r>
+    </w:p>
+    <w:p>
+      <w:pPr>
+        <w:spacing w:after="120"/>
+      </w:pPr>
+      <w:r>
+        <w:rPr>
+          <w:rFonts w:ascii="Arial" w:cs="Arial" w:eastAsia="Arial" w:hAnsi="Arial"/>
+          <w:sz w:val="22"/>
+          <w:szCs w:val="22"/>
+        </w:rPr>
+        <w:t xml:space="preserve">On the list view, emails can be moved between folders by dragging them by their subject link into the desired folder. This feature is available as of EspoCRM v7.3.</w:t>
+      </w:r>
+    </w:p>
+    <w:p>
+      <w:r>
+        <w:t xml:space="preserve"/>
+      </w:r>
+    </w:p>
+    <w:p>
+      <w:pPr>
+        <w:pStyle w:val="Heading2"/>
+      </w:pPr>
+      <w:r>
+        <w:rPr>
+          <w:rFonts w:ascii="Arial" w:cs="Arial" w:eastAsia="Arial" w:hAnsi="Arial"/>
+          <w:b/>
+          <w:bCs/>
+          <w:color w:val="2E75B6"/>
+          <w:sz w:val="26"/>
+          <w:szCs w:val="26"/>
+        </w:rPr>
+        <w:t xml:space="preserve">7. Sending Emails</w:t>
+      </w:r>
+    </w:p>
+    <w:p>
+      <w:r>
+        <w:t xml:space="preserve"/>
+      </w:r>
+    </w:p>
+    <w:p>
+      <w:pPr>
+        <w:pStyle w:val="Heading3"/>
+      </w:pPr>
+      <w:r>
+        <w:rPr>
+          <w:rFonts w:ascii="Arial" w:cs="Arial" w:eastAsia="Arial" w:hAnsi="Arial"/>
+          <w:b/>
+          <w:bCs/>
+          <w:color w:val="595959"/>
+          <w:sz w:val="24"/>
+          <w:szCs w:val="24"/>
+        </w:rPr>
+        <w:t xml:space="preserve">7.1 Ways to Compose an Email</w:t>
+      </w:r>
+    </w:p>
+    <w:p>
+      <w:pPr>
+        <w:spacing w:after="120"/>
+      </w:pPr>
+      <w:r>
+        <w:rPr>
+          <w:rFonts w:ascii="Arial" w:cs="Arial" w:eastAsia="Arial" w:hAnsi="Arial"/>
+          <w:sz w:val="22"/>
+          <w:szCs w:val="22"/>
+        </w:rPr>
+        <w:t xml:space="preserve">A new email can be composed in several ways:</w:t>
+      </w:r>
+    </w:p>
+    <w:p>
+      <w:r>
+        <w:t xml:space="preserve"/>
+      </w:r>
+    </w:p>
+    <w:p>
+      <w:pPr>
+        <w:pStyle w:val="ListParagraph"/>
+        <w:numPr>
+          <w:ilvl w:val="0"/>
+          <w:numId w:val="2"/>
+        </w:numPr>
+        <w:spacing w:after="80"/>
+      </w:pPr>
+      <w:r>
+        <w:rPr>
+          <w:rFonts w:ascii="Arial" w:cs="Arial" w:eastAsia="Arial" w:hAnsi="Arial"/>
+          <w:sz w:val="22"/>
+          <w:szCs w:val="22"/>
+        </w:rPr>
+        <w:t xml:space="preserve">Using the Compose Email button on the Emails list view.</w:t>
+      </w:r>
+    </w:p>
+    <w:p>
+      <w:pPr>
+        <w:pStyle w:val="ListParagraph"/>
+        <w:numPr>
+          <w:ilvl w:val="0"/>
+          <w:numId w:val="2"/>
+        </w:numPr>
+        <w:spacing w:after="80"/>
+      </w:pPr>
+      <w:r>
+        <w:rPr>
+          <w:rFonts w:ascii="Arial" w:cs="Arial" w:eastAsia="Arial" w:hAnsi="Arial"/>
+          <w:sz w:val="22"/>
+          <w:szCs w:val="22"/>
+        </w:rPr>
+        <w:t xml:space="preserve">Replying to an existing email.</w:t>
+      </w:r>
+    </w:p>
+    <w:p>
+      <w:pPr>
+        <w:pStyle w:val="ListParagraph"/>
+        <w:numPr>
+          <w:ilvl w:val="0"/>
+          <w:numId w:val="2"/>
+        </w:numPr>
+        <w:spacing w:after="80"/>
+      </w:pPr>
+      <w:r>
+        <w:rPr>
+          <w:rFonts w:ascii="Arial" w:cs="Arial" w:eastAsia="Arial" w:hAnsi="Arial"/>
+          <w:sz w:val="22"/>
+          <w:szCs w:val="22"/>
+        </w:rPr>
+        <w:t xml:space="preserve">Clicking on an email address displayed on any record (such as a Contact or Account).</w:t>
+      </w:r>
+    </w:p>
+    <w:p>
+      <w:pPr>
+        <w:pStyle w:val="ListParagraph"/>
+        <w:numPr>
+          <w:ilvl w:val="0"/>
+          <w:numId w:val="2"/>
+        </w:numPr>
+        <w:spacing w:after="80"/>
+      </w:pPr>
+      <w:r>
+        <w:rPr>
+          <w:rFonts w:ascii="Arial" w:cs="Arial" w:eastAsia="Arial" w:hAnsi="Arial"/>
+          <w:sz w:val="22"/>
+          <w:szCs w:val="22"/>
+        </w:rPr>
+        <w:t xml:space="preserve">Using the Compose Email action from the Activities panel on a record's detail view.</w:t>
+      </w:r>
+    </w:p>
+    <w:p>
+      <w:r>
+        <w:t xml:space="preserve"/>
+      </w:r>
+    </w:p>
+    <w:p>
+      <w:pPr>
+        <w:pStyle w:val="Heading3"/>
+      </w:pPr>
+      <w:r>
+        <w:rPr>
+          <w:rFonts w:ascii="Arial" w:cs="Arial" w:eastAsia="Arial" w:hAnsi="Arial"/>
+          <w:b/>
+          <w:bCs/>
+          <w:color w:val="595959"/>
+          <w:sz w:val="24"/>
+          <w:szCs w:val="24"/>
+        </w:rPr>
+        <w:t xml:space="preserve">7.2 Email Templates</w:t>
+      </w:r>
+    </w:p>
+    <w:p>
+      <w:pPr>
+        <w:spacing w:after="120"/>
+      </w:pPr>
+      <w:r>
+        <w:rPr>
+          <w:rFonts w:ascii="Arial" w:cs="Arial" w:eastAsia="Arial" w:hAnsi="Arial"/>
+          <w:sz w:val="22"/>
+          <w:szCs w:val="22"/>
+        </w:rPr>
+        <w:t xml:space="preserve">When composing an email, users can select a pre-defined template to populate the subject and body. Templates are managed separately and can be set up by an administrator for common communication types such as welcome messages, follow-ups, or status updates.</w:t>
+      </w:r>
+    </w:p>
+    <w:p>
+      <w:r>
+        <w:t xml:space="preserve"/>
+      </w:r>
+    </w:p>
+    <w:p>
+      <w:pPr>
+        <w:pStyle w:val="Heading3"/>
+      </w:pPr>
+      <w:r>
+        <w:rPr>
+          <w:rFonts w:ascii="Arial" w:cs="Arial" w:eastAsia="Arial" w:hAnsi="Arial"/>
+          <w:b/>
+          <w:bCs/>
+          <w:color w:val="595959"/>
+          <w:sz w:val="24"/>
+          <w:szCs w:val="24"/>
+        </w:rPr>
+        <w:t xml:space="preserve">7.3 Email Signature</w:t>
+      </w:r>
+    </w:p>
+    <w:p>
+      <w:pPr>
+        <w:spacing w:after="120"/>
+      </w:pPr>
+      <w:r>
+        <w:rPr>
+          <w:rFonts w:ascii="Arial" w:cs="Arial" w:eastAsia="Arial" w:hAnsi="Arial"/>
+          <w:sz w:val="22"/>
+          <w:szCs w:val="22"/>
+        </w:rPr>
+        <w:t xml:space="preserve">Each user can configure a personal email signature that will be automatically appended to all emails they compose. To set up a signature, go to: top-right avatar → Preferences → Email Signature.</w:t>
+      </w:r>
+    </w:p>
+    <w:p>
+      <w:r>
+        <w:t xml:space="preserve"/>
+      </w:r>
+    </w:p>
+    <w:p>
+      <w:pPr>
+        <w:pStyle w:val="Heading3"/>
+      </w:pPr>
+      <w:r>
+        <w:rPr>
+          <w:rFonts w:ascii="Arial" w:cs="Arial" w:eastAsia="Arial" w:hAnsi="Arial"/>
+          <w:b/>
+          <w:bCs/>
+          <w:color w:val="595959"/>
+          <w:sz w:val="24"/>
+          <w:szCs w:val="24"/>
+        </w:rPr>
+        <w:t xml:space="preserve">7.4 Scheduled Send</w:t>
+      </w:r>
+    </w:p>
+    <w:p>
+      <w:pPr>
+        <w:spacing w:after="120"/>
+      </w:pPr>
+      <w:r>
+        <w:rPr>
+          <w:rFonts w:ascii="Arial" w:cs="Arial" w:eastAsia="Arial" w:hAnsi="Arial"/>
+          <w:sz w:val="22"/>
+          <w:szCs w:val="22"/>
+        </w:rPr>
+        <w:t xml:space="preserve">When composing an email, it can be scheduled to be sent at a specific future time rather than immediately. The email is saved to Drafts and the scheduled time can be changed after saving. To schedule a send, use the dropdown menu next to the Send button when composing.</w:t>
+      </w:r>
+    </w:p>
+    <w:p>
+      <w:r>
+        <w:t xml:space="preserve"/>
+      </w:r>
+    </w:p>
+    <w:p>
+      <w:pPr>
+        <w:pStyle w:val="Heading3"/>
+      </w:pPr>
+      <w:r>
+        <w:rPr>
+          <w:rFonts w:ascii="Arial" w:cs="Arial" w:eastAsia="Arial" w:hAnsi="Arial"/>
+          <w:b/>
+          <w:bCs/>
+          <w:color w:val="595959"/>
+          <w:sz w:val="24"/>
+          <w:szCs w:val="24"/>
+        </w:rPr>
+        <w:t xml:space="preserve">7.5 Using an External Email Client</w:t>
+      </w:r>
+    </w:p>
+    <w:p>
+      <w:pPr>
+        <w:spacing w:after="120"/>
+      </w:pPr>
+      <w:r>
+        <w:rPr>
+          <w:rFonts w:ascii="Arial" w:cs="Arial" w:eastAsia="Arial" w:hAnsi="Arial"/>
+          <w:sz w:val="22"/>
+          <w:szCs w:val="22"/>
+        </w:rPr>
+        <w:t xml:space="preserve">If a user prefers to use their device's default email client instead of composing within EspoCRM, this can be enabled in their preferences. Go to: top-right avatar → Preferences → check Use an External Email Client.</w:t>
+      </w:r>
+    </w:p>
+    <w:p>
+      <w:r>
+        <w:t xml:space="preserve"/>
+      </w:r>
+    </w:p>
+    <w:p>
+      <w:pPr>
+        <w:pStyle w:val="Heading2"/>
+      </w:pPr>
+      <w:r>
+        <w:rPr>
+          <w:rFonts w:ascii="Arial" w:cs="Arial" w:eastAsia="Arial" w:hAnsi="Arial"/>
+          <w:b/>
+          <w:bCs/>
+          <w:color w:val="2E75B6"/>
+          <w:sz w:val="26"/>
+          <w:szCs w:val="26"/>
+        </w:rPr>
+        <w:t xml:space="preserve">8. Email Folders</w:t>
+      </w:r>
+    </w:p>
+    <w:p>
+      <w:r>
+        <w:t xml:space="preserve"/>
+      </w:r>
+    </w:p>
+    <w:p>
+      <w:pPr>
+        <w:pStyle w:val="Heading3"/>
+      </w:pPr>
+      <w:r>
+        <w:rPr>
+          <w:rFonts w:ascii="Arial" w:cs="Arial" w:eastAsia="Arial" w:hAnsi="Arial"/>
+          <w:b/>
+          <w:bCs/>
+          <w:color w:val="595959"/>
+          <w:sz w:val="24"/>
+          <w:szCs w:val="24"/>
+        </w:rPr>
+        <w:t xml:space="preserve">8.1 Personal Email Folders</w:t>
+      </w:r>
+    </w:p>
+    <w:p>
+      <w:pPr>
+        <w:spacing w:after="120"/>
+      </w:pPr>
+      <w:r>
+        <w:rPr>
+          <w:rFonts w:ascii="Arial" w:cs="Arial" w:eastAsia="Arial" w:hAnsi="Arial"/>
+          <w:sz w:val="22"/>
+          <w:szCs w:val="22"/>
+        </w:rPr>
+        <w:t xml:space="preserve">Users can create their own personal Email Folders to organize emails. To create or manage personal folders, go to: Emails list view → dropdown in the top-right corner → Folders.</w:t>
+      </w:r>
+    </w:p>
+    <w:p>
+      <w:r>
+        <w:t xml:space="preserve"/>
+      </w:r>
+    </w:p>
+    <w:p>
+      <w:pPr>
+        <w:spacing w:after="120"/>
+      </w:pPr>
+      <w:r>
+        <w:rPr>
+          <w:rFonts w:ascii="Arial" w:cs="Arial" w:eastAsia="Arial" w:hAnsi="Arial"/>
+          <w:sz w:val="22"/>
+          <w:szCs w:val="22"/>
+        </w:rPr>
+        <w:t xml:space="preserve">When creating a folder, the Skip Notification option can be enabled to suppress notifications for emails that are automatically routed to that folder.</w:t>
+      </w:r>
+    </w:p>
+    <w:p>
+      <w:r>
+        <w:t xml:space="preserve"/>
+      </w:r>
+    </w:p>
+    <w:tbl>
+      <w:tblPr>
+        <w:tblW w:type="dxa" w:w="9360"/>
+        <w:tblBorders>
+          <w:top w:val="single" w:color="auto" w:sz="4"/>
+          <w:left w:val="single" w:color="auto" w:sz="4"/>
+          <w:bottom w:val="single" w:color="auto" w:sz="4"/>
+          <w:right w:val="single" w:color="auto" w:sz="4"/>
+          <w:insideH w:val="single" w:color="auto" w:sz="4"/>
+          <w:insideV w:val="single" w:color="auto" w:sz="4"/>
+        </w:tblBorders>
+      </w:tblPr>
+      <w:tblGrid>
+        <w:gridCol w:w="9360"/>
+      </w:tblGrid>
+      <w:tr>
+        <w:tc>
+          <w:tcPr>
+            <w:tcW w:type="dxa" w:w="9360"/>
+            <w:tcBorders>
+              <w:top w:val="single" w:color="FFC107" w:sz="4"/>
+              <w:left w:val="single" w:color="FFC107" w:sz="4"/>
+              <w:bottom w:val="single" w:color="FFC107" w:sz="4"/>
+              <w:right w:val="single" w:color="FFC107" w:sz="4"/>
+            </w:tcBorders>
+            <w:shd w:fill="FFF3CD" w:val="clear"/>
+            <w:tcMar>
+              <w:top w:type="dxa" w:w="100"/>
+              <w:left w:type="dxa" w:w="160"/>
+              <w:bottom w:type="dxa" w:w="100"/>
+              <w:right w:type="dxa" w:w="160"/>
+            </w:tcMar>
+          </w:tcPr>
+          <w:p>
+            <w:r>
+              <w:rPr>
+                <w:rFonts w:ascii="Arial" w:cs="Arial" w:eastAsia="Arial" w:hAnsi="Arial"/>
+                <w:b/>
+                <w:bCs/>
+                <w:sz w:val="22"/>
+                <w:szCs w:val="22"/>
+              </w:rPr>
+              <w:t xml:space="preserve">Note: </w:t>
+            </w:r>
+            <w:r>
+              <w:rPr>
+                <w:rFonts w:ascii="Arial" w:cs="Arial" w:eastAsia="Arial" w:hAnsi="Arial"/>
+                <w:sz w:val="22"/>
+                <w:szCs w:val="22"/>
+              </w:rPr>
+              <w:t xml:space="preserve">Email folders in EspoCRM are not connected to IMAP folders. There is no two-way sync between EspoCRM folders and folders in an external email client or mail server.</w:t>
+            </w:r>
+          </w:p>
+        </w:tc>
+      </w:tr>
+    </w:tbl>
+    <w:p>
+      <w:r>
+        <w:t xml:space="preserve"/>
+      </w:r>
+    </w:p>
+    <w:p>
+      <w:pPr>
+        <w:pStyle w:val="Heading3"/>
+      </w:pPr>
+      <w:r>
+        <w:rPr>
+          <w:rFonts w:ascii="Arial" w:cs="Arial" w:eastAsia="Arial" w:hAnsi="Arial"/>
+          <w:b/>
+          <w:bCs/>
+          <w:color w:val="595959"/>
+          <w:sz w:val="24"/>
+          <w:szCs w:val="24"/>
+        </w:rPr>
+        <w:t xml:space="preserve">8.2 Group Email Folders</w:t>
+      </w:r>
+    </w:p>
+    <w:p>
+      <w:pPr>
+        <w:spacing w:after="120"/>
+      </w:pPr>
+      <w:r>
+        <w:rPr>
+          <w:rFonts w:ascii="Arial" w:cs="Arial" w:eastAsia="Arial" w:hAnsi="Arial"/>
+          <w:sz w:val="22"/>
+          <w:szCs w:val="22"/>
+        </w:rPr>
+        <w:t xml:space="preserve">Group Email Folders are shared folders accessible by teams. They are created by an administrator, who specifies which teams have access to each folder. Group folders appear alongside personal folders in the Emails list view for users who have access.</w:t>
+      </w:r>
+    </w:p>
+    <w:p>
+      <w:r>
+        <w:t xml:space="preserve"/>
+      </w:r>
+    </w:p>
+    <w:p>
+      <w:pPr>
+        <w:spacing w:after="120"/>
+      </w:pPr>
+      <w:r>
+        <w:rPr>
+          <w:rFonts w:ascii="Arial" w:cs="Arial" w:eastAsia="Arial" w:hAnsi="Arial"/>
+          <w:sz w:val="22"/>
+          <w:szCs w:val="22"/>
+        </w:rPr>
+        <w:t xml:space="preserve">Key behaviors for Group Email Folders:</w:t>
+      </w:r>
+    </w:p>
+    <w:p>
+      <w:r>
+        <w:t xml:space="preserve"/>
+      </w:r>
+    </w:p>
+    <w:p>
+      <w:pPr>
+        <w:pStyle w:val="ListParagraph"/>
+        <w:numPr>
+          <w:ilvl w:val="0"/>
+          <w:numId w:val="2"/>
+        </w:numPr>
+        <w:spacing w:after="80"/>
+      </w:pPr>
+      <w:r>
+        <w:rPr>
+          <w:rFonts w:ascii="Arial" w:cs="Arial" w:eastAsia="Arial" w:hAnsi="Arial"/>
+          <w:sz w:val="22"/>
+          <w:szCs w:val="22"/>
+        </w:rPr>
+        <w:t xml:space="preserve">Inbound emails from a group email account can be automatically routed to a specific group folder.</w:t>
+      </w:r>
+    </w:p>
+    <w:p>
+      <w:pPr>
+        <w:pStyle w:val="ListParagraph"/>
+        <w:numPr>
+          <w:ilvl w:val="0"/>
+          <w:numId w:val="2"/>
+        </w:numPr>
+        <w:spacing w:after="80"/>
+      </w:pPr>
+      <w:r>
+        <w:rPr>
+          <w:rFonts w:ascii="Arial" w:cs="Arial" w:eastAsia="Arial" w:hAnsi="Arial"/>
+          <w:sz w:val="22"/>
+          <w:szCs w:val="22"/>
+        </w:rPr>
+        <w:t xml:space="preserve">Emails matching an email filter can be automatically moved to a group folder.</w:t>
+      </w:r>
+    </w:p>
+    <w:p>
+      <w:pPr>
+        <w:pStyle w:val="ListParagraph"/>
+        <w:numPr>
+          <w:ilvl w:val="0"/>
+          <w:numId w:val="2"/>
+        </w:numPr>
+        <w:spacing w:after="80"/>
+      </w:pPr>
+      <w:r>
+        <w:rPr>
+          <w:rFonts w:ascii="Arial" w:cs="Arial" w:eastAsia="Arial" w:hAnsi="Arial"/>
+          <w:sz w:val="22"/>
+          <w:szCs w:val="22"/>
+        </w:rPr>
+        <w:t xml:space="preserve">If an email is moved from a group folder to a personal folder or the Inbox, it is unlinked from the group folder.</w:t>
+      </w:r>
+    </w:p>
+    <w:p>
+      <w:pPr>
+        <w:pStyle w:val="ListParagraph"/>
+        <w:numPr>
+          <w:ilvl w:val="0"/>
+          <w:numId w:val="2"/>
+        </w:numPr>
+        <w:spacing w:after="80"/>
+      </w:pPr>
+      <w:r>
+        <w:rPr>
+          <w:rFonts w:ascii="Arial" w:cs="Arial" w:eastAsia="Arial" w:hAnsi="Arial"/>
+          <w:sz w:val="22"/>
+          <w:szCs w:val="22"/>
+        </w:rPr>
+        <w:t xml:space="preserve">Users can only move emails to a group folder if they have edit access to that email.</w:t>
+      </w:r>
+    </w:p>
+    <w:p>
+      <w:pPr>
+        <w:pStyle w:val="ListParagraph"/>
+        <w:numPr>
+          <w:ilvl w:val="0"/>
+          <w:numId w:val="2"/>
+        </w:numPr>
+        <w:spacing w:after="80"/>
+      </w:pPr>
+      <w:r>
+        <w:rPr>
+          <w:rFonts w:ascii="Arial" w:cs="Arial" w:eastAsia="Arial" w:hAnsi="Arial"/>
+          <w:sz w:val="22"/>
+          <w:szCs w:val="22"/>
+        </w:rPr>
+        <w:t xml:space="preserve">Field-level security in Roles can be used to restrict the ability to change the group folder field on an email.</w:t>
+      </w:r>
+    </w:p>
+    <w:p>
+      <w:r>
+        <w:t xml:space="preserve"/>
+      </w:r>
+    </w:p>
+    <w:tbl>
+      <w:tblPr>
+        <w:tblW w:type="dxa" w:w="9360"/>
+        <w:tblBorders>
+          <w:top w:val="single" w:color="auto" w:sz="4"/>
+          <w:left w:val="single" w:color="auto" w:sz="4"/>
+          <w:bottom w:val="single" w:color="auto" w:sz="4"/>
+          <w:right w:val="single" w:color="auto" w:sz="4"/>
+          <w:insideH w:val="single" w:color="auto" w:sz="4"/>
+          <w:insideV w:val="single" w:color="auto" w:sz="4"/>
+        </w:tblBorders>
+      </w:tblPr>
+      <w:tblGrid>
+        <w:gridCol w:w="9360"/>
+      </w:tblGrid>
+      <w:tr>
+        <w:tc>
+          <w:tcPr>
+            <w:tcW w:type="dxa" w:w="9360"/>
+            <w:tcBorders>
+              <w:top w:val="single" w:color="FFC107" w:sz="4"/>
+              <w:left w:val="single" w:color="FFC107" w:sz="4"/>
+              <w:bottom w:val="single" w:color="FFC107" w:sz="4"/>
+              <w:right w:val="single" w:color="FFC107" w:sz="4"/>
+            </w:tcBorders>
+            <w:shd w:fill="FFF3CD" w:val="clear"/>
+            <w:tcMar>
+              <w:top w:type="dxa" w:w="100"/>
+              <w:left w:type="dxa" w:w="160"/>
+              <w:bottom w:type="dxa" w:w="100"/>
+              <w:right w:type="dxa" w:w="160"/>
+            </w:tcMar>
+          </w:tcPr>
+          <w:p>
+            <w:r>
+              <w:rPr>
+                <w:rFonts w:ascii="Arial" w:cs="Arial" w:eastAsia="Arial" w:hAnsi="Arial"/>
+                <w:b/>
+                <w:bCs/>
+                <w:sz w:val="22"/>
+                <w:szCs w:val="22"/>
+              </w:rPr>
+              <w:t xml:space="preserve">Note: </w:t>
+            </w:r>
+            <w:r>
+              <w:rPr>
+                <w:rFonts w:ascii="Arial" w:cs="Arial" w:eastAsia="Arial" w:hAnsi="Arial"/>
+                <w:sz w:val="22"/>
+                <w:szCs w:val="22"/>
+              </w:rPr>
+              <w:t xml:space="preserve">Group Email Folders are available as of EspoCRM v7.3.</w:t>
+            </w:r>
+          </w:p>
+        </w:tc>
+      </w:tr>
+    </w:tbl>
+    <w:p>
+      <w:r>
+        <w:t xml:space="preserve"/>
+      </w:r>
+    </w:p>
+    <w:p>
+      <w:pPr>
+        <w:pStyle w:val="Heading2"/>
+      </w:pPr>
+      <w:r>
+        <w:rPr>
+          <w:rFonts w:ascii="Arial" w:cs="Arial" w:eastAsia="Arial" w:hAnsi="Arial"/>
+          <w:b/>
+          <w:bCs/>
+          <w:color w:val="2E75B6"/>
+          <w:sz w:val="26"/>
+          <w:szCs w:val="26"/>
+        </w:rPr>
+        <w:t xml:space="preserve">9. Email Filters</w:t>
+      </w:r>
+    </w:p>
+    <w:p>
+      <w:r>
+        <w:t xml:space="preserve"/>
+      </w:r>
+    </w:p>
+    <w:p>
+      <w:pPr>
+        <w:spacing w:after="120"/>
+      </w:pPr>
+      <w:r>
+        <w:rPr>
+          <w:rFonts w:ascii="Arial" w:cs="Arial" w:eastAsia="Arial" w:hAnsi="Arial"/>
+          <w:sz w:val="22"/>
+          <w:szCs w:val="22"/>
+        </w:rPr>
+        <w:t xml:space="preserve">Email filters allow emails to be automatically processed based on criteria such as sender, subject, or other fields. There are two types of email filters:</w:t>
+      </w:r>
+    </w:p>
+    <w:p>
+      <w:r>
+        <w:t xml:space="preserve"/>
+      </w:r>
+    </w:p>
+    <w:p>
+      <w:pPr>
+        <w:pStyle w:val="ListParagraph"/>
+        <w:numPr>
+          <w:ilvl w:val="0"/>
+          <w:numId w:val="2"/>
+        </w:numPr>
+        <w:spacing w:after="80"/>
+      </w:pPr>
+      <w:r>
+        <w:rPr>
+          <w:rFonts w:ascii="Arial" w:cs="Arial" w:eastAsia="Arial" w:hAnsi="Arial"/>
+          <w:sz w:val="22"/>
+          <w:szCs w:val="22"/>
+        </w:rPr>
+        <w:t xml:space="preserve">Skip — the email is placed in Trash or not imported at all if the filter is associated with a Personal Email Account.</w:t>
+      </w:r>
+    </w:p>
+    <w:p>
+      <w:pPr>
+        <w:pStyle w:val="ListParagraph"/>
+        <w:numPr>
+          <w:ilvl w:val="0"/>
+          <w:numId w:val="2"/>
+        </w:numPr>
+        <w:spacing w:after="80"/>
+      </w:pPr>
+      <w:r>
+        <w:rPr>
+          <w:rFonts w:ascii="Arial" w:cs="Arial" w:eastAsia="Arial" w:hAnsi="Arial"/>
+          <w:sz w:val="22"/>
+          <w:szCs w:val="22"/>
+        </w:rPr>
+        <w:t xml:space="preserve">Put in Folder — imported emails matching the filter criteria are automatically placed in a specified folder.</w:t>
+      </w:r>
+    </w:p>
+    <w:p>
+      <w:r>
+        <w:t xml:space="preserve"/>
+      </w:r>
+    </w:p>
+    <w:p>
+      <w:pPr>
+        <w:pStyle w:val="Heading3"/>
+      </w:pPr>
+      <w:r>
+        <w:rPr>
+          <w:rFonts w:ascii="Arial" w:cs="Arial" w:eastAsia="Arial" w:hAnsi="Arial"/>
+          <w:b/>
+          <w:bCs/>
+          <w:color w:val="595959"/>
+          <w:sz w:val="24"/>
+          <w:szCs w:val="24"/>
+        </w:rPr>
+        <w:t xml:space="preserve">9.1 Global Email Filters</w:t>
+      </w:r>
+    </w:p>
+    <w:p>
+      <w:pPr>
+        <w:spacing w:after="120"/>
+      </w:pPr>
+      <w:r>
+        <w:rPr>
+          <w:rFonts w:ascii="Arial" w:cs="Arial" w:eastAsia="Arial" w:hAnsi="Arial"/>
+          <w:sz w:val="22"/>
+          <w:szCs w:val="22"/>
+        </w:rPr>
+        <w:t xml:space="preserve">Administrators can create global email filters that apply system-wide to skip undesirable emails. These are managed at: Admin → Email Filters.</w:t>
+      </w:r>
+    </w:p>
+    <w:p>
+      <w:r>
+        <w:t xml:space="preserve"/>
+      </w:r>
+    </w:p>
+    <w:p>
+      <w:pPr>
+        <w:pStyle w:val="Heading3"/>
+      </w:pPr>
+      <w:r>
+        <w:rPr>
+          <w:rFonts w:ascii="Arial" w:cs="Arial" w:eastAsia="Arial" w:hAnsi="Arial"/>
+          <w:b/>
+          <w:bCs/>
+          <w:color w:val="595959"/>
+          <w:sz w:val="24"/>
+          <w:szCs w:val="24"/>
+        </w:rPr>
+        <w:t xml:space="preserve">9.2 Personal Email Filters</w:t>
+      </w:r>
+    </w:p>
+    <w:p>
+      <w:pPr>
+        <w:spacing w:after="120"/>
+      </w:pPr>
+      <w:r>
+        <w:rPr>
+          <w:rFonts w:ascii="Arial" w:cs="Arial" w:eastAsia="Arial" w:hAnsi="Arial"/>
+          <w:sz w:val="22"/>
+          <w:szCs w:val="22"/>
+        </w:rPr>
+        <w:t xml:space="preserve">Regular users can create their own email filters that apply to their Personal Email Accounts or their entire inbox. These are managed at: Emails → dropdown in the top-right corner → Filters.</w:t>
       </w:r>
     </w:p>
     <w:p>

</xml_diff>

<commit_message>
Update CBM-EspoCRM-HowTo.docx - add Google Contacts integration section
</commit_message>
<xml_diff>
--- a/PRDs/CBM-EspoCRM-HowTo.docx
+++ b/PRDs/CBM-EspoCRM-HowTo.docx
@@ -8591,6 +8591,644 @@
         </w:tc>
       </w:tr>
     </w:tbl>
+    <w:p>
+      <w:r>
+        <w:t xml:space="preserve"/>
+      </w:r>
+    </w:p>
+    <w:p>
+      <w:pPr>
+        <w:pStyle w:val="Heading2"/>
+      </w:pPr>
+      <w:r>
+        <w:rPr>
+          <w:rFonts w:ascii="Arial" w:cs="Arial" w:eastAsia="Arial" w:hAnsi="Arial"/>
+          <w:b/>
+          <w:bCs/>
+          <w:color w:val="2E75B6"/>
+          <w:sz w:val="26"/>
+          <w:szCs w:val="26"/>
+        </w:rPr>
+        <w:t xml:space="preserve">10. Integrating EspoCRM Contacts with Google Contacts</w:t>
+      </w:r>
+    </w:p>
+    <w:p>
+      <w:r>
+        <w:t xml:space="preserve"/>
+      </w:r>
+    </w:p>
+    <w:p>
+      <w:pPr>
+        <w:spacing w:after="120"/>
+      </w:pPr>
+      <w:r>
+        <w:rPr>
+          <w:rFonts w:ascii="Arial" w:cs="Arial" w:eastAsia="Arial" w:hAnsi="Arial"/>
+          <w:sz w:val="22"/>
+          <w:szCs w:val="22"/>
+        </w:rPr>
+        <w:t xml:space="preserve">EspoCRM can push Contact and Lead records from EspoCRM into Google Contacts, keeping your CRM data accessible from any Google service or device that syncs with Google Contacts.</w:t>
+      </w:r>
+    </w:p>
+    <w:p>
+      <w:r>
+        <w:t xml:space="preserve"/>
+      </w:r>
+    </w:p>
+    <w:tbl>
+      <w:tblPr>
+        <w:tblW w:type="dxa" w:w="9360"/>
+        <w:tblBorders>
+          <w:top w:val="single" w:color="auto" w:sz="4"/>
+          <w:left w:val="single" w:color="auto" w:sz="4"/>
+          <w:bottom w:val="single" w:color="auto" w:sz="4"/>
+          <w:right w:val="single" w:color="auto" w:sz="4"/>
+          <w:insideH w:val="single" w:color="auto" w:sz="4"/>
+          <w:insideV w:val="single" w:color="auto" w:sz="4"/>
+        </w:tblBorders>
+      </w:tblPr>
+      <w:tblGrid>
+        <w:gridCol w:w="9360"/>
+      </w:tblGrid>
+      <w:tr>
+        <w:tc>
+          <w:tcPr>
+            <w:tcW w:type="dxa" w:w="9360"/>
+            <w:tcBorders>
+              <w:top w:val="single" w:color="FFC107" w:sz="4"/>
+              <w:left w:val="single" w:color="FFC107" w:sz="4"/>
+              <w:bottom w:val="single" w:color="FFC107" w:sz="4"/>
+              <w:right w:val="single" w:color="FFC107" w:sz="4"/>
+            </w:tcBorders>
+            <w:shd w:fill="FFF3CD" w:val="clear"/>
+            <w:tcMar>
+              <w:top w:type="dxa" w:w="100"/>
+              <w:left w:type="dxa" w:w="160"/>
+              <w:bottom w:type="dxa" w:w="100"/>
+              <w:right w:type="dxa" w:w="160"/>
+            </w:tcMar>
+          </w:tcPr>
+          <w:p>
+            <w:r>
+              <w:rPr>
+                <w:rFonts w:ascii="Arial" w:cs="Arial" w:eastAsia="Arial" w:hAnsi="Arial"/>
+                <w:b/>
+                <w:bCs/>
+                <w:sz w:val="22"/>
+                <w:szCs w:val="22"/>
+              </w:rPr>
+              <w:t xml:space="preserve">Note: </w:t>
+            </w:r>
+            <w:r>
+              <w:rPr>
+                <w:rFonts w:ascii="Arial" w:cs="Arial" w:eastAsia="Arial" w:hAnsi="Arial"/>
+                <w:sz w:val="22"/>
+                <w:szCs w:val="22"/>
+              </w:rPr>
+              <w:t xml:space="preserve">Before setting up Google Contacts integration for users, the administrator must first configure the Google Integration at the system level. Confirm this has been completed before proceeding with the user-level setup below.</w:t>
+            </w:r>
+          </w:p>
+        </w:tc>
+      </w:tr>
+    </w:tbl>
+    <w:p>
+      <w:r>
+        <w:t xml:space="preserve"/>
+      </w:r>
+    </w:p>
+    <w:p>
+      <w:pPr>
+        <w:pStyle w:val="Heading3"/>
+      </w:pPr>
+      <w:r>
+        <w:rPr>
+          <w:rFonts w:ascii="Arial" w:cs="Arial" w:eastAsia="Arial" w:hAnsi="Arial"/>
+          <w:b/>
+          <w:bCs/>
+          <w:color w:val="595959"/>
+          <w:sz w:val="24"/>
+          <w:szCs w:val="24"/>
+        </w:rPr>
+        <w:t xml:space="preserve">10.1 What Gets Pushed</w:t>
+      </w:r>
+    </w:p>
+    <w:p>
+      <w:pPr>
+        <w:spacing w:after="120"/>
+      </w:pPr>
+      <w:r>
+        <w:rPr>
+          <w:rFonts w:ascii="Arial" w:cs="Arial" w:eastAsia="Arial" w:hAnsi="Arial"/>
+          <w:sz w:val="22"/>
+          <w:szCs w:val="22"/>
+        </w:rPr>
+        <w:t xml:space="preserve">The following fields are pushed from EspoCRM to Google Contacts when a sync is performed:</w:t>
+      </w:r>
+    </w:p>
+    <w:p>
+      <w:r>
+        <w:t xml:space="preserve"/>
+      </w:r>
+    </w:p>
+    <w:p>
+      <w:pPr>
+        <w:pStyle w:val="ListParagraph"/>
+        <w:numPr>
+          <w:ilvl w:val="0"/>
+          <w:numId w:val="2"/>
+        </w:numPr>
+        <w:spacing w:after="80"/>
+      </w:pPr>
+      <w:r>
+        <w:rPr>
+          <w:rFonts w:ascii="Arial" w:cs="Arial" w:eastAsia="Arial" w:hAnsi="Arial"/>
+          <w:sz w:val="22"/>
+          <w:szCs w:val="22"/>
+        </w:rPr>
+        <w:t xml:space="preserve">Name</w:t>
+      </w:r>
+    </w:p>
+    <w:p>
+      <w:pPr>
+        <w:pStyle w:val="ListParagraph"/>
+        <w:numPr>
+          <w:ilvl w:val="0"/>
+          <w:numId w:val="2"/>
+        </w:numPr>
+        <w:spacing w:after="80"/>
+      </w:pPr>
+      <w:r>
+        <w:rPr>
+          <w:rFonts w:ascii="Arial" w:cs="Arial" w:eastAsia="Arial" w:hAnsi="Arial"/>
+          <w:sz w:val="22"/>
+          <w:szCs w:val="22"/>
+        </w:rPr>
+        <w:t xml:space="preserve">Description</w:t>
+      </w:r>
+    </w:p>
+    <w:p>
+      <w:pPr>
+        <w:pStyle w:val="ListParagraph"/>
+        <w:numPr>
+          <w:ilvl w:val="0"/>
+          <w:numId w:val="2"/>
+        </w:numPr>
+        <w:spacing w:after="80"/>
+      </w:pPr>
+      <w:r>
+        <w:rPr>
+          <w:rFonts w:ascii="Arial" w:cs="Arial" w:eastAsia="Arial" w:hAnsi="Arial"/>
+          <w:sz w:val="22"/>
+          <w:szCs w:val="22"/>
+        </w:rPr>
+        <w:t xml:space="preserve">Email Addresses</w:t>
+      </w:r>
+    </w:p>
+    <w:p>
+      <w:pPr>
+        <w:pStyle w:val="ListParagraph"/>
+        <w:numPr>
+          <w:ilvl w:val="0"/>
+          <w:numId w:val="2"/>
+        </w:numPr>
+        <w:spacing w:after="80"/>
+      </w:pPr>
+      <w:r>
+        <w:rPr>
+          <w:rFonts w:ascii="Arial" w:cs="Arial" w:eastAsia="Arial" w:hAnsi="Arial"/>
+          <w:sz w:val="22"/>
+          <w:szCs w:val="22"/>
+        </w:rPr>
+        <w:t xml:space="preserve">Phone Numbers</w:t>
+      </w:r>
+    </w:p>
+    <w:p>
+      <w:pPr>
+        <w:pStyle w:val="ListParagraph"/>
+        <w:numPr>
+          <w:ilvl w:val="0"/>
+          <w:numId w:val="2"/>
+        </w:numPr>
+        <w:spacing w:after="80"/>
+      </w:pPr>
+      <w:r>
+        <w:rPr>
+          <w:rFonts w:ascii="Arial" w:cs="Arial" w:eastAsia="Arial" w:hAnsi="Arial"/>
+          <w:sz w:val="22"/>
+          <w:szCs w:val="22"/>
+        </w:rPr>
+        <w:t xml:space="preserve">Account Name</w:t>
+      </w:r>
+    </w:p>
+    <w:p>
+      <w:pPr>
+        <w:pStyle w:val="ListParagraph"/>
+        <w:numPr>
+          <w:ilvl w:val="0"/>
+          <w:numId w:val="2"/>
+        </w:numPr>
+        <w:spacing w:after="80"/>
+      </w:pPr>
+      <w:r>
+        <w:rPr>
+          <w:rFonts w:ascii="Arial" w:cs="Arial" w:eastAsia="Arial" w:hAnsi="Arial"/>
+          <w:sz w:val="22"/>
+          <w:szCs w:val="22"/>
+        </w:rPr>
+        <w:t xml:space="preserve">Account Title</w:t>
+      </w:r>
+    </w:p>
+    <w:p>
+      <w:pPr>
+        <w:pStyle w:val="ListParagraph"/>
+        <w:numPr>
+          <w:ilvl w:val="0"/>
+          <w:numId w:val="2"/>
+        </w:numPr>
+        <w:spacing w:after="80"/>
+      </w:pPr>
+      <w:r>
+        <w:rPr>
+          <w:rFonts w:ascii="Arial" w:cs="Arial" w:eastAsia="Arial" w:hAnsi="Arial"/>
+          <w:sz w:val="22"/>
+          <w:szCs w:val="22"/>
+        </w:rPr>
+        <w:t xml:space="preserve">Address</w:t>
+      </w:r>
+    </w:p>
+    <w:p>
+      <w:r>
+        <w:t xml:space="preserve"/>
+      </w:r>
+    </w:p>
+    <w:p>
+      <w:pPr>
+        <w:pStyle w:val="Heading3"/>
+      </w:pPr>
+      <w:r>
+        <w:rPr>
+          <w:rFonts w:ascii="Arial" w:cs="Arial" w:eastAsia="Arial" w:hAnsi="Arial"/>
+          <w:b/>
+          <w:bCs/>
+          <w:color w:val="595959"/>
+          <w:sz w:val="24"/>
+          <w:szCs w:val="24"/>
+        </w:rPr>
+        <w:t xml:space="preserve">10.2 User Setup</w:t>
+      </w:r>
+    </w:p>
+    <w:p>
+      <w:pPr>
+        <w:spacing w:after="120"/>
+      </w:pPr>
+      <w:r>
+        <w:rPr>
+          <w:rFonts w:ascii="Arial" w:cs="Arial" w:eastAsia="Arial" w:hAnsi="Arial"/>
+          <w:sz w:val="22"/>
+          <w:szCs w:val="22"/>
+        </w:rPr>
+        <w:t xml:space="preserve">Each user must connect their Google account to EspoCRM and enable the Google Contacts scope before they can push records. To do this:</w:t>
+      </w:r>
+    </w:p>
+    <w:p>
+      <w:r>
+        <w:t xml:space="preserve"/>
+      </w:r>
+    </w:p>
+    <w:p>
+      <w:pPr>
+        <w:pStyle w:val="ListParagraph"/>
+        <w:numPr>
+          <w:ilvl w:val="0"/>
+          <w:numId w:val="3"/>
+        </w:numPr>
+        <w:spacing w:after="100"/>
+      </w:pPr>
+      <w:r>
+        <w:rPr>
+          <w:rFonts w:ascii="Arial" w:cs="Arial" w:eastAsia="Arial" w:hAnsi="Arial"/>
+          <w:sz w:val="22"/>
+          <w:szCs w:val="22"/>
+        </w:rPr>
+        <w:t xml:space="preserve">Go to your user detail view by clicking your name in the top-right menu.</w:t>
+      </w:r>
+    </w:p>
+    <w:p>
+      <w:pPr>
+        <w:pStyle w:val="ListParagraph"/>
+        <w:numPr>
+          <w:ilvl w:val="0"/>
+          <w:numId w:val="3"/>
+        </w:numPr>
+        <w:spacing w:after="100"/>
+      </w:pPr>
+      <w:r>
+        <w:rPr>
+          <w:rFonts w:ascii="Arial" w:cs="Arial" w:eastAsia="Arial" w:hAnsi="Arial"/>
+          <w:sz w:val="22"/>
+          <w:szCs w:val="22"/>
+        </w:rPr>
+        <w:t xml:space="preserve">Click the External Account button.</w:t>
+      </w:r>
+    </w:p>
+    <w:p>
+      <w:pPr>
+        <w:pStyle w:val="ListParagraph"/>
+        <w:numPr>
+          <w:ilvl w:val="0"/>
+          <w:numId w:val="3"/>
+        </w:numPr>
+        <w:spacing w:after="100"/>
+      </w:pPr>
+      <w:r>
+        <w:rPr>
+          <w:rFonts w:ascii="Arial" w:cs="Arial" w:eastAsia="Arial" w:hAnsi="Arial"/>
+          <w:sz w:val="22"/>
+          <w:szCs w:val="22"/>
+        </w:rPr>
+        <w:t xml:space="preserve">Click Google in the left panel.</w:t>
+      </w:r>
+    </w:p>
+    <w:p>
+      <w:pPr>
+        <w:pStyle w:val="ListParagraph"/>
+        <w:numPr>
+          <w:ilvl w:val="0"/>
+          <w:numId w:val="3"/>
+        </w:numPr>
+        <w:spacing w:after="100"/>
+      </w:pPr>
+      <w:r>
+        <w:rPr>
+          <w:rFonts w:ascii="Arial" w:cs="Arial" w:eastAsia="Arial" w:hAnsi="Arial"/>
+          <w:sz w:val="22"/>
+          <w:szCs w:val="22"/>
+        </w:rPr>
+        <w:t xml:space="preserve">Check the Enabled checkbox, then click the Connect button.</w:t>
+      </w:r>
+    </w:p>
+    <w:p>
+      <w:pPr>
+        <w:pStyle w:val="ListParagraph"/>
+        <w:numPr>
+          <w:ilvl w:val="0"/>
+          <w:numId w:val="3"/>
+        </w:numPr>
+        <w:spacing w:after="100"/>
+      </w:pPr>
+      <w:r>
+        <w:rPr>
+          <w:rFonts w:ascii="Arial" w:cs="Arial" w:eastAsia="Arial" w:hAnsi="Arial"/>
+          <w:sz w:val="22"/>
+          <w:szCs w:val="22"/>
+        </w:rPr>
+        <w:t xml:space="preserve">A popup will appear asking for your consent to grant EspoCRM access to your Google account. Approve it.</w:t>
+      </w:r>
+    </w:p>
+    <w:p>
+      <w:pPr>
+        <w:pStyle w:val="ListParagraph"/>
+        <w:numPr>
+          <w:ilvl w:val="0"/>
+          <w:numId w:val="3"/>
+        </w:numPr>
+        <w:spacing w:after="100"/>
+      </w:pPr>
+      <w:r>
+        <w:rPr>
+          <w:rFonts w:ascii="Arial" w:cs="Arial" w:eastAsia="Arial" w:hAnsi="Arial"/>
+          <w:sz w:val="22"/>
+          <w:szCs w:val="22"/>
+        </w:rPr>
+        <w:t xml:space="preserve">A green Connected label should appear confirming the connection was successful.</w:t>
+      </w:r>
+    </w:p>
+    <w:p>
+      <w:pPr>
+        <w:pStyle w:val="ListParagraph"/>
+        <w:numPr>
+          <w:ilvl w:val="0"/>
+          <w:numId w:val="3"/>
+        </w:numPr>
+        <w:spacing w:after="100"/>
+      </w:pPr>
+      <w:r>
+        <w:rPr>
+          <w:rFonts w:ascii="Arial" w:cs="Arial" w:eastAsia="Arial" w:hAnsi="Arial"/>
+          <w:sz w:val="22"/>
+          <w:szCs w:val="22"/>
+        </w:rPr>
+        <w:t xml:space="preserve">Check the Google Contacts checkbox to enable contact syncing.</w:t>
+      </w:r>
+    </w:p>
+    <w:p>
+      <w:pPr>
+        <w:pStyle w:val="ListParagraph"/>
+        <w:numPr>
+          <w:ilvl w:val="0"/>
+          <w:numId w:val="3"/>
+        </w:numPr>
+        <w:spacing w:after="100"/>
+      </w:pPr>
+      <w:r>
+        <w:rPr>
+          <w:rFonts w:ascii="Arial" w:cs="Arial" w:eastAsia="Arial" w:hAnsi="Arial"/>
+          <w:sz w:val="22"/>
+          <w:szCs w:val="22"/>
+        </w:rPr>
+        <w:t xml:space="preserve">Optionally, select one or more Google Contacts Groups to specify which group(s) EspoCRM records will be pushed into.</w:t>
+      </w:r>
+    </w:p>
+    <w:p>
+      <w:pPr>
+        <w:pStyle w:val="ListParagraph"/>
+        <w:numPr>
+          <w:ilvl w:val="0"/>
+          <w:numId w:val="3"/>
+        </w:numPr>
+        <w:spacing w:after="100"/>
+      </w:pPr>
+      <w:r>
+        <w:rPr>
+          <w:rFonts w:ascii="Arial" w:cs="Arial" w:eastAsia="Arial" w:hAnsi="Arial"/>
+          <w:sz w:val="22"/>
+          <w:szCs w:val="22"/>
+        </w:rPr>
+        <w:t xml:space="preserve">Click Save.</w:t>
+      </w:r>
+    </w:p>
+    <w:p>
+      <w:r>
+        <w:t xml:space="preserve"/>
+      </w:r>
+    </w:p>
+    <w:tbl>
+      <w:tblPr>
+        <w:tblW w:type="dxa" w:w="9360"/>
+        <w:tblBorders>
+          <w:top w:val="single" w:color="auto" w:sz="4"/>
+          <w:left w:val="single" w:color="auto" w:sz="4"/>
+          <w:bottom w:val="single" w:color="auto" w:sz="4"/>
+          <w:right w:val="single" w:color="auto" w:sz="4"/>
+          <w:insideH w:val="single" w:color="auto" w:sz="4"/>
+          <w:insideV w:val="single" w:color="auto" w:sz="4"/>
+        </w:tblBorders>
+      </w:tblPr>
+      <w:tblGrid>
+        <w:gridCol w:w="9360"/>
+      </w:tblGrid>
+      <w:tr>
+        <w:tc>
+          <w:tcPr>
+            <w:tcW w:type="dxa" w:w="9360"/>
+            <w:tcBorders>
+              <w:top w:val="single" w:color="FFC107" w:sz="4"/>
+              <w:left w:val="single" w:color="FFC107" w:sz="4"/>
+              <w:bottom w:val="single" w:color="FFC107" w:sz="4"/>
+              <w:right w:val="single" w:color="FFC107" w:sz="4"/>
+            </w:tcBorders>
+            <w:shd w:fill="FFF3CD" w:val="clear"/>
+            <w:tcMar>
+              <w:top w:type="dxa" w:w="100"/>
+              <w:left w:type="dxa" w:w="160"/>
+              <w:bottom w:type="dxa" w:w="100"/>
+              <w:right w:type="dxa" w:w="160"/>
+            </w:tcMar>
+          </w:tcPr>
+          <w:p>
+            <w:r>
+              <w:rPr>
+                <w:rFonts w:ascii="Arial" w:cs="Arial" w:eastAsia="Arial" w:hAnsi="Arial"/>
+                <w:b/>
+                <w:bCs/>
+                <w:sz w:val="22"/>
+                <w:szCs w:val="22"/>
+              </w:rPr>
+              <w:t xml:space="preserve">Note: </w:t>
+            </w:r>
+            <w:r>
+              <w:rPr>
+                <w:rFonts w:ascii="Arial" w:cs="Arial" w:eastAsia="Arial" w:hAnsi="Arial"/>
+                <w:sz w:val="22"/>
+                <w:szCs w:val="22"/>
+              </w:rPr>
+              <w:t xml:space="preserve">If the Google Contacts checkbox does not appear after connecting successfully, the administrator has not granted access to the Google Contacts scope. Contact your administrator to enable it.</w:t>
+            </w:r>
+          </w:p>
+        </w:tc>
+      </w:tr>
+    </w:tbl>
+    <w:p>
+      <w:r>
+        <w:t xml:space="preserve"/>
+      </w:r>
+    </w:p>
+    <w:p>
+      <w:pPr>
+        <w:pStyle w:val="Heading3"/>
+      </w:pPr>
+      <w:r>
+        <w:rPr>
+          <w:rFonts w:ascii="Arial" w:cs="Arial" w:eastAsia="Arial" w:hAnsi="Arial"/>
+          <w:b/>
+          <w:bCs/>
+          <w:color w:val="595959"/>
+          <w:sz w:val="24"/>
+          <w:szCs w:val="24"/>
+        </w:rPr>
+        <w:t xml:space="preserve">10.3 Pushing Contacts to Google</w:t>
+      </w:r>
+    </w:p>
+    <w:p>
+      <w:pPr>
+        <w:spacing w:after="120"/>
+      </w:pPr>
+      <w:r>
+        <w:rPr>
+          <w:rFonts w:ascii="Arial" w:cs="Arial" w:eastAsia="Arial" w:hAnsi="Arial"/>
+          <w:sz w:val="22"/>
+          <w:szCs w:val="22"/>
+        </w:rPr>
+        <w:t xml:space="preserve">Once the user setup is complete, contacts and leads can be pushed to Google Contacts manually:</w:t>
+      </w:r>
+    </w:p>
+    <w:p>
+      <w:r>
+        <w:t xml:space="preserve"/>
+      </w:r>
+    </w:p>
+    <w:p>
+      <w:pPr>
+        <w:pStyle w:val="ListParagraph"/>
+        <w:numPr>
+          <w:ilvl w:val="0"/>
+          <w:numId w:val="3"/>
+        </w:numPr>
+        <w:spacing w:after="100"/>
+      </w:pPr>
+      <w:r>
+        <w:rPr>
+          <w:rFonts w:ascii="Arial" w:cs="Arial" w:eastAsia="Arial" w:hAnsi="Arial"/>
+          <w:sz w:val="22"/>
+          <w:szCs w:val="22"/>
+        </w:rPr>
+        <w:t xml:space="preserve">Go to the Contacts or Leads list view.</w:t>
+      </w:r>
+    </w:p>
+    <w:p>
+      <w:pPr>
+        <w:pStyle w:val="ListParagraph"/>
+        <w:numPr>
+          <w:ilvl w:val="0"/>
+          <w:numId w:val="3"/>
+        </w:numPr>
+        <w:spacing w:after="100"/>
+      </w:pPr>
+      <w:r>
+        <w:rPr>
+          <w:rFonts w:ascii="Arial" w:cs="Arial" w:eastAsia="Arial" w:hAnsi="Arial"/>
+          <w:sz w:val="22"/>
+          <w:szCs w:val="22"/>
+        </w:rPr>
+        <w:t xml:space="preserve">Select the records you want to push using the checkboxes.</w:t>
+      </w:r>
+    </w:p>
+    <w:p>
+      <w:pPr>
+        <w:pStyle w:val="ListParagraph"/>
+        <w:numPr>
+          <w:ilvl w:val="0"/>
+          <w:numId w:val="3"/>
+        </w:numPr>
+        <w:spacing w:after="100"/>
+      </w:pPr>
+      <w:r>
+        <w:rPr>
+          <w:rFonts w:ascii="Arial" w:cs="Arial" w:eastAsia="Arial" w:hAnsi="Arial"/>
+          <w:sz w:val="22"/>
+          <w:szCs w:val="22"/>
+        </w:rPr>
+        <w:t xml:space="preserve">Click the Actions dropdown and select Push to Google.</w:t>
+      </w:r>
+    </w:p>
+    <w:p>
+      <w:r>
+        <w:t xml:space="preserve"/>
+      </w:r>
+    </w:p>
+    <w:p>
+      <w:pPr>
+        <w:spacing w:after="120"/>
+      </w:pPr>
+      <w:r>
+        <w:rPr>
+          <w:rFonts w:ascii="Arial" w:cs="Arial" w:eastAsia="Arial" w:hAnsi="Arial"/>
+          <w:sz w:val="22"/>
+          <w:szCs w:val="22"/>
+        </w:rPr>
+        <w:t xml:space="preserve">A single push action can process up to 10 records immediately. If more than 10 records are selected, the remainder will be pushed in the background by the system's scheduled task (cron). After the push completes, the contacts will be available in Google Contacts, organized into the groups specified during setup if applicable.</w:t>
+      </w:r>
+    </w:p>
     <w:p>
       <w:r>
         <w:t xml:space="preserve"/>

</xml_diff>

<commit_message>
Update CBM-EspoCRM-HowTo.docx - add Dynamic Logic panel visibility section
</commit_message>
<xml_diff>
--- a/PRDs/CBM-EspoCRM-HowTo.docx
+++ b/PRDs/CBM-EspoCRM-HowTo.docx
@@ -6148,6 +6148,784 @@
                 <w:szCs w:val="22"/>
               </w:rPr>
               <w:t xml:space="preserve">List (Small) changes affect every panel where that entity appears as a child — not just one specific parent entity. For example, if you update the Engagement List (Small) layout, the Engagements panel will show the same columns on both Account and Contact detail pages.</w:t>
+            </w:r>
+          </w:p>
+        </w:tc>
+      </w:tr>
+    </w:tbl>
+    <w:p>
+      <w:r>
+        <w:t xml:space="preserve"/>
+      </w:r>
+    </w:p>
+    <w:p>
+      <w:pPr>
+        <w:pStyle w:val="Heading2"/>
+      </w:pPr>
+      <w:r>
+        <w:rPr>
+          <w:rFonts w:ascii="Arial" w:cs="Arial" w:eastAsia="Arial" w:hAnsi="Arial"/>
+          <w:b/>
+          <w:bCs/>
+          <w:color w:val="2E75B6"/>
+          <w:sz w:val="26"/>
+          <w:szCs w:val="26"/>
+        </w:rPr>
+        <w:t xml:space="preserve">5. Controlling Panel Visibility with Dynamic Logic</w:t>
+      </w:r>
+    </w:p>
+    <w:p>
+      <w:r>
+        <w:t xml:space="preserve"/>
+      </w:r>
+    </w:p>
+    <w:p>
+      <w:pPr>
+        <w:spacing w:after="120"/>
+      </w:pPr>
+      <w:r>
+        <w:rPr>
+          <w:rFonts w:ascii="Arial" w:cs="Arial" w:eastAsia="Arial" w:hAnsi="Arial"/>
+          <w:sz w:val="22"/>
+          <w:szCs w:val="22"/>
+        </w:rPr>
+        <w:t xml:space="preserve">Dynamic Logic allows panels and fields on an entity's detail view to be shown or hidden based on the value of another field on the same record. This is useful when different record types require different layouts — for example, showing a Mentor Details panel only when a Contact's type is set to Mentor, and a Client Details panel only when the type is set to Client.</w:t>
+      </w:r>
+    </w:p>
+    <w:p>
+      <w:r>
+        <w:t xml:space="preserve"/>
+      </w:r>
+    </w:p>
+    <w:p>
+      <w:pPr>
+        <w:pStyle w:val="Heading3"/>
+      </w:pPr>
+      <w:r>
+        <w:rPr>
+          <w:rFonts w:ascii="Arial" w:cs="Arial" w:eastAsia="Arial" w:hAnsi="Arial"/>
+          <w:b/>
+          <w:bCs/>
+          <w:color w:val="595959"/>
+          <w:sz w:val="24"/>
+          <w:szCs w:val="24"/>
+        </w:rPr>
+        <w:t xml:space="preserve">5.1 How It Works</w:t>
+      </w:r>
+    </w:p>
+    <w:p>
+      <w:pPr>
+        <w:spacing w:after="120"/>
+      </w:pPr>
+      <w:r>
+        <w:rPr>
+          <w:rFonts w:ascii="Arial" w:cs="Arial" w:eastAsia="Arial" w:hAnsi="Arial"/>
+          <w:sz w:val="22"/>
+          <w:szCs w:val="22"/>
+        </w:rPr>
+        <w:t xml:space="preserve">Dynamic Logic conditions are evaluated in real time as a record is viewed or edited. When a field value changes, the visibility of any panels or fields that depend on that condition updates immediately without requiring a page refresh.</w:t>
+      </w:r>
+    </w:p>
+    <w:p>
+      <w:r>
+        <w:t xml:space="preserve"/>
+      </w:r>
+    </w:p>
+    <w:p>
+      <w:pPr>
+        <w:spacing w:after="120"/>
+      </w:pPr>
+      <w:r>
+        <w:rPr>
+          <w:rFonts w:ascii="Arial" w:cs="Arial" w:eastAsia="Arial" w:hAnsi="Arial"/>
+          <w:sz w:val="22"/>
+          <w:szCs w:val="22"/>
+        </w:rPr>
+        <w:t xml:space="preserve">Conditions can be based on any field on the entity, including:</w:t>
+      </w:r>
+    </w:p>
+    <w:p>
+      <w:pPr>
+        <w:pStyle w:val="ListParagraph"/>
+        <w:numPr>
+          <w:ilvl w:val="0"/>
+          <w:numId w:val="2"/>
+        </w:numPr>
+        <w:spacing w:after="80"/>
+      </w:pPr>
+      <w:r>
+        <w:rPr>
+          <w:rFonts w:ascii="Arial" w:cs="Arial" w:eastAsia="Arial" w:hAnsi="Arial"/>
+          <w:sz w:val="22"/>
+          <w:szCs w:val="22"/>
+        </w:rPr>
+        <w:t xml:space="preserve">Enum (dropdown) fields — show a panel when the dropdown equals a specific value</w:t>
+      </w:r>
+    </w:p>
+    <w:p>
+      <w:pPr>
+        <w:pStyle w:val="ListParagraph"/>
+        <w:numPr>
+          <w:ilvl w:val="0"/>
+          <w:numId w:val="2"/>
+        </w:numPr>
+        <w:spacing w:after="80"/>
+      </w:pPr>
+      <w:r>
+        <w:rPr>
+          <w:rFonts w:ascii="Arial" w:cs="Arial" w:eastAsia="Arial" w:hAnsi="Arial"/>
+          <w:sz w:val="22"/>
+          <w:szCs w:val="22"/>
+        </w:rPr>
+        <w:t xml:space="preserve">Boolean fields — show a panel when a checkbox is checked</w:t>
+      </w:r>
+    </w:p>
+    <w:p>
+      <w:pPr>
+        <w:pStyle w:val="ListParagraph"/>
+        <w:numPr>
+          <w:ilvl w:val="0"/>
+          <w:numId w:val="2"/>
+        </w:numPr>
+        <w:spacing w:after="80"/>
+      </w:pPr>
+      <w:r>
+        <w:rPr>
+          <w:rFonts w:ascii="Arial" w:cs="Arial" w:eastAsia="Arial" w:hAnsi="Arial"/>
+          <w:sz w:val="22"/>
+          <w:szCs w:val="22"/>
+        </w:rPr>
+        <w:t xml:space="preserve">Link fields — show a panel when a relationship field is or is not empty</w:t>
+      </w:r>
+    </w:p>
+    <w:p>
+      <w:r>
+        <w:t xml:space="preserve"/>
+      </w:r>
+    </w:p>
+    <w:p>
+      <w:pPr>
+        <w:pStyle w:val="Heading3"/>
+      </w:pPr>
+      <w:r>
+        <w:rPr>
+          <w:rFonts w:ascii="Arial" w:cs="Arial" w:eastAsia="Arial" w:hAnsi="Arial"/>
+          <w:b/>
+          <w:bCs/>
+          <w:color w:val="595959"/>
+          <w:sz w:val="24"/>
+          <w:szCs w:val="24"/>
+        </w:rPr>
+        <w:t xml:space="preserve">5.2 Step-by-Step: Configuring Dynamic Logic for a Panel</w:t>
+      </w:r>
+    </w:p>
+    <w:p>
+      <w:r>
+        <w:t xml:space="preserve"/>
+      </w:r>
+    </w:p>
+    <w:p>
+      <w:pPr>
+        <w:pStyle w:val="Heading3"/>
+      </w:pPr>
+      <w:r>
+        <w:rPr>
+          <w:rFonts w:ascii="Arial" w:cs="Arial" w:eastAsia="Arial" w:hAnsi="Arial"/>
+          <w:b/>
+          <w:bCs/>
+          <w:color w:val="595959"/>
+          <w:sz w:val="24"/>
+          <w:szCs w:val="24"/>
+        </w:rPr>
+        <w:t xml:space="preserve">Step 1 — Open Dynamic Logic</w:t>
+      </w:r>
+    </w:p>
+    <w:p>
+      <w:pPr>
+        <w:spacing w:after="120"/>
+      </w:pPr>
+      <w:r>
+        <w:rPr>
+          <w:rFonts w:ascii="Arial" w:cs="Arial" w:eastAsia="Arial" w:hAnsi="Arial"/>
+          <w:sz w:val="22"/>
+          <w:szCs w:val="22"/>
+        </w:rPr>
+        <w:t xml:space="preserve">Navigate to: Admin → Entity Manager → [Your Entity] → Dynamic Logic</w:t>
+      </w:r>
+    </w:p>
+    <w:p>
+      <w:r>
+        <w:t xml:space="preserve"/>
+      </w:r>
+    </w:p>
+    <w:p>
+      <w:pPr>
+        <w:pStyle w:val="Heading3"/>
+      </w:pPr>
+      <w:r>
+        <w:rPr>
+          <w:rFonts w:ascii="Arial" w:cs="Arial" w:eastAsia="Arial" w:hAnsi="Arial"/>
+          <w:b/>
+          <w:bCs/>
+          <w:color w:val="595959"/>
+          <w:sz w:val="24"/>
+          <w:szCs w:val="24"/>
+        </w:rPr>
+        <w:t xml:space="preserve">Step 2 — Locate the Panel</w:t>
+      </w:r>
+    </w:p>
+    <w:p>
+      <w:pPr>
+        <w:spacing w:after="120"/>
+      </w:pPr>
+      <w:r>
+        <w:rPr>
+          <w:rFonts w:ascii="Arial" w:cs="Arial" w:eastAsia="Arial" w:hAnsi="Arial"/>
+          <w:sz w:val="22"/>
+          <w:szCs w:val="22"/>
+        </w:rPr>
+        <w:t xml:space="preserve">The Dynamic Logic editor lists all panels available on the entity. Find the panel whose visibility you want to control and click on it to open its condition editor.</w:t>
+      </w:r>
+    </w:p>
+    <w:p>
+      <w:r>
+        <w:t xml:space="preserve"/>
+      </w:r>
+    </w:p>
+    <w:p>
+      <w:pPr>
+        <w:pStyle w:val="Heading3"/>
+      </w:pPr>
+      <w:r>
+        <w:rPr>
+          <w:rFonts w:ascii="Arial" w:cs="Arial" w:eastAsia="Arial" w:hAnsi="Arial"/>
+          <w:b/>
+          <w:bCs/>
+          <w:color w:val="595959"/>
+          <w:sz w:val="24"/>
+          <w:szCs w:val="24"/>
+        </w:rPr>
+        <w:t xml:space="preserve">Step 3 — Set the Visible Condition</w:t>
+      </w:r>
+    </w:p>
+    <w:p>
+      <w:pPr>
+        <w:spacing w:after="120"/>
+      </w:pPr>
+      <w:r>
+        <w:rPr>
+          <w:rFonts w:ascii="Arial" w:cs="Arial" w:eastAsia="Arial" w:hAnsi="Arial"/>
+          <w:sz w:val="22"/>
+          <w:szCs w:val="22"/>
+        </w:rPr>
+        <w:t xml:space="preserve">In the Visible condition section, define the rule that must be true for the panel to be displayed. Click Add Condition and configure:</w:t>
+      </w:r>
+    </w:p>
+    <w:p>
+      <w:r>
+        <w:t xml:space="preserve"/>
+      </w:r>
+    </w:p>
+    <w:p>
+      <w:pPr>
+        <w:pStyle w:val="ListParagraph"/>
+        <w:numPr>
+          <w:ilvl w:val="0"/>
+          <w:numId w:val="2"/>
+        </w:numPr>
+        <w:spacing w:after="80"/>
+      </w:pPr>
+      <w:r>
+        <w:rPr>
+          <w:rFonts w:ascii="Arial" w:cs="Arial" w:eastAsia="Arial" w:hAnsi="Arial"/>
+          <w:sz w:val="22"/>
+          <w:szCs w:val="22"/>
+        </w:rPr>
+        <w:t xml:space="preserve">Field — select the field whose value will drive the visibility (e.g., Contact Type).</w:t>
+      </w:r>
+    </w:p>
+    <w:p>
+      <w:pPr>
+        <w:pStyle w:val="ListParagraph"/>
+        <w:numPr>
+          <w:ilvl w:val="0"/>
+          <w:numId w:val="2"/>
+        </w:numPr>
+        <w:spacing w:after="80"/>
+      </w:pPr>
+      <w:r>
+        <w:rPr>
+          <w:rFonts w:ascii="Arial" w:cs="Arial" w:eastAsia="Arial" w:hAnsi="Arial"/>
+          <w:sz w:val="22"/>
+          <w:szCs w:val="22"/>
+        </w:rPr>
+        <w:t xml:space="preserve">Operator — select the comparison operator (e.g., Equals, Not Equals, Is Empty, etc.).</w:t>
+      </w:r>
+    </w:p>
+    <w:p>
+      <w:pPr>
+        <w:pStyle w:val="ListParagraph"/>
+        <w:numPr>
+          <w:ilvl w:val="0"/>
+          <w:numId w:val="2"/>
+        </w:numPr>
+        <w:spacing w:after="80"/>
+      </w:pPr>
+      <w:r>
+        <w:rPr>
+          <w:rFonts w:ascii="Arial" w:cs="Arial" w:eastAsia="Arial" w:hAnsi="Arial"/>
+          <w:sz w:val="22"/>
+          <w:szCs w:val="22"/>
+        </w:rPr>
+        <w:t xml:space="preserve">Value — enter or select the value to compare against (e.g., Mentor).</w:t>
+      </w:r>
+    </w:p>
+    <w:p>
+      <w:r>
+        <w:t xml:space="preserve"/>
+      </w:r>
+    </w:p>
+    <w:p>
+      <w:pPr>
+        <w:spacing w:after="120"/>
+      </w:pPr>
+      <w:r>
+        <w:rPr>
+          <w:rFonts w:ascii="Arial" w:cs="Arial" w:eastAsia="Arial" w:hAnsi="Arial"/>
+          <w:sz w:val="22"/>
+          <w:szCs w:val="22"/>
+        </w:rPr>
+        <w:t xml:space="preserve">Multiple conditions can be combined using AND or OR logic if the visibility depends on more than one field value.</w:t>
+      </w:r>
+    </w:p>
+    <w:p>
+      <w:r>
+        <w:t xml:space="preserve"/>
+      </w:r>
+    </w:p>
+    <w:p>
+      <w:pPr>
+        <w:pStyle w:val="Heading3"/>
+      </w:pPr>
+      <w:r>
+        <w:rPr>
+          <w:rFonts w:ascii="Arial" w:cs="Arial" w:eastAsia="Arial" w:hAnsi="Arial"/>
+          <w:b/>
+          <w:bCs/>
+          <w:color w:val="595959"/>
+          <w:sz w:val="24"/>
+          <w:szCs w:val="24"/>
+        </w:rPr>
+        <w:t xml:space="preserve">Step 4 — Save</w:t>
+      </w:r>
+    </w:p>
+    <w:p>
+      <w:pPr>
+        <w:spacing w:after="120"/>
+      </w:pPr>
+      <w:r>
+        <w:rPr>
+          <w:rFonts w:ascii="Arial" w:cs="Arial" w:eastAsia="Arial" w:hAnsi="Arial"/>
+          <w:sz w:val="22"/>
+          <w:szCs w:val="22"/>
+        </w:rPr>
+        <w:t xml:space="preserve">Click Save. The condition takes effect immediately. Open a record of that entity type and change the controlling field value to confirm the panel shows and hides correctly.</w:t>
+      </w:r>
+    </w:p>
+    <w:p>
+      <w:r>
+        <w:t xml:space="preserve"/>
+      </w:r>
+    </w:p>
+    <w:p>
+      <w:pPr>
+        <w:pStyle w:val="Heading2"/>
+      </w:pPr>
+      <w:r>
+        <w:rPr>
+          <w:rFonts w:ascii="Arial" w:cs="Arial" w:eastAsia="Arial" w:hAnsi="Arial"/>
+          <w:b/>
+          <w:bCs/>
+          <w:color w:val="2E75B6"/>
+          <w:sz w:val="26"/>
+          <w:szCs w:val="26"/>
+        </w:rPr>
+        <w:t xml:space="preserve">5.3 Example: Contact Type Driving Panel Visibility</w:t>
+      </w:r>
+    </w:p>
+    <w:p>
+      <w:pPr>
+        <w:spacing w:after="120"/>
+      </w:pPr>
+      <w:r>
+        <w:rPr>
+          <w:rFonts w:ascii="Arial" w:cs="Arial" w:eastAsia="Arial" w:hAnsi="Arial"/>
+          <w:sz w:val="22"/>
+          <w:szCs w:val="22"/>
+        </w:rPr>
+        <w:t xml:space="preserve">The CBM Contact entity uses Contact Type (an enum field with values Mentor and Client) to control which detail panels are displayed. The configuration is:</w:t>
+      </w:r>
+    </w:p>
+    <w:p>
+      <w:r>
+        <w:t xml:space="preserve"/>
+      </w:r>
+    </w:p>
+    <w:tbl>
+      <w:tblPr>
+        <w:tblW w:type="dxa" w:w="9360"/>
+        <w:tblBorders>
+          <w:top w:val="single" w:color="auto" w:sz="4"/>
+          <w:left w:val="single" w:color="auto" w:sz="4"/>
+          <w:bottom w:val="single" w:color="auto" w:sz="4"/>
+          <w:right w:val="single" w:color="auto" w:sz="4"/>
+          <w:insideH w:val="single" w:color="auto" w:sz="4"/>
+          <w:insideV w:val="single" w:color="auto" w:sz="4"/>
+        </w:tblBorders>
+      </w:tblPr>
+      <w:tblGrid>
+        <w:gridCol w:w="2800"/>
+        <w:gridCol w:w="2800"/>
+        <w:gridCol w:w="3760"/>
+      </w:tblGrid>
+      <w:tr>
+        <w:tc>
+          <w:tcPr>
+            <w:tcW w:type="dxa" w:w="2800"/>
+            <w:tcBorders>
+              <w:top w:val="single" w:color="AAAAAA" w:sz="1"/>
+              <w:left w:val="single" w:color="AAAAAA" w:sz="1"/>
+              <w:bottom w:val="single" w:color="AAAAAA" w:sz="1"/>
+              <w:right w:val="single" w:color="AAAAAA" w:sz="1"/>
+            </w:tcBorders>
+            <w:shd w:fill="D5E8F0" w:val="clear"/>
+            <w:tcMar>
+              <w:top w:type="dxa" w:w="80"/>
+              <w:left w:type="dxa" w:w="160"/>
+              <w:bottom w:type="dxa" w:w="80"/>
+              <w:right w:type="dxa" w:w="160"/>
+            </w:tcMar>
+          </w:tcPr>
+          <w:p>
+            <w:r>
+              <w:rPr>
+                <w:rFonts w:ascii="Arial" w:cs="Arial" w:eastAsia="Arial" w:hAnsi="Arial"/>
+                <w:b/>
+                <w:bCs/>
+                <w:sz w:val="20"/>
+                <w:szCs w:val="20"/>
+              </w:rPr>
+              <w:t xml:space="preserve">Panel</w:t>
+            </w:r>
+          </w:p>
+        </w:tc>
+        <w:tc>
+          <w:tcPr>
+            <w:tcW w:type="dxa" w:w="2800"/>
+            <w:tcBorders>
+              <w:top w:val="single" w:color="AAAAAA" w:sz="1"/>
+              <w:left w:val="single" w:color="AAAAAA" w:sz="1"/>
+              <w:bottom w:val="single" w:color="AAAAAA" w:sz="1"/>
+              <w:right w:val="single" w:color="AAAAAA" w:sz="1"/>
+            </w:tcBorders>
+            <w:shd w:fill="D5E8F0" w:val="clear"/>
+            <w:tcMar>
+              <w:top w:type="dxa" w:w="80"/>
+              <w:left w:type="dxa" w:w="160"/>
+              <w:bottom w:type="dxa" w:w="80"/>
+              <w:right w:type="dxa" w:w="160"/>
+            </w:tcMar>
+          </w:tcPr>
+          <w:p>
+            <w:r>
+              <w:rPr>
+                <w:rFonts w:ascii="Arial" w:cs="Arial" w:eastAsia="Arial" w:hAnsi="Arial"/>
+                <w:b/>
+                <w:bCs/>
+                <w:sz w:val="20"/>
+                <w:szCs w:val="20"/>
+              </w:rPr>
+              <w:t xml:space="preserve">Visible When</w:t>
+            </w:r>
+          </w:p>
+        </w:tc>
+        <w:tc>
+          <w:tcPr>
+            <w:tcW w:type="dxa" w:w="3760"/>
+            <w:tcBorders>
+              <w:top w:val="single" w:color="AAAAAA" w:sz="1"/>
+              <w:left w:val="single" w:color="AAAAAA" w:sz="1"/>
+              <w:bottom w:val="single" w:color="AAAAAA" w:sz="1"/>
+              <w:right w:val="single" w:color="AAAAAA" w:sz="1"/>
+            </w:tcBorders>
+            <w:shd w:fill="D5E8F0" w:val="clear"/>
+            <w:tcMar>
+              <w:top w:type="dxa" w:w="80"/>
+              <w:left w:type="dxa" w:w="160"/>
+              <w:bottom w:type="dxa" w:w="80"/>
+              <w:right w:type="dxa" w:w="160"/>
+            </w:tcMar>
+          </w:tcPr>
+          <w:p>
+            <w:r>
+              <w:rPr>
+                <w:rFonts w:ascii="Arial" w:cs="Arial" w:eastAsia="Arial" w:hAnsi="Arial"/>
+                <w:b/>
+                <w:bCs/>
+                <w:sz w:val="20"/>
+                <w:szCs w:val="20"/>
+              </w:rPr>
+              <w:t xml:space="preserve">Condition</w:t>
+            </w:r>
+          </w:p>
+        </w:tc>
+      </w:tr>
+      <w:tr>
+        <w:tc>
+          <w:tcPr>
+            <w:tcW w:type="dxa" w:w="2800"/>
+            <w:tcBorders>
+              <w:top w:val="single" w:color="CCCCCC" w:sz="1"/>
+              <w:left w:val="single" w:color="CCCCCC" w:sz="1"/>
+              <w:bottom w:val="single" w:color="CCCCCC" w:sz="1"/>
+              <w:right w:val="single" w:color="CCCCCC" w:sz="1"/>
+            </w:tcBorders>
+            <w:tcMar>
+              <w:top w:type="dxa" w:w="80"/>
+              <w:left w:type="dxa" w:w="160"/>
+              <w:bottom w:type="dxa" w:w="80"/>
+              <w:right w:type="dxa" w:w="160"/>
+            </w:tcMar>
+          </w:tcPr>
+          <w:p>
+            <w:r>
+              <w:rPr>
+                <w:rFonts w:ascii="Arial" w:cs="Arial" w:eastAsia="Arial" w:hAnsi="Arial"/>
+                <w:sz w:val="20"/>
+                <w:szCs w:val="20"/>
+              </w:rPr>
+              <w:t xml:space="preserve">Mentor Details</w:t>
+            </w:r>
+          </w:p>
+        </w:tc>
+        <w:tc>
+          <w:tcPr>
+            <w:tcW w:type="dxa" w:w="2800"/>
+            <w:tcBorders>
+              <w:top w:val="single" w:color="CCCCCC" w:sz="1"/>
+              <w:left w:val="single" w:color="CCCCCC" w:sz="1"/>
+              <w:bottom w:val="single" w:color="CCCCCC" w:sz="1"/>
+              <w:right w:val="single" w:color="CCCCCC" w:sz="1"/>
+            </w:tcBorders>
+            <w:tcMar>
+              <w:top w:type="dxa" w:w="80"/>
+              <w:left w:type="dxa" w:w="160"/>
+              <w:bottom w:type="dxa" w:w="80"/>
+              <w:right w:type="dxa" w:w="160"/>
+            </w:tcMar>
+          </w:tcPr>
+          <w:p>
+            <w:r>
+              <w:rPr>
+                <w:rFonts w:ascii="Arial" w:cs="Arial" w:eastAsia="Arial" w:hAnsi="Arial"/>
+                <w:sz w:val="20"/>
+                <w:szCs w:val="20"/>
+              </w:rPr>
+              <w:t xml:space="preserve">Contact Type = Mentor</w:t>
+            </w:r>
+          </w:p>
+        </w:tc>
+        <w:tc>
+          <w:tcPr>
+            <w:tcW w:type="dxa" w:w="3760"/>
+            <w:tcBorders>
+              <w:top w:val="single" w:color="CCCCCC" w:sz="1"/>
+              <w:left w:val="single" w:color="CCCCCC" w:sz="1"/>
+              <w:bottom w:val="single" w:color="CCCCCC" w:sz="1"/>
+              <w:right w:val="single" w:color="CCCCCC" w:sz="1"/>
+            </w:tcBorders>
+            <w:tcMar>
+              <w:top w:type="dxa" w:w="80"/>
+              <w:left w:type="dxa" w:w="160"/>
+              <w:bottom w:type="dxa" w:w="80"/>
+              <w:right w:type="dxa" w:w="160"/>
+            </w:tcMar>
+          </w:tcPr>
+          <w:p>
+            <w:r>
+              <w:rPr>
+                <w:rFonts w:ascii="Arial" w:cs="Arial" w:eastAsia="Arial" w:hAnsi="Arial"/>
+                <w:sz w:val="20"/>
+                <w:szCs w:val="20"/>
+              </w:rPr>
+              <w:t xml:space="preserve">Contact Type Equals Mentor</w:t>
+            </w:r>
+          </w:p>
+        </w:tc>
+      </w:tr>
+      <w:tr>
+        <w:tc>
+          <w:tcPr>
+            <w:tcW w:type="dxa" w:w="2800"/>
+            <w:tcBorders>
+              <w:top w:val="single" w:color="CCCCCC" w:sz="1"/>
+              <w:left w:val="single" w:color="CCCCCC" w:sz="1"/>
+              <w:bottom w:val="single" w:color="CCCCCC" w:sz="1"/>
+              <w:right w:val="single" w:color="CCCCCC" w:sz="1"/>
+            </w:tcBorders>
+            <w:tcMar>
+              <w:top w:type="dxa" w:w="80"/>
+              <w:left w:type="dxa" w:w="160"/>
+              <w:bottom w:type="dxa" w:w="80"/>
+              <w:right w:type="dxa" w:w="160"/>
+            </w:tcMar>
+          </w:tcPr>
+          <w:p>
+            <w:r>
+              <w:rPr>
+                <w:rFonts w:ascii="Arial" w:cs="Arial" w:eastAsia="Arial" w:hAnsi="Arial"/>
+                <w:sz w:val="20"/>
+                <w:szCs w:val="20"/>
+              </w:rPr>
+              <w:t xml:space="preserve">Client Details</w:t>
+            </w:r>
+          </w:p>
+        </w:tc>
+        <w:tc>
+          <w:tcPr>
+            <w:tcW w:type="dxa" w:w="2800"/>
+            <w:tcBorders>
+              <w:top w:val="single" w:color="CCCCCC" w:sz="1"/>
+              <w:left w:val="single" w:color="CCCCCC" w:sz="1"/>
+              <w:bottom w:val="single" w:color="CCCCCC" w:sz="1"/>
+              <w:right w:val="single" w:color="CCCCCC" w:sz="1"/>
+            </w:tcBorders>
+            <w:tcMar>
+              <w:top w:type="dxa" w:w="80"/>
+              <w:left w:type="dxa" w:w="160"/>
+              <w:bottom w:type="dxa" w:w="80"/>
+              <w:right w:type="dxa" w:w="160"/>
+            </w:tcMar>
+          </w:tcPr>
+          <w:p>
+            <w:r>
+              <w:rPr>
+                <w:rFonts w:ascii="Arial" w:cs="Arial" w:eastAsia="Arial" w:hAnsi="Arial"/>
+                <w:sz w:val="20"/>
+                <w:szCs w:val="20"/>
+              </w:rPr>
+              <w:t xml:space="preserve">Contact Type = Client</w:t>
+            </w:r>
+          </w:p>
+        </w:tc>
+        <w:tc>
+          <w:tcPr>
+            <w:tcW w:type="dxa" w:w="3760"/>
+            <w:tcBorders>
+              <w:top w:val="single" w:color="CCCCCC" w:sz="1"/>
+              <w:left w:val="single" w:color="CCCCCC" w:sz="1"/>
+              <w:bottom w:val="single" w:color="CCCCCC" w:sz="1"/>
+              <w:right w:val="single" w:color="CCCCCC" w:sz="1"/>
+            </w:tcBorders>
+            <w:tcMar>
+              <w:top w:type="dxa" w:w="80"/>
+              <w:left w:type="dxa" w:w="160"/>
+              <w:bottom w:type="dxa" w:w="80"/>
+              <w:right w:type="dxa" w:w="160"/>
+            </w:tcMar>
+          </w:tcPr>
+          <w:p>
+            <w:r>
+              <w:rPr>
+                <w:rFonts w:ascii="Arial" w:cs="Arial" w:eastAsia="Arial" w:hAnsi="Arial"/>
+                <w:sz w:val="20"/>
+                <w:szCs w:val="20"/>
+              </w:rPr>
+              <w:t xml:space="preserve">Contact Type Equals Client</w:t>
+            </w:r>
+          </w:p>
+        </w:tc>
+      </w:tr>
+    </w:tbl>
+    <w:p>
+      <w:r>
+        <w:t xml:space="preserve"/>
+      </w:r>
+    </w:p>
+    <w:p>
+      <w:r>
+        <w:t xml:space="preserve"/>
+      </w:r>
+    </w:p>
+    <w:p>
+      <w:pPr>
+        <w:spacing w:after="120"/>
+      </w:pPr>
+      <w:r>
+        <w:rPr>
+          <w:rFonts w:ascii="Arial" w:cs="Arial" w:eastAsia="Arial" w:hAnsi="Arial"/>
+          <w:sz w:val="22"/>
+          <w:szCs w:val="22"/>
+        </w:rPr>
+        <w:t xml:space="preserve">When a Contact record is opened, only the panel matching the current Contact Type value is displayed. If Contact Type is not yet set, neither panel is shown until a value is selected.</w:t>
+      </w:r>
+    </w:p>
+    <w:p>
+      <w:r>
+        <w:t xml:space="preserve"/>
+      </w:r>
+    </w:p>
+    <w:tbl>
+      <w:tblPr>
+        <w:tblW w:type="dxa" w:w="9360"/>
+        <w:tblBorders>
+          <w:top w:val="single" w:color="auto" w:sz="4"/>
+          <w:left w:val="single" w:color="auto" w:sz="4"/>
+          <w:bottom w:val="single" w:color="auto" w:sz="4"/>
+          <w:right w:val="single" w:color="auto" w:sz="4"/>
+          <w:insideH w:val="single" w:color="auto" w:sz="4"/>
+          <w:insideV w:val="single" w:color="auto" w:sz="4"/>
+        </w:tblBorders>
+      </w:tblPr>
+      <w:tblGrid>
+        <w:gridCol w:w="9360"/>
+      </w:tblGrid>
+      <w:tr>
+        <w:tc>
+          <w:tcPr>
+            <w:tcW w:type="dxa" w:w="9360"/>
+            <w:tcBorders>
+              <w:top w:val="single" w:color="FFC107" w:sz="4"/>
+              <w:left w:val="single" w:color="FFC107" w:sz="4"/>
+              <w:bottom w:val="single" w:color="FFC107" w:sz="4"/>
+              <w:right w:val="single" w:color="FFC107" w:sz="4"/>
+            </w:tcBorders>
+            <w:shd w:fill="FFF3CD" w:val="clear"/>
+            <w:tcMar>
+              <w:top w:type="dxa" w:w="100"/>
+              <w:left w:type="dxa" w:w="160"/>
+              <w:bottom w:type="dxa" w:w="100"/>
+              <w:right w:type="dxa" w:w="160"/>
+            </w:tcMar>
+          </w:tcPr>
+          <w:p>
+            <w:r>
+              <w:rPr>
+                <w:rFonts w:ascii="Arial" w:cs="Arial" w:eastAsia="Arial" w:hAnsi="Arial"/>
+                <w:b/>
+                <w:bCs/>
+                <w:sz w:val="22"/>
+                <w:szCs w:val="22"/>
+              </w:rPr>
+              <w:t xml:space="preserve">Note: </w:t>
+            </w:r>
+            <w:r>
+              <w:rPr>
+                <w:rFonts w:ascii="Arial" w:cs="Arial" w:eastAsia="Arial" w:hAnsi="Arial"/>
+                <w:sz w:val="22"/>
+                <w:szCs w:val="22"/>
+              </w:rPr>
+              <w:t xml:space="preserve">Dynamic Logic conditions apply to the detail view and edit view only. They do not filter which records appear in list views or relationship panels — for that, use search filters or saved views.</w:t>
             </w:r>
           </w:p>
         </w:tc>

</xml_diff>

<commit_message>
Update CBM-EspoCRM-HowTo.docx - add SMS/Twilio integration section
</commit_message>
<xml_diff>
--- a/PRDs/CBM-EspoCRM-HowTo.docx
+++ b/PRDs/CBM-EspoCRM-HowTo.docx
@@ -10007,6 +10007,884 @@
         <w:t xml:space="preserve">A single push action can process up to 10 records immediately. If more than 10 records are selected, the remainder will be pushed in the background by the system's scheduled task (cron). After the push completes, the contacts will be available in Google Contacts, organized into the groups specified during setup if applicable.</w:t>
       </w:r>
     </w:p>
+    <w:p>
+      <w:r>
+        <w:t xml:space="preserve"/>
+      </w:r>
+    </w:p>
+    <w:p>
+      <w:pPr>
+        <w:pStyle w:val="Heading2"/>
+      </w:pPr>
+      <w:r>
+        <w:rPr>
+          <w:rFonts w:ascii="Arial" w:cs="Arial" w:eastAsia="Arial" w:hAnsi="Arial"/>
+          <w:b/>
+          <w:bCs/>
+          <w:color w:val="2E75B6"/>
+          <w:sz w:val="26"/>
+          <w:szCs w:val="26"/>
+        </w:rPr>
+        <w:t xml:space="preserve">11. SMS Sending via Twilio</w:t>
+      </w:r>
+    </w:p>
+    <w:p>
+      <w:r>
+        <w:t xml:space="preserve"/>
+      </w:r>
+    </w:p>
+    <w:p>
+      <w:pPr>
+        <w:spacing w:after="120"/>
+      </w:pPr>
+      <w:r>
+        <w:rPr>
+          <w:rFonts w:ascii="Arial" w:cs="Arial" w:eastAsia="Arial" w:hAnsi="Arial"/>
+          <w:sz w:val="22"/>
+          <w:szCs w:val="22"/>
+        </w:rPr>
+        <w:t xml:space="preserve">EspoCRM includes built-in functionality for sending SMS messages but does not ship with any SMS provider out of the box. SMS sending requires the official SMS Providers extension, which adds support for multiple providers including Twilio.</w:t>
+      </w:r>
+    </w:p>
+    <w:p>
+      <w:r>
+        <w:t xml:space="preserve"/>
+      </w:r>
+    </w:p>
+    <w:p>
+      <w:pPr>
+        <w:pStyle w:val="Heading3"/>
+      </w:pPr>
+      <w:r>
+        <w:rPr>
+          <w:rFonts w:ascii="Arial" w:cs="Arial" w:eastAsia="Arial" w:hAnsi="Arial"/>
+          <w:b/>
+          <w:bCs/>
+          <w:color w:val="595959"/>
+          <w:sz w:val="24"/>
+          <w:szCs w:val="24"/>
+        </w:rPr>
+        <w:t xml:space="preserve">11.1 Supported SMS Providers</w:t>
+      </w:r>
+    </w:p>
+    <w:p>
+      <w:pPr>
+        <w:spacing w:after="120"/>
+      </w:pPr>
+      <w:r>
+        <w:rPr>
+          <w:rFonts w:ascii="Arial" w:cs="Arial" w:eastAsia="Arial" w:hAnsi="Arial"/>
+          <w:sz w:val="22"/>
+          <w:szCs w:val="22"/>
+        </w:rPr>
+        <w:t xml:space="preserve">The SMS Providers extension supports the following providers:</w:t>
+      </w:r>
+    </w:p>
+    <w:p>
+      <w:r>
+        <w:t xml:space="preserve"/>
+      </w:r>
+    </w:p>
+    <w:p>
+      <w:pPr>
+        <w:pStyle w:val="ListParagraph"/>
+        <w:numPr>
+          <w:ilvl w:val="0"/>
+          <w:numId w:val="2"/>
+        </w:numPr>
+        <w:spacing w:after="80"/>
+      </w:pPr>
+      <w:r>
+        <w:rPr>
+          <w:rFonts w:ascii="Arial" w:cs="Arial" w:eastAsia="Arial" w:hAnsi="Arial"/>
+          <w:sz w:val="22"/>
+          <w:szCs w:val="22"/>
+        </w:rPr>
+        <w:t xml:space="preserve">Twilio</w:t>
+      </w:r>
+    </w:p>
+    <w:p>
+      <w:pPr>
+        <w:pStyle w:val="ListParagraph"/>
+        <w:numPr>
+          <w:ilvl w:val="0"/>
+          <w:numId w:val="2"/>
+        </w:numPr>
+        <w:spacing w:after="80"/>
+      </w:pPr>
+      <w:r>
+        <w:rPr>
+          <w:rFonts w:ascii="Arial" w:cs="Arial" w:eastAsia="Arial" w:hAnsi="Arial"/>
+          <w:sz w:val="22"/>
+          <w:szCs w:val="22"/>
+        </w:rPr>
+        <w:t xml:space="preserve">Spryng</w:t>
+      </w:r>
+    </w:p>
+    <w:p>
+      <w:pPr>
+        <w:pStyle w:val="ListParagraph"/>
+        <w:numPr>
+          <w:ilvl w:val="0"/>
+          <w:numId w:val="2"/>
+        </w:numPr>
+        <w:spacing w:after="80"/>
+      </w:pPr>
+      <w:r>
+        <w:rPr>
+          <w:rFonts w:ascii="Arial" w:cs="Arial" w:eastAsia="Arial" w:hAnsi="Arial"/>
+          <w:sz w:val="22"/>
+          <w:szCs w:val="22"/>
+        </w:rPr>
+        <w:t xml:space="preserve">seven</w:t>
+      </w:r>
+    </w:p>
+    <w:p>
+      <w:pPr>
+        <w:pStyle w:val="ListParagraph"/>
+        <w:numPr>
+          <w:ilvl w:val="0"/>
+          <w:numId w:val="2"/>
+        </w:numPr>
+        <w:spacing w:after="80"/>
+      </w:pPr>
+      <w:r>
+        <w:rPr>
+          <w:rFonts w:ascii="Arial" w:cs="Arial" w:eastAsia="Arial" w:hAnsi="Arial"/>
+          <w:sz w:val="22"/>
+          <w:szCs w:val="22"/>
+        </w:rPr>
+        <w:t xml:space="preserve">smstools</w:t>
+      </w:r>
+    </w:p>
+    <w:p>
+      <w:pPr>
+        <w:pStyle w:val="ListParagraph"/>
+        <w:numPr>
+          <w:ilvl w:val="0"/>
+          <w:numId w:val="2"/>
+        </w:numPr>
+        <w:spacing w:after="80"/>
+      </w:pPr>
+      <w:r>
+        <w:rPr>
+          <w:rFonts w:ascii="Arial" w:cs="Arial" w:eastAsia="Arial" w:hAnsi="Arial"/>
+          <w:sz w:val="22"/>
+          <w:szCs w:val="22"/>
+        </w:rPr>
+        <w:t xml:space="preserve">SerwerSms</w:t>
+      </w:r>
+    </w:p>
+    <w:p>
+      <w:pPr>
+        <w:pStyle w:val="ListParagraph"/>
+        <w:numPr>
+          <w:ilvl w:val="0"/>
+          <w:numId w:val="2"/>
+        </w:numPr>
+        <w:spacing w:after="80"/>
+      </w:pPr>
+      <w:r>
+        <w:rPr>
+          <w:rFonts w:ascii="Arial" w:cs="Arial" w:eastAsia="Arial" w:hAnsi="Arial"/>
+          <w:sz w:val="22"/>
+          <w:szCs w:val="22"/>
+        </w:rPr>
+        <w:t xml:space="preserve">Verimor</w:t>
+      </w:r>
+    </w:p>
+    <w:p>
+      <w:pPr>
+        <w:pStyle w:val="ListParagraph"/>
+        <w:numPr>
+          <w:ilvl w:val="0"/>
+          <w:numId w:val="2"/>
+        </w:numPr>
+        <w:spacing w:after="80"/>
+      </w:pPr>
+      <w:r>
+        <w:rPr>
+          <w:rFonts w:ascii="Arial" w:cs="Arial" w:eastAsia="Arial" w:hAnsi="Arial"/>
+          <w:sz w:val="22"/>
+          <w:szCs w:val="22"/>
+        </w:rPr>
+        <w:t xml:space="preserve">GatewayAPI</w:t>
+      </w:r>
+    </w:p>
+    <w:p>
+      <w:r>
+        <w:t xml:space="preserve"/>
+      </w:r>
+    </w:p>
+    <w:tbl>
+      <w:tblPr>
+        <w:tblW w:type="dxa" w:w="9360"/>
+        <w:tblBorders>
+          <w:top w:val="single" w:color="auto" w:sz="4"/>
+          <w:left w:val="single" w:color="auto" w:sz="4"/>
+          <w:bottom w:val="single" w:color="auto" w:sz="4"/>
+          <w:right w:val="single" w:color="auto" w:sz="4"/>
+          <w:insideH w:val="single" w:color="auto" w:sz="4"/>
+          <w:insideV w:val="single" w:color="auto" w:sz="4"/>
+        </w:tblBorders>
+      </w:tblPr>
+      <w:tblGrid>
+        <w:gridCol w:w="9360"/>
+      </w:tblGrid>
+      <w:tr>
+        <w:tc>
+          <w:tcPr>
+            <w:tcW w:type="dxa" w:w="9360"/>
+            <w:tcBorders>
+              <w:top w:val="single" w:color="FFC107" w:sz="4"/>
+              <w:left w:val="single" w:color="FFC107" w:sz="4"/>
+              <w:bottom w:val="single" w:color="FFC107" w:sz="4"/>
+              <w:right w:val="single" w:color="FFC107" w:sz="4"/>
+            </w:tcBorders>
+            <w:shd w:fill="FFF3CD" w:val="clear"/>
+            <w:tcMar>
+              <w:top w:type="dxa" w:w="100"/>
+              <w:left w:type="dxa" w:w="160"/>
+              <w:bottom w:type="dxa" w:w="100"/>
+              <w:right w:type="dxa" w:w="160"/>
+            </w:tcMar>
+          </w:tcPr>
+          <w:p>
+            <w:r>
+              <w:rPr>
+                <w:rFonts w:ascii="Arial" w:cs="Arial" w:eastAsia="Arial" w:hAnsi="Arial"/>
+                <w:b/>
+                <w:bCs/>
+                <w:sz w:val="22"/>
+                <w:szCs w:val="22"/>
+              </w:rPr>
+              <w:t xml:space="preserve">Note: </w:t>
+            </w:r>
+            <w:r>
+              <w:rPr>
+                <w:rFonts w:ascii="Arial" w:cs="Arial" w:eastAsia="Arial" w:hAnsi="Arial"/>
+                <w:sz w:val="22"/>
+                <w:szCs w:val="22"/>
+              </w:rPr>
+              <w:t xml:space="preserve">Out of the box, SMS can be sent from a Formula script or PHP code. The VoIP Integration additionally provides the ability to send SMS through the EspoCRM UI, but this is available only for the Twilio provider.</w:t>
+            </w:r>
+          </w:p>
+        </w:tc>
+      </w:tr>
+    </w:tbl>
+    <w:p>
+      <w:r>
+        <w:t xml:space="preserve"/>
+      </w:r>
+    </w:p>
+    <w:p>
+      <w:pPr>
+        <w:pStyle w:val="Heading3"/>
+      </w:pPr>
+      <w:r>
+        <w:rPr>
+          <w:rFonts w:ascii="Arial" w:cs="Arial" w:eastAsia="Arial" w:hAnsi="Arial"/>
+          <w:b/>
+          <w:bCs/>
+          <w:color w:val="595959"/>
+          <w:sz w:val="24"/>
+          <w:szCs w:val="24"/>
+        </w:rPr>
+        <w:t xml:space="preserve">11.2 Step 1 — Install the SMS Providers Extension</w:t>
+      </w:r>
+    </w:p>
+    <w:p>
+      <w:pPr>
+        <w:spacing w:after="120"/>
+      </w:pPr>
+      <w:r>
+        <w:rPr>
+          <w:rFonts w:ascii="Arial" w:cs="Arial" w:eastAsia="Arial" w:hAnsi="Arial"/>
+          <w:sz w:val="22"/>
+          <w:szCs w:val="22"/>
+        </w:rPr>
+        <w:t xml:space="preserve">Download the extension package from the EspoCRM SMS Providers GitHub repository (look under the Assets section of the latest release). Then install it in EspoCRM:</w:t>
+      </w:r>
+    </w:p>
+    <w:p>
+      <w:r>
+        <w:t xml:space="preserve"/>
+      </w:r>
+    </w:p>
+    <w:p>
+      <w:pPr>
+        <w:pStyle w:val="ListParagraph"/>
+        <w:numPr>
+          <w:ilvl w:val="0"/>
+          <w:numId w:val="3"/>
+        </w:numPr>
+        <w:spacing w:after="100"/>
+      </w:pPr>
+      <w:r>
+        <w:rPr>
+          <w:rFonts w:ascii="Arial" w:cs="Arial" w:eastAsia="Arial" w:hAnsi="Arial"/>
+          <w:sz w:val="22"/>
+          <w:szCs w:val="22"/>
+        </w:rPr>
+        <w:t xml:space="preserve">Go to: Admin → Extensions.</w:t>
+      </w:r>
+    </w:p>
+    <w:p>
+      <w:pPr>
+        <w:pStyle w:val="ListParagraph"/>
+        <w:numPr>
+          <w:ilvl w:val="0"/>
+          <w:numId w:val="3"/>
+        </w:numPr>
+        <w:spacing w:after="100"/>
+      </w:pPr>
+      <w:r>
+        <w:rPr>
+          <w:rFonts w:ascii="Arial" w:cs="Arial" w:eastAsia="Arial" w:hAnsi="Arial"/>
+          <w:sz w:val="22"/>
+          <w:szCs w:val="22"/>
+        </w:rPr>
+        <w:t xml:space="preserve">Click Choose File and select the downloaded extension package.</w:t>
+      </w:r>
+    </w:p>
+    <w:p>
+      <w:pPr>
+        <w:pStyle w:val="ListParagraph"/>
+        <w:numPr>
+          <w:ilvl w:val="0"/>
+          <w:numId w:val="3"/>
+        </w:numPr>
+        <w:spacing w:after="100"/>
+      </w:pPr>
+      <w:r>
+        <w:rPr>
+          <w:rFonts w:ascii="Arial" w:cs="Arial" w:eastAsia="Arial" w:hAnsi="Arial"/>
+          <w:sz w:val="22"/>
+          <w:szCs w:val="22"/>
+        </w:rPr>
+        <w:t xml:space="preserve">Click Upload, then follow the prompts to install.</w:t>
+      </w:r>
+    </w:p>
+    <w:p>
+      <w:r>
+        <w:t xml:space="preserve"/>
+      </w:r>
+    </w:p>
+    <w:p>
+      <w:pPr>
+        <w:pStyle w:val="Heading3"/>
+      </w:pPr>
+      <w:r>
+        <w:rPr>
+          <w:rFonts w:ascii="Arial" w:cs="Arial" w:eastAsia="Arial" w:hAnsi="Arial"/>
+          <w:b/>
+          <w:bCs/>
+          <w:color w:val="595959"/>
+          <w:sz w:val="24"/>
+          <w:szCs w:val="24"/>
+        </w:rPr>
+        <w:t xml:space="preserve">11.3 Step 2 — Configure the SMS Provider</w:t>
+      </w:r>
+    </w:p>
+    <w:p>
+      <w:pPr>
+        <w:spacing w:after="120"/>
+      </w:pPr>
+      <w:r>
+        <w:rPr>
+          <w:rFonts w:ascii="Arial" w:cs="Arial" w:eastAsia="Arial" w:hAnsi="Arial"/>
+          <w:sz w:val="22"/>
+          <w:szCs w:val="22"/>
+        </w:rPr>
+        <w:t xml:space="preserve">After the extension is installed, configure the SMS provider settings:</w:t>
+      </w:r>
+    </w:p>
+    <w:p>
+      <w:r>
+        <w:t xml:space="preserve"/>
+      </w:r>
+    </w:p>
+    <w:p>
+      <w:pPr>
+        <w:pStyle w:val="ListParagraph"/>
+        <w:numPr>
+          <w:ilvl w:val="0"/>
+          <w:numId w:val="3"/>
+        </w:numPr>
+        <w:spacing w:after="100"/>
+      </w:pPr>
+      <w:r>
+        <w:rPr>
+          <w:rFonts w:ascii="Arial" w:cs="Arial" w:eastAsia="Arial" w:hAnsi="Arial"/>
+          <w:sz w:val="22"/>
+          <w:szCs w:val="22"/>
+        </w:rPr>
+        <w:t xml:space="preserve">Go to: Admin → SMS.</w:t>
+      </w:r>
+    </w:p>
+    <w:p>
+      <w:pPr>
+        <w:pStyle w:val="ListParagraph"/>
+        <w:numPr>
+          <w:ilvl w:val="0"/>
+          <w:numId w:val="3"/>
+        </w:numPr>
+        <w:spacing w:after="100"/>
+      </w:pPr>
+      <w:r>
+        <w:rPr>
+          <w:rFonts w:ascii="Arial" w:cs="Arial" w:eastAsia="Arial" w:hAnsi="Arial"/>
+          <w:sz w:val="22"/>
+          <w:szCs w:val="22"/>
+        </w:rPr>
+        <w:t xml:space="preserve">Select your SMS provider from the Provider dropdown (e.g., Twilio).</w:t>
+      </w:r>
+    </w:p>
+    <w:p>
+      <w:pPr>
+        <w:pStyle w:val="ListParagraph"/>
+        <w:numPr>
+          <w:ilvl w:val="0"/>
+          <w:numId w:val="3"/>
+        </w:numPr>
+        <w:spacing w:after="100"/>
+      </w:pPr>
+      <w:r>
+        <w:rPr>
+          <w:rFonts w:ascii="Arial" w:cs="Arial" w:eastAsia="Arial" w:hAnsi="Arial"/>
+          <w:sz w:val="22"/>
+          <w:szCs w:val="22"/>
+        </w:rPr>
+        <w:t xml:space="preserve">In the SMS From Number field, enter the sending phone number including the country code (e.g., +11111111111).</w:t>
+      </w:r>
+    </w:p>
+    <w:p>
+      <w:pPr>
+        <w:pStyle w:val="ListParagraph"/>
+        <w:numPr>
+          <w:ilvl w:val="0"/>
+          <w:numId w:val="3"/>
+        </w:numPr>
+        <w:spacing w:after="100"/>
+      </w:pPr>
+      <w:r>
+        <w:rPr>
+          <w:rFonts w:ascii="Arial" w:cs="Arial" w:eastAsia="Arial" w:hAnsi="Arial"/>
+          <w:sz w:val="22"/>
+          <w:szCs w:val="22"/>
+        </w:rPr>
+        <w:t xml:space="preserve">Click Save.</w:t>
+      </w:r>
+    </w:p>
+    <w:p>
+      <w:r>
+        <w:t xml:space="preserve"/>
+      </w:r>
+    </w:p>
+    <w:p>
+      <w:pPr>
+        <w:pStyle w:val="ListParagraph"/>
+        <w:numPr>
+          <w:ilvl w:val="0"/>
+          <w:numId w:val="3"/>
+        </w:numPr>
+        <w:spacing w:after="100"/>
+      </w:pPr>
+      <w:r>
+        <w:rPr>
+          <w:rFonts w:ascii="Arial" w:cs="Arial" w:eastAsia="Arial" w:hAnsi="Arial"/>
+          <w:sz w:val="22"/>
+          <w:szCs w:val="22"/>
+        </w:rPr>
+        <w:t xml:space="preserve">Go to: Admin → Integrations and select your provider (e.g., Twilio).</w:t>
+      </w:r>
+    </w:p>
+    <w:p>
+      <w:pPr>
+        <w:pStyle w:val="ListParagraph"/>
+        <w:numPr>
+          <w:ilvl w:val="0"/>
+          <w:numId w:val="3"/>
+        </w:numPr>
+        <w:spacing w:after="100"/>
+      </w:pPr>
+      <w:r>
+        <w:rPr>
+          <w:rFonts w:ascii="Arial" w:cs="Arial" w:eastAsia="Arial" w:hAnsi="Arial"/>
+          <w:sz w:val="22"/>
+          <w:szCs w:val="22"/>
+        </w:rPr>
+        <w:t xml:space="preserve">Enter the required credentials and parameters for that provider (for Twilio: Account SID and Auth Token from your Twilio console).</w:t>
+      </w:r>
+    </w:p>
+    <w:p>
+      <w:pPr>
+        <w:pStyle w:val="ListParagraph"/>
+        <w:numPr>
+          <w:ilvl w:val="0"/>
+          <w:numId w:val="3"/>
+        </w:numPr>
+        <w:spacing w:after="100"/>
+      </w:pPr>
+      <w:r>
+        <w:rPr>
+          <w:rFonts w:ascii="Arial" w:cs="Arial" w:eastAsia="Arial" w:hAnsi="Arial"/>
+          <w:sz w:val="22"/>
+          <w:szCs w:val="22"/>
+        </w:rPr>
+        <w:t xml:space="preserve">Click Save.</w:t>
+      </w:r>
+    </w:p>
+    <w:p>
+      <w:r>
+        <w:t xml:space="preserve"/>
+      </w:r>
+    </w:p>
+    <w:p>
+      <w:pPr>
+        <w:pStyle w:val="Heading3"/>
+      </w:pPr>
+      <w:r>
+        <w:rPr>
+          <w:rFonts w:ascii="Arial" w:cs="Arial" w:eastAsia="Arial" w:hAnsi="Arial"/>
+          <w:b/>
+          <w:bCs/>
+          <w:color w:val="595959"/>
+          <w:sz w:val="24"/>
+          <w:szCs w:val="24"/>
+        </w:rPr>
+        <w:t xml:space="preserve">11.4 Sending SMS via Formula Script</w:t>
+      </w:r>
+    </w:p>
+    <w:p>
+      <w:pPr>
+        <w:spacing w:after="120"/>
+      </w:pPr>
+      <w:r>
+        <w:rPr>
+          <w:rFonts w:ascii="Arial" w:cs="Arial" w:eastAsia="Arial" w:hAnsi="Arial"/>
+          <w:sz w:val="22"/>
+          <w:szCs w:val="22"/>
+        </w:rPr>
+        <w:t xml:space="preserve">Once the extension is installed and configured, SMS messages can be sent programmatically using the ext\sms\send formula function. This is useful for automated notifications triggered by workflows or other system events.</w:t>
+      </w:r>
+    </w:p>
+    <w:p>
+      <w:r>
+        <w:t xml:space="preserve"/>
+      </w:r>
+    </w:p>
+    <w:p>
+      <w:pPr>
+        <w:pStyle w:val="Heading3"/>
+      </w:pPr>
+      <w:r>
+        <w:rPr>
+          <w:rFonts w:ascii="Arial" w:cs="Arial" w:eastAsia="Arial" w:hAnsi="Arial"/>
+          <w:b/>
+          <w:bCs/>
+          <w:color w:val="595959"/>
+          <w:sz w:val="24"/>
+          <w:szCs w:val="24"/>
+        </w:rPr>
+        <w:t xml:space="preserve">11.5 Sending SMS via Workflow (Requires Advanced Pack)</w:t>
+      </w:r>
+    </w:p>
+    <w:p>
+      <w:pPr>
+        <w:spacing w:after="120"/>
+      </w:pPr>
+      <w:r>
+        <w:rPr>
+          <w:rFonts w:ascii="Arial" w:cs="Arial" w:eastAsia="Arial" w:hAnsi="Arial"/>
+          <w:sz w:val="22"/>
+          <w:szCs w:val="22"/>
+        </w:rPr>
+        <w:t xml:space="preserve">With the Workflow tool and the Advanced Pack extension, EspoCRM can be configured to send SMS notifications automatically when specific conditions are met. To set this up:</w:t>
+      </w:r>
+    </w:p>
+    <w:p>
+      <w:r>
+        <w:t xml:space="preserve"/>
+      </w:r>
+    </w:p>
+    <w:p>
+      <w:pPr>
+        <w:pStyle w:val="ListParagraph"/>
+        <w:numPr>
+          <w:ilvl w:val="0"/>
+          <w:numId w:val="3"/>
+        </w:numPr>
+        <w:spacing w:after="100"/>
+      </w:pPr>
+      <w:r>
+        <w:rPr>
+          <w:rFonts w:ascii="Arial" w:cs="Arial" w:eastAsia="Arial" w:hAnsi="Arial"/>
+          <w:sz w:val="22"/>
+          <w:szCs w:val="22"/>
+        </w:rPr>
+        <w:t xml:space="preserve">Create a new Workflow rule with the desired trigger type and conditions (e.g., when an Engagement status changes to Active).</w:t>
+      </w:r>
+    </w:p>
+    <w:p>
+      <w:pPr>
+        <w:pStyle w:val="ListParagraph"/>
+        <w:numPr>
+          <w:ilvl w:val="0"/>
+          <w:numId w:val="3"/>
+        </w:numPr>
+        <w:spacing w:after="100"/>
+      </w:pPr>
+      <w:r>
+        <w:rPr>
+          <w:rFonts w:ascii="Arial" w:cs="Arial" w:eastAsia="Arial" w:hAnsi="Arial"/>
+          <w:sz w:val="22"/>
+          <w:szCs w:val="22"/>
+        </w:rPr>
+        <w:t xml:space="preserve">Add an Execute Formula Script action to the workflow.</w:t>
+      </w:r>
+    </w:p>
+    <w:p>
+      <w:pPr>
+        <w:pStyle w:val="ListParagraph"/>
+        <w:numPr>
+          <w:ilvl w:val="0"/>
+          <w:numId w:val="3"/>
+        </w:numPr>
+        <w:spacing w:after="100"/>
+      </w:pPr>
+      <w:r>
+        <w:rPr>
+          <w:rFonts w:ascii="Arial" w:cs="Arial" w:eastAsia="Arial" w:hAnsi="Arial"/>
+          <w:sz w:val="22"/>
+          <w:szCs w:val="22"/>
+        </w:rPr>
+        <w:t xml:space="preserve">Paste a formula script that creates an SMS record and sends it. A basic example:</w:t>
+      </w:r>
+    </w:p>
+    <w:p>
+      <w:r>
+        <w:t xml:space="preserve"/>
+      </w:r>
+    </w:p>
+    <w:tbl>
+      <w:tblPr>
+        <w:tblW w:type="dxa" w:w="9360"/>
+        <w:tblBorders>
+          <w:top w:val="single" w:color="auto" w:sz="4"/>
+          <w:left w:val="single" w:color="auto" w:sz="4"/>
+          <w:bottom w:val="single" w:color="auto" w:sz="4"/>
+          <w:right w:val="single" w:color="auto" w:sz="4"/>
+          <w:insideH w:val="single" w:color="auto" w:sz="4"/>
+          <w:insideV w:val="single" w:color="auto" w:sz="4"/>
+        </w:tblBorders>
+      </w:tblPr>
+      <w:tblGrid>
+        <w:gridCol w:w="9360"/>
+      </w:tblGrid>
+      <w:tr>
+        <w:tc>
+          <w:tcPr>
+            <w:tcW w:type="dxa" w:w="9360"/>
+            <w:tcBorders>
+              <w:top w:val="single" w:color="CCCCCC" w:sz="1"/>
+              <w:left w:val="single" w:color="CCCCCC" w:sz="1"/>
+              <w:bottom w:val="single" w:color="CCCCCC" w:sz="1"/>
+              <w:right w:val="single" w:color="CCCCCC" w:sz="1"/>
+            </w:tcBorders>
+            <w:shd w:fill="F5F5F5" w:val="clear"/>
+            <w:tcMar>
+              <w:top w:type="dxa" w:w="100"/>
+              <w:left w:type="dxa" w:w="200"/>
+              <w:bottom w:type="dxa" w:w="100"/>
+              <w:right w:type="dxa" w:w="200"/>
+            </w:tcMar>
+          </w:tcPr>
+          <w:p>
+            <w:r>
+              <w:rPr>
+                <w:rFonts w:ascii="Courier New" w:cs="Courier New" w:eastAsia="Courier New" w:hAnsi="Courier New"/>
+                <w:sz w:val="18"/>
+                <w:szCs w:val="18"/>
+              </w:rPr>
+              <w:t xml:space="preserve">$body = 'Hi! This is an SMS notification from EspoCRM.';</w:t>
+            </w:r>
+          </w:p>
+          <w:p>
+            <w:r>
+              <w:rPr>
+                <w:rFonts w:ascii="Courier New" w:cs="Courier New" w:eastAsia="Courier New" w:hAnsi="Courier New"/>
+                <w:sz w:val="18"/>
+                <w:szCs w:val="18"/>
+              </w:rPr>
+              <w:t xml:space="preserve"/>
+            </w:r>
+          </w:p>
+          <w:p>
+            <w:r>
+              <w:rPr>
+                <w:rFonts w:ascii="Courier New" w:cs="Courier New" w:eastAsia="Courier New" w:hAnsi="Courier New"/>
+                <w:color w:val="666666"/>
+                <w:sz w:val="18"/>
+                <w:szCs w:val="18"/>
+              </w:rPr>
+              <w:t xml:space="preserve">// Phone number is obtained from the entity.</w:t>
+            </w:r>
+          </w:p>
+          <w:p>
+            <w:r>
+              <w:rPr>
+                <w:rFonts w:ascii="Courier New" w:cs="Courier New" w:eastAsia="Courier New" w:hAnsi="Courier New"/>
+                <w:sz w:val="18"/>
+                <w:szCs w:val="18"/>
+              </w:rPr>
+              <w:t xml:space="preserve">$phoneNumber = phoneNumber;</w:t>
+            </w:r>
+          </w:p>
+          <w:p>
+            <w:r>
+              <w:rPr>
+                <w:rFonts w:ascii="Courier New" w:cs="Courier New" w:eastAsia="Courier New" w:hAnsi="Courier New"/>
+                <w:sz w:val="18"/>
+                <w:szCs w:val="18"/>
+              </w:rPr>
+              <w:t xml:space="preserve"/>
+            </w:r>
+          </w:p>
+          <w:p>
+            <w:r>
+              <w:rPr>
+                <w:rFonts w:ascii="Courier New" w:cs="Courier New" w:eastAsia="Courier New" w:hAnsi="Courier New"/>
+                <w:sz w:val="18"/>
+                <w:szCs w:val="18"/>
+              </w:rPr>
+              <w:t xml:space="preserve">$smsId = record\create(</w:t>
+            </w:r>
+          </w:p>
+          <w:p>
+            <w:r>
+              <w:rPr>
+                <w:rFonts w:ascii="Courier New" w:cs="Courier New" w:eastAsia="Courier New" w:hAnsi="Courier New"/>
+                <w:sz w:val="18"/>
+                <w:szCs w:val="18"/>
+              </w:rPr>
+              <w:t xml:space="preserve">    'Sms',</w:t>
+            </w:r>
+          </w:p>
+          <w:p>
+            <w:r>
+              <w:rPr>
+                <w:rFonts w:ascii="Courier New" w:cs="Courier New" w:eastAsia="Courier New" w:hAnsi="Courier New"/>
+                <w:sz w:val="18"/>
+                <w:szCs w:val="18"/>
+              </w:rPr>
+              <w:t xml:space="preserve">    'to', $phoneNumber,</w:t>
+            </w:r>
+          </w:p>
+          <w:p>
+            <w:r>
+              <w:rPr>
+                <w:rFonts w:ascii="Courier New" w:cs="Courier New" w:eastAsia="Courier New" w:hAnsi="Courier New"/>
+                <w:sz w:val="18"/>
+                <w:szCs w:val="18"/>
+              </w:rPr>
+              <w:t xml:space="preserve">    'body', $body</w:t>
+            </w:r>
+          </w:p>
+          <w:p>
+            <w:r>
+              <w:rPr>
+                <w:rFonts w:ascii="Courier New" w:cs="Courier New" w:eastAsia="Courier New" w:hAnsi="Courier New"/>
+                <w:sz w:val="18"/>
+                <w:szCs w:val="18"/>
+              </w:rPr>
+              <w:t xml:space="preserve">);</w:t>
+            </w:r>
+          </w:p>
+          <w:p>
+            <w:r>
+              <w:rPr>
+                <w:rFonts w:ascii="Courier New" w:cs="Courier New" w:eastAsia="Courier New" w:hAnsi="Courier New"/>
+                <w:sz w:val="18"/>
+                <w:szCs w:val="18"/>
+              </w:rPr>
+              <w:t xml:space="preserve"/>
+            </w:r>
+          </w:p>
+          <w:p>
+            <w:r>
+              <w:rPr>
+                <w:rFonts w:ascii="Courier New" w:cs="Courier New" w:eastAsia="Courier New" w:hAnsi="Courier New"/>
+                <w:sz w:val="18"/>
+                <w:szCs w:val="18"/>
+              </w:rPr>
+              <w:t xml:space="preserve">ext\sms\send($smsId);</w:t>
+            </w:r>
+          </w:p>
+        </w:tc>
+      </w:tr>
+    </w:tbl>
+    <w:p>
+      <w:r>
+        <w:t xml:space="preserve"/>
+      </w:r>
+    </w:p>
+    <w:tbl>
+      <w:tblPr>
+        <w:tblW w:type="dxa" w:w="9360"/>
+        <w:tblBorders>
+          <w:top w:val="single" w:color="auto" w:sz="4"/>
+          <w:left w:val="single" w:color="auto" w:sz="4"/>
+          <w:bottom w:val="single" w:color="auto" w:sz="4"/>
+          <w:right w:val="single" w:color="auto" w:sz="4"/>
+          <w:insideH w:val="single" w:color="auto" w:sz="4"/>
+          <w:insideV w:val="single" w:color="auto" w:sz="4"/>
+        </w:tblBorders>
+      </w:tblPr>
+      <w:tblGrid>
+        <w:gridCol w:w="9360"/>
+      </w:tblGrid>
+      <w:tr>
+        <w:tc>
+          <w:tcPr>
+            <w:tcW w:type="dxa" w:w="9360"/>
+            <w:tcBorders>
+              <w:top w:val="single" w:color="FFC107" w:sz="4"/>
+              <w:left w:val="single" w:color="FFC107" w:sz="4"/>
+              <w:bottom w:val="single" w:color="FFC107" w:sz="4"/>
+              <w:right w:val="single" w:color="FFC107" w:sz="4"/>
+            </w:tcBorders>
+            <w:shd w:fill="FFF3CD" w:val="clear"/>
+            <w:tcMar>
+              <w:top w:type="dxa" w:w="100"/>
+              <w:left w:type="dxa" w:w="160"/>
+              <w:bottom w:type="dxa" w:w="100"/>
+              <w:right w:type="dxa" w:w="160"/>
+            </w:tcMar>
+          </w:tcPr>
+          <w:p>
+            <w:r>
+              <w:rPr>
+                <w:rFonts w:ascii="Arial" w:cs="Arial" w:eastAsia="Arial" w:hAnsi="Arial"/>
+                <w:b/>
+                <w:bCs/>
+                <w:sz w:val="22"/>
+                <w:szCs w:val="22"/>
+              </w:rPr>
+              <w:t xml:space="preserve">Note: </w:t>
+            </w:r>
+            <w:r>
+              <w:rPr>
+                <w:rFonts w:ascii="Arial" w:cs="Arial" w:eastAsia="Arial" w:hAnsi="Arial"/>
+                <w:sz w:val="22"/>
+                <w:szCs w:val="22"/>
+              </w:rPr>
+              <w:t xml:space="preserve">The Advanced Pack extension is required to use Workflows in EspoCRM. Confirm this extension is installed before attempting to configure workflow-based SMS sending.</w:t>
+            </w:r>
+          </w:p>
+        </w:tc>
+      </w:tr>
+    </w:tbl>
     <w:p>
       <w:r>
         <w:t xml:space="preserve"/>

</xml_diff>

<commit_message>
Update CBM-EspoCRM-HowTo.docx - clarify left/right label cross-mapping in section 2.5
</commit_message>
<xml_diff>
--- a/PRDs/CBM-EspoCRM-HowTo.docx
+++ b/PRDs/CBM-EspoCRM-HowTo.docx
@@ -3502,6 +3502,121 @@
         <w:t xml:space="preserve"/>
       </w:r>
     </w:p>
+    <w:p>
+      <w:r>
+        <w:t xml:space="preserve"/>
+      </w:r>
+    </w:p>
+    <w:p>
+      <w:pPr>
+        <w:spacing w:after="120"/>
+      </w:pPr>
+      <w:r>
+        <w:rPr>
+          <w:rFonts w:ascii="Arial" w:cs="Arial" w:eastAsia="Arial" w:hAnsi="Arial"/>
+          <w:sz w:val="22"/>
+          <w:szCs w:val="22"/>
+        </w:rPr>
+        <w:t xml:space="preserve">An important point about how labels cross sides:</w:t>
+      </w:r>
+    </w:p>
+    <w:p>
+      <w:pPr>
+        <w:pStyle w:val="ListParagraph"/>
+        <w:numPr>
+          <w:ilvl w:val="0"/>
+          <w:numId w:val="2"/>
+        </w:numPr>
+        <w:spacing w:after="80"/>
+      </w:pPr>
+      <w:r>
+        <w:rPr>
+          <w:rFonts w:ascii="Arial" w:cs="Arial" w:eastAsia="Arial" w:hAnsi="Arial"/>
+          <w:sz w:val="22"/>
+          <w:szCs w:val="22"/>
+        </w:rPr>
+        <w:t xml:space="preserve">The entity on the Left side of the dialog will display the Label defined on the Right side in its UI — for example, the Left entity (Engagement) will show the Right-side Label (Assigned Mentor) as a field on its detail page.</w:t>
+      </w:r>
+    </w:p>
+    <w:p>
+      <w:pPr>
+        <w:pStyle w:val="ListParagraph"/>
+        <w:numPr>
+          <w:ilvl w:val="0"/>
+          <w:numId w:val="2"/>
+        </w:numPr>
+        <w:spacing w:after="80"/>
+      </w:pPr>
+      <w:r>
+        <w:rPr>
+          <w:rFonts w:ascii="Arial" w:cs="Arial" w:eastAsia="Arial" w:hAnsi="Arial"/>
+          <w:sz w:val="22"/>
+          <w:szCs w:val="22"/>
+        </w:rPr>
+        <w:t xml:space="preserve">The entity on the Right side of the dialog will display the Label defined on the Left side in its UI — for example, the Right entity (Contact) will show the Left-side Label (Engagements) as the title of its related records panel.</w:t>
+      </w:r>
+    </w:p>
+    <w:p>
+      <w:r>
+        <w:t xml:space="preserve"/>
+      </w:r>
+    </w:p>
+    <w:tbl>
+      <w:tblPr>
+        <w:tblW w:type="dxa" w:w="9360"/>
+        <w:tblBorders>
+          <w:top w:val="single" w:color="auto" w:sz="4"/>
+          <w:left w:val="single" w:color="auto" w:sz="4"/>
+          <w:bottom w:val="single" w:color="auto" w:sz="4"/>
+          <w:right w:val="single" w:color="auto" w:sz="4"/>
+          <w:insideH w:val="single" w:color="auto" w:sz="4"/>
+          <w:insideV w:val="single" w:color="auto" w:sz="4"/>
+        </w:tblBorders>
+      </w:tblPr>
+      <w:tblGrid>
+        <w:gridCol w:w="9360"/>
+      </w:tblGrid>
+      <w:tr>
+        <w:tc>
+          <w:tcPr>
+            <w:tcW w:type="dxa" w:w="9360"/>
+            <w:tcBorders>
+              <w:top w:val="single" w:color="FFC107" w:sz="4"/>
+              <w:left w:val="single" w:color="FFC107" w:sz="4"/>
+              <w:bottom w:val="single" w:color="FFC107" w:sz="4"/>
+              <w:right w:val="single" w:color="FFC107" w:sz="4"/>
+            </w:tcBorders>
+            <w:shd w:fill="FFF3CD" w:val="clear"/>
+            <w:tcMar>
+              <w:top w:type="dxa" w:w="100"/>
+              <w:left w:type="dxa" w:w="160"/>
+              <w:bottom w:type="dxa" w:w="100"/>
+              <w:right w:type="dxa" w:w="160"/>
+            </w:tcMar>
+          </w:tcPr>
+          <w:p>
+            <w:r>
+              <w:rPr>
+                <w:rFonts w:ascii="Arial" w:cs="Arial" w:eastAsia="Arial" w:hAnsi="Arial"/>
+                <w:b/>
+                <w:bCs/>
+                <w:sz w:val="22"/>
+                <w:szCs w:val="22"/>
+              </w:rPr>
+              <w:t xml:space="preserve">Note: </w:t>
+            </w:r>
+            <w:r>
+              <w:rPr>
+                <w:rFonts w:ascii="Arial" w:cs="Arial" w:eastAsia="Arial" w:hAnsi="Arial"/>
+                <w:sz w:val="22"/>
+                <w:szCs w:val="22"/>
+              </w:rPr>
+              <w:t xml:space="preserve">Think of it as a cross: each side's label is what the other side shows. Before saving, confirm that both labels make sense from the perspective of the entity that will actually display them.</w:t>
+            </w:r>
+          </w:p>
+        </w:tc>
+      </w:tr>
+    </w:tbl>
     <w:p>
       <w:r>
         <w:t xml:space="preserve"/>

</xml_diff>

<commit_message>
Update CBM-EspoCRM-HowTo.docx - clarify Left/Right side terminology in Step 2 relationship type descriptions
</commit_message>
<xml_diff>
--- a/PRDs/CBM-EspoCRM-HowTo.docx
+++ b/PRDs/CBM-EspoCRM-HowTo.docx
@@ -2732,7 +2732,7 @@
           <w:sz w:val="22"/>
           <w:szCs w:val="22"/>
         </w:rPr>
-        <w:t xml:space="preserve">Many-to-One — use this when many records of the source entity each point to one record in the foreign entity. For example, many Engagements each have one Assigned Mentor. This puts a single link field on the source entity (Engagement) and a related records panel on the foreign entity (Contact).</w:t>
+        <w:t xml:space="preserve">Many-to-One — use this when many records of the Source Entity (Left Side) each point to one record in the Foreign Entity (Right Side). For example, many Engagements each have one Assigned Mentor. This puts a single link field on the Source Entity (Engagement) and a related records panel on the Foreign Entity (Contact).</w:t>
       </w:r>
     </w:p>
     <w:p>
@@ -2750,7 +2750,7 @@
           <w:sz w:val="22"/>
           <w:szCs w:val="22"/>
         </w:rPr>
-        <w:t xml:space="preserve">One-to-Many — use this when one record in the source entity is linked to many records in the foreign entity. This is the mirror of Many-to-One — the end result is identical, but you are defining it from the opposite entity's perspective.</w:t>
+        <w:t xml:space="preserve">One-to-Many — use this when one record in the Source Entity (Left Side) is linked to many records in the Foreign Entity (Right Side). This is the mirror of Many-to-One — the end result is identical, but you are defining it from the opposite entity's perspective.</w:t>
       </w:r>
     </w:p>
     <w:p>

</xml_diff>

<commit_message>
Update CBM-EspoCRM-HowTo.docx - add Enum blank first entry notes to sections 1.3 and 5.1
</commit_message>
<xml_diff>
--- a/PRDs/CBM-EspoCRM-HowTo.docx
+++ b/PRDs/CBM-EspoCRM-HowTo.docx
@@ -997,7 +997,7 @@
                 <w:sz w:val="22"/>
                 <w:szCs w:val="22"/>
               </w:rPr>
-              <w:t xml:space="preserve">Link-type fields (relationships to other entities) are not created through the Fields tab. See Section 2 for how to create relationships between entities.</w:t>
+              <w:t xml:space="preserve">For Enum fields, if you want the field to have no default value, you must add a blank entry as the first option in the list AND leave the Default Value field empty. If the first option in the list is not blank, EspoCRM will automatically use the first item as the default value regardless of the Default Value setting. This is especially important for fields used to drive Dynamic Logic panel visibility — a blank first entry ensures no panel is shown until a value is explicitly selected.</w:t>
             </w:r>
           </w:p>
         </w:tc>
@@ -6418,6 +6418,62 @@
         <w:t xml:space="preserve"/>
       </w:r>
     </w:p>
+    <w:tbl>
+      <w:tblPr>
+        <w:tblW w:type="dxa" w:w="9360"/>
+        <w:tblBorders>
+          <w:top w:val="single" w:color="auto" w:sz="4"/>
+          <w:left w:val="single" w:color="auto" w:sz="4"/>
+          <w:bottom w:val="single" w:color="auto" w:sz="4"/>
+          <w:right w:val="single" w:color="auto" w:sz="4"/>
+          <w:insideH w:val="single" w:color="auto" w:sz="4"/>
+          <w:insideV w:val="single" w:color="auto" w:sz="4"/>
+        </w:tblBorders>
+      </w:tblPr>
+      <w:tblGrid>
+        <w:gridCol w:w="9360"/>
+      </w:tblGrid>
+      <w:tr>
+        <w:tc>
+          <w:tcPr>
+            <w:tcW w:type="dxa" w:w="9360"/>
+            <w:tcBorders>
+              <w:top w:val="single" w:color="FFC107" w:sz="4"/>
+              <w:left w:val="single" w:color="FFC107" w:sz="4"/>
+              <w:bottom w:val="single" w:color="FFC107" w:sz="4"/>
+              <w:right w:val="single" w:color="FFC107" w:sz="4"/>
+            </w:tcBorders>
+            <w:shd w:fill="FFF3CD" w:val="clear"/>
+            <w:tcMar>
+              <w:top w:type="dxa" w:w="100"/>
+              <w:left w:type="dxa" w:w="160"/>
+              <w:bottom w:type="dxa" w:w="100"/>
+              <w:right w:type="dxa" w:w="160"/>
+            </w:tcMar>
+          </w:tcPr>
+          <w:p>
+            <w:r>
+              <w:rPr>
+                <w:rFonts w:ascii="Arial" w:cs="Arial" w:eastAsia="Arial" w:hAnsi="Arial"/>
+                <w:b/>
+                <w:bCs/>
+                <w:sz w:val="22"/>
+                <w:szCs w:val="22"/>
+              </w:rPr>
+              <w:t xml:space="preserve">Note: </w:t>
+            </w:r>
+            <w:r>
+              <w:rPr>
+                <w:rFonts w:ascii="Arial" w:cs="Arial" w:eastAsia="Arial" w:hAnsi="Arial"/>
+                <w:sz w:val="22"/>
+                <w:szCs w:val="22"/>
+              </w:rPr>
+              <w:t xml:space="preserve">When using an Enum field to drive Dynamic Logic, ensure the first option in the Enum list is a blank entry and the Default Value is also left blank. If the first option is not blank, EspoCRM will assign it as the default, which will cause a panel to be shown immediately on new records before a user has intentionally selected a value. See Section 1.3 for details on configuring Enum fields correctly.</w:t>
+            </w:r>
+          </w:p>
+        </w:tc>
+      </w:tr>
+    </w:tbl>
     <w:p>
       <w:pPr>
         <w:pStyle w:val="Heading3"/>

</xml_diff>

<commit_message>
Update CBM-EspoCRM-HowTo.docx - add dynamic handler section 1.4 for enum default based on another field
</commit_message>
<xml_diff>
--- a/PRDs/CBM-EspoCRM-HowTo.docx
+++ b/PRDs/CBM-EspoCRM-HowTo.docx
@@ -1008,6 +1008,67 @@
         <w:t xml:space="preserve"/>
       </w:r>
     </w:p>
+    <w:tbl>
+      <w:tblPr>
+        <w:tblW w:type="dxa" w:w="9360"/>
+        <w:tblBorders>
+          <w:top w:val="single" w:color="auto" w:sz="4"/>
+          <w:left w:val="single" w:color="auto" w:sz="4"/>
+          <w:bottom w:val="single" w:color="auto" w:sz="4"/>
+          <w:right w:val="single" w:color="auto" w:sz="4"/>
+          <w:insideH w:val="single" w:color="auto" w:sz="4"/>
+          <w:insideV w:val="single" w:color="auto" w:sz="4"/>
+        </w:tblBorders>
+      </w:tblPr>
+      <w:tblGrid>
+        <w:gridCol w:w="9360"/>
+      </w:tblGrid>
+      <w:tr>
+        <w:tc>
+          <w:tcPr>
+            <w:tcW w:type="dxa" w:w="9360"/>
+            <w:tcBorders>
+              <w:top w:val="single" w:color="FFC107" w:sz="4"/>
+              <w:left w:val="single" w:color="FFC107" w:sz="4"/>
+              <w:bottom w:val="single" w:color="FFC107" w:sz="4"/>
+              <w:right w:val="single" w:color="FFC107" w:sz="4"/>
+            </w:tcBorders>
+            <w:shd w:fill="FFF3CD" w:val="clear"/>
+            <w:tcMar>
+              <w:top w:type="dxa" w:w="100"/>
+              <w:left w:type="dxa" w:w="160"/>
+              <w:bottom w:type="dxa" w:w="100"/>
+              <w:right w:type="dxa" w:w="160"/>
+            </w:tcMar>
+          </w:tcPr>
+          <w:p>
+            <w:r>
+              <w:rPr>
+                <w:rFonts w:ascii="Arial" w:cs="Arial" w:eastAsia="Arial" w:hAnsi="Arial"/>
+                <w:b/>
+                <w:bCs/>
+                <w:sz w:val="22"/>
+                <w:szCs w:val="22"/>
+              </w:rPr>
+              <w:t xml:space="preserve">Note: </w:t>
+            </w:r>
+            <w:r>
+              <w:rPr>
+                <w:rFonts w:ascii="Arial" w:cs="Arial" w:eastAsia="Arial" w:hAnsi="Arial"/>
+                <w:sz w:val="22"/>
+                <w:szCs w:val="22"/>
+              </w:rPr>
+              <w:t xml:space="preserve">Link-type fields (relationships to other entities) are not created through the Fields tab. See Section 2 for how to create relationships between entities.</w:t>
+            </w:r>
+          </w:p>
+        </w:tc>
+      </w:tr>
+    </w:tbl>
+    <w:p>
+      <w:r>
+        <w:t xml:space="preserve"/>
+      </w:r>
+    </w:p>
     <w:p>
       <w:pPr>
         <w:pStyle w:val="Heading3"/>
@@ -1021,7 +1082,701 @@
           <w:sz w:val="24"/>
           <w:szCs w:val="24"/>
         </w:rPr>
-        <w:t xml:space="preserve">1.4 Adding the Entity to the Left Navigation Column</w:t>
+        <w:t xml:space="preserve">1.4 Setting an Enum Default Value Based on Another Field (Dynamic Handler)</w:t>
+      </w:r>
+    </w:p>
+    <w:p>
+      <w:pPr>
+        <w:spacing w:after="120"/>
+      </w:pPr>
+      <w:r>
+        <w:rPr>
+          <w:rFonts w:ascii="Arial" w:cs="Arial" w:eastAsia="Arial" w:hAnsi="Arial"/>
+          <w:sz w:val="22"/>
+          <w:szCs w:val="22"/>
+        </w:rPr>
+        <w:t xml:space="preserve">EspoCRM does not provide a GUI option to set the default value of an Enum field based on the value of another field. This requires a custom JavaScript Dynamic Handler — a developer-level customization that runs in the browser and responds to field value changes in real time.</w:t>
+      </w:r>
+    </w:p>
+    <w:p>
+      <w:r>
+        <w:t xml:space="preserve"/>
+      </w:r>
+    </w:p>
+    <w:tbl>
+      <w:tblPr>
+        <w:tblW w:type="dxa" w:w="9360"/>
+        <w:tblBorders>
+          <w:top w:val="single" w:color="auto" w:sz="4"/>
+          <w:left w:val="single" w:color="auto" w:sz="4"/>
+          <w:bottom w:val="single" w:color="auto" w:sz="4"/>
+          <w:right w:val="single" w:color="auto" w:sz="4"/>
+          <w:insideH w:val="single" w:color="auto" w:sz="4"/>
+          <w:insideV w:val="single" w:color="auto" w:sz="4"/>
+        </w:tblBorders>
+      </w:tblPr>
+      <w:tblGrid>
+        <w:gridCol w:w="9360"/>
+      </w:tblGrid>
+      <w:tr>
+        <w:tc>
+          <w:tcPr>
+            <w:tcW w:type="dxa" w:w="9360"/>
+            <w:tcBorders>
+              <w:top w:val="single" w:color="FFC107" w:sz="4"/>
+              <w:left w:val="single" w:color="FFC107" w:sz="4"/>
+              <w:bottom w:val="single" w:color="FFC107" w:sz="4"/>
+              <w:right w:val="single" w:color="FFC107" w:sz="4"/>
+            </w:tcBorders>
+            <w:shd w:fill="FFF3CD" w:val="clear"/>
+            <w:tcMar>
+              <w:top w:type="dxa" w:w="100"/>
+              <w:left w:type="dxa" w:w="160"/>
+              <w:bottom w:type="dxa" w:w="100"/>
+              <w:right w:type="dxa" w:w="160"/>
+            </w:tcMar>
+          </w:tcPr>
+          <w:p>
+            <w:r>
+              <w:rPr>
+                <w:rFonts w:ascii="Arial" w:cs="Arial" w:eastAsia="Arial" w:hAnsi="Arial"/>
+                <w:b/>
+                <w:bCs/>
+                <w:sz w:val="22"/>
+                <w:szCs w:val="22"/>
+              </w:rPr>
+              <w:t xml:space="preserve">Note: </w:t>
+            </w:r>
+            <w:r>
+              <w:rPr>
+                <w:rFonts w:ascii="Arial" w:cs="Arial" w:eastAsia="Arial" w:hAnsi="Arial"/>
+                <w:sz w:val="22"/>
+                <w:szCs w:val="22"/>
+              </w:rPr>
+              <w:t xml:space="preserve">This approach requires custom JavaScript development and direct file access to the EspoCRM server. It is not available through the Admin UI. Only proceed if you are comfortable with JavaScript and have server file access.</w:t>
+            </w:r>
+          </w:p>
+        </w:tc>
+      </w:tr>
+    </w:tbl>
+    <w:p>
+      <w:r>
+        <w:t xml:space="preserve"/>
+      </w:r>
+    </w:p>
+    <w:p>
+      <w:pPr>
+        <w:pStyle w:val="Heading3"/>
+      </w:pPr>
+      <w:r>
+        <w:rPr>
+          <w:rFonts w:ascii="Arial" w:cs="Arial" w:eastAsia="Arial" w:hAnsi="Arial"/>
+          <w:b/>
+          <w:bCs/>
+          <w:color w:val="595959"/>
+          <w:sz w:val="24"/>
+          <w:szCs w:val="24"/>
+        </w:rPr>
+        <w:t xml:space="preserve">Step 1 — Create the Dynamic Handler File</w:t>
+      </w:r>
+    </w:p>
+    <w:p>
+      <w:pPr>
+        <w:spacing w:after="120"/>
+      </w:pPr>
+      <w:r>
+        <w:rPr>
+          <w:rFonts w:ascii="Arial" w:cs="Arial" w:eastAsia="Arial" w:hAnsi="Arial"/>
+          <w:sz w:val="22"/>
+          <w:szCs w:val="22"/>
+        </w:rPr>
+        <w:t xml:space="preserve">Create the following file on the EspoCRM server:</w:t>
+      </w:r>
+    </w:p>
+    <w:p>
+      <w:r>
+        <w:t xml:space="preserve"/>
+      </w:r>
+    </w:p>
+    <w:tbl>
+      <w:tblPr>
+        <w:tblW w:type="dxa" w:w="9360"/>
+        <w:tblBorders>
+          <w:top w:val="single" w:color="auto" w:sz="4"/>
+          <w:left w:val="single" w:color="auto" w:sz="4"/>
+          <w:bottom w:val="single" w:color="auto" w:sz="4"/>
+          <w:right w:val="single" w:color="auto" w:sz="4"/>
+          <w:insideH w:val="single" w:color="auto" w:sz="4"/>
+          <w:insideV w:val="single" w:color="auto" w:sz="4"/>
+        </w:tblBorders>
+      </w:tblPr>
+      <w:tblGrid>
+        <w:gridCol w:w="9360"/>
+      </w:tblGrid>
+      <w:tr>
+        <w:tc>
+          <w:tcPr>
+            <w:tcW w:type="dxa" w:w="9360"/>
+            <w:tcBorders>
+              <w:top w:val="single" w:color="CCCCCC" w:sz="1"/>
+              <w:left w:val="single" w:color="CCCCCC" w:sz="1"/>
+              <w:bottom w:val="single" w:color="CCCCCC" w:sz="1"/>
+              <w:right w:val="single" w:color="CCCCCC" w:sz="1"/>
+            </w:tcBorders>
+            <w:shd w:fill="F5F5F5" w:val="clear"/>
+            <w:tcMar>
+              <w:top w:type="dxa" w:w="100"/>
+              <w:left w:type="dxa" w:w="200"/>
+              <w:bottom w:type="dxa" w:w="100"/>
+              <w:right w:type="dxa" w:w="200"/>
+            </w:tcMar>
+          </w:tcPr>
+          <w:p>
+            <w:r>
+              <w:rPr>
+                <w:rFonts w:ascii="Courier New" w:cs="Courier New" w:eastAsia="Courier New" w:hAnsi="Courier New"/>
+                <w:sz w:val="18"/>
+                <w:szCs w:val="18"/>
+              </w:rPr>
+              <w:t xml:space="preserve">client/custom/src/my-dynamic-handler.js</w:t>
+            </w:r>
+          </w:p>
+        </w:tc>
+      </w:tr>
+    </w:tbl>
+    <w:p>
+      <w:r>
+        <w:t xml:space="preserve"/>
+      </w:r>
+    </w:p>
+    <w:p>
+      <w:pPr>
+        <w:spacing w:after="120"/>
+      </w:pPr>
+      <w:r>
+        <w:rPr>
+          <w:rFonts w:ascii="Arial" w:cs="Arial" w:eastAsia="Arial" w:hAnsi="Arial"/>
+          <w:sz w:val="22"/>
+          <w:szCs w:val="22"/>
+        </w:rPr>
+        <w:t xml:space="preserve">Paste the following code into that file, replacing anotherField, targetEnumField, SpecificValue, DefaultValueA, and DefaultValueB with your actual field names and values:</w:t>
+      </w:r>
+    </w:p>
+    <w:p>
+      <w:r>
+        <w:t xml:space="preserve"/>
+      </w:r>
+    </w:p>
+    <w:tbl>
+      <w:tblPr>
+        <w:tblW w:type="dxa" w:w="9360"/>
+        <w:tblBorders>
+          <w:top w:val="single" w:color="auto" w:sz="4"/>
+          <w:left w:val="single" w:color="auto" w:sz="4"/>
+          <w:bottom w:val="single" w:color="auto" w:sz="4"/>
+          <w:right w:val="single" w:color="auto" w:sz="4"/>
+          <w:insideH w:val="single" w:color="auto" w:sz="4"/>
+          <w:insideV w:val="single" w:color="auto" w:sz="4"/>
+        </w:tblBorders>
+      </w:tblPr>
+      <w:tblGrid>
+        <w:gridCol w:w="9360"/>
+      </w:tblGrid>
+      <w:tr>
+        <w:tc>
+          <w:tcPr>
+            <w:tcW w:type="dxa" w:w="9360"/>
+            <w:tcBorders>
+              <w:top w:val="single" w:color="CCCCCC" w:sz="1"/>
+              <w:left w:val="single" w:color="CCCCCC" w:sz="1"/>
+              <w:bottom w:val="single" w:color="CCCCCC" w:sz="1"/>
+              <w:right w:val="single" w:color="CCCCCC" w:sz="1"/>
+            </w:tcBorders>
+            <w:shd w:fill="F5F5F5" w:val="clear"/>
+            <w:tcMar>
+              <w:top w:type="dxa" w:w="100"/>
+              <w:left w:type="dxa" w:w="200"/>
+              <w:bottom w:type="dxa" w:w="100"/>
+              <w:right w:type="dxa" w:w="200"/>
+            </w:tcMar>
+          </w:tcPr>
+          <w:p>
+            <w:r>
+              <w:rPr>
+                <w:rFonts w:ascii="Courier New" w:cs="Courier New" w:eastAsia="Courier New" w:hAnsi="Courier New"/>
+                <w:sz w:val="18"/>
+                <w:szCs w:val="18"/>
+              </w:rPr>
+              <w:t xml:space="preserve">define('custom:my-dynamic-handler', ['dynamic-handler'], (Dep) =&gt; {</w:t>
+            </w:r>
+          </w:p>
+          <w:p>
+            <w:r>
+              <w:rPr>
+                <w:rFonts w:ascii="Courier New" w:cs="Courier New" w:eastAsia="Courier New" w:hAnsi="Courier New"/>
+                <w:sz w:val="18"/>
+                <w:szCs w:val="18"/>
+              </w:rPr>
+              <w:t xml:space="preserve">    return class extends Dep {</w:t>
+            </w:r>
+          </w:p>
+          <w:p>
+            <w:r>
+              <w:rPr>
+                <w:rFonts w:ascii="Courier New" w:cs="Courier New" w:eastAsia="Courier New" w:hAnsi="Courier New"/>
+                <w:sz w:val="18"/>
+                <w:szCs w:val="18"/>
+              </w:rPr>
+              <w:t xml:space="preserve">        init() {</w:t>
+            </w:r>
+          </w:p>
+          <w:p>
+            <w:r>
+              <w:rPr>
+                <w:rFonts w:ascii="Courier New" w:cs="Courier New" w:eastAsia="Courier New" w:hAnsi="Courier New"/>
+                <w:sz w:val="18"/>
+                <w:szCs w:val="18"/>
+              </w:rPr>
+              <w:t xml:space="preserve">            this.controlFields();</w:t>
+            </w:r>
+          </w:p>
+          <w:p>
+            <w:r>
+              <w:rPr>
+                <w:rFonts w:ascii="Courier New" w:cs="Courier New" w:eastAsia="Courier New" w:hAnsi="Courier New"/>
+                <w:sz w:val="18"/>
+                <w:szCs w:val="18"/>
+              </w:rPr>
+              <w:t xml:space="preserve">            this.recordView.listenTo(this.model, 'change:anotherField', () =&gt; this.controlFields());</w:t>
+            </w:r>
+          </w:p>
+          <w:p>
+            <w:r>
+              <w:rPr>
+                <w:rFonts w:ascii="Courier New" w:cs="Courier New" w:eastAsia="Courier New" w:hAnsi="Courier New"/>
+                <w:sz w:val="18"/>
+                <w:szCs w:val="18"/>
+              </w:rPr>
+              <w:t xml:space="preserve">        }</w:t>
+            </w:r>
+          </w:p>
+          <w:p>
+            <w:r>
+              <w:rPr>
+                <w:rFonts w:ascii="Courier New" w:cs="Courier New" w:eastAsia="Courier New" w:hAnsi="Courier New"/>
+                <w:sz w:val="18"/>
+                <w:szCs w:val="18"/>
+              </w:rPr>
+              <w:t xml:space="preserve"/>
+            </w:r>
+          </w:p>
+          <w:p>
+            <w:r>
+              <w:rPr>
+                <w:rFonts w:ascii="Courier New" w:cs="Courier New" w:eastAsia="Courier New" w:hAnsi="Courier New"/>
+                <w:sz w:val="18"/>
+                <w:szCs w:val="18"/>
+              </w:rPr>
+              <w:t xml:space="preserve">        controlFields() {</w:t>
+            </w:r>
+          </w:p>
+          <w:p>
+            <w:r>
+              <w:rPr>
+                <w:rFonts w:ascii="Courier New" w:cs="Courier New" w:eastAsia="Courier New" w:hAnsi="Courier New"/>
+                <w:sz w:val="18"/>
+                <w:szCs w:val="18"/>
+              </w:rPr>
+              <w:t xml:space="preserve">            const value = this.recordView.model.get('anotherField');</w:t>
+            </w:r>
+          </w:p>
+          <w:p>
+            <w:r>
+              <w:rPr>
+                <w:rFonts w:ascii="Courier New" w:cs="Courier New" w:eastAsia="Courier New" w:hAnsi="Courier New"/>
+                <w:sz w:val="18"/>
+                <w:szCs w:val="18"/>
+              </w:rPr>
+              <w:t xml:space="preserve">            if (value === 'SpecificValue') {</w:t>
+            </w:r>
+          </w:p>
+          <w:p>
+            <w:r>
+              <w:rPr>
+                <w:rFonts w:ascii="Courier New" w:cs="Courier New" w:eastAsia="Courier New" w:hAnsi="Courier New"/>
+                <w:sz w:val="18"/>
+                <w:szCs w:val="18"/>
+              </w:rPr>
+              <w:t xml:space="preserve">                this.recordView.setFieldOptionList('targetEnumField', ['DefaultValueA']);</w:t>
+            </w:r>
+          </w:p>
+          <w:p>
+            <w:r>
+              <w:rPr>
+                <w:rFonts w:ascii="Courier New" w:cs="Courier New" w:eastAsia="Courier New" w:hAnsi="Courier New"/>
+                <w:sz w:val="18"/>
+                <w:szCs w:val="18"/>
+              </w:rPr>
+              <w:t xml:space="preserve">            } else {</w:t>
+            </w:r>
+          </w:p>
+          <w:p>
+            <w:r>
+              <w:rPr>
+                <w:rFonts w:ascii="Courier New" w:cs="Courier New" w:eastAsia="Courier New" w:hAnsi="Courier New"/>
+                <w:sz w:val="18"/>
+                <w:szCs w:val="18"/>
+              </w:rPr>
+              <w:t xml:space="preserve">                this.recordView.setFieldOptionList('targetEnumField', ['DefaultValueB']);</w:t>
+            </w:r>
+          </w:p>
+          <w:p>
+            <w:r>
+              <w:rPr>
+                <w:rFonts w:ascii="Courier New" w:cs="Courier New" w:eastAsia="Courier New" w:hAnsi="Courier New"/>
+                <w:sz w:val="18"/>
+                <w:szCs w:val="18"/>
+              </w:rPr>
+              <w:t xml:space="preserve">            }</w:t>
+            </w:r>
+          </w:p>
+          <w:p>
+            <w:r>
+              <w:rPr>
+                <w:rFonts w:ascii="Courier New" w:cs="Courier New" w:eastAsia="Courier New" w:hAnsi="Courier New"/>
+                <w:sz w:val="18"/>
+                <w:szCs w:val="18"/>
+              </w:rPr>
+              <w:t xml:space="preserve">        }</w:t>
+            </w:r>
+          </w:p>
+          <w:p>
+            <w:r>
+              <w:rPr>
+                <w:rFonts w:ascii="Courier New" w:cs="Courier New" w:eastAsia="Courier New" w:hAnsi="Courier New"/>
+                <w:sz w:val="18"/>
+                <w:szCs w:val="18"/>
+              </w:rPr>
+              <w:t xml:space="preserve">    };</w:t>
+            </w:r>
+          </w:p>
+          <w:p>
+            <w:r>
+              <w:rPr>
+                <w:rFonts w:ascii="Courier New" w:cs="Courier New" w:eastAsia="Courier New" w:hAnsi="Courier New"/>
+                <w:sz w:val="18"/>
+                <w:szCs w:val="18"/>
+              </w:rPr>
+              <w:t xml:space="preserve">});</w:t>
+            </w:r>
+          </w:p>
+        </w:tc>
+      </w:tr>
+    </w:tbl>
+    <w:p>
+      <w:r>
+        <w:t xml:space="preserve"/>
+      </w:r>
+    </w:p>
+    <w:p>
+      <w:pPr>
+        <w:pStyle w:val="Heading3"/>
+      </w:pPr>
+      <w:r>
+        <w:rPr>
+          <w:rFonts w:ascii="Arial" w:cs="Arial" w:eastAsia="Arial" w:hAnsi="Arial"/>
+          <w:b/>
+          <w:bCs/>
+          <w:color w:val="595959"/>
+          <w:sz w:val="24"/>
+          <w:szCs w:val="24"/>
+        </w:rPr>
+        <w:t xml:space="preserve">Step 2 — Link the Handler to the Entity</w:t>
+      </w:r>
+    </w:p>
+    <w:p>
+      <w:pPr>
+        <w:spacing w:after="120"/>
+      </w:pPr>
+      <w:r>
+        <w:rPr>
+          <w:rFonts w:ascii="Arial" w:cs="Arial" w:eastAsia="Arial" w:hAnsi="Arial"/>
+          <w:sz w:val="22"/>
+          <w:szCs w:val="22"/>
+        </w:rPr>
+        <w:t xml:space="preserve">Create or edit the entity's client metadata file on the server:</w:t>
+      </w:r>
+    </w:p>
+    <w:p>
+      <w:r>
+        <w:t xml:space="preserve"/>
+      </w:r>
+    </w:p>
+    <w:tbl>
+      <w:tblPr>
+        <w:tblW w:type="dxa" w:w="9360"/>
+        <w:tblBorders>
+          <w:top w:val="single" w:color="auto" w:sz="4"/>
+          <w:left w:val="single" w:color="auto" w:sz="4"/>
+          <w:bottom w:val="single" w:color="auto" w:sz="4"/>
+          <w:right w:val="single" w:color="auto" w:sz="4"/>
+          <w:insideH w:val="single" w:color="auto" w:sz="4"/>
+          <w:insideV w:val="single" w:color="auto" w:sz="4"/>
+        </w:tblBorders>
+      </w:tblPr>
+      <w:tblGrid>
+        <w:gridCol w:w="9360"/>
+      </w:tblGrid>
+      <w:tr>
+        <w:tc>
+          <w:tcPr>
+            <w:tcW w:type="dxa" w:w="9360"/>
+            <w:tcBorders>
+              <w:top w:val="single" w:color="CCCCCC" w:sz="1"/>
+              <w:left w:val="single" w:color="CCCCCC" w:sz="1"/>
+              <w:bottom w:val="single" w:color="CCCCCC" w:sz="1"/>
+              <w:right w:val="single" w:color="CCCCCC" w:sz="1"/>
+            </w:tcBorders>
+            <w:shd w:fill="F5F5F5" w:val="clear"/>
+            <w:tcMar>
+              <w:top w:type="dxa" w:w="100"/>
+              <w:left w:type="dxa" w:w="200"/>
+              <w:bottom w:type="dxa" w:w="100"/>
+              <w:right w:type="dxa" w:w="200"/>
+            </w:tcMar>
+          </w:tcPr>
+          <w:p>
+            <w:r>
+              <w:rPr>
+                <w:rFonts w:ascii="Courier New" w:cs="Courier New" w:eastAsia="Courier New" w:hAnsi="Courier New"/>
+                <w:sz w:val="18"/>
+                <w:szCs w:val="18"/>
+              </w:rPr>
+              <w:t xml:space="preserve">custom/Espo/Custom/Resources/metadata/clientDefs/YourEntity.json</w:t>
+            </w:r>
+          </w:p>
+        </w:tc>
+      </w:tr>
+    </w:tbl>
+    <w:p>
+      <w:r>
+        <w:t xml:space="preserve"/>
+      </w:r>
+    </w:p>
+    <w:p>
+      <w:pPr>
+        <w:spacing w:after="120"/>
+      </w:pPr>
+      <w:r>
+        <w:rPr>
+          <w:rFonts w:ascii="Arial" w:cs="Arial" w:eastAsia="Arial" w:hAnsi="Arial"/>
+          <w:sz w:val="22"/>
+          <w:szCs w:val="22"/>
+        </w:rPr>
+        <w:t xml:space="preserve">Add the following to that JSON file, replacing YourEntity with your actual entity name:</w:t>
+      </w:r>
+    </w:p>
+    <w:p>
+      <w:r>
+        <w:t xml:space="preserve"/>
+      </w:r>
+    </w:p>
+    <w:tbl>
+      <w:tblPr>
+        <w:tblW w:type="dxa" w:w="9360"/>
+        <w:tblBorders>
+          <w:top w:val="single" w:color="auto" w:sz="4"/>
+          <w:left w:val="single" w:color="auto" w:sz="4"/>
+          <w:bottom w:val="single" w:color="auto" w:sz="4"/>
+          <w:right w:val="single" w:color="auto" w:sz="4"/>
+          <w:insideH w:val="single" w:color="auto" w:sz="4"/>
+          <w:insideV w:val="single" w:color="auto" w:sz="4"/>
+        </w:tblBorders>
+      </w:tblPr>
+      <w:tblGrid>
+        <w:gridCol w:w="9360"/>
+      </w:tblGrid>
+      <w:tr>
+        <w:tc>
+          <w:tcPr>
+            <w:tcW w:type="dxa" w:w="9360"/>
+            <w:tcBorders>
+              <w:top w:val="single" w:color="CCCCCC" w:sz="1"/>
+              <w:left w:val="single" w:color="CCCCCC" w:sz="1"/>
+              <w:bottom w:val="single" w:color="CCCCCC" w:sz="1"/>
+              <w:right w:val="single" w:color="CCCCCC" w:sz="1"/>
+            </w:tcBorders>
+            <w:shd w:fill="F5F5F5" w:val="clear"/>
+            <w:tcMar>
+              <w:top w:type="dxa" w:w="100"/>
+              <w:left w:type="dxa" w:w="200"/>
+              <w:bottom w:type="dxa" w:w="100"/>
+              <w:right w:type="dxa" w:w="200"/>
+            </w:tcMar>
+          </w:tcPr>
+          <w:p>
+            <w:r>
+              <w:rPr>
+                <w:rFonts w:ascii="Courier New" w:cs="Courier New" w:eastAsia="Courier New" w:hAnsi="Courier New"/>
+                <w:sz w:val="18"/>
+                <w:szCs w:val="18"/>
+              </w:rPr>
+              <w:t xml:space="preserve">{</w:t>
+            </w:r>
+          </w:p>
+          <w:p>
+            <w:r>
+              <w:rPr>
+                <w:rFonts w:ascii="Courier New" w:cs="Courier New" w:eastAsia="Courier New" w:hAnsi="Courier New"/>
+                <w:sz w:val="18"/>
+                <w:szCs w:val="18"/>
+              </w:rPr>
+              <w:t xml:space="preserve">    "dynamicHandler": "custom:my-dynamic-handler"</w:t>
+            </w:r>
+          </w:p>
+          <w:p>
+            <w:r>
+              <w:rPr>
+                <w:rFonts w:ascii="Courier New" w:cs="Courier New" w:eastAsia="Courier New" w:hAnsi="Courier New"/>
+                <w:sz w:val="18"/>
+                <w:szCs w:val="18"/>
+              </w:rPr>
+              <w:t xml:space="preserve">}</w:t>
+            </w:r>
+          </w:p>
+        </w:tc>
+      </w:tr>
+    </w:tbl>
+    <w:p>
+      <w:r>
+        <w:t xml:space="preserve"/>
+      </w:r>
+    </w:p>
+    <w:p>
+      <w:pPr>
+        <w:pStyle w:val="Heading3"/>
+      </w:pPr>
+      <w:r>
+        <w:rPr>
+          <w:rFonts w:ascii="Arial" w:cs="Arial" w:eastAsia="Arial" w:hAnsi="Arial"/>
+          <w:b/>
+          <w:bCs/>
+          <w:color w:val="595959"/>
+          <w:sz w:val="24"/>
+          <w:szCs w:val="24"/>
+        </w:rPr>
+        <w:t xml:space="preserve">Step 3 — Clear Cache and Refresh</w:t>
+      </w:r>
+    </w:p>
+    <w:p>
+      <w:pPr>
+        <w:spacing w:after="120"/>
+      </w:pPr>
+      <w:r>
+        <w:rPr>
+          <w:rFonts w:ascii="Arial" w:cs="Arial" w:eastAsia="Arial" w:hAnsi="Arial"/>
+          <w:sz w:val="22"/>
+          <w:szCs w:val="22"/>
+        </w:rPr>
+        <w:t xml:space="preserve">After saving both files, clear the EspoCRM cache and refresh your browser:</w:t>
+      </w:r>
+    </w:p>
+    <w:p>
+      <w:r>
+        <w:t xml:space="preserve"/>
+      </w:r>
+    </w:p>
+    <w:p>
+      <w:pPr>
+        <w:pStyle w:val="ListParagraph"/>
+        <w:numPr>
+          <w:ilvl w:val="0"/>
+          <w:numId w:val="3"/>
+        </w:numPr>
+        <w:spacing w:after="100"/>
+      </w:pPr>
+      <w:r>
+        <w:rPr>
+          <w:rFonts w:ascii="Arial" w:cs="Arial" w:eastAsia="Arial" w:hAnsi="Arial"/>
+          <w:sz w:val="22"/>
+          <w:szCs w:val="22"/>
+        </w:rPr>
+        <w:t xml:space="preserve">Go to: Admin → Clear Cache.</w:t>
+      </w:r>
+    </w:p>
+    <w:p>
+      <w:pPr>
+        <w:pStyle w:val="ListParagraph"/>
+        <w:numPr>
+          <w:ilvl w:val="0"/>
+          <w:numId w:val="3"/>
+        </w:numPr>
+        <w:spacing w:after="100"/>
+      </w:pPr>
+      <w:r>
+        <w:rPr>
+          <w:rFonts w:ascii="Arial" w:cs="Arial" w:eastAsia="Arial" w:hAnsi="Arial"/>
+          <w:sz w:val="22"/>
+          <w:szCs w:val="22"/>
+        </w:rPr>
+        <w:t xml:space="preserve">Hard-refresh your browser (Ctrl+Shift+R or Cmd+Shift+R).</w:t>
+      </w:r>
+    </w:p>
+    <w:p>
+      <w:pPr>
+        <w:pStyle w:val="ListParagraph"/>
+        <w:numPr>
+          <w:ilvl w:val="0"/>
+          <w:numId w:val="3"/>
+        </w:numPr>
+        <w:spacing w:after="100"/>
+      </w:pPr>
+      <w:r>
+        <w:rPr>
+          <w:rFonts w:ascii="Arial" w:cs="Arial" w:eastAsia="Arial" w:hAnsi="Arial"/>
+          <w:sz w:val="22"/>
+          <w:szCs w:val="22"/>
+        </w:rPr>
+        <w:t xml:space="preserve">Open a record of the target entity and change the controlling field value to confirm the Enum options update correctly.</w:t>
+      </w:r>
+    </w:p>
+    <w:p>
+      <w:r>
+        <w:t xml:space="preserve"/>
+      </w:r>
+    </w:p>
+    <w:p>
+      <w:pPr>
+        <w:spacing w:after="120"/>
+      </w:pPr>
+      <w:r>
+        <w:rPr>
+          <w:rFonts w:ascii="Arial" w:cs="Arial" w:eastAsia="Arial" w:hAnsi="Arial"/>
+          <w:sz w:val="22"/>
+          <w:szCs w:val="22"/>
+        </w:rPr>
+        <w:t xml:space="preserve">Alternatively, Dynamic Logic (Admin → Entity Manager → [Entity] → Dynamic Logic) can be used to show/hide or make fields required based on another field value without custom code — but it cannot set a default Enum value. Use the Dynamic Handler approach when you need full control over which options are available based on another field.</w:t>
+      </w:r>
+    </w:p>
+    <w:p>
+      <w:r>
+        <w:t xml:space="preserve"/>
+      </w:r>
+    </w:p>
+    <w:p>
+      <w:pPr>
+        <w:pStyle w:val="Heading3"/>
+      </w:pPr>
+      <w:r>
+        <w:rPr>
+          <w:rFonts w:ascii="Arial" w:cs="Arial" w:eastAsia="Arial" w:hAnsi="Arial"/>
+          <w:b/>
+          <w:bCs/>
+          <w:color w:val="595959"/>
+          <w:sz w:val="24"/>
+          <w:szCs w:val="24"/>
+        </w:rPr>
+        <w:t xml:space="preserve">1.5 Adding the Entity to the Left Navigation Column</w:t>
       </w:r>
     </w:p>
     <w:p>

</xml_diff>

<commit_message>
Update CBM-EspoCRM-HowTo.docx - add Note/activity stream research question
</commit_message>
<xml_diff>
--- a/PRDs/CBM-EspoCRM-HowTo.docx
+++ b/PRDs/CBM-EspoCRM-HowTo.docx
@@ -11961,6 +11961,24 @@
           <w:szCs w:val="22"/>
         </w:rPr>
         <w:t xml:space="preserve">How to show all emails sent to a contact on their Contact detail page — there is no Emails panel available in the Contact entity's Bottom Panels layout, suggesting email display is handled through a different mechanism such as email archiving or the activity stream. The correct configuration path needs to be identified and documented.</w:t>
+      </w:r>
+    </w:p>
+    <w:p>
+      <w:pPr>
+        <w:pStyle w:val="ListParagraph"/>
+        <w:numPr>
+          <w:ilvl w:val="0"/>
+          <w:numId w:val="2"/>
+        </w:numPr>
+        <w:spacing w:after="80"/>
+      </w:pPr>
+      <w:r>
+        <w:rPr>
+          <w:rFonts w:ascii="Arial" w:cs="Arial" w:eastAsia="Arial" w:hAnsi="Arial"/>
+          <w:sz w:val="22"/>
+          <w:szCs w:val="22"/>
+        </w:rPr>
+        <w:t xml:space="preserve">How do users add notes to a record — the Note entity exists in Entity Manager as a system-level entity with limited configurability (Fields only, no Layouts or Relationships tabs). It likely powers an activity stream or notes panel on record detail pages, but the exact user-facing path for posting notes, attaching files, and viewing note history on a record needs to be identified and documented.</w:t>
       </w:r>
     </w:p>
     <w:p>

</xml_diff>

<commit_message>
Update CBM-EspoCRM-HowTo.docx - add Wysiwyg and expand Text field descriptions in section 1.3
</commit_message>
<xml_diff>
--- a/PRDs/CBM-EspoCRM-HowTo.docx
+++ b/PRDs/CBM-EspoCRM-HowTo.docx
@@ -867,7 +867,25 @@
           <w:sz w:val="22"/>
           <w:szCs w:val="22"/>
         </w:rPr>
-        <w:t xml:space="preserve">Text — long-form text (notes, descriptions)</w:t>
+        <w:t xml:space="preserve">Text — long-form plain text (notes, descriptions). Renders as a multi-line textarea that expands to show full content.</w:t>
+      </w:r>
+    </w:p>
+    <w:p>
+      <w:pPr>
+        <w:pStyle w:val="ListParagraph"/>
+        <w:numPr>
+          <w:ilvl w:val="0"/>
+          <w:numId w:val="2"/>
+        </w:numPr>
+        <w:spacing w:after="80"/>
+      </w:pPr>
+      <w:r>
+        <w:rPr>
+          <w:rFonts w:ascii="Arial" w:cs="Arial" w:eastAsia="Arial" w:hAnsi="Arial"/>
+          <w:sz w:val="22"/>
+          <w:szCs w:val="22"/>
+        </w:rPr>
+        <w:t xml:space="preserve">Wysiwyg — rich text editor with formatting toolbar (bold, italic, lists, links, etc.). Renders formatted HTML output in the detail view, making notes and descriptions more readable. Best choice when users need to format content. Note: data is stored internally as HTML, so exported or programmatically accessed data will include HTML markup.</w:t>
       </w:r>
     </w:p>
     <w:p>

</xml_diff>

<commit_message>
Add Section 5 Automations to Implementation Guide; add Section 6 Formula Scripts to How To Guide (v0.5)
</commit_message>
<xml_diff>
--- a/PRDs/CBM-EspoCRM-HowTo.docx
+++ b/PRDs/CBM-EspoCRM-HowTo.docx
@@ -7862,6 +7862,1014 @@
         <w:t xml:space="preserve"/>
       </w:r>
     </w:p>
+    <w:p>
+      <w:r>
+        <w:t xml:space="preserve"/>
+      </w:r>
+    </w:p>
+    <w:p>
+      <w:r>
+        <w:t xml:space="preserve"/>
+      </w:r>
+    </w:p>
+    <w:p>
+      <w:pPr>
+        <w:pStyle w:val="Heading2"/>
+      </w:pPr>
+      <w:r>
+        <w:rPr>
+          <w:rFonts w:ascii="Arial" w:cs="Arial" w:eastAsia="Arial" w:hAnsi="Arial"/>
+          <w:b/>
+          <w:bCs/>
+          <w:sz w:val="28"/>
+          <w:szCs w:val="28"/>
+        </w:rPr>
+        <w:t xml:space="preserve">6. Automating Field Values with Entity Formula Scripts</w:t>
+      </w:r>
+    </w:p>
+    <w:p>
+      <w:r>
+        <w:t xml:space="preserve"/>
+      </w:r>
+    </w:p>
+    <w:p>
+      <w:pPr>
+        <w:spacing w:after="120"/>
+      </w:pPr>
+      <w:r>
+        <w:rPr>
+          <w:rFonts w:ascii="Arial" w:cs="Arial" w:eastAsia="Arial" w:hAnsi="Arial"/>
+          <w:sz w:val="22"/>
+          <w:szCs w:val="22"/>
+        </w:rPr>
+        <w:t xml:space="preserve">EspoCRM’s Entity Formula Script allows you to automatically set field values whenever a record is saved. The formula runs on every create or update triggered through the UI or API, and only executes the action when your specified conditions are met. This is the simplest and most reliable automation option in EspoCRM — no extensions required, and everything is configured through the admin UI.</w:t>
+      </w:r>
+    </w:p>
+    <w:p>
+      <w:r>
+        <w:t xml:space="preserve"/>
+      </w:r>
+    </w:p>
+    <w:p>
+      <w:pPr>
+        <w:pStyle w:val="Heading3"/>
+      </w:pPr>
+      <w:r>
+        <w:rPr>
+          <w:rFonts w:ascii="Arial" w:cs="Arial" w:eastAsia="Arial" w:hAnsi="Arial"/>
+          <w:b/>
+          <w:bCs/>
+          <w:sz w:val="24"/>
+          <w:szCs w:val="24"/>
+        </w:rPr>
+        <w:t xml:space="preserve">6.1 When to Use Entity Formula Script</w:t>
+      </w:r>
+    </w:p>
+    <w:p>
+      <w:pPr>
+        <w:spacing w:after="120"/>
+      </w:pPr>
+      <w:r>
+        <w:rPr>
+          <w:rFonts w:ascii="Arial" w:cs="Arial" w:eastAsia="Arial" w:hAnsi="Arial"/>
+          <w:sz w:val="22"/>
+          <w:szCs w:val="22"/>
+        </w:rPr>
+        <w:t xml:space="preserve">Use the Entity Formula Script approach when:</w:t>
+      </w:r>
+    </w:p>
+    <w:p>
+      <w:pPr>
+        <w:spacing w:after="120"/>
+      </w:pPr>
+      <w:r>
+        <w:rPr>
+          <w:rFonts w:ascii="Arial" w:cs="Arial" w:eastAsia="Arial" w:hAnsi="Arial"/>
+          <w:sz w:val="22"/>
+          <w:szCs w:val="22"/>
+        </w:rPr>
+        <w:t xml:space="preserve">•  You need to automatically set a field on the same record that is being saved.</w:t>
+      </w:r>
+    </w:p>
+    <w:p>
+      <w:pPr>
+        <w:spacing w:after="120"/>
+      </w:pPr>
+      <w:r>
+        <w:rPr>
+          <w:rFonts w:ascii="Arial" w:cs="Arial" w:eastAsia="Arial" w:hAnsi="Arial"/>
+          <w:sz w:val="22"/>
+          <w:szCs w:val="22"/>
+        </w:rPr>
+        <w:t xml:space="preserve">•  The action should fire on every save, not just once.</w:t>
+      </w:r>
+    </w:p>
+    <w:p>
+      <w:pPr>
+        <w:spacing w:after="120"/>
+      </w:pPr>
+      <w:r>
+        <w:rPr>
+          <w:rFonts w:ascii="Arial" w:cs="Arial" w:eastAsia="Arial" w:hAnsi="Arial"/>
+          <w:sz w:val="22"/>
+          <w:szCs w:val="22"/>
+        </w:rPr>
+        <w:t xml:space="preserve">•  The logic is condition-based (e.g. “only set this field if another field changed to a specific value and the target field is currently empty”).</w:t>
+      </w:r>
+    </w:p>
+    <w:p>
+      <w:pPr>
+        <w:spacing w:after="120"/>
+      </w:pPr>
+      <w:r>
+        <w:rPr>
+          <w:rFonts w:ascii="Arial" w:cs="Arial" w:eastAsia="Arial" w:hAnsi="Arial"/>
+          <w:sz w:val="22"/>
+          <w:szCs w:val="22"/>
+        </w:rPr>
+        <w:t xml:space="preserve">For more complex automation — such as sending emails, creating related records, or triggering multi-step sequences — use the Workflow tool (Advanced Pack extension required). See the CBM CRM Implementation Guide, Section 5 for guidance on choosing between the two approaches.</w:t>
+      </w:r>
+    </w:p>
+    <w:p>
+      <w:r>
+        <w:t xml:space="preserve"/>
+      </w:r>
+    </w:p>
+    <w:tbl>
+      <w:tblPr>
+        <w:tblW w:type="dxa" w:w="9360"/>
+        <w:tblBorders>
+          <w:top w:val="single" w:color="FFC107" w:sz="4"/>
+          <w:left w:val="single" w:color="FFC107" w:sz="4"/>
+          <w:bottom w:val="single" w:color="FFC107" w:sz="4"/>
+          <w:right w:val="single" w:color="FFC107" w:sz="4"/>
+        </w:tblBorders>
+      </w:tblPr>
+      <w:tblGrid>
+        <w:gridCol w:w="9360"/>
+      </w:tblGrid>
+      <w:tr>
+        <w:tc>
+          <w:tcPr>
+            <w:tcW w:type="dxa" w:w="9360"/>
+            <w:tcBorders>
+              <w:top w:val="single" w:color="FFC107" w:sz="4"/>
+              <w:left w:val="single" w:color="FFC107" w:sz="4"/>
+              <w:bottom w:val="single" w:color="FFC107" w:sz="4"/>
+              <w:right w:val="single" w:color="FFC107" w:sz="4"/>
+            </w:tcBorders>
+            <w:shd w:fill="FFF3CD" w:val="clear"/>
+            <w:tcMar>
+              <w:top w:type="dxa" w:w="100"/>
+              <w:left w:type="dxa" w:w="160"/>
+              <w:bottom w:type="dxa" w:w="100"/>
+              <w:right w:type="dxa" w:w="160"/>
+            </w:tcMar>
+          </w:tcPr>
+          <w:p>
+            <w:r>
+              <w:rPr>
+                <w:rFonts w:ascii="Arial" w:cs="Arial" w:eastAsia="Arial" w:hAnsi="Arial"/>
+                <w:b/>
+                <w:bCs/>
+                <w:sz w:val="22"/>
+                <w:szCs w:val="22"/>
+              </w:rPr>
+              <w:t xml:space="preserve">Note: </w:t>
+            </w:r>
+            <w:r>
+              <w:rPr>
+                <w:rFonts w:ascii="Arial" w:cs="Arial" w:eastAsia="Arial" w:hAnsi="Arial"/>
+                <w:sz w:val="22"/>
+                <w:szCs w:val="22"/>
+              </w:rPr>
+              <w:t xml:space="preserve">Entity Formula Scripts are not executed when a record is saved from within the system itself — for example, from within a Workflow action, hook, or custom code. For CBM’s use cases, where all record saves are initiated by an admin or mentor through the UI, this limitation does not apply.</w:t>
+            </w:r>
+          </w:p>
+        </w:tc>
+      </w:tr>
+    </w:tbl>
+    <w:p>
+      <w:r>
+        <w:t xml:space="preserve"/>
+      </w:r>
+    </w:p>
+    <w:p>
+      <w:pPr>
+        <w:pStyle w:val="Heading3"/>
+      </w:pPr>
+      <w:r>
+        <w:rPr>
+          <w:rFonts w:ascii="Arial" w:cs="Arial" w:eastAsia="Arial" w:hAnsi="Arial"/>
+          <w:b/>
+          <w:bCs/>
+          <w:sz w:val="24"/>
+          <w:szCs w:val="24"/>
+        </w:rPr>
+        <w:t xml:space="preserve">6.2 Where to Find the Formula Editor</w:t>
+      </w:r>
+    </w:p>
+    <w:p>
+      <w:pPr>
+        <w:spacing w:after="120"/>
+      </w:pPr>
+      <w:r>
+        <w:rPr>
+          <w:rFonts w:ascii="Arial" w:cs="Arial" w:eastAsia="Arial" w:hAnsi="Arial"/>
+          <w:sz w:val="22"/>
+          <w:szCs w:val="22"/>
+        </w:rPr>
+        <w:t xml:space="preserve">Navigate to: Administration → Entity Manager → [Entity Name] → Formula</w:t>
+      </w:r>
+    </w:p>
+    <w:p>
+      <w:pPr>
+        <w:spacing w:after="120"/>
+      </w:pPr>
+      <w:r>
+        <w:rPr>
+          <w:rFonts w:ascii="Arial" w:cs="Arial" w:eastAsia="Arial" w:hAnsi="Arial"/>
+          <w:sz w:val="22"/>
+          <w:szCs w:val="22"/>
+        </w:rPr>
+        <w:t xml:space="preserve">The Formula editor is a text field that accepts EspoCRM’s formula scripting language. Multiple rules can be combined in a single script — separate each statement with a semicolon.</w:t>
+      </w:r>
+    </w:p>
+    <w:p>
+      <w:r>
+        <w:t xml:space="preserve"/>
+      </w:r>
+    </w:p>
+    <w:p>
+      <w:pPr>
+        <w:pStyle w:val="Heading3"/>
+      </w:pPr>
+      <w:r>
+        <w:rPr>
+          <w:rFonts w:ascii="Arial" w:cs="Arial" w:eastAsia="Arial" w:hAnsi="Arial"/>
+          <w:b/>
+          <w:bCs/>
+          <w:sz w:val="24"/>
+          <w:szCs w:val="24"/>
+        </w:rPr>
+        <w:t xml:space="preserve">6.3 Step-by-Step: Adding a Formula Rule</w:t>
+      </w:r>
+    </w:p>
+    <w:p>
+      <w:r>
+        <w:t xml:space="preserve"/>
+      </w:r>
+    </w:p>
+    <w:p>
+      <w:pPr>
+        <w:spacing w:after="80"/>
+      </w:pPr>
+      <w:r>
+        <w:rPr>
+          <w:rFonts w:ascii="Arial" w:cs="Arial" w:eastAsia="Arial" w:hAnsi="Arial"/>
+          <w:b/>
+          <w:bCs/>
+          <w:sz w:val="22"/>
+          <w:szCs w:val="22"/>
+        </w:rPr>
+        <w:t xml:space="preserve">Step 1 — Open the Formula Editor</w:t>
+      </w:r>
+    </w:p>
+    <w:p>
+      <w:pPr>
+        <w:spacing w:after="120"/>
+      </w:pPr>
+      <w:r>
+        <w:rPr>
+          <w:rFonts w:ascii="Arial" w:cs="Arial" w:eastAsia="Arial" w:hAnsi="Arial"/>
+          <w:sz w:val="22"/>
+          <w:szCs w:val="22"/>
+        </w:rPr>
+        <w:t xml:space="preserve">Navigate to: Administration → Entity Manager → [Your Entity] → Formula</w:t>
+      </w:r>
+    </w:p>
+    <w:p>
+      <w:r>
+        <w:t xml:space="preserve"/>
+      </w:r>
+    </w:p>
+    <w:p>
+      <w:pPr>
+        <w:spacing w:after="80"/>
+      </w:pPr>
+      <w:r>
+        <w:rPr>
+          <w:rFonts w:ascii="Arial" w:cs="Arial" w:eastAsia="Arial" w:hAnsi="Arial"/>
+          <w:b/>
+          <w:bCs/>
+          <w:sz w:val="22"/>
+          <w:szCs w:val="22"/>
+        </w:rPr>
+        <w:t xml:space="preserve">Step 2 — Write the Formula</w:t>
+      </w:r>
+    </w:p>
+    <w:p>
+      <w:pPr>
+        <w:spacing w:after="120"/>
+      </w:pPr>
+      <w:r>
+        <w:rPr>
+          <w:rFonts w:ascii="Arial" w:cs="Arial" w:eastAsia="Arial" w:hAnsi="Arial"/>
+          <w:sz w:val="22"/>
+          <w:szCs w:val="22"/>
+        </w:rPr>
+        <w:t xml:space="preserve">Enter your formula in the text area. The standard pattern for a conditional field-setting rule is:</w:t>
+      </w:r>
+    </w:p>
+    <w:p>
+      <w:r>
+        <w:t xml:space="preserve"/>
+      </w:r>
+    </w:p>
+    <w:p>
+      <w:pPr>
+        <w:spacing w:before="0" w:after="0"/>
+      </w:pPr>
+      <w:r>
+        <w:rPr>
+          <w:rFonts w:ascii="Courier New" w:cs="Courier New" w:eastAsia="Courier New" w:hAnsi="Courier New"/>
+          <w:sz w:val="18"/>
+          <w:szCs w:val="18"/>
+          <w:shd w:fill="F2F2F2" w:val="clear"/>
+        </w:rPr>
+        <w:t xml:space="preserve">ifThen(</w:t>
+      </w:r>
+    </w:p>
+    <w:p>
+      <w:pPr>
+        <w:spacing w:before="0" w:after="0"/>
+      </w:pPr>
+      <w:r>
+        <w:rPr>
+          <w:rFonts w:ascii="Courier New" w:cs="Courier New" w:eastAsia="Courier New" w:hAnsi="Courier New"/>
+          <w:sz w:val="18"/>
+          <w:szCs w:val="18"/>
+          <w:shd w:fill="F2F2F2" w:val="clear"/>
+        </w:rPr>
+        <w:t xml:space="preserve">    entity\isAttributeChanged('fieldName') &amp;&amp; fieldName == 'TargetValue' &amp;&amp; targetDateField == null,</w:t>
+      </w:r>
+    </w:p>
+    <w:p>
+      <w:pPr>
+        <w:spacing w:before="0" w:after="0"/>
+      </w:pPr>
+      <w:r>
+        <w:rPr>
+          <w:rFonts w:ascii="Courier New" w:cs="Courier New" w:eastAsia="Courier New" w:hAnsi="Courier New"/>
+          <w:sz w:val="18"/>
+          <w:szCs w:val="18"/>
+          <w:shd w:fill="F2F2F2" w:val="clear"/>
+        </w:rPr>
+        <w:t xml:space="preserve">    targetDateField = datetime\today()</w:t>
+      </w:r>
+    </w:p>
+    <w:p>
+      <w:pPr>
+        <w:spacing w:before="0" w:after="0"/>
+      </w:pPr>
+      <w:r>
+        <w:rPr>
+          <w:rFonts w:ascii="Courier New" w:cs="Courier New" w:eastAsia="Courier New" w:hAnsi="Courier New"/>
+          <w:sz w:val="18"/>
+          <w:szCs w:val="18"/>
+          <w:shd w:fill="F2F2F2" w:val="clear"/>
+        </w:rPr>
+        <w:t xml:space="preserve">);</w:t>
+      </w:r>
+    </w:p>
+    <w:p>
+      <w:r>
+        <w:t xml:space="preserve"/>
+      </w:r>
+    </w:p>
+    <w:p>
+      <w:pPr>
+        <w:spacing w:after="120"/>
+      </w:pPr>
+      <w:r>
+        <w:rPr>
+          <w:rFonts w:ascii="Arial" w:cs="Arial" w:eastAsia="Arial" w:hAnsi="Arial"/>
+          <w:sz w:val="22"/>
+          <w:szCs w:val="22"/>
+        </w:rPr>
+        <w:t xml:space="preserve">The key formula functions used in this pattern are:</w:t>
+      </w:r>
+    </w:p>
+    <w:p>
+      <w:pPr>
+        <w:spacing w:after="120"/>
+      </w:pPr>
+      <w:r>
+        <w:rPr>
+          <w:rFonts w:ascii="Arial" w:cs="Arial" w:eastAsia="Arial" w:hAnsi="Arial"/>
+          <w:sz w:val="22"/>
+          <w:szCs w:val="22"/>
+        </w:rPr>
+        <w:t xml:space="preserve">•  entity\isAttributeChanged('fieldName') — returns true if the named field was changed on this save. Prevents the action from firing on unrelated saves.</w:t>
+      </w:r>
+    </w:p>
+    <w:p>
+      <w:pPr>
+        <w:spacing w:after="120"/>
+      </w:pPr>
+      <w:r>
+        <w:rPr>
+          <w:rFonts w:ascii="Arial" w:cs="Arial" w:eastAsia="Arial" w:hAnsi="Arial"/>
+          <w:sz w:val="22"/>
+          <w:szCs w:val="22"/>
+        </w:rPr>
+        <w:t xml:space="preserve">•  fieldName == 'TargetValue' — checks that the field was changed to the specific value you care about.</w:t>
+      </w:r>
+    </w:p>
+    <w:p>
+      <w:pPr>
+        <w:spacing w:after="120"/>
+      </w:pPr>
+      <w:r>
+        <w:rPr>
+          <w:rFonts w:ascii="Arial" w:cs="Arial" w:eastAsia="Arial" w:hAnsi="Arial"/>
+          <w:sz w:val="22"/>
+          <w:szCs w:val="22"/>
+        </w:rPr>
+        <w:t xml:space="preserve">•  targetDateField == null — a guard condition that prevents overwriting the field if it was already set. Remove this guard if you want the field to update every time the condition is met.</w:t>
+      </w:r>
+    </w:p>
+    <w:p>
+      <w:pPr>
+        <w:spacing w:after="120"/>
+      </w:pPr>
+      <w:r>
+        <w:rPr>
+          <w:rFonts w:ascii="Arial" w:cs="Arial" w:eastAsia="Arial" w:hAnsi="Arial"/>
+          <w:sz w:val="22"/>
+          <w:szCs w:val="22"/>
+        </w:rPr>
+        <w:t xml:space="preserve">•  datetime\today() — returns today’s date. Use datetime\now() if you need a date and time rather than just a date.</w:t>
+      </w:r>
+    </w:p>
+    <w:p>
+      <w:r>
+        <w:t xml:space="preserve"/>
+      </w:r>
+    </w:p>
+    <w:tbl>
+      <w:tblPr>
+        <w:tblW w:type="dxa" w:w="9360"/>
+        <w:tblBorders>
+          <w:top w:val="single" w:color="FFC107" w:sz="4"/>
+          <w:left w:val="single" w:color="FFC107" w:sz="4"/>
+          <w:bottom w:val="single" w:color="FFC107" w:sz="4"/>
+          <w:right w:val="single" w:color="FFC107" w:sz="4"/>
+        </w:tblBorders>
+      </w:tblPr>
+      <w:tblGrid>
+        <w:gridCol w:w="9360"/>
+      </w:tblGrid>
+      <w:tr>
+        <w:tc>
+          <w:tcPr>
+            <w:tcW w:type="dxa" w:w="9360"/>
+            <w:tcBorders>
+              <w:top w:val="single" w:color="FFC107" w:sz="4"/>
+              <w:left w:val="single" w:color="FFC107" w:sz="4"/>
+              <w:bottom w:val="single" w:color="FFC107" w:sz="4"/>
+              <w:right w:val="single" w:color="FFC107" w:sz="4"/>
+            </w:tcBorders>
+            <w:shd w:fill="FFF3CD" w:val="clear"/>
+            <w:tcMar>
+              <w:top w:type="dxa" w:w="100"/>
+              <w:left w:type="dxa" w:w="160"/>
+              <w:bottom w:type="dxa" w:w="100"/>
+              <w:right w:type="dxa" w:w="160"/>
+            </w:tcMar>
+          </w:tcPr>
+          <w:p>
+            <w:r>
+              <w:rPr>
+                <w:rFonts w:ascii="Arial" w:cs="Arial" w:eastAsia="Arial" w:hAnsi="Arial"/>
+                <w:b/>
+                <w:bCs/>
+                <w:sz w:val="22"/>
+                <w:szCs w:val="22"/>
+              </w:rPr>
+              <w:t xml:space="preserve">Note: </w:t>
+            </w:r>
+            <w:r>
+              <w:rPr>
+                <w:rFonts w:ascii="Arial" w:cs="Arial" w:eastAsia="Arial" w:hAnsi="Arial"/>
+                <w:sz w:val="22"/>
+                <w:szCs w:val="22"/>
+              </w:rPr>
+              <w:t xml:space="preserve">Field names in the formula must match the exact internal field name as defined in EspoCRM Entity Manager — not the display label. Verify field names under Administration → Entity Manager → [Entity] → Fields. Internal names are typically camelCase (e.g. mentorAssignedDate, not Mentor Assigned Date).</w:t>
+            </w:r>
+          </w:p>
+        </w:tc>
+      </w:tr>
+    </w:tbl>
+    <w:p>
+      <w:r>
+        <w:t xml:space="preserve"/>
+      </w:r>
+    </w:p>
+    <w:p>
+      <w:pPr>
+        <w:spacing w:after="80"/>
+      </w:pPr>
+      <w:r>
+        <w:rPr>
+          <w:rFonts w:ascii="Arial" w:cs="Arial" w:eastAsia="Arial" w:hAnsi="Arial"/>
+          <w:b/>
+          <w:bCs/>
+          <w:sz w:val="22"/>
+          <w:szCs w:val="22"/>
+        </w:rPr>
+        <w:t xml:space="preserve">Step 3 — Save</w:t>
+      </w:r>
+    </w:p>
+    <w:p>
+      <w:pPr>
+        <w:spacing w:after="120"/>
+      </w:pPr>
+      <w:r>
+        <w:rPr>
+          <w:rFonts w:ascii="Arial" w:cs="Arial" w:eastAsia="Arial" w:hAnsi="Arial"/>
+          <w:sz w:val="22"/>
+          <w:szCs w:val="22"/>
+        </w:rPr>
+        <w:t xml:space="preserve">Click Save. The formula takes effect immediately on the next save of any record of that entity type. No cache clear or server restart is required.</w:t>
+      </w:r>
+    </w:p>
+    <w:p>
+      <w:r>
+        <w:t xml:space="preserve"/>
+      </w:r>
+    </w:p>
+    <w:p>
+      <w:pPr>
+        <w:spacing w:after="80"/>
+      </w:pPr>
+      <w:r>
+        <w:rPr>
+          <w:rFonts w:ascii="Arial" w:cs="Arial" w:eastAsia="Arial" w:hAnsi="Arial"/>
+          <w:b/>
+          <w:bCs/>
+          <w:sz w:val="22"/>
+          <w:szCs w:val="22"/>
+        </w:rPr>
+        <w:t xml:space="preserve">Step 4 — Test</w:t>
+      </w:r>
+    </w:p>
+    <w:p>
+      <w:pPr>
+        <w:spacing w:after="120"/>
+      </w:pPr>
+      <w:r>
+        <w:rPr>
+          <w:rFonts w:ascii="Arial" w:cs="Arial" w:eastAsia="Arial" w:hAnsi="Arial"/>
+          <w:sz w:val="22"/>
+          <w:szCs w:val="22"/>
+        </w:rPr>
+        <w:t xml:space="preserve">Open a test record of that entity type and trigger the condition (e.g. change the Status field to the target value). Save the record and confirm the formula field is populated as expected.</w:t>
+      </w:r>
+    </w:p>
+    <w:p>
+      <w:r>
+        <w:t xml:space="preserve"/>
+      </w:r>
+    </w:p>
+    <w:p>
+      <w:pPr>
+        <w:pStyle w:val="Heading3"/>
+      </w:pPr>
+      <w:r>
+        <w:rPr>
+          <w:rFonts w:ascii="Arial" w:cs="Arial" w:eastAsia="Arial" w:hAnsi="Arial"/>
+          <w:b/>
+          <w:bCs/>
+          <w:sz w:val="24"/>
+          <w:szCs w:val="24"/>
+        </w:rPr>
+        <w:t xml:space="preserve">6.4 CBM Example: Mentor Assigned Date on Engagement</w:t>
+      </w:r>
+    </w:p>
+    <w:p>
+      <w:pPr>
+        <w:spacing w:after="120"/>
+      </w:pPr>
+      <w:r>
+        <w:rPr>
+          <w:rFonts w:ascii="Arial" w:cs="Arial" w:eastAsia="Arial" w:hAnsi="Arial"/>
+          <w:sz w:val="22"/>
+          <w:szCs w:val="22"/>
+        </w:rPr>
+        <w:t xml:space="preserve">The Mentor Assigned Date field on the Engagement entity is automatically set when an admin saves an Engagement with Status = Assigned. The formula is:</w:t>
+      </w:r>
+    </w:p>
+    <w:p>
+      <w:r>
+        <w:t xml:space="preserve"/>
+      </w:r>
+    </w:p>
+    <w:p>
+      <w:pPr>
+        <w:spacing w:before="0" w:after="0"/>
+      </w:pPr>
+      <w:r>
+        <w:rPr>
+          <w:rFonts w:ascii="Courier New" w:cs="Courier New" w:eastAsia="Courier New" w:hAnsi="Courier New"/>
+          <w:sz w:val="18"/>
+          <w:szCs w:val="18"/>
+          <w:shd w:fill="F2F2F2" w:val="clear"/>
+        </w:rPr>
+        <w:t xml:space="preserve">ifThen(</w:t>
+      </w:r>
+    </w:p>
+    <w:p>
+      <w:pPr>
+        <w:spacing w:before="0" w:after="0"/>
+      </w:pPr>
+      <w:r>
+        <w:rPr>
+          <w:rFonts w:ascii="Courier New" w:cs="Courier New" w:eastAsia="Courier New" w:hAnsi="Courier New"/>
+          <w:sz w:val="18"/>
+          <w:szCs w:val="18"/>
+          <w:shd w:fill="F2F2F2" w:val="clear"/>
+        </w:rPr>
+        <w:t xml:space="preserve">    entity\isAttributeChanged('status') &amp;&amp; status == 'Assigned' &amp;&amp; mentorAssignedDate == null,</w:t>
+      </w:r>
+    </w:p>
+    <w:p>
+      <w:pPr>
+        <w:spacing w:before="0" w:after="0"/>
+      </w:pPr>
+      <w:r>
+        <w:rPr>
+          <w:rFonts w:ascii="Courier New" w:cs="Courier New" w:eastAsia="Courier New" w:hAnsi="Courier New"/>
+          <w:sz w:val="18"/>
+          <w:szCs w:val="18"/>
+          <w:shd w:fill="F2F2F2" w:val="clear"/>
+        </w:rPr>
+        <w:t xml:space="preserve">    mentorAssignedDate = datetime\today()</w:t>
+      </w:r>
+    </w:p>
+    <w:p>
+      <w:pPr>
+        <w:spacing w:before="0" w:after="0"/>
+      </w:pPr>
+      <w:r>
+        <w:rPr>
+          <w:rFonts w:ascii="Courier New" w:cs="Courier New" w:eastAsia="Courier New" w:hAnsi="Courier New"/>
+          <w:sz w:val="18"/>
+          <w:szCs w:val="18"/>
+          <w:shd w:fill="F2F2F2" w:val="clear"/>
+        </w:rPr>
+        <w:t xml:space="preserve">);</w:t>
+      </w:r>
+    </w:p>
+    <w:p>
+      <w:r>
+        <w:t xml:space="preserve"/>
+      </w:r>
+    </w:p>
+    <w:p>
+      <w:pPr>
+        <w:spacing w:after="120"/>
+      </w:pPr>
+      <w:r>
+        <w:rPr>
+          <w:rFonts w:ascii="Arial" w:cs="Arial" w:eastAsia="Arial" w:hAnsi="Arial"/>
+          <w:sz w:val="22"/>
+          <w:szCs w:val="22"/>
+        </w:rPr>
+        <w:t xml:space="preserve">How it works:</w:t>
+      </w:r>
+    </w:p>
+    <w:p>
+      <w:pPr>
+        <w:spacing w:after="120"/>
+      </w:pPr>
+      <w:r>
+        <w:rPr>
+          <w:rFonts w:ascii="Arial" w:cs="Arial" w:eastAsia="Arial" w:hAnsi="Arial"/>
+          <w:sz w:val="22"/>
+          <w:szCs w:val="22"/>
+        </w:rPr>
+        <w:t xml:space="preserve">•  entity\isAttributeChanged('status') — fires only when the Status field was changed on this save, not on unrelated edits.</w:t>
+      </w:r>
+    </w:p>
+    <w:p>
+      <w:pPr>
+        <w:spacing w:after="120"/>
+      </w:pPr>
+      <w:r>
+        <w:rPr>
+          <w:rFonts w:ascii="Arial" w:cs="Arial" w:eastAsia="Arial" w:hAnsi="Arial"/>
+          <w:sz w:val="22"/>
+          <w:szCs w:val="22"/>
+        </w:rPr>
+        <w:t xml:space="preserve">•  status == 'Assigned' — ensures the date is only set when the status is specifically being changed to Assigned (i.e. when a mentor is nominated).</w:t>
+      </w:r>
+    </w:p>
+    <w:p>
+      <w:pPr>
+        <w:spacing w:after="120"/>
+      </w:pPr>
+      <w:r>
+        <w:rPr>
+          <w:rFonts w:ascii="Arial" w:cs="Arial" w:eastAsia="Arial" w:hAnsi="Arial"/>
+          <w:sz w:val="22"/>
+          <w:szCs w:val="22"/>
+        </w:rPr>
+        <w:t xml:space="preserve">•  mentorAssignedDate == null — prevents the date from being overwritten if the Engagement is later edited for any other reason.</w:t>
+      </w:r>
+    </w:p>
+    <w:p>
+      <w:pPr>
+        <w:spacing w:after="120"/>
+      </w:pPr>
+      <w:r>
+        <w:rPr>
+          <w:rFonts w:ascii="Arial" w:cs="Arial" w:eastAsia="Arial" w:hAnsi="Arial"/>
+          <w:sz w:val="22"/>
+          <w:szCs w:val="22"/>
+        </w:rPr>
+        <w:t xml:space="preserve">•  mentorAssignedDate = datetime\today() — sets the field to today’s date at the moment of save.</w:t>
+      </w:r>
+    </w:p>
+    <w:p>
+      <w:r>
+        <w:t xml:space="preserve"/>
+      </w:r>
+    </w:p>
+    <w:p>
+      <w:pPr>
+        <w:spacing w:after="120"/>
+      </w:pPr>
+      <w:r>
+        <w:rPr>
+          <w:rFonts w:ascii="Arial" w:cs="Arial" w:eastAsia="Arial" w:hAnsi="Arial"/>
+          <w:sz w:val="22"/>
+          <w:szCs w:val="22"/>
+        </w:rPr>
+        <w:t xml:space="preserve">This date is used to measure how long it takes from mentor assignment to the first session (the Assigned → Active transition), which is a key engagement health metric.</w:t>
+      </w:r>
+    </w:p>
+    <w:p>
+      <w:r>
+        <w:t xml:space="preserve"/>
+      </w:r>
+    </w:p>
+    <w:p>
+      <w:pPr>
+        <w:pStyle w:val="Heading3"/>
+      </w:pPr>
+      <w:r>
+        <w:rPr>
+          <w:rFonts w:ascii="Arial" w:cs="Arial" w:eastAsia="Arial" w:hAnsi="Arial"/>
+          <w:b/>
+          <w:bCs/>
+          <w:sz w:val="24"/>
+          <w:szCs w:val="24"/>
+        </w:rPr>
+        <w:t xml:space="preserve">6.5 Adding Multiple Rules</w:t>
+      </w:r>
+    </w:p>
+    <w:p>
+      <w:pPr>
+        <w:spacing w:after="120"/>
+      </w:pPr>
+      <w:r>
+        <w:rPr>
+          <w:rFonts w:ascii="Arial" w:cs="Arial" w:eastAsia="Arial" w:hAnsi="Arial"/>
+          <w:sz w:val="22"/>
+          <w:szCs w:val="22"/>
+        </w:rPr>
+        <w:t xml:space="preserve">Multiple formula rules can coexist in the same Formula editor. Separate each rule with a semicolon. For example, if the Engagement entity later has a second automation (e.g. auto-setting a Close Date), both rules can live in the same script:</w:t>
+      </w:r>
+    </w:p>
+    <w:p>
+      <w:r>
+        <w:t xml:space="preserve"/>
+      </w:r>
+    </w:p>
+    <w:p>
+      <w:pPr>
+        <w:spacing w:before="0" w:after="0"/>
+      </w:pPr>
+      <w:r>
+        <w:rPr>
+          <w:rFonts w:ascii="Courier New" w:cs="Courier New" w:eastAsia="Courier New" w:hAnsi="Courier New"/>
+          <w:sz w:val="18"/>
+          <w:szCs w:val="18"/>
+          <w:shd w:fill="F2F2F2" w:val="clear"/>
+        </w:rPr>
+        <w:t xml:space="preserve">ifThen(</w:t>
+      </w:r>
+    </w:p>
+    <w:p>
+      <w:pPr>
+        <w:spacing w:before="0" w:after="0"/>
+      </w:pPr>
+      <w:r>
+        <w:rPr>
+          <w:rFonts w:ascii="Courier New" w:cs="Courier New" w:eastAsia="Courier New" w:hAnsi="Courier New"/>
+          <w:sz w:val="18"/>
+          <w:szCs w:val="18"/>
+          <w:shd w:fill="F2F2F2" w:val="clear"/>
+        </w:rPr>
+        <w:t xml:space="preserve">    entity\isAttributeChanged('status') &amp;&amp; status == 'Assigned' &amp;&amp; mentorAssignedDate == null,</w:t>
+      </w:r>
+    </w:p>
+    <w:p>
+      <w:pPr>
+        <w:spacing w:before="0" w:after="0"/>
+      </w:pPr>
+      <w:r>
+        <w:rPr>
+          <w:rFonts w:ascii="Courier New" w:cs="Courier New" w:eastAsia="Courier New" w:hAnsi="Courier New"/>
+          <w:sz w:val="18"/>
+          <w:szCs w:val="18"/>
+          <w:shd w:fill="F2F2F2" w:val="clear"/>
+        </w:rPr>
+        <w:t xml:space="preserve">    mentorAssignedDate = datetime\today()</w:t>
+      </w:r>
+    </w:p>
+    <w:p>
+      <w:pPr>
+        <w:spacing w:before="0" w:after="0"/>
+      </w:pPr>
+      <w:r>
+        <w:rPr>
+          <w:rFonts w:ascii="Courier New" w:cs="Courier New" w:eastAsia="Courier New" w:hAnsi="Courier New"/>
+          <w:sz w:val="18"/>
+          <w:szCs w:val="18"/>
+          <w:shd w:fill="F2F2F2" w:val="clear"/>
+        </w:rPr>
+        <w:t xml:space="preserve">);</w:t>
+      </w:r>
+    </w:p>
+    <w:p>
+      <w:pPr>
+        <w:spacing w:before="0" w:after="0"/>
+      </w:pPr>
+      <w:r>
+        <w:rPr>
+          <w:rFonts w:ascii="Courier New" w:cs="Courier New" w:eastAsia="Courier New" w:hAnsi="Courier New"/>
+          <w:sz w:val="18"/>
+          <w:szCs w:val="18"/>
+          <w:shd w:fill="F2F2F2" w:val="clear"/>
+        </w:rPr>
+        <w:t xml:space="preserve"/>
+      </w:r>
+    </w:p>
+    <w:p>
+      <w:pPr>
+        <w:spacing w:before="0" w:after="0"/>
+      </w:pPr>
+      <w:r>
+        <w:rPr>
+          <w:rFonts w:ascii="Courier New" w:cs="Courier New" w:eastAsia="Courier New" w:hAnsi="Courier New"/>
+          <w:sz w:val="18"/>
+          <w:szCs w:val="18"/>
+          <w:shd w:fill="F2F2F2" w:val="clear"/>
+        </w:rPr>
+        <w:t xml:space="preserve">ifThen(</w:t>
+      </w:r>
+    </w:p>
+    <w:p>
+      <w:pPr>
+        <w:spacing w:before="0" w:after="0"/>
+      </w:pPr>
+      <w:r>
+        <w:rPr>
+          <w:rFonts w:ascii="Courier New" w:cs="Courier New" w:eastAsia="Courier New" w:hAnsi="Courier New"/>
+          <w:sz w:val="18"/>
+          <w:szCs w:val="18"/>
+          <w:shd w:fill="F2F2F2" w:val="clear"/>
+        </w:rPr>
+        <w:t xml:space="preserve">    entity\isAttributeChanged('status')</w:t>
+      </w:r>
+    </w:p>
+    <w:p>
+      <w:pPr>
+        <w:spacing w:before="0" w:after="0"/>
+      </w:pPr>
+      <w:r>
+        <w:rPr>
+          <w:rFonts w:ascii="Courier New" w:cs="Courier New" w:eastAsia="Courier New" w:hAnsi="Courier New"/>
+          <w:sz w:val="18"/>
+          <w:szCs w:val="18"/>
+          <w:shd w:fill="F2F2F2" w:val="clear"/>
+        </w:rPr>
+        <w:t xml:space="preserve">    &amp;&amp; (status == 'Completed' || status == 'Abandoned')</w:t>
+      </w:r>
+    </w:p>
+    <w:p>
+      <w:pPr>
+        <w:spacing w:before="0" w:after="0"/>
+      </w:pPr>
+      <w:r>
+        <w:rPr>
+          <w:rFonts w:ascii="Courier New" w:cs="Courier New" w:eastAsia="Courier New" w:hAnsi="Courier New"/>
+          <w:sz w:val="18"/>
+          <w:szCs w:val="18"/>
+          <w:shd w:fill="F2F2F2" w:val="clear"/>
+        </w:rPr>
+        <w:t xml:space="preserve">    &amp;&amp; closeDate == null,</w:t>
+      </w:r>
+    </w:p>
+    <w:p>
+      <w:pPr>
+        <w:spacing w:before="0" w:after="0"/>
+      </w:pPr>
+      <w:r>
+        <w:rPr>
+          <w:rFonts w:ascii="Courier New" w:cs="Courier New" w:eastAsia="Courier New" w:hAnsi="Courier New"/>
+          <w:sz w:val="18"/>
+          <w:szCs w:val="18"/>
+          <w:shd w:fill="F2F2F2" w:val="clear"/>
+        </w:rPr>
+        <w:t xml:space="preserve">    closeDate = datetime\today()</w:t>
+      </w:r>
+    </w:p>
+    <w:p>
+      <w:pPr>
+        <w:spacing w:before="0" w:after="0"/>
+      </w:pPr>
+      <w:r>
+        <w:rPr>
+          <w:rFonts w:ascii="Courier New" w:cs="Courier New" w:eastAsia="Courier New" w:hAnsi="Courier New"/>
+          <w:sz w:val="18"/>
+          <w:szCs w:val="18"/>
+          <w:shd w:fill="F2F2F2" w:val="clear"/>
+        </w:rPr>
+        <w:t xml:space="preserve">);</w:t>
+      </w:r>
+    </w:p>
+    <w:p>
+      <w:r>
+        <w:t xml:space="preserve"/>
+      </w:r>
+    </w:p>
+    <w:tbl>
+      <w:tblPr>
+        <w:tblW w:type="dxa" w:w="9360"/>
+        <w:tblBorders>
+          <w:top w:val="single" w:color="FFC107" w:sz="4"/>
+          <w:left w:val="single" w:color="FFC107" w:sz="4"/>
+          <w:bottom w:val="single" w:color="FFC107" w:sz="4"/>
+          <w:right w:val="single" w:color="FFC107" w:sz="4"/>
+        </w:tblBorders>
+      </w:tblPr>
+      <w:tblGrid>
+        <w:gridCol w:w="9360"/>
+      </w:tblGrid>
+      <w:tr>
+        <w:tc>
+          <w:tcPr>
+            <w:tcW w:type="dxa" w:w="9360"/>
+            <w:tcBorders>
+              <w:top w:val="single" w:color="FFC107" w:sz="4"/>
+              <w:left w:val="single" w:color="FFC107" w:sz="4"/>
+              <w:bottom w:val="single" w:color="FFC107" w:sz="4"/>
+              <w:right w:val="single" w:color="FFC107" w:sz="4"/>
+            </w:tcBorders>
+            <w:shd w:fill="FFF3CD" w:val="clear"/>
+            <w:tcMar>
+              <w:top w:type="dxa" w:w="100"/>
+              <w:left w:type="dxa" w:w="160"/>
+              <w:bottom w:type="dxa" w:w="100"/>
+              <w:right w:type="dxa" w:w="160"/>
+            </w:tcMar>
+          </w:tcPr>
+          <w:p>
+            <w:r>
+              <w:rPr>
+                <w:rFonts w:ascii="Arial" w:cs="Arial" w:eastAsia="Arial" w:hAnsi="Arial"/>
+                <w:b/>
+                <w:bCs/>
+                <w:sz w:val="22"/>
+                <w:szCs w:val="22"/>
+              </w:rPr>
+              <w:t xml:space="preserve">Note: </w:t>
+            </w:r>
+            <w:r>
+              <w:rPr>
+                <w:rFonts w:ascii="Arial" w:cs="Arial" w:eastAsia="Arial" w:hAnsi="Arial"/>
+                <w:sz w:val="22"/>
+                <w:szCs w:val="22"/>
+              </w:rPr>
+              <w:t xml:space="preserve">EspoCRM executes the entire formula script top to bottom on every save. Keep all automations for a given entity in a single script rather than splitting them across multiple scripts — there is only one Formula field per entity.</w:t>
+            </w:r>
+          </w:p>
+        </w:tc>
+      </w:tr>
+    </w:tbl>
     <w:p>
       <w:r>
         <w:t xml:space="preserve"/>

</xml_diff>

<commit_message>
Merge remote How To edits + add Section 5 Automations (impl) and Section 6 Formula Scripts (how to) (v0.5)
</commit_message>
<xml_diff>
--- a/PRDs/CBM-EspoCRM-HowTo.docx
+++ b/PRDs/CBM-EspoCRM-HowTo.docx
@@ -867,7 +867,25 @@
           <w:sz w:val="22"/>
           <w:szCs w:val="22"/>
         </w:rPr>
-        <w:t xml:space="preserve">Text — long-form text (notes, descriptions)</w:t>
+        <w:t xml:space="preserve">Text — long-form plain text (notes, descriptions). Renders as a multi-line textarea that expands to show full content.</w:t>
+      </w:r>
+    </w:p>
+    <w:p>
+      <w:pPr>
+        <w:pStyle w:val="ListParagraph"/>
+        <w:numPr>
+          <w:ilvl w:val="0"/>
+          <w:numId w:val="2"/>
+        </w:numPr>
+        <w:spacing w:after="80"/>
+      </w:pPr>
+      <w:r>
+        <w:rPr>
+          <w:rFonts w:ascii="Arial" w:cs="Arial" w:eastAsia="Arial" w:hAnsi="Arial"/>
+          <w:sz w:val="22"/>
+          <w:szCs w:val="22"/>
+        </w:rPr>
+        <w:t xml:space="preserve">Wysiwyg — rich text editor with formatting toolbar (bold, italic, lists, links, etc.). Renders formatted HTML output in the detail view, making notes and descriptions more readable. Best choice when users need to format content. Note: data is stored internally as HTML, so exported or programmatically accessed data will include HTML markup.</w:t>
       </w:r>
     </w:p>
     <w:p>
@@ -12969,6 +12987,24 @@
           <w:szCs w:val="22"/>
         </w:rPr>
         <w:t xml:space="preserve">How to show all emails sent to a contact on their Contact detail page — there is no Emails panel available in the Contact entity's Bottom Panels layout, suggesting email display is handled through a different mechanism such as email archiving or the activity stream. The correct configuration path needs to be identified and documented.</w:t>
+      </w:r>
+    </w:p>
+    <w:p>
+      <w:pPr>
+        <w:pStyle w:val="ListParagraph"/>
+        <w:numPr>
+          <w:ilvl w:val="0"/>
+          <w:numId w:val="2"/>
+        </w:numPr>
+        <w:spacing w:after="80"/>
+      </w:pPr>
+      <w:r>
+        <w:rPr>
+          <w:rFonts w:ascii="Arial" w:cs="Arial" w:eastAsia="Arial" w:hAnsi="Arial"/>
+          <w:sz w:val="22"/>
+          <w:szCs w:val="22"/>
+        </w:rPr>
+        <w:t xml:space="preserve">How do users add notes to a record — the Note entity exists in Entity Manager as a system-level entity with limited configurability (Fields only, no Layouts or Relationships tabs). It likely powers an activity stream or notes panel on record detail pages, but the exact user-facing path for posting notes, attaching files, and viewing note history on a record needs to be identified and documented.</w:t>
       </w:r>
     </w:p>
     <w:p>

</xml_diff>

<commit_message>
Update CBM-EspoCRM-HowTo.docx - add Section 6 Tab-Break panels
</commit_message>
<xml_diff>
--- a/PRDs/CBM-EspoCRM-HowTo.docx
+++ b/PRDs/CBM-EspoCRM-HowTo.docx
@@ -7881,16 +7881,6 @@
       </w:r>
     </w:p>
     <w:p>
-      <w:r>
-        <w:t xml:space="preserve"/>
-      </w:r>
-    </w:p>
-    <w:p>
-      <w:r>
-        <w:t xml:space="preserve"/>
-      </w:r>
-    </w:p>
-    <w:p>
       <w:pPr>
         <w:pStyle w:val="Heading2"/>
       </w:pPr>
@@ -7899,10 +7889,11 @@
           <w:rFonts w:ascii="Arial" w:cs="Arial" w:eastAsia="Arial" w:hAnsi="Arial"/>
           <w:b/>
           <w:bCs/>
-          <w:sz w:val="28"/>
-          <w:szCs w:val="28"/>
-        </w:rPr>
-        <w:t xml:space="preserve">6. Automating Field Values with Entity Formula Scripts</w:t>
+          <w:color w:val="2E75B6"/>
+          <w:sz w:val="26"/>
+          <w:szCs w:val="26"/>
+        </w:rPr>
+        <w:t xml:space="preserve">6. Organizing Fields into Tabs on the Detail View</w:t>
       </w:r>
     </w:p>
     <w:p>
@@ -7920,7 +7911,7 @@
           <w:sz w:val="22"/>
           <w:szCs w:val="22"/>
         </w:rPr>
-        <w:t xml:space="preserve">EspoCRM’s Entity Formula Script allows you to automatically set field values whenever a record is saved. The formula runs on every create or update triggered through the UI or API, and only executes the action when your specified conditions are met. This is the simplest and most reliable automation option in EspoCRM — no extensions required, and everything is configured through the admin UI.</w:t>
+        <w:t xml:space="preserve">For entities with a large number of fields, EspoCRM supports organizing panels into tabs on the detail view. This reduces scrolling and improves usability by grouping related fields under clickable tab headers. Tab support is available as of EspoCRM v7.2.</w:t>
       </w:r>
     </w:p>
     <w:p>
@@ -7937,10 +7928,11 @@
           <w:rFonts w:ascii="Arial" w:cs="Arial" w:eastAsia="Arial" w:hAnsi="Arial"/>
           <w:b/>
           <w:bCs/>
+          <w:color w:val="595959"/>
           <w:sz w:val="24"/>
           <w:szCs w:val="24"/>
         </w:rPr>
-        <w:t xml:space="preserve">6.1 When to Use Entity Formula Script</w:t>
+        <w:t xml:space="preserve">6.1 How Tabs Work</w:t>
       </w:r>
     </w:p>
     <w:p>
@@ -7953,7 +7945,49 @@
           <w:sz w:val="22"/>
           <w:szCs w:val="22"/>
         </w:rPr>
-        <w:t xml:space="preserve">Use the Entity Formula Script approach when:</w:t>
+        <w:t xml:space="preserve">Tabs are created by designating certain panels as Tab-Break panels in the Detail View layout. A Tab-Break panel marks the start of a new tab — all panels following it (until the next Tab-Break) are grouped into that tab. The Tab-Break panel's label becomes the tab header displayed at the top of the detail view.</w:t>
+      </w:r>
+    </w:p>
+    <w:p>
+      <w:r>
+        <w:t xml:space="preserve"/>
+      </w:r>
+    </w:p>
+    <w:p>
+      <w:pPr>
+        <w:pStyle w:val="Heading3"/>
+      </w:pPr>
+      <w:r>
+        <w:rPr>
+          <w:rFonts w:ascii="Arial" w:cs="Arial" w:eastAsia="Arial" w:hAnsi="Arial"/>
+          <w:b/>
+          <w:bCs/>
+          <w:color w:val="595959"/>
+          <w:sz w:val="24"/>
+          <w:szCs w:val="24"/>
+        </w:rPr>
+        <w:t xml:space="preserve">6.2 Step-by-Step: Adding Tabs to a Detail View</w:t>
+      </w:r>
+    </w:p>
+    <w:p>
+      <w:r>
+        <w:t xml:space="preserve"/>
+      </w:r>
+    </w:p>
+    <w:p>
+      <w:pPr>
+        <w:pStyle w:val="Heading3"/>
+      </w:pPr>
+      <w:r>
+        <w:rPr>
+          <w:rFonts w:ascii="Arial" w:cs="Arial" w:eastAsia="Arial" w:hAnsi="Arial"/>
+          <w:b/>
+          <w:bCs/>
+          <w:color w:val="595959"/>
+          <w:sz w:val="24"/>
+          <w:szCs w:val="24"/>
+        </w:rPr>
+        <w:t xml:space="preserve">Step 1 — Open the Detail View Layout</w:t>
       </w:r>
     </w:p>
     <w:p>
@@ -7966,7 +8000,28 @@
           <w:sz w:val="22"/>
           <w:szCs w:val="22"/>
         </w:rPr>
-        <w:t xml:space="preserve">•  You need to automatically set a field on the same record that is being saved.</w:t>
+        <w:t xml:space="preserve">Navigate to: Admin → Entity Manager → [Your Entity] → Layouts → Detail View</w:t>
+      </w:r>
+    </w:p>
+    <w:p>
+      <w:r>
+        <w:t xml:space="preserve"/>
+      </w:r>
+    </w:p>
+    <w:p>
+      <w:pPr>
+        <w:pStyle w:val="Heading3"/>
+      </w:pPr>
+      <w:r>
+        <w:rPr>
+          <w:rFonts w:ascii="Arial" w:cs="Arial" w:eastAsia="Arial" w:hAnsi="Arial"/>
+          <w:b/>
+          <w:bCs/>
+          <w:color w:val="595959"/>
+          <w:sz w:val="24"/>
+          <w:szCs w:val="24"/>
+        </w:rPr>
+        <w:t xml:space="preserve">Step 2 — Edit a Panel to Make It a Tab-Break</w:t>
       </w:r>
     </w:p>
     <w:p>
@@ -7979,7 +8034,69 @@
           <w:sz w:val="22"/>
           <w:szCs w:val="22"/>
         </w:rPr>
-        <w:t xml:space="preserve">•  The action should fire on every save, not just once.</w:t>
+        <w:t xml:space="preserve">Click the pencil (edit) icon on the panel you want to be the first panel in a new tab. In the panel settings:</w:t>
+      </w:r>
+    </w:p>
+    <w:p>
+      <w:r>
+        <w:t xml:space="preserve"/>
+      </w:r>
+    </w:p>
+    <w:p>
+      <w:pPr>
+        <w:pStyle w:val="ListParagraph"/>
+        <w:numPr>
+          <w:ilvl w:val="0"/>
+          <w:numId w:val="2"/>
+        </w:numPr>
+        <w:spacing w:after="80"/>
+      </w:pPr>
+      <w:r>
+        <w:rPr>
+          <w:rFonts w:ascii="Arial" w:cs="Arial" w:eastAsia="Arial" w:hAnsi="Arial"/>
+          <w:sz w:val="22"/>
+          <w:szCs w:val="22"/>
+        </w:rPr>
+        <w:t xml:space="preserve">Check the Tab-break option to designate this panel as the start of a new tab.</w:t>
+      </w:r>
+    </w:p>
+    <w:p>
+      <w:pPr>
+        <w:pStyle w:val="ListParagraph"/>
+        <w:numPr>
+          <w:ilvl w:val="0"/>
+          <w:numId w:val="2"/>
+        </w:numPr>
+        <w:spacing w:after="80"/>
+      </w:pPr>
+      <w:r>
+        <w:rPr>
+          <w:rFonts w:ascii="Arial" w:cs="Arial" w:eastAsia="Arial" w:hAnsi="Arial"/>
+          <w:sz w:val="22"/>
+          <w:szCs w:val="22"/>
+        </w:rPr>
+        <w:t xml:space="preserve">Enter a Tab Label — this is the text that will appear on the tab header (e.g., Personal Info, Training, Engagement Details).</w:t>
+      </w:r>
+    </w:p>
+    <w:p>
+      <w:r>
+        <w:t xml:space="preserve"/>
+      </w:r>
+    </w:p>
+    <w:p>
+      <w:pPr>
+        <w:pStyle w:val="Heading3"/>
+      </w:pPr>
+      <w:r>
+        <w:rPr>
+          <w:rFonts w:ascii="Arial" w:cs="Arial" w:eastAsia="Arial" w:hAnsi="Arial"/>
+          <w:b/>
+          <w:bCs/>
+          <w:color w:val="595959"/>
+          <w:sz w:val="24"/>
+          <w:szCs w:val="24"/>
+        </w:rPr>
+        <w:t xml:space="preserve">Step 3 — Organize Additional Panels</w:t>
       </w:r>
     </w:p>
     <w:p>
@@ -7992,7 +8109,12 @@
           <w:sz w:val="22"/>
           <w:szCs w:val="22"/>
         </w:rPr>
-        <w:t xml:space="preserve">•  The logic is condition-based (e.g. “only set this field if another field changed to a specific value and the target field is currently empty”).</w:t>
+        <w:t xml:space="preserve">All panels below a Tab-Break panel are automatically grouped into that tab, until the next Tab-Break panel is encountered. To create additional tabs, repeat Step 2 for each panel that should start a new tab.</w:t>
+      </w:r>
+    </w:p>
+    <w:p>
+      <w:r>
+        <w:t xml:space="preserve"/>
       </w:r>
     </w:p>
     <w:p>
@@ -8005,7 +8127,193 @@
           <w:sz w:val="22"/>
           <w:szCs w:val="22"/>
         </w:rPr>
-        <w:t xml:space="preserve">For more complex automation — such as sending emails, creating related records, or triggering multi-step sequences — use the Workflow tool (Advanced Pack extension required). See the CBM CRM Implementation Guide, Section 5 for guidance on choosing between the two approaches.</w:t>
+        <w:t xml:space="preserve">For example, if you have panels A, B, C, D, E and you mark A and C as Tab-Break panels:</w:t>
+      </w:r>
+    </w:p>
+    <w:p>
+      <w:pPr>
+        <w:pStyle w:val="ListParagraph"/>
+        <w:numPr>
+          <w:ilvl w:val="0"/>
+          <w:numId w:val="2"/>
+        </w:numPr>
+        <w:spacing w:after="80"/>
+      </w:pPr>
+      <w:r>
+        <w:rPr>
+          <w:rFonts w:ascii="Arial" w:cs="Arial" w:eastAsia="Arial" w:hAnsi="Arial"/>
+          <w:sz w:val="22"/>
+          <w:szCs w:val="22"/>
+        </w:rPr>
+        <w:t xml:space="preserve">Tab 1 (label from A) — contains panels A and B</w:t>
+      </w:r>
+    </w:p>
+    <w:p>
+      <w:pPr>
+        <w:pStyle w:val="ListParagraph"/>
+        <w:numPr>
+          <w:ilvl w:val="0"/>
+          <w:numId w:val="2"/>
+        </w:numPr>
+        <w:spacing w:after="80"/>
+      </w:pPr>
+      <w:r>
+        <w:rPr>
+          <w:rFonts w:ascii="Arial" w:cs="Arial" w:eastAsia="Arial" w:hAnsi="Arial"/>
+          <w:sz w:val="22"/>
+          <w:szCs w:val="22"/>
+        </w:rPr>
+        <w:t xml:space="preserve">Tab 2 (label from C) — contains panels C, D, and E</w:t>
+      </w:r>
+    </w:p>
+    <w:p>
+      <w:r>
+        <w:t xml:space="preserve"/>
+      </w:r>
+    </w:p>
+    <w:p>
+      <w:pPr>
+        <w:pStyle w:val="Heading3"/>
+      </w:pPr>
+      <w:r>
+        <w:rPr>
+          <w:rFonts w:ascii="Arial" w:cs="Arial" w:eastAsia="Arial" w:hAnsi="Arial"/>
+          <w:b/>
+          <w:bCs/>
+          <w:color w:val="595959"/>
+          <w:sz w:val="24"/>
+          <w:szCs w:val="24"/>
+        </w:rPr>
+        <w:t xml:space="preserve">Step 4 — Save and Clear Cache</w:t>
+      </w:r>
+    </w:p>
+    <w:p>
+      <w:pPr>
+        <w:pStyle w:val="ListParagraph"/>
+        <w:numPr>
+          <w:ilvl w:val="0"/>
+          <w:numId w:val="3"/>
+        </w:numPr>
+        <w:spacing w:after="100"/>
+      </w:pPr>
+      <w:r>
+        <w:rPr>
+          <w:rFonts w:ascii="Arial" w:cs="Arial" w:eastAsia="Arial" w:hAnsi="Arial"/>
+          <w:sz w:val="22"/>
+          <w:szCs w:val="22"/>
+        </w:rPr>
+        <w:t xml:space="preserve">Click Save in the layout editor.</w:t>
+      </w:r>
+    </w:p>
+    <w:p>
+      <w:pPr>
+        <w:pStyle w:val="ListParagraph"/>
+        <w:numPr>
+          <w:ilvl w:val="0"/>
+          <w:numId w:val="3"/>
+        </w:numPr>
+        <w:spacing w:after="100"/>
+      </w:pPr>
+      <w:r>
+        <w:rPr>
+          <w:rFonts w:ascii="Arial" w:cs="Arial" w:eastAsia="Arial" w:hAnsi="Arial"/>
+          <w:sz w:val="22"/>
+          <w:szCs w:val="22"/>
+        </w:rPr>
+        <w:t xml:space="preserve">Go to: Admin → Clear Cache.</w:t>
+      </w:r>
+    </w:p>
+    <w:p>
+      <w:pPr>
+        <w:pStyle w:val="ListParagraph"/>
+        <w:numPr>
+          <w:ilvl w:val="0"/>
+          <w:numId w:val="3"/>
+        </w:numPr>
+        <w:spacing w:after="100"/>
+      </w:pPr>
+      <w:r>
+        <w:rPr>
+          <w:rFonts w:ascii="Arial" w:cs="Arial" w:eastAsia="Arial" w:hAnsi="Arial"/>
+          <w:sz w:val="22"/>
+          <w:szCs w:val="22"/>
+        </w:rPr>
+        <w:t xml:space="preserve">Refresh your browser. The detail view will now show tabs at the top.</w:t>
+      </w:r>
+    </w:p>
+    <w:p>
+      <w:r>
+        <w:t xml:space="preserve"/>
+      </w:r>
+    </w:p>
+    <w:p>
+      <w:pPr>
+        <w:pStyle w:val="Heading3"/>
+      </w:pPr>
+      <w:r>
+        <w:rPr>
+          <w:rFonts w:ascii="Arial" w:cs="Arial" w:eastAsia="Arial" w:hAnsi="Arial"/>
+          <w:b/>
+          <w:bCs/>
+          <w:color w:val="595959"/>
+          <w:sz w:val="24"/>
+          <w:szCs w:val="24"/>
+        </w:rPr>
+        <w:t xml:space="preserve">6.3 Important Notes</w:t>
+      </w:r>
+    </w:p>
+    <w:p>
+      <w:pPr>
+        <w:pStyle w:val="ListParagraph"/>
+        <w:numPr>
+          <w:ilvl w:val="0"/>
+          <w:numId w:val="2"/>
+        </w:numPr>
+        <w:spacing w:after="80"/>
+      </w:pPr>
+      <w:r>
+        <w:rPr>
+          <w:rFonts w:ascii="Arial" w:cs="Arial" w:eastAsia="Arial" w:hAnsi="Arial"/>
+          <w:sz w:val="22"/>
+          <w:szCs w:val="22"/>
+        </w:rPr>
+        <w:t xml:space="preserve">Tab-Break panels should not be combined with the Hidden panel parameter — they are not fully compatible.</w:t>
+      </w:r>
+    </w:p>
+    <w:p>
+      <w:pPr>
+        <w:pStyle w:val="ListParagraph"/>
+        <w:numPr>
+          <w:ilvl w:val="0"/>
+          <w:numId w:val="2"/>
+        </w:numPr>
+        <w:spacing w:after="80"/>
+      </w:pPr>
+      <w:r>
+        <w:rPr>
+          <w:rFonts w:ascii="Arial" w:cs="Arial" w:eastAsia="Arial" w:hAnsi="Arial"/>
+          <w:sz w:val="22"/>
+          <w:szCs w:val="22"/>
+        </w:rPr>
+        <w:t xml:space="preserve">Dynamic Logic conditions can be used to control the visibility of both individual panels and entire tabs based on field values, the same way as documented in Section 5.</w:t>
+      </w:r>
+    </w:p>
+    <w:p>
+      <w:pPr>
+        <w:pStyle w:val="ListParagraph"/>
+        <w:numPr>
+          <w:ilvl w:val="0"/>
+          <w:numId w:val="2"/>
+        </w:numPr>
+        <w:spacing w:after="80"/>
+      </w:pPr>
+      <w:r>
+        <w:rPr>
+          <w:rFonts w:ascii="Arial" w:cs="Arial" w:eastAsia="Arial" w:hAnsi="Arial"/>
+          <w:sz w:val="22"/>
+          <w:szCs w:val="22"/>
+        </w:rPr>
+        <w:t xml:space="preserve">If only one tab is defined, EspoCRM will display the layout without tabs. At least two Tab-Break panels are needed for the tab interface to appear.</w:t>
       </w:r>
     </w:p>
     <w:p>
@@ -8017,10 +8325,12 @@
       <w:tblPr>
         <w:tblW w:type="dxa" w:w="9360"/>
         <w:tblBorders>
-          <w:top w:val="single" w:color="FFC107" w:sz="4"/>
-          <w:left w:val="single" w:color="FFC107" w:sz="4"/>
-          <w:bottom w:val="single" w:color="FFC107" w:sz="4"/>
-          <w:right w:val="single" w:color="FFC107" w:sz="4"/>
+          <w:top w:val="single" w:color="auto" w:sz="4"/>
+          <w:left w:val="single" w:color="auto" w:sz="4"/>
+          <w:bottom w:val="single" w:color="auto" w:sz="4"/>
+          <w:right w:val="single" w:color="auto" w:sz="4"/>
+          <w:insideH w:val="single" w:color="auto" w:sz="4"/>
+          <w:insideV w:val="single" w:color="auto" w:sz="4"/>
         </w:tblBorders>
       </w:tblPr>
       <w:tblGrid>
@@ -8061,7 +8371,7 @@
                 <w:sz w:val="22"/>
                 <w:szCs w:val="22"/>
               </w:rPr>
-              <w:t xml:space="preserve">Entity Formula Scripts are not executed when a record is saved from within the system itself — for example, from within a Workflow action, hook, or custom code. For CBM’s use cases, where all record saves are initiated by an admin or mentor through the UI, this limitation does not apply.</w:t>
+              <w:t xml:space="preserve">Tab organization only affects the Detail View and Edit View. It has no effect on List View, Bottom Panels, or List (Small) layouts.</w:t>
             </w:r>
           </w:p>
         </w:tc>
@@ -8072,822 +8382,6 @@
         <w:t xml:space="preserve"/>
       </w:r>
     </w:p>
-    <w:p>
-      <w:pPr>
-        <w:pStyle w:val="Heading3"/>
-      </w:pPr>
-      <w:r>
-        <w:rPr>
-          <w:rFonts w:ascii="Arial" w:cs="Arial" w:eastAsia="Arial" w:hAnsi="Arial"/>
-          <w:b/>
-          <w:bCs/>
-          <w:sz w:val="24"/>
-          <w:szCs w:val="24"/>
-        </w:rPr>
-        <w:t xml:space="preserve">6.2 Where to Find the Formula Editor</w:t>
-      </w:r>
-    </w:p>
-    <w:p>
-      <w:pPr>
-        <w:spacing w:after="120"/>
-      </w:pPr>
-      <w:r>
-        <w:rPr>
-          <w:rFonts w:ascii="Arial" w:cs="Arial" w:eastAsia="Arial" w:hAnsi="Arial"/>
-          <w:sz w:val="22"/>
-          <w:szCs w:val="22"/>
-        </w:rPr>
-        <w:t xml:space="preserve">Navigate to: Administration → Entity Manager → [Entity Name] → Formula</w:t>
-      </w:r>
-    </w:p>
-    <w:p>
-      <w:pPr>
-        <w:spacing w:after="120"/>
-      </w:pPr>
-      <w:r>
-        <w:rPr>
-          <w:rFonts w:ascii="Arial" w:cs="Arial" w:eastAsia="Arial" w:hAnsi="Arial"/>
-          <w:sz w:val="22"/>
-          <w:szCs w:val="22"/>
-        </w:rPr>
-        <w:t xml:space="preserve">The Formula editor is a text field that accepts EspoCRM’s formula scripting language. Multiple rules can be combined in a single script — separate each statement with a semicolon.</w:t>
-      </w:r>
-    </w:p>
-    <w:p>
-      <w:r>
-        <w:t xml:space="preserve"/>
-      </w:r>
-    </w:p>
-    <w:p>
-      <w:pPr>
-        <w:pStyle w:val="Heading3"/>
-      </w:pPr>
-      <w:r>
-        <w:rPr>
-          <w:rFonts w:ascii="Arial" w:cs="Arial" w:eastAsia="Arial" w:hAnsi="Arial"/>
-          <w:b/>
-          <w:bCs/>
-          <w:sz w:val="24"/>
-          <w:szCs w:val="24"/>
-        </w:rPr>
-        <w:t xml:space="preserve">6.3 Step-by-Step: Adding a Formula Rule</w:t>
-      </w:r>
-    </w:p>
-    <w:p>
-      <w:r>
-        <w:t xml:space="preserve"/>
-      </w:r>
-    </w:p>
-    <w:p>
-      <w:pPr>
-        <w:spacing w:after="80"/>
-      </w:pPr>
-      <w:r>
-        <w:rPr>
-          <w:rFonts w:ascii="Arial" w:cs="Arial" w:eastAsia="Arial" w:hAnsi="Arial"/>
-          <w:b/>
-          <w:bCs/>
-          <w:sz w:val="22"/>
-          <w:szCs w:val="22"/>
-        </w:rPr>
-        <w:t xml:space="preserve">Step 1 — Open the Formula Editor</w:t>
-      </w:r>
-    </w:p>
-    <w:p>
-      <w:pPr>
-        <w:spacing w:after="120"/>
-      </w:pPr>
-      <w:r>
-        <w:rPr>
-          <w:rFonts w:ascii="Arial" w:cs="Arial" w:eastAsia="Arial" w:hAnsi="Arial"/>
-          <w:sz w:val="22"/>
-          <w:szCs w:val="22"/>
-        </w:rPr>
-        <w:t xml:space="preserve">Navigate to: Administration → Entity Manager → [Your Entity] → Formula</w:t>
-      </w:r>
-    </w:p>
-    <w:p>
-      <w:r>
-        <w:t xml:space="preserve"/>
-      </w:r>
-    </w:p>
-    <w:p>
-      <w:pPr>
-        <w:spacing w:after="80"/>
-      </w:pPr>
-      <w:r>
-        <w:rPr>
-          <w:rFonts w:ascii="Arial" w:cs="Arial" w:eastAsia="Arial" w:hAnsi="Arial"/>
-          <w:b/>
-          <w:bCs/>
-          <w:sz w:val="22"/>
-          <w:szCs w:val="22"/>
-        </w:rPr>
-        <w:t xml:space="preserve">Step 2 — Write the Formula</w:t>
-      </w:r>
-    </w:p>
-    <w:p>
-      <w:pPr>
-        <w:spacing w:after="120"/>
-      </w:pPr>
-      <w:r>
-        <w:rPr>
-          <w:rFonts w:ascii="Arial" w:cs="Arial" w:eastAsia="Arial" w:hAnsi="Arial"/>
-          <w:sz w:val="22"/>
-          <w:szCs w:val="22"/>
-        </w:rPr>
-        <w:t xml:space="preserve">Enter your formula in the text area. The standard pattern for a conditional field-setting rule is:</w:t>
-      </w:r>
-    </w:p>
-    <w:p>
-      <w:r>
-        <w:t xml:space="preserve"/>
-      </w:r>
-    </w:p>
-    <w:p>
-      <w:pPr>
-        <w:spacing w:before="0" w:after="0"/>
-      </w:pPr>
-      <w:r>
-        <w:rPr>
-          <w:rFonts w:ascii="Courier New" w:cs="Courier New" w:eastAsia="Courier New" w:hAnsi="Courier New"/>
-          <w:sz w:val="18"/>
-          <w:szCs w:val="18"/>
-          <w:shd w:fill="F2F2F2" w:val="clear"/>
-        </w:rPr>
-        <w:t xml:space="preserve">ifThen(</w:t>
-      </w:r>
-    </w:p>
-    <w:p>
-      <w:pPr>
-        <w:spacing w:before="0" w:after="0"/>
-      </w:pPr>
-      <w:r>
-        <w:rPr>
-          <w:rFonts w:ascii="Courier New" w:cs="Courier New" w:eastAsia="Courier New" w:hAnsi="Courier New"/>
-          <w:sz w:val="18"/>
-          <w:szCs w:val="18"/>
-          <w:shd w:fill="F2F2F2" w:val="clear"/>
-        </w:rPr>
-        <w:t xml:space="preserve">    entity\isAttributeChanged('fieldName') &amp;&amp; fieldName == 'TargetValue' &amp;&amp; targetDateField == null,</w:t>
-      </w:r>
-    </w:p>
-    <w:p>
-      <w:pPr>
-        <w:spacing w:before="0" w:after="0"/>
-      </w:pPr>
-      <w:r>
-        <w:rPr>
-          <w:rFonts w:ascii="Courier New" w:cs="Courier New" w:eastAsia="Courier New" w:hAnsi="Courier New"/>
-          <w:sz w:val="18"/>
-          <w:szCs w:val="18"/>
-          <w:shd w:fill="F2F2F2" w:val="clear"/>
-        </w:rPr>
-        <w:t xml:space="preserve">    targetDateField = datetime\today()</w:t>
-      </w:r>
-    </w:p>
-    <w:p>
-      <w:pPr>
-        <w:spacing w:before="0" w:after="0"/>
-      </w:pPr>
-      <w:r>
-        <w:rPr>
-          <w:rFonts w:ascii="Courier New" w:cs="Courier New" w:eastAsia="Courier New" w:hAnsi="Courier New"/>
-          <w:sz w:val="18"/>
-          <w:szCs w:val="18"/>
-          <w:shd w:fill="F2F2F2" w:val="clear"/>
-        </w:rPr>
-        <w:t xml:space="preserve">);</w:t>
-      </w:r>
-    </w:p>
-    <w:p>
-      <w:r>
-        <w:t xml:space="preserve"/>
-      </w:r>
-    </w:p>
-    <w:p>
-      <w:pPr>
-        <w:spacing w:after="120"/>
-      </w:pPr>
-      <w:r>
-        <w:rPr>
-          <w:rFonts w:ascii="Arial" w:cs="Arial" w:eastAsia="Arial" w:hAnsi="Arial"/>
-          <w:sz w:val="22"/>
-          <w:szCs w:val="22"/>
-        </w:rPr>
-        <w:t xml:space="preserve">The key formula functions used in this pattern are:</w:t>
-      </w:r>
-    </w:p>
-    <w:p>
-      <w:pPr>
-        <w:spacing w:after="120"/>
-      </w:pPr>
-      <w:r>
-        <w:rPr>
-          <w:rFonts w:ascii="Arial" w:cs="Arial" w:eastAsia="Arial" w:hAnsi="Arial"/>
-          <w:sz w:val="22"/>
-          <w:szCs w:val="22"/>
-        </w:rPr>
-        <w:t xml:space="preserve">•  entity\isAttributeChanged('fieldName') — returns true if the named field was changed on this save. Prevents the action from firing on unrelated saves.</w:t>
-      </w:r>
-    </w:p>
-    <w:p>
-      <w:pPr>
-        <w:spacing w:after="120"/>
-      </w:pPr>
-      <w:r>
-        <w:rPr>
-          <w:rFonts w:ascii="Arial" w:cs="Arial" w:eastAsia="Arial" w:hAnsi="Arial"/>
-          <w:sz w:val="22"/>
-          <w:szCs w:val="22"/>
-        </w:rPr>
-        <w:t xml:space="preserve">•  fieldName == 'TargetValue' — checks that the field was changed to the specific value you care about.</w:t>
-      </w:r>
-    </w:p>
-    <w:p>
-      <w:pPr>
-        <w:spacing w:after="120"/>
-      </w:pPr>
-      <w:r>
-        <w:rPr>
-          <w:rFonts w:ascii="Arial" w:cs="Arial" w:eastAsia="Arial" w:hAnsi="Arial"/>
-          <w:sz w:val="22"/>
-          <w:szCs w:val="22"/>
-        </w:rPr>
-        <w:t xml:space="preserve">•  targetDateField == null — a guard condition that prevents overwriting the field if it was already set. Remove this guard if you want the field to update every time the condition is met.</w:t>
-      </w:r>
-    </w:p>
-    <w:p>
-      <w:pPr>
-        <w:spacing w:after="120"/>
-      </w:pPr>
-      <w:r>
-        <w:rPr>
-          <w:rFonts w:ascii="Arial" w:cs="Arial" w:eastAsia="Arial" w:hAnsi="Arial"/>
-          <w:sz w:val="22"/>
-          <w:szCs w:val="22"/>
-        </w:rPr>
-        <w:t xml:space="preserve">•  datetime\today() — returns today’s date. Use datetime\now() if you need a date and time rather than just a date.</w:t>
-      </w:r>
-    </w:p>
-    <w:p>
-      <w:r>
-        <w:t xml:space="preserve"/>
-      </w:r>
-    </w:p>
-    <w:tbl>
-      <w:tblPr>
-        <w:tblW w:type="dxa" w:w="9360"/>
-        <w:tblBorders>
-          <w:top w:val="single" w:color="FFC107" w:sz="4"/>
-          <w:left w:val="single" w:color="FFC107" w:sz="4"/>
-          <w:bottom w:val="single" w:color="FFC107" w:sz="4"/>
-          <w:right w:val="single" w:color="FFC107" w:sz="4"/>
-        </w:tblBorders>
-      </w:tblPr>
-      <w:tblGrid>
-        <w:gridCol w:w="9360"/>
-      </w:tblGrid>
-      <w:tr>
-        <w:tc>
-          <w:tcPr>
-            <w:tcW w:type="dxa" w:w="9360"/>
-            <w:tcBorders>
-              <w:top w:val="single" w:color="FFC107" w:sz="4"/>
-              <w:left w:val="single" w:color="FFC107" w:sz="4"/>
-              <w:bottom w:val="single" w:color="FFC107" w:sz="4"/>
-              <w:right w:val="single" w:color="FFC107" w:sz="4"/>
-            </w:tcBorders>
-            <w:shd w:fill="FFF3CD" w:val="clear"/>
-            <w:tcMar>
-              <w:top w:type="dxa" w:w="100"/>
-              <w:left w:type="dxa" w:w="160"/>
-              <w:bottom w:type="dxa" w:w="100"/>
-              <w:right w:type="dxa" w:w="160"/>
-            </w:tcMar>
-          </w:tcPr>
-          <w:p>
-            <w:r>
-              <w:rPr>
-                <w:rFonts w:ascii="Arial" w:cs="Arial" w:eastAsia="Arial" w:hAnsi="Arial"/>
-                <w:b/>
-                <w:bCs/>
-                <w:sz w:val="22"/>
-                <w:szCs w:val="22"/>
-              </w:rPr>
-              <w:t xml:space="preserve">Note: </w:t>
-            </w:r>
-            <w:r>
-              <w:rPr>
-                <w:rFonts w:ascii="Arial" w:cs="Arial" w:eastAsia="Arial" w:hAnsi="Arial"/>
-                <w:sz w:val="22"/>
-                <w:szCs w:val="22"/>
-              </w:rPr>
-              <w:t xml:space="preserve">Field names in the formula must match the exact internal field name as defined in EspoCRM Entity Manager — not the display label. Verify field names under Administration → Entity Manager → [Entity] → Fields. Internal names are typically camelCase (e.g. mentorAssignedDate, not Mentor Assigned Date).</w:t>
-            </w:r>
-          </w:p>
-        </w:tc>
-      </w:tr>
-    </w:tbl>
-    <w:p>
-      <w:r>
-        <w:t xml:space="preserve"/>
-      </w:r>
-    </w:p>
-    <w:p>
-      <w:pPr>
-        <w:spacing w:after="80"/>
-      </w:pPr>
-      <w:r>
-        <w:rPr>
-          <w:rFonts w:ascii="Arial" w:cs="Arial" w:eastAsia="Arial" w:hAnsi="Arial"/>
-          <w:b/>
-          <w:bCs/>
-          <w:sz w:val="22"/>
-          <w:szCs w:val="22"/>
-        </w:rPr>
-        <w:t xml:space="preserve">Step 3 — Save</w:t>
-      </w:r>
-    </w:p>
-    <w:p>
-      <w:pPr>
-        <w:spacing w:after="120"/>
-      </w:pPr>
-      <w:r>
-        <w:rPr>
-          <w:rFonts w:ascii="Arial" w:cs="Arial" w:eastAsia="Arial" w:hAnsi="Arial"/>
-          <w:sz w:val="22"/>
-          <w:szCs w:val="22"/>
-        </w:rPr>
-        <w:t xml:space="preserve">Click Save. The formula takes effect immediately on the next save of any record of that entity type. No cache clear or server restart is required.</w:t>
-      </w:r>
-    </w:p>
-    <w:p>
-      <w:r>
-        <w:t xml:space="preserve"/>
-      </w:r>
-    </w:p>
-    <w:p>
-      <w:pPr>
-        <w:spacing w:after="80"/>
-      </w:pPr>
-      <w:r>
-        <w:rPr>
-          <w:rFonts w:ascii="Arial" w:cs="Arial" w:eastAsia="Arial" w:hAnsi="Arial"/>
-          <w:b/>
-          <w:bCs/>
-          <w:sz w:val="22"/>
-          <w:szCs w:val="22"/>
-        </w:rPr>
-        <w:t xml:space="preserve">Step 4 — Test</w:t>
-      </w:r>
-    </w:p>
-    <w:p>
-      <w:pPr>
-        <w:spacing w:after="120"/>
-      </w:pPr>
-      <w:r>
-        <w:rPr>
-          <w:rFonts w:ascii="Arial" w:cs="Arial" w:eastAsia="Arial" w:hAnsi="Arial"/>
-          <w:sz w:val="22"/>
-          <w:szCs w:val="22"/>
-        </w:rPr>
-        <w:t xml:space="preserve">Open a test record of that entity type and trigger the condition (e.g. change the Status field to the target value). Save the record and confirm the formula field is populated as expected.</w:t>
-      </w:r>
-    </w:p>
-    <w:p>
-      <w:r>
-        <w:t xml:space="preserve"/>
-      </w:r>
-    </w:p>
-    <w:p>
-      <w:pPr>
-        <w:pStyle w:val="Heading3"/>
-      </w:pPr>
-      <w:r>
-        <w:rPr>
-          <w:rFonts w:ascii="Arial" w:cs="Arial" w:eastAsia="Arial" w:hAnsi="Arial"/>
-          <w:b/>
-          <w:bCs/>
-          <w:sz w:val="24"/>
-          <w:szCs w:val="24"/>
-        </w:rPr>
-        <w:t xml:space="preserve">6.4 CBM Example: Mentor Assigned Date on Engagement</w:t>
-      </w:r>
-    </w:p>
-    <w:p>
-      <w:pPr>
-        <w:spacing w:after="120"/>
-      </w:pPr>
-      <w:r>
-        <w:rPr>
-          <w:rFonts w:ascii="Arial" w:cs="Arial" w:eastAsia="Arial" w:hAnsi="Arial"/>
-          <w:sz w:val="22"/>
-          <w:szCs w:val="22"/>
-        </w:rPr>
-        <w:t xml:space="preserve">The Mentor Assigned Date field on the Engagement entity is automatically set when an admin saves an Engagement with Status = Assigned. The formula is:</w:t>
-      </w:r>
-    </w:p>
-    <w:p>
-      <w:r>
-        <w:t xml:space="preserve"/>
-      </w:r>
-    </w:p>
-    <w:p>
-      <w:pPr>
-        <w:spacing w:before="0" w:after="0"/>
-      </w:pPr>
-      <w:r>
-        <w:rPr>
-          <w:rFonts w:ascii="Courier New" w:cs="Courier New" w:eastAsia="Courier New" w:hAnsi="Courier New"/>
-          <w:sz w:val="18"/>
-          <w:szCs w:val="18"/>
-          <w:shd w:fill="F2F2F2" w:val="clear"/>
-        </w:rPr>
-        <w:t xml:space="preserve">ifThen(</w:t>
-      </w:r>
-    </w:p>
-    <w:p>
-      <w:pPr>
-        <w:spacing w:before="0" w:after="0"/>
-      </w:pPr>
-      <w:r>
-        <w:rPr>
-          <w:rFonts w:ascii="Courier New" w:cs="Courier New" w:eastAsia="Courier New" w:hAnsi="Courier New"/>
-          <w:sz w:val="18"/>
-          <w:szCs w:val="18"/>
-          <w:shd w:fill="F2F2F2" w:val="clear"/>
-        </w:rPr>
-        <w:t xml:space="preserve">    entity\isAttributeChanged('status') &amp;&amp; status == 'Assigned' &amp;&amp; mentorAssignedDate == null,</w:t>
-      </w:r>
-    </w:p>
-    <w:p>
-      <w:pPr>
-        <w:spacing w:before="0" w:after="0"/>
-      </w:pPr>
-      <w:r>
-        <w:rPr>
-          <w:rFonts w:ascii="Courier New" w:cs="Courier New" w:eastAsia="Courier New" w:hAnsi="Courier New"/>
-          <w:sz w:val="18"/>
-          <w:szCs w:val="18"/>
-          <w:shd w:fill="F2F2F2" w:val="clear"/>
-        </w:rPr>
-        <w:t xml:space="preserve">    mentorAssignedDate = datetime\today()</w:t>
-      </w:r>
-    </w:p>
-    <w:p>
-      <w:pPr>
-        <w:spacing w:before="0" w:after="0"/>
-      </w:pPr>
-      <w:r>
-        <w:rPr>
-          <w:rFonts w:ascii="Courier New" w:cs="Courier New" w:eastAsia="Courier New" w:hAnsi="Courier New"/>
-          <w:sz w:val="18"/>
-          <w:szCs w:val="18"/>
-          <w:shd w:fill="F2F2F2" w:val="clear"/>
-        </w:rPr>
-        <w:t xml:space="preserve">);</w:t>
-      </w:r>
-    </w:p>
-    <w:p>
-      <w:r>
-        <w:t xml:space="preserve"/>
-      </w:r>
-    </w:p>
-    <w:p>
-      <w:pPr>
-        <w:spacing w:after="120"/>
-      </w:pPr>
-      <w:r>
-        <w:rPr>
-          <w:rFonts w:ascii="Arial" w:cs="Arial" w:eastAsia="Arial" w:hAnsi="Arial"/>
-          <w:sz w:val="22"/>
-          <w:szCs w:val="22"/>
-        </w:rPr>
-        <w:t xml:space="preserve">How it works:</w:t>
-      </w:r>
-    </w:p>
-    <w:p>
-      <w:pPr>
-        <w:spacing w:after="120"/>
-      </w:pPr>
-      <w:r>
-        <w:rPr>
-          <w:rFonts w:ascii="Arial" w:cs="Arial" w:eastAsia="Arial" w:hAnsi="Arial"/>
-          <w:sz w:val="22"/>
-          <w:szCs w:val="22"/>
-        </w:rPr>
-        <w:t xml:space="preserve">•  entity\isAttributeChanged('status') — fires only when the Status field was changed on this save, not on unrelated edits.</w:t>
-      </w:r>
-    </w:p>
-    <w:p>
-      <w:pPr>
-        <w:spacing w:after="120"/>
-      </w:pPr>
-      <w:r>
-        <w:rPr>
-          <w:rFonts w:ascii="Arial" w:cs="Arial" w:eastAsia="Arial" w:hAnsi="Arial"/>
-          <w:sz w:val="22"/>
-          <w:szCs w:val="22"/>
-        </w:rPr>
-        <w:t xml:space="preserve">•  status == 'Assigned' — ensures the date is only set when the status is specifically being changed to Assigned (i.e. when a mentor is nominated).</w:t>
-      </w:r>
-    </w:p>
-    <w:p>
-      <w:pPr>
-        <w:spacing w:after="120"/>
-      </w:pPr>
-      <w:r>
-        <w:rPr>
-          <w:rFonts w:ascii="Arial" w:cs="Arial" w:eastAsia="Arial" w:hAnsi="Arial"/>
-          <w:sz w:val="22"/>
-          <w:szCs w:val="22"/>
-        </w:rPr>
-        <w:t xml:space="preserve">•  mentorAssignedDate == null — prevents the date from being overwritten if the Engagement is later edited for any other reason.</w:t>
-      </w:r>
-    </w:p>
-    <w:p>
-      <w:pPr>
-        <w:spacing w:after="120"/>
-      </w:pPr>
-      <w:r>
-        <w:rPr>
-          <w:rFonts w:ascii="Arial" w:cs="Arial" w:eastAsia="Arial" w:hAnsi="Arial"/>
-          <w:sz w:val="22"/>
-          <w:szCs w:val="22"/>
-        </w:rPr>
-        <w:t xml:space="preserve">•  mentorAssignedDate = datetime\today() — sets the field to today’s date at the moment of save.</w:t>
-      </w:r>
-    </w:p>
-    <w:p>
-      <w:r>
-        <w:t xml:space="preserve"/>
-      </w:r>
-    </w:p>
-    <w:p>
-      <w:pPr>
-        <w:spacing w:after="120"/>
-      </w:pPr>
-      <w:r>
-        <w:rPr>
-          <w:rFonts w:ascii="Arial" w:cs="Arial" w:eastAsia="Arial" w:hAnsi="Arial"/>
-          <w:sz w:val="22"/>
-          <w:szCs w:val="22"/>
-        </w:rPr>
-        <w:t xml:space="preserve">This date is used to measure how long it takes from mentor assignment to the first session (the Assigned → Active transition), which is a key engagement health metric.</w:t>
-      </w:r>
-    </w:p>
-    <w:p>
-      <w:r>
-        <w:t xml:space="preserve"/>
-      </w:r>
-    </w:p>
-    <w:p>
-      <w:pPr>
-        <w:pStyle w:val="Heading3"/>
-      </w:pPr>
-      <w:r>
-        <w:rPr>
-          <w:rFonts w:ascii="Arial" w:cs="Arial" w:eastAsia="Arial" w:hAnsi="Arial"/>
-          <w:b/>
-          <w:bCs/>
-          <w:sz w:val="24"/>
-          <w:szCs w:val="24"/>
-        </w:rPr>
-        <w:t xml:space="preserve">6.5 Adding Multiple Rules</w:t>
-      </w:r>
-    </w:p>
-    <w:p>
-      <w:pPr>
-        <w:spacing w:after="120"/>
-      </w:pPr>
-      <w:r>
-        <w:rPr>
-          <w:rFonts w:ascii="Arial" w:cs="Arial" w:eastAsia="Arial" w:hAnsi="Arial"/>
-          <w:sz w:val="22"/>
-          <w:szCs w:val="22"/>
-        </w:rPr>
-        <w:t xml:space="preserve">Multiple formula rules can coexist in the same Formula editor. Separate each rule with a semicolon. For example, if the Engagement entity later has a second automation (e.g. auto-setting a Close Date), both rules can live in the same script:</w:t>
-      </w:r>
-    </w:p>
-    <w:p>
-      <w:r>
-        <w:t xml:space="preserve"/>
-      </w:r>
-    </w:p>
-    <w:p>
-      <w:pPr>
-        <w:spacing w:before="0" w:after="0"/>
-      </w:pPr>
-      <w:r>
-        <w:rPr>
-          <w:rFonts w:ascii="Courier New" w:cs="Courier New" w:eastAsia="Courier New" w:hAnsi="Courier New"/>
-          <w:sz w:val="18"/>
-          <w:szCs w:val="18"/>
-          <w:shd w:fill="F2F2F2" w:val="clear"/>
-        </w:rPr>
-        <w:t xml:space="preserve">ifThen(</w:t>
-      </w:r>
-    </w:p>
-    <w:p>
-      <w:pPr>
-        <w:spacing w:before="0" w:after="0"/>
-      </w:pPr>
-      <w:r>
-        <w:rPr>
-          <w:rFonts w:ascii="Courier New" w:cs="Courier New" w:eastAsia="Courier New" w:hAnsi="Courier New"/>
-          <w:sz w:val="18"/>
-          <w:szCs w:val="18"/>
-          <w:shd w:fill="F2F2F2" w:val="clear"/>
-        </w:rPr>
-        <w:t xml:space="preserve">    entity\isAttributeChanged('status') &amp;&amp; status == 'Assigned' &amp;&amp; mentorAssignedDate == null,</w:t>
-      </w:r>
-    </w:p>
-    <w:p>
-      <w:pPr>
-        <w:spacing w:before="0" w:after="0"/>
-      </w:pPr>
-      <w:r>
-        <w:rPr>
-          <w:rFonts w:ascii="Courier New" w:cs="Courier New" w:eastAsia="Courier New" w:hAnsi="Courier New"/>
-          <w:sz w:val="18"/>
-          <w:szCs w:val="18"/>
-          <w:shd w:fill="F2F2F2" w:val="clear"/>
-        </w:rPr>
-        <w:t xml:space="preserve">    mentorAssignedDate = datetime\today()</w:t>
-      </w:r>
-    </w:p>
-    <w:p>
-      <w:pPr>
-        <w:spacing w:before="0" w:after="0"/>
-      </w:pPr>
-      <w:r>
-        <w:rPr>
-          <w:rFonts w:ascii="Courier New" w:cs="Courier New" w:eastAsia="Courier New" w:hAnsi="Courier New"/>
-          <w:sz w:val="18"/>
-          <w:szCs w:val="18"/>
-          <w:shd w:fill="F2F2F2" w:val="clear"/>
-        </w:rPr>
-        <w:t xml:space="preserve">);</w:t>
-      </w:r>
-    </w:p>
-    <w:p>
-      <w:pPr>
-        <w:spacing w:before="0" w:after="0"/>
-      </w:pPr>
-      <w:r>
-        <w:rPr>
-          <w:rFonts w:ascii="Courier New" w:cs="Courier New" w:eastAsia="Courier New" w:hAnsi="Courier New"/>
-          <w:sz w:val="18"/>
-          <w:szCs w:val="18"/>
-          <w:shd w:fill="F2F2F2" w:val="clear"/>
-        </w:rPr>
-        <w:t xml:space="preserve"/>
-      </w:r>
-    </w:p>
-    <w:p>
-      <w:pPr>
-        <w:spacing w:before="0" w:after="0"/>
-      </w:pPr>
-      <w:r>
-        <w:rPr>
-          <w:rFonts w:ascii="Courier New" w:cs="Courier New" w:eastAsia="Courier New" w:hAnsi="Courier New"/>
-          <w:sz w:val="18"/>
-          <w:szCs w:val="18"/>
-          <w:shd w:fill="F2F2F2" w:val="clear"/>
-        </w:rPr>
-        <w:t xml:space="preserve">ifThen(</w:t>
-      </w:r>
-    </w:p>
-    <w:p>
-      <w:pPr>
-        <w:spacing w:before="0" w:after="0"/>
-      </w:pPr>
-      <w:r>
-        <w:rPr>
-          <w:rFonts w:ascii="Courier New" w:cs="Courier New" w:eastAsia="Courier New" w:hAnsi="Courier New"/>
-          <w:sz w:val="18"/>
-          <w:szCs w:val="18"/>
-          <w:shd w:fill="F2F2F2" w:val="clear"/>
-        </w:rPr>
-        <w:t xml:space="preserve">    entity\isAttributeChanged('status')</w:t>
-      </w:r>
-    </w:p>
-    <w:p>
-      <w:pPr>
-        <w:spacing w:before="0" w:after="0"/>
-      </w:pPr>
-      <w:r>
-        <w:rPr>
-          <w:rFonts w:ascii="Courier New" w:cs="Courier New" w:eastAsia="Courier New" w:hAnsi="Courier New"/>
-          <w:sz w:val="18"/>
-          <w:szCs w:val="18"/>
-          <w:shd w:fill="F2F2F2" w:val="clear"/>
-        </w:rPr>
-        <w:t xml:space="preserve">    &amp;&amp; (status == 'Completed' || status == 'Abandoned')</w:t>
-      </w:r>
-    </w:p>
-    <w:p>
-      <w:pPr>
-        <w:spacing w:before="0" w:after="0"/>
-      </w:pPr>
-      <w:r>
-        <w:rPr>
-          <w:rFonts w:ascii="Courier New" w:cs="Courier New" w:eastAsia="Courier New" w:hAnsi="Courier New"/>
-          <w:sz w:val="18"/>
-          <w:szCs w:val="18"/>
-          <w:shd w:fill="F2F2F2" w:val="clear"/>
-        </w:rPr>
-        <w:t xml:space="preserve">    &amp;&amp; closeDate == null,</w:t>
-      </w:r>
-    </w:p>
-    <w:p>
-      <w:pPr>
-        <w:spacing w:before="0" w:after="0"/>
-      </w:pPr>
-      <w:r>
-        <w:rPr>
-          <w:rFonts w:ascii="Courier New" w:cs="Courier New" w:eastAsia="Courier New" w:hAnsi="Courier New"/>
-          <w:sz w:val="18"/>
-          <w:szCs w:val="18"/>
-          <w:shd w:fill="F2F2F2" w:val="clear"/>
-        </w:rPr>
-        <w:t xml:space="preserve">    closeDate = datetime\today()</w:t>
-      </w:r>
-    </w:p>
-    <w:p>
-      <w:pPr>
-        <w:spacing w:before="0" w:after="0"/>
-      </w:pPr>
-      <w:r>
-        <w:rPr>
-          <w:rFonts w:ascii="Courier New" w:cs="Courier New" w:eastAsia="Courier New" w:hAnsi="Courier New"/>
-          <w:sz w:val="18"/>
-          <w:szCs w:val="18"/>
-          <w:shd w:fill="F2F2F2" w:val="clear"/>
-        </w:rPr>
-        <w:t xml:space="preserve">);</w:t>
-      </w:r>
-    </w:p>
-    <w:p>
-      <w:r>
-        <w:t xml:space="preserve"/>
-      </w:r>
-    </w:p>
-    <w:tbl>
-      <w:tblPr>
-        <w:tblW w:type="dxa" w:w="9360"/>
-        <w:tblBorders>
-          <w:top w:val="single" w:color="FFC107" w:sz="4"/>
-          <w:left w:val="single" w:color="FFC107" w:sz="4"/>
-          <w:bottom w:val="single" w:color="FFC107" w:sz="4"/>
-          <w:right w:val="single" w:color="FFC107" w:sz="4"/>
-        </w:tblBorders>
-      </w:tblPr>
-      <w:tblGrid>
-        <w:gridCol w:w="9360"/>
-      </w:tblGrid>
-      <w:tr>
-        <w:tc>
-          <w:tcPr>
-            <w:tcW w:type="dxa" w:w="9360"/>
-            <w:tcBorders>
-              <w:top w:val="single" w:color="FFC107" w:sz="4"/>
-              <w:left w:val="single" w:color="FFC107" w:sz="4"/>
-              <w:bottom w:val="single" w:color="FFC107" w:sz="4"/>
-              <w:right w:val="single" w:color="FFC107" w:sz="4"/>
-            </w:tcBorders>
-            <w:shd w:fill="FFF3CD" w:val="clear"/>
-            <w:tcMar>
-              <w:top w:type="dxa" w:w="100"/>
-              <w:left w:type="dxa" w:w="160"/>
-              <w:bottom w:type="dxa" w:w="100"/>
-              <w:right w:type="dxa" w:w="160"/>
-            </w:tcMar>
-          </w:tcPr>
-          <w:p>
-            <w:r>
-              <w:rPr>
-                <w:rFonts w:ascii="Arial" w:cs="Arial" w:eastAsia="Arial" w:hAnsi="Arial"/>
-                <w:b/>
-                <w:bCs/>
-                <w:sz w:val="22"/>
-                <w:szCs w:val="22"/>
-              </w:rPr>
-              <w:t xml:space="preserve">Note: </w:t>
-            </w:r>
-            <w:r>
-              <w:rPr>
-                <w:rFonts w:ascii="Arial" w:cs="Arial" w:eastAsia="Arial" w:hAnsi="Arial"/>
-                <w:sz w:val="22"/>
-                <w:szCs w:val="22"/>
-              </w:rPr>
-              <w:t xml:space="preserve">EspoCRM executes the entire formula script top to bottom on every save. Keep all automations for a given entity in a single script rather than splitting them across multiple scripts — there is only one Formula field per entity.</w:t>
-            </w:r>
-          </w:p>
-        </w:tc>
-      </w:tr>
-    </w:tbl>
     <w:p>
       <w:r>
         <w:t xml:space="preserve"/>

</xml_diff>

<commit_message>
Update EspoCRM How To Guide v1.1: add Section 1.2 Entity Types, revision control, change log
</commit_message>
<xml_diff>
--- a/PRDs/CBM-EspoCRM-HowTo.docx
+++ b/PRDs/CBM-EspoCRM-HowTo.docx
@@ -61,6 +61,314 @@
         <w:t xml:space="preserve"/>
       </w:r>
     </w:p>
+    <w:p>
+      <w:r>
+        <w:t xml:space="preserve"/>
+      </w:r>
+    </w:p>
+    <w:tbl>
+      <w:tblPr>
+        <w:tblW w:type="dxa" w:w="9360"/>
+        <w:tblBorders>
+          <w:top w:val="single" w:color="auto" w:sz="4"/>
+          <w:left w:val="single" w:color="auto" w:sz="4"/>
+          <w:bottom w:val="single" w:color="auto" w:sz="4"/>
+          <w:right w:val="single" w:color="auto" w:sz="4"/>
+          <w:insideH w:val="single" w:color="auto" w:sz="4"/>
+          <w:insideV w:val="single" w:color="auto" w:sz="4"/>
+        </w:tblBorders>
+      </w:tblPr>
+      <w:tblGrid>
+        <w:gridCol w:w="2880"/>
+        <w:gridCol w:w="6480"/>
+      </w:tblGrid>
+      <w:tr>
+        <w:tc>
+          <w:tcPr>
+            <w:tcW w:type="dxa" w:w="2880"/>
+            <w:tcBorders>
+              <w:top w:val="single" w:color="AAAAAA" w:sz="1"/>
+              <w:left w:val="single" w:color="AAAAAA" w:sz="1"/>
+              <w:bottom w:val="single" w:color="AAAAAA" w:sz="1"/>
+              <w:right w:val="single" w:color="AAAAAA" w:sz="1"/>
+            </w:tcBorders>
+            <w:shd w:fill="D5E8F0" w:val="clear"/>
+            <w:tcMar>
+              <w:top w:type="dxa" w:w="80"/>
+              <w:left w:type="dxa" w:w="160"/>
+              <w:bottom w:type="dxa" w:w="80"/>
+              <w:right w:type="dxa" w:w="160"/>
+            </w:tcMar>
+          </w:tcPr>
+          <w:p>
+            <w:r>
+              <w:rPr>
+                <w:rFonts w:ascii="Arial" w:cs="Arial" w:eastAsia="Arial" w:hAnsi="Arial"/>
+                <w:b/>
+                <w:bCs/>
+                <w:sz w:val="20"/>
+                <w:szCs w:val="20"/>
+              </w:rPr>
+              <w:t xml:space="preserve">Field</w:t>
+            </w:r>
+          </w:p>
+        </w:tc>
+        <w:tc>
+          <w:tcPr>
+            <w:tcW w:type="dxa" w:w="6480"/>
+            <w:tcBorders>
+              <w:top w:val="single" w:color="AAAAAA" w:sz="1"/>
+              <w:left w:val="single" w:color="AAAAAA" w:sz="1"/>
+              <w:bottom w:val="single" w:color="AAAAAA" w:sz="1"/>
+              <w:right w:val="single" w:color="AAAAAA" w:sz="1"/>
+            </w:tcBorders>
+            <w:shd w:fill="D5E8F0" w:val="clear"/>
+            <w:tcMar>
+              <w:top w:type="dxa" w:w="80"/>
+              <w:left w:type="dxa" w:w="160"/>
+              <w:bottom w:type="dxa" w:w="80"/>
+              <w:right w:type="dxa" w:w="160"/>
+            </w:tcMar>
+          </w:tcPr>
+          <w:p>
+            <w:r>
+              <w:rPr>
+                <w:rFonts w:ascii="Arial" w:cs="Arial" w:eastAsia="Arial" w:hAnsi="Arial"/>
+                <w:b/>
+                <w:bCs/>
+                <w:sz w:val="20"/>
+                <w:szCs w:val="20"/>
+              </w:rPr>
+              <w:t xml:space="preserve">Value</w:t>
+            </w:r>
+          </w:p>
+        </w:tc>
+      </w:tr>
+      <w:tr>
+        <w:tc>
+          <w:tcPr>
+            <w:tcW w:type="dxa" w:w="2880"/>
+            <w:tcBorders>
+              <w:top w:val="single" w:color="CCCCCC" w:sz="1"/>
+              <w:left w:val="single" w:color="CCCCCC" w:sz="1"/>
+              <w:bottom w:val="single" w:color="CCCCCC" w:sz="1"/>
+              <w:right w:val="single" w:color="CCCCCC" w:sz="1"/>
+            </w:tcBorders>
+            <w:tcMar>
+              <w:top w:type="dxa" w:w="80"/>
+              <w:left w:type="dxa" w:w="160"/>
+              <w:bottom w:type="dxa" w:w="80"/>
+              <w:right w:type="dxa" w:w="160"/>
+            </w:tcMar>
+          </w:tcPr>
+          <w:p>
+            <w:r>
+              <w:rPr>
+                <w:rFonts w:ascii="Arial" w:cs="Arial" w:eastAsia="Arial" w:hAnsi="Arial"/>
+                <w:sz w:val="20"/>
+                <w:szCs w:val="20"/>
+              </w:rPr>
+              <w:t xml:space="preserve">Document</w:t>
+            </w:r>
+          </w:p>
+        </w:tc>
+        <w:tc>
+          <w:tcPr>
+            <w:tcW w:type="dxa" w:w="6480"/>
+            <w:tcBorders>
+              <w:top w:val="single" w:color="CCCCCC" w:sz="1"/>
+              <w:left w:val="single" w:color="CCCCCC" w:sz="1"/>
+              <w:bottom w:val="single" w:color="CCCCCC" w:sz="1"/>
+              <w:right w:val="single" w:color="CCCCCC" w:sz="1"/>
+            </w:tcBorders>
+            <w:tcMar>
+              <w:top w:type="dxa" w:w="80"/>
+              <w:left w:type="dxa" w:w="160"/>
+              <w:bottom w:type="dxa" w:w="80"/>
+              <w:right w:type="dxa" w:w="160"/>
+            </w:tcMar>
+          </w:tcPr>
+          <w:p>
+            <w:r>
+              <w:rPr>
+                <w:rFonts w:ascii="Arial" w:cs="Arial" w:eastAsia="Arial" w:hAnsi="Arial"/>
+                <w:sz w:val="20"/>
+                <w:szCs w:val="20"/>
+              </w:rPr>
+              <w:t xml:space="preserve">EspoCRM How To Guide</w:t>
+            </w:r>
+          </w:p>
+        </w:tc>
+      </w:tr>
+      <w:tr>
+        <w:tc>
+          <w:tcPr>
+            <w:tcW w:type="dxa" w:w="2880"/>
+            <w:tcBorders>
+              <w:top w:val="single" w:color="CCCCCC" w:sz="1"/>
+              <w:left w:val="single" w:color="CCCCCC" w:sz="1"/>
+              <w:bottom w:val="single" w:color="CCCCCC" w:sz="1"/>
+              <w:right w:val="single" w:color="CCCCCC" w:sz="1"/>
+            </w:tcBorders>
+            <w:tcMar>
+              <w:top w:type="dxa" w:w="80"/>
+              <w:left w:type="dxa" w:w="160"/>
+              <w:bottom w:type="dxa" w:w="80"/>
+              <w:right w:type="dxa" w:w="160"/>
+            </w:tcMar>
+          </w:tcPr>
+          <w:p>
+            <w:r>
+              <w:rPr>
+                <w:rFonts w:ascii="Arial" w:cs="Arial" w:eastAsia="Arial" w:hAnsi="Arial"/>
+                <w:sz w:val="20"/>
+                <w:szCs w:val="20"/>
+              </w:rPr>
+              <w:t xml:space="preserve">Owner</w:t>
+            </w:r>
+          </w:p>
+        </w:tc>
+        <w:tc>
+          <w:tcPr>
+            <w:tcW w:type="dxa" w:w="6480"/>
+            <w:tcBorders>
+              <w:top w:val="single" w:color="CCCCCC" w:sz="1"/>
+              <w:left w:val="single" w:color="CCCCCC" w:sz="1"/>
+              <w:bottom w:val="single" w:color="CCCCCC" w:sz="1"/>
+              <w:right w:val="single" w:color="CCCCCC" w:sz="1"/>
+            </w:tcBorders>
+            <w:tcMar>
+              <w:top w:type="dxa" w:w="80"/>
+              <w:left w:type="dxa" w:w="160"/>
+              <w:bottom w:type="dxa" w:w="80"/>
+              <w:right w:type="dxa" w:w="160"/>
+            </w:tcMar>
+          </w:tcPr>
+          <w:p>
+            <w:r>
+              <w:rPr>
+                <w:rFonts w:ascii="Arial" w:cs="Arial" w:eastAsia="Arial" w:hAnsi="Arial"/>
+                <w:sz w:val="20"/>
+                <w:szCs w:val="20"/>
+              </w:rPr>
+              <w:t xml:space="preserve">Cleveland Business Mentors</w:t>
+            </w:r>
+          </w:p>
+        </w:tc>
+      </w:tr>
+      <w:tr>
+        <w:tc>
+          <w:tcPr>
+            <w:tcW w:type="dxa" w:w="2880"/>
+            <w:tcBorders>
+              <w:top w:val="single" w:color="CCCCCC" w:sz="1"/>
+              <w:left w:val="single" w:color="CCCCCC" w:sz="1"/>
+              <w:bottom w:val="single" w:color="CCCCCC" w:sz="1"/>
+              <w:right w:val="single" w:color="CCCCCC" w:sz="1"/>
+            </w:tcBorders>
+            <w:tcMar>
+              <w:top w:type="dxa" w:w="80"/>
+              <w:left w:type="dxa" w:w="160"/>
+              <w:bottom w:type="dxa" w:w="80"/>
+              <w:right w:type="dxa" w:w="160"/>
+            </w:tcMar>
+          </w:tcPr>
+          <w:p>
+            <w:r>
+              <w:rPr>
+                <w:rFonts w:ascii="Arial" w:cs="Arial" w:eastAsia="Arial" w:hAnsi="Arial"/>
+                <w:sz w:val="20"/>
+                <w:szCs w:val="20"/>
+              </w:rPr>
+              <w:t xml:space="preserve">Version</w:t>
+            </w:r>
+          </w:p>
+        </w:tc>
+        <w:tc>
+          <w:tcPr>
+            <w:tcW w:type="dxa" w:w="6480"/>
+            <w:tcBorders>
+              <w:top w:val="single" w:color="CCCCCC" w:sz="1"/>
+              <w:left w:val="single" w:color="CCCCCC" w:sz="1"/>
+              <w:bottom w:val="single" w:color="CCCCCC" w:sz="1"/>
+              <w:right w:val="single" w:color="CCCCCC" w:sz="1"/>
+            </w:tcBorders>
+            <w:tcMar>
+              <w:top w:type="dxa" w:w="80"/>
+              <w:left w:type="dxa" w:w="160"/>
+              <w:bottom w:type="dxa" w:w="80"/>
+              <w:right w:type="dxa" w:w="160"/>
+            </w:tcMar>
+          </w:tcPr>
+          <w:p>
+            <w:r>
+              <w:rPr>
+                <w:rFonts w:ascii="Arial" w:cs="Arial" w:eastAsia="Arial" w:hAnsi="Arial"/>
+                <w:sz w:val="20"/>
+                <w:szCs w:val="20"/>
+              </w:rPr>
+              <w:t xml:space="preserve">1.1</w:t>
+            </w:r>
+          </w:p>
+        </w:tc>
+      </w:tr>
+      <w:tr>
+        <w:tc>
+          <w:tcPr>
+            <w:tcW w:type="dxa" w:w="2880"/>
+            <w:tcBorders>
+              <w:top w:val="single" w:color="CCCCCC" w:sz="1"/>
+              <w:left w:val="single" w:color="CCCCCC" w:sz="1"/>
+              <w:bottom w:val="single" w:color="CCCCCC" w:sz="1"/>
+              <w:right w:val="single" w:color="CCCCCC" w:sz="1"/>
+            </w:tcBorders>
+            <w:tcMar>
+              <w:top w:type="dxa" w:w="80"/>
+              <w:left w:type="dxa" w:w="160"/>
+              <w:bottom w:type="dxa" w:w="80"/>
+              <w:right w:type="dxa" w:w="160"/>
+            </w:tcMar>
+          </w:tcPr>
+          <w:p>
+            <w:r>
+              <w:rPr>
+                <w:rFonts w:ascii="Arial" w:cs="Arial" w:eastAsia="Arial" w:hAnsi="Arial"/>
+                <w:sz w:val="20"/>
+                <w:szCs w:val="20"/>
+              </w:rPr>
+              <w:t xml:space="preserve">Last Updated</w:t>
+            </w:r>
+          </w:p>
+        </w:tc>
+        <w:tc>
+          <w:tcPr>
+            <w:tcW w:type="dxa" w:w="6480"/>
+            <w:tcBorders>
+              <w:top w:val="single" w:color="CCCCCC" w:sz="1"/>
+              <w:left w:val="single" w:color="CCCCCC" w:sz="1"/>
+              <w:bottom w:val="single" w:color="CCCCCC" w:sz="1"/>
+              <w:right w:val="single" w:color="CCCCCC" w:sz="1"/>
+            </w:tcBorders>
+            <w:tcMar>
+              <w:top w:type="dxa" w:w="80"/>
+              <w:left w:type="dxa" w:w="160"/>
+              <w:bottom w:type="dxa" w:w="80"/>
+              <w:right w:type="dxa" w:w="160"/>
+            </w:tcMar>
+          </w:tcPr>
+          <w:p>
+            <w:r>
+              <w:rPr>
+                <w:rFonts w:ascii="Arial" w:cs="Arial" w:eastAsia="Arial" w:hAnsi="Arial"/>
+                <w:sz w:val="20"/>
+                <w:szCs w:val="20"/>
+              </w:rPr>
+              <w:t xml:space="preserve">05-05-26 11:03</w:t>
+            </w:r>
+          </w:p>
+        </w:tc>
+      </w:tr>
+    </w:tbl>
     <w:p>
       <w:r>
         <w:t xml:space="preserve"/>
@@ -220,7 +528,1167 @@
           <w:sz w:val="24"/>
           <w:szCs w:val="24"/>
         </w:rPr>
-        <w:t xml:space="preserve">1.2 Step-by-Step: Creating a New Entity</w:t>
+        <w:t xml:space="preserve">1.2 Entity Types</w:t>
+      </w:r>
+    </w:p>
+    <w:p>
+      <w:r>
+        <w:t xml:space="preserve"/>
+      </w:r>
+    </w:p>
+    <w:p>
+      <w:pPr>
+        <w:spacing w:after="120"/>
+      </w:pPr>
+      <w:r>
+        <w:rPr>
+          <w:rFonts w:ascii="Arial" w:cs="Arial" w:eastAsia="Arial" w:hAnsi="Arial"/>
+          <w:sz w:val="22"/>
+          <w:szCs w:val="22"/>
+        </w:rPr>
+        <w:t xml:space="preserve">When you create a custom entity, EspoCRM requires you to select an Entity Type (referred to internally as a "template"). This choice determines the default fields the entity will have, which built-in side panels appear on the detail view, whether the entity supports calendar display, and how name fields are structured. The Entity Type is a structural decision made at creation time. Changing it afterward requires manual edits to PHP class definitions and JSON metadata files on the server — it cannot be done through the Admin UI. Choose carefully before saving.</w:t>
+      </w:r>
+    </w:p>
+    <w:p>
+      <w:r>
+        <w:t xml:space="preserve"/>
+      </w:r>
+    </w:p>
+    <w:p>
+      <w:pPr>
+        <w:spacing w:after="120"/>
+      </w:pPr>
+      <w:r>
+        <w:rPr>
+          <w:rFonts w:ascii="Arial" w:cs="Arial" w:eastAsia="Arial" w:hAnsi="Arial"/>
+          <w:b/>
+          <w:bCs/>
+          <w:sz w:val="22"/>
+          <w:szCs w:val="22"/>
+        </w:rPr>
+        <w:t xml:space="preserve">Available Entity Types:</w:t>
+      </w:r>
+    </w:p>
+    <w:p>
+      <w:r>
+        <w:t xml:space="preserve"/>
+      </w:r>
+    </w:p>
+    <w:tbl>
+      <w:tblPr>
+        <w:tblW w:type="dxa" w:w="9360"/>
+        <w:tblBorders>
+          <w:top w:val="single" w:color="auto" w:sz="4"/>
+          <w:left w:val="single" w:color="auto" w:sz="4"/>
+          <w:bottom w:val="single" w:color="auto" w:sz="4"/>
+          <w:right w:val="single" w:color="auto" w:sz="4"/>
+          <w:insideH w:val="single" w:color="auto" w:sz="4"/>
+          <w:insideV w:val="single" w:color="auto" w:sz="4"/>
+        </w:tblBorders>
+      </w:tblPr>
+      <w:tblGrid>
+        <w:gridCol w:w="1500"/>
+        <w:gridCol w:w="5060"/>
+        <w:gridCol w:w="2800"/>
+      </w:tblGrid>
+      <w:tr>
+        <w:tc>
+          <w:tcPr>
+            <w:tcW w:type="dxa" w:w="1500"/>
+            <w:tcBorders>
+              <w:top w:val="single" w:color="AAAAAA" w:sz="1"/>
+              <w:left w:val="single" w:color="AAAAAA" w:sz="1"/>
+              <w:bottom w:val="single" w:color="AAAAAA" w:sz="1"/>
+              <w:right w:val="single" w:color="AAAAAA" w:sz="1"/>
+            </w:tcBorders>
+            <w:shd w:fill="D5E8F0" w:val="clear"/>
+            <w:tcMar>
+              <w:top w:type="dxa" w:w="80"/>
+              <w:left w:type="dxa" w:w="160"/>
+              <w:bottom w:type="dxa" w:w="80"/>
+              <w:right w:type="dxa" w:w="160"/>
+            </w:tcMar>
+          </w:tcPr>
+          <w:p>
+            <w:r>
+              <w:rPr>
+                <w:rFonts w:ascii="Arial" w:cs="Arial" w:eastAsia="Arial" w:hAnsi="Arial"/>
+                <w:b/>
+                <w:bCs/>
+                <w:sz w:val="20"/>
+                <w:szCs w:val="20"/>
+              </w:rPr>
+              <w:t xml:space="preserve">Type</w:t>
+            </w:r>
+          </w:p>
+        </w:tc>
+        <w:tc>
+          <w:tcPr>
+            <w:tcW w:type="dxa" w:w="5060"/>
+            <w:tcBorders>
+              <w:top w:val="single" w:color="AAAAAA" w:sz="1"/>
+              <w:left w:val="single" w:color="AAAAAA" w:sz="1"/>
+              <w:bottom w:val="single" w:color="AAAAAA" w:sz="1"/>
+              <w:right w:val="single" w:color="AAAAAA" w:sz="1"/>
+            </w:tcBorders>
+            <w:shd w:fill="D5E8F0" w:val="clear"/>
+            <w:tcMar>
+              <w:top w:type="dxa" w:w="80"/>
+              <w:left w:type="dxa" w:w="160"/>
+              <w:bottom w:type="dxa" w:w="80"/>
+              <w:right w:type="dxa" w:w="160"/>
+            </w:tcMar>
+          </w:tcPr>
+          <w:p>
+            <w:r>
+              <w:rPr>
+                <w:rFonts w:ascii="Arial" w:cs="Arial" w:eastAsia="Arial" w:hAnsi="Arial"/>
+                <w:b/>
+                <w:bCs/>
+                <w:sz w:val="20"/>
+                <w:szCs w:val="20"/>
+              </w:rPr>
+              <w:t xml:space="preserve">What You Get</w:t>
+            </w:r>
+          </w:p>
+        </w:tc>
+        <w:tc>
+          <w:tcPr>
+            <w:tcW w:type="dxa" w:w="2800"/>
+            <w:tcBorders>
+              <w:top w:val="single" w:color="AAAAAA" w:sz="1"/>
+              <w:left w:val="single" w:color="AAAAAA" w:sz="1"/>
+              <w:bottom w:val="single" w:color="AAAAAA" w:sz="1"/>
+              <w:right w:val="single" w:color="AAAAAA" w:sz="1"/>
+            </w:tcBorders>
+            <w:shd w:fill="D5E8F0" w:val="clear"/>
+            <w:tcMar>
+              <w:top w:type="dxa" w:w="80"/>
+              <w:left w:type="dxa" w:w="160"/>
+              <w:bottom w:type="dxa" w:w="80"/>
+              <w:right w:type="dxa" w:w="160"/>
+            </w:tcMar>
+          </w:tcPr>
+          <w:p>
+            <w:r>
+              <w:rPr>
+                <w:rFonts w:ascii="Arial" w:cs="Arial" w:eastAsia="Arial" w:hAnsi="Arial"/>
+                <w:b/>
+                <w:bCs/>
+                <w:sz w:val="20"/>
+                <w:szCs w:val="20"/>
+              </w:rPr>
+              <w:t xml:space="preserve">Best For</w:t>
+            </w:r>
+          </w:p>
+        </w:tc>
+      </w:tr>
+      <w:tr>
+        <w:tc>
+          <w:tcPr>
+            <w:tcW w:type="dxa" w:w="1500"/>
+            <w:tcBorders>
+              <w:top w:val="single" w:color="CCCCCC" w:sz="1"/>
+              <w:left w:val="single" w:color="CCCCCC" w:sz="1"/>
+              <w:bottom w:val="single" w:color="CCCCCC" w:sz="1"/>
+              <w:right w:val="single" w:color="CCCCCC" w:sz="1"/>
+            </w:tcBorders>
+            <w:tcMar>
+              <w:top w:type="dxa" w:w="80"/>
+              <w:left w:type="dxa" w:w="160"/>
+              <w:bottom w:type="dxa" w:w="80"/>
+              <w:right w:type="dxa" w:w="160"/>
+            </w:tcMar>
+          </w:tcPr>
+          <w:p>
+            <w:r>
+              <w:rPr>
+                <w:rFonts w:ascii="Arial" w:cs="Arial" w:eastAsia="Arial" w:hAnsi="Arial"/>
+                <w:sz w:val="20"/>
+                <w:szCs w:val="20"/>
+              </w:rPr>
+              <w:t xml:space="preserve">Base</w:t>
+            </w:r>
+          </w:p>
+        </w:tc>
+        <w:tc>
+          <w:tcPr>
+            <w:tcW w:type="dxa" w:w="5060"/>
+            <w:tcBorders>
+              <w:top w:val="single" w:color="CCCCCC" w:sz="1"/>
+              <w:left w:val="single" w:color="CCCCCC" w:sz="1"/>
+              <w:bottom w:val="single" w:color="CCCCCC" w:sz="1"/>
+              <w:right w:val="single" w:color="CCCCCC" w:sz="1"/>
+            </w:tcBorders>
+            <w:tcMar>
+              <w:top w:type="dxa" w:w="80"/>
+              <w:left w:type="dxa" w:w="160"/>
+              <w:bottom w:type="dxa" w:w="80"/>
+              <w:right w:type="dxa" w:w="160"/>
+            </w:tcMar>
+          </w:tcPr>
+          <w:p>
+            <w:r>
+              <w:rPr>
+                <w:rFonts w:ascii="Arial" w:cs="Arial" w:eastAsia="Arial" w:hAnsi="Arial"/>
+                <w:sz w:val="20"/>
+                <w:szCs w:val="20"/>
+              </w:rPr>
+              <w:t xml:space="preserve">Standard system fields only (Name, Description, Assigned User, Teams). No activity panels, no calendar integration.</w:t>
+            </w:r>
+          </w:p>
+        </w:tc>
+        <w:tc>
+          <w:tcPr>
+            <w:tcW w:type="dxa" w:w="2800"/>
+            <w:tcBorders>
+              <w:top w:val="single" w:color="CCCCCC" w:sz="1"/>
+              <w:left w:val="single" w:color="CCCCCC" w:sz="1"/>
+              <w:bottom w:val="single" w:color="CCCCCC" w:sz="1"/>
+              <w:right w:val="single" w:color="CCCCCC" w:sz="1"/>
+            </w:tcBorders>
+            <w:tcMar>
+              <w:top w:type="dxa" w:w="80"/>
+              <w:left w:type="dxa" w:w="160"/>
+              <w:bottom w:type="dxa" w:w="80"/>
+              <w:right w:type="dxa" w:w="160"/>
+            </w:tcMar>
+          </w:tcPr>
+          <w:p>
+            <w:r>
+              <w:rPr>
+                <w:rFonts w:ascii="Arial" w:cs="Arial" w:eastAsia="Arial" w:hAnsi="Arial"/>
+                <w:sz w:val="20"/>
+                <w:szCs w:val="20"/>
+              </w:rPr>
+              <w:t xml:space="preserve">Lookup tables and simple reference data.</w:t>
+            </w:r>
+          </w:p>
+        </w:tc>
+      </w:tr>
+      <w:tr>
+        <w:tc>
+          <w:tcPr>
+            <w:tcW w:type="dxa" w:w="1500"/>
+            <w:tcBorders>
+              <w:top w:val="single" w:color="CCCCCC" w:sz="1"/>
+              <w:left w:val="single" w:color="CCCCCC" w:sz="1"/>
+              <w:bottom w:val="single" w:color="CCCCCC" w:sz="1"/>
+              <w:right w:val="single" w:color="CCCCCC" w:sz="1"/>
+            </w:tcBorders>
+            <w:tcMar>
+              <w:top w:type="dxa" w:w="80"/>
+              <w:left w:type="dxa" w:w="160"/>
+              <w:bottom w:type="dxa" w:w="80"/>
+              <w:right w:type="dxa" w:w="160"/>
+            </w:tcMar>
+          </w:tcPr>
+          <w:p>
+            <w:r>
+              <w:rPr>
+                <w:rFonts w:ascii="Arial" w:cs="Arial" w:eastAsia="Arial" w:hAnsi="Arial"/>
+                <w:sz w:val="20"/>
+                <w:szCs w:val="20"/>
+              </w:rPr>
+              <w:t xml:space="preserve">Base Plus</w:t>
+            </w:r>
+          </w:p>
+        </w:tc>
+        <w:tc>
+          <w:tcPr>
+            <w:tcW w:type="dxa" w:w="5060"/>
+            <w:tcBorders>
+              <w:top w:val="single" w:color="CCCCCC" w:sz="1"/>
+              <w:left w:val="single" w:color="CCCCCC" w:sz="1"/>
+              <w:bottom w:val="single" w:color="CCCCCC" w:sz="1"/>
+              <w:right w:val="single" w:color="CCCCCC" w:sz="1"/>
+            </w:tcBorders>
+            <w:tcMar>
+              <w:top w:type="dxa" w:w="80"/>
+              <w:left w:type="dxa" w:w="160"/>
+              <w:bottom w:type="dxa" w:w="80"/>
+              <w:right w:type="dxa" w:w="160"/>
+            </w:tcMar>
+          </w:tcPr>
+          <w:p>
+            <w:r>
+              <w:rPr>
+                <w:rFonts w:ascii="Arial" w:cs="Arial" w:eastAsia="Arial" w:hAnsi="Arial"/>
+                <w:sz w:val="20"/>
+                <w:szCs w:val="20"/>
+              </w:rPr>
+              <w:t xml:space="preserve">Base features plus the Activities, History, and Tasks side panels. Records can have Meetings, Calls, Tasks, and Emails logged against them.</w:t>
+            </w:r>
+          </w:p>
+        </w:tc>
+        <w:tc>
+          <w:tcPr>
+            <w:tcW w:type="dxa" w:w="2800"/>
+            <w:tcBorders>
+              <w:top w:val="single" w:color="CCCCCC" w:sz="1"/>
+              <w:left w:val="single" w:color="CCCCCC" w:sz="1"/>
+              <w:bottom w:val="single" w:color="CCCCCC" w:sz="1"/>
+              <w:right w:val="single" w:color="CCCCCC" w:sz="1"/>
+            </w:tcBorders>
+            <w:tcMar>
+              <w:top w:type="dxa" w:w="80"/>
+              <w:left w:type="dxa" w:w="160"/>
+              <w:bottom w:type="dxa" w:w="80"/>
+              <w:right w:type="dxa" w:w="160"/>
+            </w:tcMar>
+          </w:tcPr>
+          <w:p>
+            <w:r>
+              <w:rPr>
+                <w:rFonts w:ascii="Arial" w:cs="Arial" w:eastAsia="Arial" w:hAnsi="Arial"/>
+                <w:sz w:val="20"/>
+                <w:szCs w:val="20"/>
+              </w:rPr>
+              <w:t xml:space="preserve">Most custom tracking entities (e.g., Engagement, Application).</w:t>
+            </w:r>
+          </w:p>
+        </w:tc>
+      </w:tr>
+      <w:tr>
+        <w:tc>
+          <w:tcPr>
+            <w:tcW w:type="dxa" w:w="1500"/>
+            <w:tcBorders>
+              <w:top w:val="single" w:color="CCCCCC" w:sz="1"/>
+              <w:left w:val="single" w:color="CCCCCC" w:sz="1"/>
+              <w:bottom w:val="single" w:color="CCCCCC" w:sz="1"/>
+              <w:right w:val="single" w:color="CCCCCC" w:sz="1"/>
+            </w:tcBorders>
+            <w:tcMar>
+              <w:top w:type="dxa" w:w="80"/>
+              <w:left w:type="dxa" w:w="160"/>
+              <w:bottom w:type="dxa" w:w="80"/>
+              <w:right w:type="dxa" w:w="160"/>
+            </w:tcMar>
+          </w:tcPr>
+          <w:p>
+            <w:r>
+              <w:rPr>
+                <w:rFonts w:ascii="Arial" w:cs="Arial" w:eastAsia="Arial" w:hAnsi="Arial"/>
+                <w:sz w:val="20"/>
+                <w:szCs w:val="20"/>
+              </w:rPr>
+              <w:t xml:space="preserve">Person</w:t>
+            </w:r>
+          </w:p>
+        </w:tc>
+        <w:tc>
+          <w:tcPr>
+            <w:tcW w:type="dxa" w:w="5060"/>
+            <w:tcBorders>
+              <w:top w:val="single" w:color="CCCCCC" w:sz="1"/>
+              <w:left w:val="single" w:color="CCCCCC" w:sz="1"/>
+              <w:bottom w:val="single" w:color="CCCCCC" w:sz="1"/>
+              <w:right w:val="single" w:color="CCCCCC" w:sz="1"/>
+            </w:tcBorders>
+            <w:tcMar>
+              <w:top w:type="dxa" w:w="80"/>
+              <w:left w:type="dxa" w:w="160"/>
+              <w:bottom w:type="dxa" w:w="80"/>
+              <w:right w:type="dxa" w:w="160"/>
+            </w:tcMar>
+          </w:tcPr>
+          <w:p>
+            <w:r>
+              <w:rPr>
+                <w:rFonts w:ascii="Arial" w:cs="Arial" w:eastAsia="Arial" w:hAnsi="Arial"/>
+                <w:sz w:val="20"/>
+                <w:szCs w:val="20"/>
+              </w:rPr>
+              <w:t xml:space="preserve">Base Plus features plus split name fields (Salutation, First Name, Middle Name, Last Name), Email, Phone, and Address. Records are flagged as containing personal data, which enables email-history matching by email address.</w:t>
+            </w:r>
+          </w:p>
+        </w:tc>
+        <w:tc>
+          <w:tcPr>
+            <w:tcW w:type="dxa" w:w="2800"/>
+            <w:tcBorders>
+              <w:top w:val="single" w:color="CCCCCC" w:sz="1"/>
+              <w:left w:val="single" w:color="CCCCCC" w:sz="1"/>
+              <w:bottom w:val="single" w:color="CCCCCC" w:sz="1"/>
+              <w:right w:val="single" w:color="CCCCCC" w:sz="1"/>
+            </w:tcBorders>
+            <w:tcMar>
+              <w:top w:type="dxa" w:w="80"/>
+              <w:left w:type="dxa" w:w="160"/>
+              <w:bottom w:type="dxa" w:w="80"/>
+              <w:right w:type="dxa" w:w="160"/>
+            </w:tcMar>
+          </w:tcPr>
+          <w:p>
+            <w:r>
+              <w:rPr>
+                <w:rFonts w:ascii="Arial" w:cs="Arial" w:eastAsia="Arial" w:hAnsi="Arial"/>
+                <w:sz w:val="20"/>
+                <w:szCs w:val="20"/>
+              </w:rPr>
+              <w:t xml:space="preserve">Any entity representing a human (Mentor, Mentee, Sponsor).</w:t>
+            </w:r>
+          </w:p>
+        </w:tc>
+      </w:tr>
+      <w:tr>
+        <w:tc>
+          <w:tcPr>
+            <w:tcW w:type="dxa" w:w="1500"/>
+            <w:tcBorders>
+              <w:top w:val="single" w:color="CCCCCC" w:sz="1"/>
+              <w:left w:val="single" w:color="CCCCCC" w:sz="1"/>
+              <w:bottom w:val="single" w:color="CCCCCC" w:sz="1"/>
+              <w:right w:val="single" w:color="CCCCCC" w:sz="1"/>
+            </w:tcBorders>
+            <w:tcMar>
+              <w:top w:type="dxa" w:w="80"/>
+              <w:left w:type="dxa" w:w="160"/>
+              <w:bottom w:type="dxa" w:w="80"/>
+              <w:right w:type="dxa" w:w="160"/>
+            </w:tcMar>
+          </w:tcPr>
+          <w:p>
+            <w:r>
+              <w:rPr>
+                <w:rFonts w:ascii="Arial" w:cs="Arial" w:eastAsia="Arial" w:hAnsi="Arial"/>
+                <w:sz w:val="20"/>
+                <w:szCs w:val="20"/>
+              </w:rPr>
+              <w:t xml:space="preserve">Company</w:t>
+            </w:r>
+          </w:p>
+        </w:tc>
+        <w:tc>
+          <w:tcPr>
+            <w:tcW w:type="dxa" w:w="5060"/>
+            <w:tcBorders>
+              <w:top w:val="single" w:color="CCCCCC" w:sz="1"/>
+              <w:left w:val="single" w:color="CCCCCC" w:sz="1"/>
+              <w:bottom w:val="single" w:color="CCCCCC" w:sz="1"/>
+              <w:right w:val="single" w:color="CCCCCC" w:sz="1"/>
+            </w:tcBorders>
+            <w:tcMar>
+              <w:top w:type="dxa" w:w="80"/>
+              <w:left w:type="dxa" w:w="160"/>
+              <w:bottom w:type="dxa" w:w="80"/>
+              <w:right w:type="dxa" w:w="160"/>
+            </w:tcMar>
+          </w:tcPr>
+          <w:p>
+            <w:r>
+              <w:rPr>
+                <w:rFonts w:ascii="Arial" w:cs="Arial" w:eastAsia="Arial" w:hAnsi="Arial"/>
+                <w:sz w:val="20"/>
+                <w:szCs w:val="20"/>
+              </w:rPr>
+              <w:t xml:space="preserve">Base Plus features plus organization-style Name field, Email, Phone, Billing Address, and Shipping Address.</w:t>
+            </w:r>
+          </w:p>
+        </w:tc>
+        <w:tc>
+          <w:tcPr>
+            <w:tcW w:type="dxa" w:w="2800"/>
+            <w:tcBorders>
+              <w:top w:val="single" w:color="CCCCCC" w:sz="1"/>
+              <w:left w:val="single" w:color="CCCCCC" w:sz="1"/>
+              <w:bottom w:val="single" w:color="CCCCCC" w:sz="1"/>
+              <w:right w:val="single" w:color="CCCCCC" w:sz="1"/>
+            </w:tcBorders>
+            <w:tcMar>
+              <w:top w:type="dxa" w:w="80"/>
+              <w:left w:type="dxa" w:w="160"/>
+              <w:bottom w:type="dxa" w:w="80"/>
+              <w:right w:type="dxa" w:w="160"/>
+            </w:tcMar>
+          </w:tcPr>
+          <w:p>
+            <w:r>
+              <w:rPr>
+                <w:rFonts w:ascii="Arial" w:cs="Arial" w:eastAsia="Arial" w:hAnsi="Arial"/>
+                <w:sz w:val="20"/>
+                <w:szCs w:val="20"/>
+              </w:rPr>
+              <w:t xml:space="preserve">Any entity representing an organization (Partner Company, Sponsor Organization).</w:t>
+            </w:r>
+          </w:p>
+        </w:tc>
+      </w:tr>
+      <w:tr>
+        <w:tc>
+          <w:tcPr>
+            <w:tcW w:type="dxa" w:w="1500"/>
+            <w:tcBorders>
+              <w:top w:val="single" w:color="CCCCCC" w:sz="1"/>
+              <w:left w:val="single" w:color="CCCCCC" w:sz="1"/>
+              <w:bottom w:val="single" w:color="CCCCCC" w:sz="1"/>
+              <w:right w:val="single" w:color="CCCCCC" w:sz="1"/>
+            </w:tcBorders>
+            <w:tcMar>
+              <w:top w:type="dxa" w:w="80"/>
+              <w:left w:type="dxa" w:w="160"/>
+              <w:bottom w:type="dxa" w:w="80"/>
+              <w:right w:type="dxa" w:w="160"/>
+            </w:tcMar>
+          </w:tcPr>
+          <w:p>
+            <w:r>
+              <w:rPr>
+                <w:rFonts w:ascii="Arial" w:cs="Arial" w:eastAsia="Arial" w:hAnsi="Arial"/>
+                <w:sz w:val="20"/>
+                <w:szCs w:val="20"/>
+              </w:rPr>
+              <w:t xml:space="preserve">Event</w:t>
+            </w:r>
+          </w:p>
+        </w:tc>
+        <w:tc>
+          <w:tcPr>
+            <w:tcW w:type="dxa" w:w="5060"/>
+            <w:tcBorders>
+              <w:top w:val="single" w:color="CCCCCC" w:sz="1"/>
+              <w:left w:val="single" w:color="CCCCCC" w:sz="1"/>
+              <w:bottom w:val="single" w:color="CCCCCC" w:sz="1"/>
+              <w:right w:val="single" w:color="CCCCCC" w:sz="1"/>
+            </w:tcBorders>
+            <w:tcMar>
+              <w:top w:type="dxa" w:w="80"/>
+              <w:left w:type="dxa" w:w="160"/>
+              <w:bottom w:type="dxa" w:w="80"/>
+              <w:right w:type="dxa" w:w="160"/>
+            </w:tcMar>
+          </w:tcPr>
+          <w:p>
+            <w:r>
+              <w:rPr>
+                <w:rFonts w:ascii="Arial" w:cs="Arial" w:eastAsia="Arial" w:hAnsi="Arial"/>
+                <w:sz w:val="20"/>
+                <w:szCs w:val="20"/>
+              </w:rPr>
+              <w:t xml:space="preserve">Base Plus features plus Date Start, Date End, Duration, Parent, and Status fields. Records appear on the EspoCRM Calendar.</w:t>
+            </w:r>
+          </w:p>
+        </w:tc>
+        <w:tc>
+          <w:tcPr>
+            <w:tcW w:type="dxa" w:w="2800"/>
+            <w:tcBorders>
+              <w:top w:val="single" w:color="CCCCCC" w:sz="1"/>
+              <w:left w:val="single" w:color="CCCCCC" w:sz="1"/>
+              <w:bottom w:val="single" w:color="CCCCCC" w:sz="1"/>
+              <w:right w:val="single" w:color="CCCCCC" w:sz="1"/>
+            </w:tcBorders>
+            <w:tcMar>
+              <w:top w:type="dxa" w:w="80"/>
+              <w:left w:type="dxa" w:w="160"/>
+              <w:bottom w:type="dxa" w:w="80"/>
+              <w:right w:type="dxa" w:w="160"/>
+            </w:tcMar>
+          </w:tcPr>
+          <w:p>
+            <w:r>
+              <w:rPr>
+                <w:rFonts w:ascii="Arial" w:cs="Arial" w:eastAsia="Arial" w:hAnsi="Arial"/>
+                <w:sz w:val="20"/>
+                <w:szCs w:val="20"/>
+              </w:rPr>
+              <w:t xml:space="preserve">Sessions, webinars, and other scheduled activities.</w:t>
+            </w:r>
+          </w:p>
+        </w:tc>
+      </w:tr>
+      <w:tr>
+        <w:tc>
+          <w:tcPr>
+            <w:tcW w:type="dxa" w:w="1500"/>
+            <w:tcBorders>
+              <w:top w:val="single" w:color="CCCCCC" w:sz="1"/>
+              <w:left w:val="single" w:color="CCCCCC" w:sz="1"/>
+              <w:bottom w:val="single" w:color="CCCCCC" w:sz="1"/>
+              <w:right w:val="single" w:color="CCCCCC" w:sz="1"/>
+            </w:tcBorders>
+            <w:tcMar>
+              <w:top w:type="dxa" w:w="80"/>
+              <w:left w:type="dxa" w:w="160"/>
+              <w:bottom w:type="dxa" w:w="80"/>
+              <w:right w:type="dxa" w:w="160"/>
+            </w:tcMar>
+          </w:tcPr>
+          <w:p>
+            <w:r>
+              <w:rPr>
+                <w:rFonts w:ascii="Arial" w:cs="Arial" w:eastAsia="Arial" w:hAnsi="Arial"/>
+                <w:sz w:val="20"/>
+                <w:szCs w:val="20"/>
+              </w:rPr>
+              <w:t xml:space="preserve">Category Tree</w:t>
+            </w:r>
+          </w:p>
+        </w:tc>
+        <w:tc>
+          <w:tcPr>
+            <w:tcW w:type="dxa" w:w="5060"/>
+            <w:tcBorders>
+              <w:top w:val="single" w:color="CCCCCC" w:sz="1"/>
+              <w:left w:val="single" w:color="CCCCCC" w:sz="1"/>
+              <w:bottom w:val="single" w:color="CCCCCC" w:sz="1"/>
+              <w:right w:val="single" w:color="CCCCCC" w:sz="1"/>
+            </w:tcBorders>
+            <w:tcMar>
+              <w:top w:type="dxa" w:w="80"/>
+              <w:left w:type="dxa" w:w="160"/>
+              <w:bottom w:type="dxa" w:w="80"/>
+              <w:right w:type="dxa" w:w="160"/>
+            </w:tcMar>
+          </w:tcPr>
+          <w:p>
+            <w:r>
+              <w:rPr>
+                <w:rFonts w:ascii="Arial" w:cs="Arial" w:eastAsia="Arial" w:hAnsi="Arial"/>
+                <w:sz w:val="20"/>
+                <w:szCs w:val="20"/>
+              </w:rPr>
+              <w:t xml:space="preserve">Hierarchical parent-child structure with tree navigation in the UI.</w:t>
+            </w:r>
+          </w:p>
+        </w:tc>
+        <w:tc>
+          <w:tcPr>
+            <w:tcW w:type="dxa" w:w="2800"/>
+            <w:tcBorders>
+              <w:top w:val="single" w:color="CCCCCC" w:sz="1"/>
+              <w:left w:val="single" w:color="CCCCCC" w:sz="1"/>
+              <w:bottom w:val="single" w:color="CCCCCC" w:sz="1"/>
+              <w:right w:val="single" w:color="CCCCCC" w:sz="1"/>
+            </w:tcBorders>
+            <w:tcMar>
+              <w:top w:type="dxa" w:w="80"/>
+              <w:left w:type="dxa" w:w="160"/>
+              <w:bottom w:type="dxa" w:w="80"/>
+              <w:right w:type="dxa" w:w="160"/>
+            </w:tcMar>
+          </w:tcPr>
+          <w:p>
+            <w:r>
+              <w:rPr>
+                <w:rFonts w:ascii="Arial" w:cs="Arial" w:eastAsia="Arial" w:hAnsi="Arial"/>
+                <w:sz w:val="20"/>
+                <w:szCs w:val="20"/>
+              </w:rPr>
+              <w:t xml:space="preserve">Nested category lists (e.g., topic taxonomies).</w:t>
+            </w:r>
+          </w:p>
+        </w:tc>
+      </w:tr>
+    </w:tbl>
+    <w:p>
+      <w:r>
+        <w:t xml:space="preserve"/>
+      </w:r>
+    </w:p>
+    <w:p>
+      <w:r>
+        <w:t xml:space="preserve"/>
+      </w:r>
+    </w:p>
+    <w:p>
+      <w:pPr>
+        <w:spacing w:after="120"/>
+      </w:pPr>
+      <w:r>
+        <w:rPr>
+          <w:rFonts w:ascii="Arial" w:cs="Arial" w:eastAsia="Arial" w:hAnsi="Arial"/>
+          <w:b/>
+          <w:bCs/>
+          <w:sz w:val="22"/>
+          <w:szCs w:val="22"/>
+        </w:rPr>
+        <w:t xml:space="preserve">Why the Choice Matters:</w:t>
+      </w:r>
+    </w:p>
+    <w:p>
+      <w:r>
+        <w:t xml:space="preserve"/>
+      </w:r>
+    </w:p>
+    <w:p>
+      <w:pPr>
+        <w:spacing w:after="120"/>
+      </w:pPr>
+      <w:r>
+        <w:rPr>
+          <w:rFonts w:ascii="Arial" w:cs="Arial" w:eastAsia="Arial" w:hAnsi="Arial"/>
+          <w:sz w:val="22"/>
+          <w:szCs w:val="22"/>
+        </w:rPr>
+        <w:t xml:space="preserve">EspoCRM’s Admin UI does not provide a way to change the type of an existing entity. Converting an entity from one type to another after creation requires manual edits to PHP class definitions, JSON metadata files, and scope configuration on the server. In practice, the entity type should be treated as immutable once any record exists. If the wrong type is selected and discovered before records are entered, the cleanest path is to delete the entity and recreate it with the correct type.</w:t>
+      </w:r>
+    </w:p>
+    <w:p>
+      <w:r>
+        <w:t xml:space="preserve"/>
+      </w:r>
+    </w:p>
+    <w:p>
+      <w:pPr>
+        <w:spacing w:after="120"/>
+      </w:pPr>
+      <w:r>
+        <w:rPr>
+          <w:rFonts w:ascii="Arial" w:cs="Arial" w:eastAsia="Arial" w:hAnsi="Arial"/>
+          <w:b/>
+          <w:bCs/>
+          <w:sz w:val="22"/>
+          <w:szCs w:val="22"/>
+        </w:rPr>
+        <w:t xml:space="preserve">Recommended Types for CBM Use Cases:</w:t>
+      </w:r>
+    </w:p>
+    <w:p>
+      <w:r>
+        <w:t xml:space="preserve"/>
+      </w:r>
+    </w:p>
+    <w:tbl>
+      <w:tblPr>
+        <w:tblW w:type="dxa" w:w="9360"/>
+        <w:tblBorders>
+          <w:top w:val="single" w:color="auto" w:sz="4"/>
+          <w:left w:val="single" w:color="auto" w:sz="4"/>
+          <w:bottom w:val="single" w:color="auto" w:sz="4"/>
+          <w:right w:val="single" w:color="auto" w:sz="4"/>
+          <w:insideH w:val="single" w:color="auto" w:sz="4"/>
+          <w:insideV w:val="single" w:color="auto" w:sz="4"/>
+        </w:tblBorders>
+      </w:tblPr>
+      <w:tblGrid>
+        <w:gridCol w:w="5500"/>
+        <w:gridCol w:w="3860"/>
+      </w:tblGrid>
+      <w:tr>
+        <w:tc>
+          <w:tcPr>
+            <w:tcW w:type="dxa" w:w="5500"/>
+            <w:tcBorders>
+              <w:top w:val="single" w:color="AAAAAA" w:sz="1"/>
+              <w:left w:val="single" w:color="AAAAAA" w:sz="1"/>
+              <w:bottom w:val="single" w:color="AAAAAA" w:sz="1"/>
+              <w:right w:val="single" w:color="AAAAAA" w:sz="1"/>
+            </w:tcBorders>
+            <w:shd w:fill="D5E8F0" w:val="clear"/>
+            <w:tcMar>
+              <w:top w:type="dxa" w:w="80"/>
+              <w:left w:type="dxa" w:w="160"/>
+              <w:bottom w:type="dxa" w:w="80"/>
+              <w:right w:type="dxa" w:w="160"/>
+            </w:tcMar>
+          </w:tcPr>
+          <w:p>
+            <w:r>
+              <w:rPr>
+                <w:rFonts w:ascii="Arial" w:cs="Arial" w:eastAsia="Arial" w:hAnsi="Arial"/>
+                <w:b/>
+                <w:bCs/>
+                <w:sz w:val="20"/>
+                <w:szCs w:val="20"/>
+              </w:rPr>
+              <w:t xml:space="preserve">Use Case</w:t>
+            </w:r>
+          </w:p>
+        </w:tc>
+        <w:tc>
+          <w:tcPr>
+            <w:tcW w:type="dxa" w:w="3860"/>
+            <w:tcBorders>
+              <w:top w:val="single" w:color="AAAAAA" w:sz="1"/>
+              <w:left w:val="single" w:color="AAAAAA" w:sz="1"/>
+              <w:bottom w:val="single" w:color="AAAAAA" w:sz="1"/>
+              <w:right w:val="single" w:color="AAAAAA" w:sz="1"/>
+            </w:tcBorders>
+            <w:shd w:fill="D5E8F0" w:val="clear"/>
+            <w:tcMar>
+              <w:top w:type="dxa" w:w="80"/>
+              <w:left w:type="dxa" w:w="160"/>
+              <w:bottom w:type="dxa" w:w="80"/>
+              <w:right w:type="dxa" w:w="160"/>
+            </w:tcMar>
+          </w:tcPr>
+          <w:p>
+            <w:r>
+              <w:rPr>
+                <w:rFonts w:ascii="Arial" w:cs="Arial" w:eastAsia="Arial" w:hAnsi="Arial"/>
+                <w:b/>
+                <w:bCs/>
+                <w:sz w:val="20"/>
+                <w:szCs w:val="20"/>
+              </w:rPr>
+              <w:t xml:space="preserve">Recommended Type</w:t>
+            </w:r>
+          </w:p>
+        </w:tc>
+      </w:tr>
+      <w:tr>
+        <w:tc>
+          <w:tcPr>
+            <w:tcW w:type="dxa" w:w="5500"/>
+            <w:tcBorders>
+              <w:top w:val="single" w:color="CCCCCC" w:sz="1"/>
+              <w:left w:val="single" w:color="CCCCCC" w:sz="1"/>
+              <w:bottom w:val="single" w:color="CCCCCC" w:sz="1"/>
+              <w:right w:val="single" w:color="CCCCCC" w:sz="1"/>
+            </w:tcBorders>
+            <w:tcMar>
+              <w:top w:type="dxa" w:w="80"/>
+              <w:left w:type="dxa" w:w="160"/>
+              <w:bottom w:type="dxa" w:w="80"/>
+              <w:right w:type="dxa" w:w="160"/>
+            </w:tcMar>
+          </w:tcPr>
+          <w:p>
+            <w:r>
+              <w:rPr>
+                <w:rFonts w:ascii="Arial" w:cs="Arial" w:eastAsia="Arial" w:hAnsi="Arial"/>
+                <w:sz w:val="20"/>
+                <w:szCs w:val="20"/>
+              </w:rPr>
+              <w:t xml:space="preserve">Person record (Mentor, Mentee, Sponsor, etc.)</w:t>
+            </w:r>
+          </w:p>
+        </w:tc>
+        <w:tc>
+          <w:tcPr>
+            <w:tcW w:type="dxa" w:w="3860"/>
+            <w:tcBorders>
+              <w:top w:val="single" w:color="CCCCCC" w:sz="1"/>
+              <w:left w:val="single" w:color="CCCCCC" w:sz="1"/>
+              <w:bottom w:val="single" w:color="CCCCCC" w:sz="1"/>
+              <w:right w:val="single" w:color="CCCCCC" w:sz="1"/>
+            </w:tcBorders>
+            <w:tcMar>
+              <w:top w:type="dxa" w:w="80"/>
+              <w:left w:type="dxa" w:w="160"/>
+              <w:bottom w:type="dxa" w:w="80"/>
+              <w:right w:type="dxa" w:w="160"/>
+            </w:tcMar>
+          </w:tcPr>
+          <w:p>
+            <w:r>
+              <w:rPr>
+                <w:rFonts w:ascii="Arial" w:cs="Arial" w:eastAsia="Arial" w:hAnsi="Arial"/>
+                <w:sz w:val="20"/>
+                <w:szCs w:val="20"/>
+              </w:rPr>
+              <w:t xml:space="preserve">Person</w:t>
+            </w:r>
+          </w:p>
+        </w:tc>
+      </w:tr>
+      <w:tr>
+        <w:tc>
+          <w:tcPr>
+            <w:tcW w:type="dxa" w:w="5500"/>
+            <w:tcBorders>
+              <w:top w:val="single" w:color="CCCCCC" w:sz="1"/>
+              <w:left w:val="single" w:color="CCCCCC" w:sz="1"/>
+              <w:bottom w:val="single" w:color="CCCCCC" w:sz="1"/>
+              <w:right w:val="single" w:color="CCCCCC" w:sz="1"/>
+            </w:tcBorders>
+            <w:tcMar>
+              <w:top w:type="dxa" w:w="80"/>
+              <w:left w:type="dxa" w:w="160"/>
+              <w:bottom w:type="dxa" w:w="80"/>
+              <w:right w:type="dxa" w:w="160"/>
+            </w:tcMar>
+          </w:tcPr>
+          <w:p>
+            <w:r>
+              <w:rPr>
+                <w:rFonts w:ascii="Arial" w:cs="Arial" w:eastAsia="Arial" w:hAnsi="Arial"/>
+                <w:sz w:val="20"/>
+                <w:szCs w:val="20"/>
+              </w:rPr>
+              <w:t xml:space="preserve">Organization record (Partner Company, Sponsor Organization)</w:t>
+            </w:r>
+          </w:p>
+        </w:tc>
+        <w:tc>
+          <w:tcPr>
+            <w:tcW w:type="dxa" w:w="3860"/>
+            <w:tcBorders>
+              <w:top w:val="single" w:color="CCCCCC" w:sz="1"/>
+              <w:left w:val="single" w:color="CCCCCC" w:sz="1"/>
+              <w:bottom w:val="single" w:color="CCCCCC" w:sz="1"/>
+              <w:right w:val="single" w:color="CCCCCC" w:sz="1"/>
+            </w:tcBorders>
+            <w:tcMar>
+              <w:top w:type="dxa" w:w="80"/>
+              <w:left w:type="dxa" w:w="160"/>
+              <w:bottom w:type="dxa" w:w="80"/>
+              <w:right w:type="dxa" w:w="160"/>
+            </w:tcMar>
+          </w:tcPr>
+          <w:p>
+            <w:r>
+              <w:rPr>
+                <w:rFonts w:ascii="Arial" w:cs="Arial" w:eastAsia="Arial" w:hAnsi="Arial"/>
+                <w:sz w:val="20"/>
+                <w:szCs w:val="20"/>
+              </w:rPr>
+              <w:t xml:space="preserve">Company</w:t>
+            </w:r>
+          </w:p>
+        </w:tc>
+      </w:tr>
+      <w:tr>
+        <w:tc>
+          <w:tcPr>
+            <w:tcW w:type="dxa" w:w="5500"/>
+            <w:tcBorders>
+              <w:top w:val="single" w:color="CCCCCC" w:sz="1"/>
+              <w:left w:val="single" w:color="CCCCCC" w:sz="1"/>
+              <w:bottom w:val="single" w:color="CCCCCC" w:sz="1"/>
+              <w:right w:val="single" w:color="CCCCCC" w:sz="1"/>
+            </w:tcBorders>
+            <w:tcMar>
+              <w:top w:type="dxa" w:w="80"/>
+              <w:left w:type="dxa" w:w="160"/>
+              <w:bottom w:type="dxa" w:w="80"/>
+              <w:right w:type="dxa" w:w="160"/>
+            </w:tcMar>
+          </w:tcPr>
+          <w:p>
+            <w:r>
+              <w:rPr>
+                <w:rFonts w:ascii="Arial" w:cs="Arial" w:eastAsia="Arial" w:hAnsi="Arial"/>
+                <w:sz w:val="20"/>
+                <w:szCs w:val="20"/>
+              </w:rPr>
+              <w:t xml:space="preserve">Scheduled session, meeting, or webinar</w:t>
+            </w:r>
+          </w:p>
+        </w:tc>
+        <w:tc>
+          <w:tcPr>
+            <w:tcW w:type="dxa" w:w="3860"/>
+            <w:tcBorders>
+              <w:top w:val="single" w:color="CCCCCC" w:sz="1"/>
+              <w:left w:val="single" w:color="CCCCCC" w:sz="1"/>
+              <w:bottom w:val="single" w:color="CCCCCC" w:sz="1"/>
+              <w:right w:val="single" w:color="CCCCCC" w:sz="1"/>
+            </w:tcBorders>
+            <w:tcMar>
+              <w:top w:type="dxa" w:w="80"/>
+              <w:left w:type="dxa" w:w="160"/>
+              <w:bottom w:type="dxa" w:w="80"/>
+              <w:right w:type="dxa" w:w="160"/>
+            </w:tcMar>
+          </w:tcPr>
+          <w:p>
+            <w:r>
+              <w:rPr>
+                <w:rFonts w:ascii="Arial" w:cs="Arial" w:eastAsia="Arial" w:hAnsi="Arial"/>
+                <w:sz w:val="20"/>
+                <w:szCs w:val="20"/>
+              </w:rPr>
+              <w:t xml:space="preserve">Event</w:t>
+            </w:r>
+          </w:p>
+        </w:tc>
+      </w:tr>
+      <w:tr>
+        <w:tc>
+          <w:tcPr>
+            <w:tcW w:type="dxa" w:w="5500"/>
+            <w:tcBorders>
+              <w:top w:val="single" w:color="CCCCCC" w:sz="1"/>
+              <w:left w:val="single" w:color="CCCCCC" w:sz="1"/>
+              <w:bottom w:val="single" w:color="CCCCCC" w:sz="1"/>
+              <w:right w:val="single" w:color="CCCCCC" w:sz="1"/>
+            </w:tcBorders>
+            <w:tcMar>
+              <w:top w:type="dxa" w:w="80"/>
+              <w:left w:type="dxa" w:w="160"/>
+              <w:bottom w:type="dxa" w:w="80"/>
+              <w:right w:type="dxa" w:w="160"/>
+            </w:tcMar>
+          </w:tcPr>
+          <w:p>
+            <w:r>
+              <w:rPr>
+                <w:rFonts w:ascii="Arial" w:cs="Arial" w:eastAsia="Arial" w:hAnsi="Arial"/>
+                <w:sz w:val="20"/>
+                <w:szCs w:val="20"/>
+              </w:rPr>
+              <w:t xml:space="preserve">Tracking record with activity logging (Engagement, Application)</w:t>
+            </w:r>
+          </w:p>
+        </w:tc>
+        <w:tc>
+          <w:tcPr>
+            <w:tcW w:type="dxa" w:w="3860"/>
+            <w:tcBorders>
+              <w:top w:val="single" w:color="CCCCCC" w:sz="1"/>
+              <w:left w:val="single" w:color="CCCCCC" w:sz="1"/>
+              <w:bottom w:val="single" w:color="CCCCCC" w:sz="1"/>
+              <w:right w:val="single" w:color="CCCCCC" w:sz="1"/>
+            </w:tcBorders>
+            <w:tcMar>
+              <w:top w:type="dxa" w:w="80"/>
+              <w:left w:type="dxa" w:w="160"/>
+              <w:bottom w:type="dxa" w:w="80"/>
+              <w:right w:type="dxa" w:w="160"/>
+            </w:tcMar>
+          </w:tcPr>
+          <w:p>
+            <w:r>
+              <w:rPr>
+                <w:rFonts w:ascii="Arial" w:cs="Arial" w:eastAsia="Arial" w:hAnsi="Arial"/>
+                <w:sz w:val="20"/>
+                <w:szCs w:val="20"/>
+              </w:rPr>
+              <w:t xml:space="preserve">Base Plus</w:t>
+            </w:r>
+          </w:p>
+        </w:tc>
+      </w:tr>
+      <w:tr>
+        <w:tc>
+          <w:tcPr>
+            <w:tcW w:type="dxa" w:w="5500"/>
+            <w:tcBorders>
+              <w:top w:val="single" w:color="CCCCCC" w:sz="1"/>
+              <w:left w:val="single" w:color="CCCCCC" w:sz="1"/>
+              <w:bottom w:val="single" w:color="CCCCCC" w:sz="1"/>
+              <w:right w:val="single" w:color="CCCCCC" w:sz="1"/>
+            </w:tcBorders>
+            <w:tcMar>
+              <w:top w:type="dxa" w:w="80"/>
+              <w:left w:type="dxa" w:w="160"/>
+              <w:bottom w:type="dxa" w:w="80"/>
+              <w:right w:type="dxa" w:w="160"/>
+            </w:tcMar>
+          </w:tcPr>
+          <w:p>
+            <w:r>
+              <w:rPr>
+                <w:rFonts w:ascii="Arial" w:cs="Arial" w:eastAsia="Arial" w:hAnsi="Arial"/>
+                <w:sz w:val="20"/>
+                <w:szCs w:val="20"/>
+              </w:rPr>
+              <w:t xml:space="preserve">Simple lookup or reference data (Industry list, Skill list)</w:t>
+            </w:r>
+          </w:p>
+        </w:tc>
+        <w:tc>
+          <w:tcPr>
+            <w:tcW w:type="dxa" w:w="3860"/>
+            <w:tcBorders>
+              <w:top w:val="single" w:color="CCCCCC" w:sz="1"/>
+              <w:left w:val="single" w:color="CCCCCC" w:sz="1"/>
+              <w:bottom w:val="single" w:color="CCCCCC" w:sz="1"/>
+              <w:right w:val="single" w:color="CCCCCC" w:sz="1"/>
+            </w:tcBorders>
+            <w:tcMar>
+              <w:top w:type="dxa" w:w="80"/>
+              <w:left w:type="dxa" w:w="160"/>
+              <w:bottom w:type="dxa" w:w="80"/>
+              <w:right w:type="dxa" w:w="160"/>
+            </w:tcMar>
+          </w:tcPr>
+          <w:p>
+            <w:r>
+              <w:rPr>
+                <w:rFonts w:ascii="Arial" w:cs="Arial" w:eastAsia="Arial" w:hAnsi="Arial"/>
+                <w:sz w:val="20"/>
+                <w:szCs w:val="20"/>
+              </w:rPr>
+              <w:t xml:space="preserve">Base</w:t>
+            </w:r>
+          </w:p>
+        </w:tc>
+      </w:tr>
+      <w:tr>
+        <w:tc>
+          <w:tcPr>
+            <w:tcW w:type="dxa" w:w="5500"/>
+            <w:tcBorders>
+              <w:top w:val="single" w:color="CCCCCC" w:sz="1"/>
+              <w:left w:val="single" w:color="CCCCCC" w:sz="1"/>
+              <w:bottom w:val="single" w:color="CCCCCC" w:sz="1"/>
+              <w:right w:val="single" w:color="CCCCCC" w:sz="1"/>
+            </w:tcBorders>
+            <w:tcMar>
+              <w:top w:type="dxa" w:w="80"/>
+              <w:left w:type="dxa" w:w="160"/>
+              <w:bottom w:type="dxa" w:w="80"/>
+              <w:right w:type="dxa" w:w="160"/>
+            </w:tcMar>
+          </w:tcPr>
+          <w:p>
+            <w:r>
+              <w:rPr>
+                <w:rFonts w:ascii="Arial" w:cs="Arial" w:eastAsia="Arial" w:hAnsi="Arial"/>
+                <w:sz w:val="20"/>
+                <w:szCs w:val="20"/>
+              </w:rPr>
+              <w:t xml:space="preserve">Hierarchical category list (topic taxonomy)</w:t>
+            </w:r>
+          </w:p>
+        </w:tc>
+        <w:tc>
+          <w:tcPr>
+            <w:tcW w:type="dxa" w:w="3860"/>
+            <w:tcBorders>
+              <w:top w:val="single" w:color="CCCCCC" w:sz="1"/>
+              <w:left w:val="single" w:color="CCCCCC" w:sz="1"/>
+              <w:bottom w:val="single" w:color="CCCCCC" w:sz="1"/>
+              <w:right w:val="single" w:color="CCCCCC" w:sz="1"/>
+            </w:tcBorders>
+            <w:tcMar>
+              <w:top w:type="dxa" w:w="80"/>
+              <w:left w:type="dxa" w:w="160"/>
+              <w:bottom w:type="dxa" w:w="80"/>
+              <w:right w:type="dxa" w:w="160"/>
+            </w:tcMar>
+          </w:tcPr>
+          <w:p>
+            <w:r>
+              <w:rPr>
+                <w:rFonts w:ascii="Arial" w:cs="Arial" w:eastAsia="Arial" w:hAnsi="Arial"/>
+                <w:sz w:val="20"/>
+                <w:szCs w:val="20"/>
+              </w:rPr>
+              <w:t xml:space="preserve">Category Tree</w:t>
+            </w:r>
+          </w:p>
+        </w:tc>
+      </w:tr>
+    </w:tbl>
+    <w:p>
+      <w:r>
+        <w:t xml:space="preserve"/>
+      </w:r>
+    </w:p>
+    <w:p>
+      <w:r>
+        <w:t xml:space="preserve"/>
+      </w:r>
+    </w:p>
+    <w:p>
+      <w:pPr>
+        <w:pStyle w:val="Heading3"/>
+      </w:pPr>
+      <w:r>
+        <w:rPr>
+          <w:rFonts w:ascii="Arial" w:cs="Arial" w:eastAsia="Arial" w:hAnsi="Arial"/>
+          <w:b/>
+          <w:bCs/>
+          <w:color w:val="595959"/>
+          <w:sz w:val="24"/>
+          <w:szCs w:val="24"/>
+        </w:rPr>
+        <w:t xml:space="preserve">1.3 Step-by-Step: Creating a New Entity</w:t>
       </w:r>
     </w:p>
     <w:p>
@@ -732,7 +2200,7 @@
                 <w:sz w:val="20"/>
                 <w:szCs w:val="20"/>
               </w:rPr>
-              <w:t xml:space="preserve">Use Base for most custom entities. Base Plus includes Teams/Followers support.</w:t>
+              <w:t xml:space="preserve">Determines the structural template for the entity (default fields, side panels, calendar integration). See Section 1.2 for a full discussion of the available types and how to choose. The type cannot be changed through the UI after creation.</w:t>
             </w:r>
           </w:p>
         </w:tc>
@@ -795,7 +2263,7 @@
           <w:sz w:val="24"/>
           <w:szCs w:val="24"/>
         </w:rPr>
-        <w:t xml:space="preserve">1.3 Adding Custom Fields</w:t>
+        <w:t xml:space="preserve">1.4 Adding Custom Fields</w:t>
       </w:r>
     </w:p>
     <w:p>
@@ -1100,7 +2568,7 @@
           <w:sz w:val="24"/>
           <w:szCs w:val="24"/>
         </w:rPr>
-        <w:t xml:space="preserve">1.4 Setting an Enum Default Value Based on Another Field (Dynamic Handler)</w:t>
+        <w:t xml:space="preserve">1.5 Setting an Enum Default Value Based on Another Field (Dynamic Handler)</w:t>
       </w:r>
     </w:p>
     <w:p>
@@ -1794,7 +3262,7 @@
           <w:sz w:val="24"/>
           <w:szCs w:val="24"/>
         </w:rPr>
-        <w:t xml:space="preserve">1.5 Adding the Entity to the Left Navigation Column</w:t>
+        <w:t xml:space="preserve">1.6 Adding the Entity to the Left Navigation Column</w:t>
       </w:r>
     </w:p>
     <w:p>
@@ -7241,7 +8709,7 @@
                 <w:sz w:val="22"/>
                 <w:szCs w:val="22"/>
               </w:rPr>
-              <w:t xml:space="preserve">When using an Enum field to drive Dynamic Logic, ensure the first option in the Enum list is a blank entry and the Default Value is also left blank. If the first option is not blank, EspoCRM will assign it as the default, which will cause a panel to be shown immediately on new records before a user has intentionally selected a value. See Section 1.3 for details on configuring Enum fields correctly.</w:t>
+              <w:t xml:space="preserve">When using an Enum field to drive Dynamic Logic, ensure the first option in the Enum list is a blank entry and the Default Value is also left blank. If the first option is not blank, EspoCRM will assign it as the default, which will cause a panel to be shown immediately on new records before a user has intentionally selected a value. See Section 1.4 for details on configuring Enum fields correctly.</w:t>
             </w:r>
           </w:p>
         </w:tc>
@@ -12537,6 +14005,393 @@
         <w:t xml:space="preserve">How do users add notes to a record — the Note entity exists in Entity Manager as a system-level entity with limited configurability (Fields only, no Layouts or Relationships tabs). It likely powers an activity stream or notes panel on record detail pages, but the exact user-facing path for posting notes, attaching files, and viewing note history on a record needs to be identified and documented.</w:t>
       </w:r>
     </w:p>
+    <w:p>
+      <w:r>
+        <w:t xml:space="preserve"/>
+      </w:r>
+    </w:p>
+    <w:p>
+      <w:pPr>
+        <w:pStyle w:val="Heading2"/>
+      </w:pPr>
+      <w:r>
+        <w:rPr>
+          <w:rFonts w:ascii="Arial" w:cs="Arial" w:eastAsia="Arial" w:hAnsi="Arial"/>
+          <w:b/>
+          <w:bCs/>
+          <w:color w:val="2E75B6"/>
+          <w:sz w:val="26"/>
+          <w:szCs w:val="26"/>
+        </w:rPr>
+        <w:t xml:space="preserve">Change Log</w:t>
+      </w:r>
+    </w:p>
+    <w:p>
+      <w:r>
+        <w:t xml:space="preserve"/>
+      </w:r>
+    </w:p>
+    <w:tbl>
+      <w:tblPr>
+        <w:tblW w:type="dxa" w:w="9360"/>
+        <w:tblBorders>
+          <w:top w:val="single" w:color="auto" w:sz="4"/>
+          <w:left w:val="single" w:color="auto" w:sz="4"/>
+          <w:bottom w:val="single" w:color="auto" w:sz="4"/>
+          <w:right w:val="single" w:color="auto" w:sz="4"/>
+          <w:insideH w:val="single" w:color="auto" w:sz="4"/>
+          <w:insideV w:val="single" w:color="auto" w:sz="4"/>
+        </w:tblBorders>
+      </w:tblPr>
+      <w:tblGrid>
+        <w:gridCol w:w="1200"/>
+        <w:gridCol w:w="1700"/>
+        <w:gridCol w:w="2200"/>
+        <w:gridCol w:w="4260"/>
+      </w:tblGrid>
+      <w:tr>
+        <w:tc>
+          <w:tcPr>
+            <w:tcW w:type="dxa" w:w="1200"/>
+            <w:tcBorders>
+              <w:top w:val="single" w:color="AAAAAA" w:sz="1"/>
+              <w:left w:val="single" w:color="AAAAAA" w:sz="1"/>
+              <w:bottom w:val="single" w:color="AAAAAA" w:sz="1"/>
+              <w:right w:val="single" w:color="AAAAAA" w:sz="1"/>
+            </w:tcBorders>
+            <w:shd w:fill="D5E8F0" w:val="clear"/>
+            <w:tcMar>
+              <w:top w:type="dxa" w:w="80"/>
+              <w:left w:type="dxa" w:w="160"/>
+              <w:bottom w:type="dxa" w:w="80"/>
+              <w:right w:type="dxa" w:w="160"/>
+            </w:tcMar>
+          </w:tcPr>
+          <w:p>
+            <w:r>
+              <w:rPr>
+                <w:rFonts w:ascii="Arial" w:cs="Arial" w:eastAsia="Arial" w:hAnsi="Arial"/>
+                <w:b/>
+                <w:bCs/>
+                <w:sz w:val="20"/>
+                <w:szCs w:val="20"/>
+              </w:rPr>
+              <w:t xml:space="preserve">Version</w:t>
+            </w:r>
+          </w:p>
+        </w:tc>
+        <w:tc>
+          <w:tcPr>
+            <w:tcW w:type="dxa" w:w="1700"/>
+            <w:tcBorders>
+              <w:top w:val="single" w:color="AAAAAA" w:sz="1"/>
+              <w:left w:val="single" w:color="AAAAAA" w:sz="1"/>
+              <w:bottom w:val="single" w:color="AAAAAA" w:sz="1"/>
+              <w:right w:val="single" w:color="AAAAAA" w:sz="1"/>
+            </w:tcBorders>
+            <w:shd w:fill="D5E8F0" w:val="clear"/>
+            <w:tcMar>
+              <w:top w:type="dxa" w:w="80"/>
+              <w:left w:type="dxa" w:w="160"/>
+              <w:bottom w:type="dxa" w:w="80"/>
+              <w:right w:type="dxa" w:w="160"/>
+            </w:tcMar>
+          </w:tcPr>
+          <w:p>
+            <w:r>
+              <w:rPr>
+                <w:rFonts w:ascii="Arial" w:cs="Arial" w:eastAsia="Arial" w:hAnsi="Arial"/>
+                <w:b/>
+                <w:bCs/>
+                <w:sz w:val="20"/>
+                <w:szCs w:val="20"/>
+              </w:rPr>
+              <w:t xml:space="preserve">Date</w:t>
+            </w:r>
+          </w:p>
+        </w:tc>
+        <w:tc>
+          <w:tcPr>
+            <w:tcW w:type="dxa" w:w="2200"/>
+            <w:tcBorders>
+              <w:top w:val="single" w:color="AAAAAA" w:sz="1"/>
+              <w:left w:val="single" w:color="AAAAAA" w:sz="1"/>
+              <w:bottom w:val="single" w:color="AAAAAA" w:sz="1"/>
+              <w:right w:val="single" w:color="AAAAAA" w:sz="1"/>
+            </w:tcBorders>
+            <w:shd w:fill="D5E8F0" w:val="clear"/>
+            <w:tcMar>
+              <w:top w:type="dxa" w:w="80"/>
+              <w:left w:type="dxa" w:w="160"/>
+              <w:bottom w:type="dxa" w:w="80"/>
+              <w:right w:type="dxa" w:w="160"/>
+            </w:tcMar>
+          </w:tcPr>
+          <w:p>
+            <w:r>
+              <w:rPr>
+                <w:rFonts w:ascii="Arial" w:cs="Arial" w:eastAsia="Arial" w:hAnsi="Arial"/>
+                <w:b/>
+                <w:bCs/>
+                <w:sz w:val="20"/>
+                <w:szCs w:val="20"/>
+              </w:rPr>
+              <w:t xml:space="preserve">Author</w:t>
+            </w:r>
+          </w:p>
+        </w:tc>
+        <w:tc>
+          <w:tcPr>
+            <w:tcW w:type="dxa" w:w="4260"/>
+            <w:tcBorders>
+              <w:top w:val="single" w:color="AAAAAA" w:sz="1"/>
+              <w:left w:val="single" w:color="AAAAAA" w:sz="1"/>
+              <w:bottom w:val="single" w:color="AAAAAA" w:sz="1"/>
+              <w:right w:val="single" w:color="AAAAAA" w:sz="1"/>
+            </w:tcBorders>
+            <w:shd w:fill="D5E8F0" w:val="clear"/>
+            <w:tcMar>
+              <w:top w:type="dxa" w:w="80"/>
+              <w:left w:type="dxa" w:w="160"/>
+              <w:bottom w:type="dxa" w:w="80"/>
+              <w:right w:type="dxa" w:w="160"/>
+            </w:tcMar>
+          </w:tcPr>
+          <w:p>
+            <w:r>
+              <w:rPr>
+                <w:rFonts w:ascii="Arial" w:cs="Arial" w:eastAsia="Arial" w:hAnsi="Arial"/>
+                <w:b/>
+                <w:bCs/>
+                <w:sz w:val="20"/>
+                <w:szCs w:val="20"/>
+              </w:rPr>
+              <w:t xml:space="preserve">Description</w:t>
+            </w:r>
+          </w:p>
+        </w:tc>
+      </w:tr>
+      <w:tr>
+        <w:tc>
+          <w:tcPr>
+            <w:tcW w:type="dxa" w:w="1200"/>
+            <w:tcBorders>
+              <w:top w:val="single" w:color="CCCCCC" w:sz="1"/>
+              <w:left w:val="single" w:color="CCCCCC" w:sz="1"/>
+              <w:bottom w:val="single" w:color="CCCCCC" w:sz="1"/>
+              <w:right w:val="single" w:color="CCCCCC" w:sz="1"/>
+            </w:tcBorders>
+            <w:tcMar>
+              <w:top w:type="dxa" w:w="80"/>
+              <w:left w:type="dxa" w:w="160"/>
+              <w:bottom w:type="dxa" w:w="80"/>
+              <w:right w:type="dxa" w:w="160"/>
+            </w:tcMar>
+          </w:tcPr>
+          <w:p>
+            <w:r>
+              <w:rPr>
+                <w:rFonts w:ascii="Arial" w:cs="Arial" w:eastAsia="Arial" w:hAnsi="Arial"/>
+                <w:sz w:val="20"/>
+                <w:szCs w:val="20"/>
+              </w:rPr>
+              <w:t xml:space="preserve">1.0</w:t>
+            </w:r>
+          </w:p>
+        </w:tc>
+        <w:tc>
+          <w:tcPr>
+            <w:tcW w:type="dxa" w:w="1700"/>
+            <w:tcBorders>
+              <w:top w:val="single" w:color="CCCCCC" w:sz="1"/>
+              <w:left w:val="single" w:color="CCCCCC" w:sz="1"/>
+              <w:bottom w:val="single" w:color="CCCCCC" w:sz="1"/>
+              <w:right w:val="single" w:color="CCCCCC" w:sz="1"/>
+            </w:tcBorders>
+            <w:tcMar>
+              <w:top w:type="dxa" w:w="80"/>
+              <w:left w:type="dxa" w:w="160"/>
+              <w:bottom w:type="dxa" w:w="80"/>
+              <w:right w:type="dxa" w:w="160"/>
+            </w:tcMar>
+          </w:tcPr>
+          <w:p>
+            <w:r>
+              <w:rPr>
+                <w:rFonts w:ascii="Arial" w:cs="Arial" w:eastAsia="Arial" w:hAnsi="Arial"/>
+                <w:sz w:val="20"/>
+                <w:szCs w:val="20"/>
+              </w:rPr>
+              <w:t xml:space="preserve">05-05-26 11:03</w:t>
+            </w:r>
+          </w:p>
+        </w:tc>
+        <w:tc>
+          <w:tcPr>
+            <w:tcW w:type="dxa" w:w="2200"/>
+            <w:tcBorders>
+              <w:top w:val="single" w:color="CCCCCC" w:sz="1"/>
+              <w:left w:val="single" w:color="CCCCCC" w:sz="1"/>
+              <w:bottom w:val="single" w:color="CCCCCC" w:sz="1"/>
+              <w:right w:val="single" w:color="CCCCCC" w:sz="1"/>
+            </w:tcBorders>
+            <w:tcMar>
+              <w:top w:type="dxa" w:w="80"/>
+              <w:left w:type="dxa" w:w="160"/>
+              <w:bottom w:type="dxa" w:w="80"/>
+              <w:right w:type="dxa" w:w="160"/>
+            </w:tcMar>
+          </w:tcPr>
+          <w:p>
+            <w:r>
+              <w:rPr>
+                <w:rFonts w:ascii="Arial" w:cs="Arial" w:eastAsia="Arial" w:hAnsi="Arial"/>
+                <w:sz w:val="20"/>
+                <w:szCs w:val="20"/>
+              </w:rPr>
+              <w:t xml:space="preserve">Doug Bower</w:t>
+            </w:r>
+          </w:p>
+        </w:tc>
+        <w:tc>
+          <w:tcPr>
+            <w:tcW w:type="dxa" w:w="4260"/>
+            <w:tcBorders>
+              <w:top w:val="single" w:color="CCCCCC" w:sz="1"/>
+              <w:left w:val="single" w:color="CCCCCC" w:sz="1"/>
+              <w:bottom w:val="single" w:color="CCCCCC" w:sz="1"/>
+              <w:right w:val="single" w:color="CCCCCC" w:sz="1"/>
+            </w:tcBorders>
+            <w:tcMar>
+              <w:top w:type="dxa" w:w="80"/>
+              <w:left w:type="dxa" w:w="160"/>
+              <w:bottom w:type="dxa" w:w="80"/>
+              <w:right w:type="dxa" w:w="160"/>
+            </w:tcMar>
+          </w:tcPr>
+          <w:p>
+            <w:r>
+              <w:rPr>
+                <w:rFonts w:ascii="Arial" w:cs="Arial" w:eastAsia="Arial" w:hAnsi="Arial"/>
+                <w:sz w:val="20"/>
+                <w:szCs w:val="20"/>
+              </w:rPr>
+              <w:t xml:space="preserve">Initial baseline — existing content prior to revision control adoption.</w:t>
+            </w:r>
+          </w:p>
+        </w:tc>
+      </w:tr>
+      <w:tr>
+        <w:tc>
+          <w:tcPr>
+            <w:tcW w:type="dxa" w:w="1200"/>
+            <w:tcBorders>
+              <w:top w:val="single" w:color="CCCCCC" w:sz="1"/>
+              <w:left w:val="single" w:color="CCCCCC" w:sz="1"/>
+              <w:bottom w:val="single" w:color="CCCCCC" w:sz="1"/>
+              <w:right w:val="single" w:color="CCCCCC" w:sz="1"/>
+            </w:tcBorders>
+            <w:tcMar>
+              <w:top w:type="dxa" w:w="80"/>
+              <w:left w:type="dxa" w:w="160"/>
+              <w:bottom w:type="dxa" w:w="80"/>
+              <w:right w:type="dxa" w:w="160"/>
+            </w:tcMar>
+          </w:tcPr>
+          <w:p>
+            <w:r>
+              <w:rPr>
+                <w:rFonts w:ascii="Arial" w:cs="Arial" w:eastAsia="Arial" w:hAnsi="Arial"/>
+                <w:sz w:val="20"/>
+                <w:szCs w:val="20"/>
+              </w:rPr>
+              <w:t xml:space="preserve">1.1</w:t>
+            </w:r>
+          </w:p>
+        </w:tc>
+        <w:tc>
+          <w:tcPr>
+            <w:tcW w:type="dxa" w:w="1700"/>
+            <w:tcBorders>
+              <w:top w:val="single" w:color="CCCCCC" w:sz="1"/>
+              <w:left w:val="single" w:color="CCCCCC" w:sz="1"/>
+              <w:bottom w:val="single" w:color="CCCCCC" w:sz="1"/>
+              <w:right w:val="single" w:color="CCCCCC" w:sz="1"/>
+            </w:tcBorders>
+            <w:tcMar>
+              <w:top w:type="dxa" w:w="80"/>
+              <w:left w:type="dxa" w:w="160"/>
+              <w:bottom w:type="dxa" w:w="80"/>
+              <w:right w:type="dxa" w:w="160"/>
+            </w:tcMar>
+          </w:tcPr>
+          <w:p>
+            <w:r>
+              <w:rPr>
+                <w:rFonts w:ascii="Arial" w:cs="Arial" w:eastAsia="Arial" w:hAnsi="Arial"/>
+                <w:sz w:val="20"/>
+                <w:szCs w:val="20"/>
+              </w:rPr>
+              <w:t xml:space="preserve">05-05-26 11:03</w:t>
+            </w:r>
+          </w:p>
+        </w:tc>
+        <w:tc>
+          <w:tcPr>
+            <w:tcW w:type="dxa" w:w="2200"/>
+            <w:tcBorders>
+              <w:top w:val="single" w:color="CCCCCC" w:sz="1"/>
+              <w:left w:val="single" w:color="CCCCCC" w:sz="1"/>
+              <w:bottom w:val="single" w:color="CCCCCC" w:sz="1"/>
+              <w:right w:val="single" w:color="CCCCCC" w:sz="1"/>
+            </w:tcBorders>
+            <w:tcMar>
+              <w:top w:type="dxa" w:w="80"/>
+              <w:left w:type="dxa" w:w="160"/>
+              <w:bottom w:type="dxa" w:w="80"/>
+              <w:right w:type="dxa" w:w="160"/>
+            </w:tcMar>
+          </w:tcPr>
+          <w:p>
+            <w:r>
+              <w:rPr>
+                <w:rFonts w:ascii="Arial" w:cs="Arial" w:eastAsia="Arial" w:hAnsi="Arial"/>
+                <w:sz w:val="20"/>
+                <w:szCs w:val="20"/>
+              </w:rPr>
+              <w:t xml:space="preserve">Doug Bower</w:t>
+            </w:r>
+          </w:p>
+        </w:tc>
+        <w:tc>
+          <w:tcPr>
+            <w:tcW w:type="dxa" w:w="4260"/>
+            <w:tcBorders>
+              <w:top w:val="single" w:color="CCCCCC" w:sz="1"/>
+              <w:left w:val="single" w:color="CCCCCC" w:sz="1"/>
+              <w:bottom w:val="single" w:color="CCCCCC" w:sz="1"/>
+              <w:right w:val="single" w:color="CCCCCC" w:sz="1"/>
+            </w:tcBorders>
+            <w:tcMar>
+              <w:top w:type="dxa" w:w="80"/>
+              <w:left w:type="dxa" w:w="160"/>
+              <w:bottom w:type="dxa" w:w="80"/>
+              <w:right w:type="dxa" w:w="160"/>
+            </w:tcMar>
+          </w:tcPr>
+          <w:p>
+            <w:r>
+              <w:rPr>
+                <w:rFonts w:ascii="Arial" w:cs="Arial" w:eastAsia="Arial" w:hAnsi="Arial"/>
+                <w:sz w:val="20"/>
+                <w:szCs w:val="20"/>
+              </w:rPr>
+              <w:t xml:space="preserve">Added Section 1.2 "Entity Types"; renumbered subsequent subsections in Section 1; updated Type-field note in the entity-creation procedure.</w:t>
+            </w:r>
+          </w:p>
+        </w:tc>
+      </w:tr>
+    </w:tbl>
     <w:p>
       <w:r>
         <w:t xml:space="preserve"/>

</xml_diff>

<commit_message>
Add Section 2.8 'Foreign Fields' to How-To Guide
Adds a new Section 2.8 'Foreign Fields — Displaying Linked Entity Data'
to the EspoCRM How-To Guide, placed after Section 2.7 (assignedMentor
example) and before the UI Configuration heading.

The new section covers:
- What Foreign fields are and when to use them
- How they work (link dependency, read-only behavior, cardinality caveats)
- Step-by-step instructions for adding a Foreign field
- Worked example: Mentor Email on Engagement, building on the
  assignedMentor link from Section 2.7
- Operational constraints (read-only, link required, workflow trigger
  guidance, Many-to-Many limitations)

Revision control updated:
- Version 1.1 -> 1.2
- Last Updated 05-05-26 11:03 -> 05-10-26 04:27
- Change Log gains a v1.2 entry
</commit_message>
<xml_diff>
--- a/PRDs/CBM-EspoCRM-HowTo.docx
+++ b/PRDs/CBM-EspoCRM-HowTo.docx
@@ -307,7 +307,7 @@
                 <w:sz w:val="20"/>
                 <w:szCs w:val="20"/>
               </w:rPr>
-              <w:t xml:space="preserve">1.1</w:t>
+              <w:t xml:space="preserve">1.2</w:t>
             </w:r>
           </w:p>
         </w:tc>
@@ -363,7 +363,7 @@
                 <w:sz w:val="20"/>
                 <w:szCs w:val="20"/>
               </w:rPr>
-              <w:t xml:space="preserve">05-05-26 11:03</w:t>
+              <w:t xml:space="preserve">05-10-26 04:27</w:t>
             </w:r>
           </w:p>
         </w:tc>
@@ -7483,6 +7483,800 @@
     </w:p>
     <w:p>
       <w:pPr>
+        <w:pStyle w:val="Heading3"/>
+      </w:pPr>
+      <w:r>
+        <w:rPr>
+          <w:rFonts w:ascii="Arial" w:cs="Arial" w:eastAsia="Arial" w:hAnsi="Arial"/>
+          <w:b/>
+          <w:bCs/>
+          <w:color w:val="595959"/>
+          <w:sz w:val="24"/>
+          <w:szCs w:val="24"/>
+        </w:rPr>
+        <w:t xml:space="preserve">2.8 Foreign Fields — Displaying Linked Entity Data</w:t>
+      </w:r>
+    </w:p>
+    <w:p>
+      <w:pPr>
+        <w:spacing w:after="120"/>
+      </w:pPr>
+      <w:r>
+        <w:rPr>
+          <w:rFonts w:ascii="Arial" w:cs="Arial" w:eastAsia="Arial" w:hAnsi="Arial"/>
+          <w:sz w:val="22"/>
+          <w:szCs w:val="22"/>
+        </w:rPr>
+        <w:t xml:space="preserve">A Foreign field displays a value from a related entity by reaching through an existing link (relationship). It is a read-only mirror — the actual data lives on the related record, but it appears on this entity for display, filtering, sorting, and reporting purposes. Foreign fields are the standard way to surface data from a parent or related entity inside list views, search filters, and reports without requiring users to click through to the related record.</w:t>
+      </w:r>
+    </w:p>
+    <w:p>
+      <w:r>
+        <w:t xml:space="preserve"/>
+      </w:r>
+    </w:p>
+    <w:p>
+      <w:pPr>
+        <w:pStyle w:val="Heading3"/>
+      </w:pPr>
+      <w:r>
+        <w:rPr>
+          <w:rFonts w:ascii="Arial" w:cs="Arial" w:eastAsia="Arial" w:hAnsi="Arial"/>
+          <w:b/>
+          <w:bCs/>
+          <w:color w:val="595959"/>
+          <w:sz w:val="24"/>
+          <w:szCs w:val="24"/>
+        </w:rPr>
+        <w:t xml:space="preserve">How Foreign Fields Work</w:t>
+      </w:r>
+    </w:p>
+    <w:p>
+      <w:pPr>
+        <w:spacing w:after="120"/>
+      </w:pPr>
+      <w:r>
+        <w:rPr>
+          <w:rFonts w:ascii="Arial" w:cs="Arial" w:eastAsia="Arial" w:hAnsi="Arial"/>
+          <w:sz w:val="22"/>
+          <w:szCs w:val="22"/>
+        </w:rPr>
+        <w:t xml:space="preserve">A Foreign field requires a link (relationship) to already exist. It does not create a relationship; it follows one that has already been defined in the Relationships tab. Once configured, the Foreign field behaves like a regular field: it appears in list views, can be searched and filtered on, and can be referenced in reports and formulas. The displayed value updates when the source record changes or when the host record is linked to a different related record.</w:t>
+      </w:r>
+    </w:p>
+    <w:p>
+      <w:pPr>
+        <w:spacing w:after="120"/>
+      </w:pPr>
+      <w:r>
+        <w:rPr>
+          <w:rFonts w:ascii="Arial" w:cs="Arial" w:eastAsia="Arial" w:hAnsi="Arial"/>
+          <w:sz w:val="22"/>
+          <w:szCs w:val="22"/>
+        </w:rPr>
+        <w:t xml:space="preserve">Foreign fields are most commonly used with Many-to-One links (the “many” side reaching up to the “one” side). With Many-to-Many links, behavior is undefined when the host record is linked to multiple related records, so Foreign fields should be limited to Many-to-One and One-to-One relationships in practice.</w:t>
+      </w:r>
+    </w:p>
+    <w:p>
+      <w:r>
+        <w:t xml:space="preserve"/>
+      </w:r>
+    </w:p>
+    <w:p>
+      <w:pPr>
+        <w:pStyle w:val="Heading3"/>
+      </w:pPr>
+      <w:r>
+        <w:rPr>
+          <w:rFonts w:ascii="Arial" w:cs="Arial" w:eastAsia="Arial" w:hAnsi="Arial"/>
+          <w:b/>
+          <w:bCs/>
+          <w:color w:val="595959"/>
+          <w:sz w:val="24"/>
+          <w:szCs w:val="24"/>
+        </w:rPr>
+        <w:t xml:space="preserve">Step-by-Step: Adding a Foreign Field</w:t>
+      </w:r>
+    </w:p>
+    <w:p>
+      <w:pPr>
+        <w:spacing w:after="120"/>
+      </w:pPr>
+      <w:r>
+        <w:rPr>
+          <w:rFonts w:ascii="Arial" w:cs="Arial" w:eastAsia="Arial" w:hAnsi="Arial"/>
+          <w:sz w:val="22"/>
+          <w:szCs w:val="22"/>
+        </w:rPr>
+        <w:t xml:space="preserve">The following steps assume the underlying link already exists. If the link has not been created yet, complete Section 2.5 first, then return here.</w:t>
+      </w:r>
+    </w:p>
+    <w:p>
+      <w:r>
+        <w:t xml:space="preserve"/>
+      </w:r>
+    </w:p>
+    <w:p>
+      <w:pPr>
+        <w:pStyle w:val="Heading3"/>
+      </w:pPr>
+      <w:r>
+        <w:rPr>
+          <w:rFonts w:ascii="Arial" w:cs="Arial" w:eastAsia="Arial" w:hAnsi="Arial"/>
+          <w:b/>
+          <w:bCs/>
+          <w:color w:val="595959"/>
+          <w:sz w:val="24"/>
+          <w:szCs w:val="24"/>
+        </w:rPr>
+        <w:t xml:space="preserve">Step 1 — Open the Fields Tab</w:t>
+      </w:r>
+    </w:p>
+    <w:p>
+      <w:pPr>
+        <w:spacing w:after="120"/>
+      </w:pPr>
+      <w:r>
+        <w:rPr>
+          <w:rFonts w:ascii="Arial" w:cs="Arial" w:eastAsia="Arial" w:hAnsi="Arial"/>
+          <w:sz w:val="22"/>
+          <w:szCs w:val="22"/>
+        </w:rPr>
+        <w:t xml:space="preserve">Navigate to: Admin → Entity Manager → [Entity that hosts the Foreign field] → Fields → Add Field.</w:t>
+      </w:r>
+    </w:p>
+    <w:p>
+      <w:r>
+        <w:t xml:space="preserve"/>
+      </w:r>
+    </w:p>
+    <w:p>
+      <w:pPr>
+        <w:pStyle w:val="Heading3"/>
+      </w:pPr>
+      <w:r>
+        <w:rPr>
+          <w:rFonts w:ascii="Arial" w:cs="Arial" w:eastAsia="Arial" w:hAnsi="Arial"/>
+          <w:b/>
+          <w:bCs/>
+          <w:color w:val="595959"/>
+          <w:sz w:val="24"/>
+          <w:szCs w:val="24"/>
+        </w:rPr>
+        <w:t xml:space="preserve">Step 2 — Select the Foreign Field Type</w:t>
+      </w:r>
+    </w:p>
+    <w:p>
+      <w:pPr>
+        <w:spacing w:after="120"/>
+      </w:pPr>
+      <w:r>
+        <w:rPr>
+          <w:rFonts w:ascii="Arial" w:cs="Arial" w:eastAsia="Arial" w:hAnsi="Arial"/>
+          <w:sz w:val="22"/>
+          <w:szCs w:val="22"/>
+        </w:rPr>
+        <w:t xml:space="preserve">In the field-type list, choose Foreign. The form will change to show Link and Field selectors specific to this type.</w:t>
+      </w:r>
+    </w:p>
+    <w:p>
+      <w:r>
+        <w:t xml:space="preserve"/>
+      </w:r>
+    </w:p>
+    <w:p>
+      <w:pPr>
+        <w:pStyle w:val="Heading3"/>
+      </w:pPr>
+      <w:r>
+        <w:rPr>
+          <w:rFonts w:ascii="Arial" w:cs="Arial" w:eastAsia="Arial" w:hAnsi="Arial"/>
+          <w:b/>
+          <w:bCs/>
+          <w:color w:val="595959"/>
+          <w:sz w:val="24"/>
+          <w:szCs w:val="24"/>
+        </w:rPr>
+        <w:t xml:space="preserve">Step 3 — Choose the Link to Traverse</w:t>
+      </w:r>
+    </w:p>
+    <w:p>
+      <w:pPr>
+        <w:spacing w:after="120"/>
+      </w:pPr>
+      <w:r>
+        <w:rPr>
+          <w:rFonts w:ascii="Arial" w:cs="Arial" w:eastAsia="Arial" w:hAnsi="Arial"/>
+          <w:sz w:val="22"/>
+          <w:szCs w:val="22"/>
+        </w:rPr>
+        <w:t xml:space="preserve">The Link dropdown lists the existing relationships defined on this entity. Pick the relationship that points to the entity whose data you want to display. If the link you need is not in the list, the relationship has not been created yet — return to Section 2.5 to add it.</w:t>
+      </w:r>
+    </w:p>
+    <w:p>
+      <w:r>
+        <w:t xml:space="preserve"/>
+      </w:r>
+    </w:p>
+    <w:p>
+      <w:pPr>
+        <w:pStyle w:val="Heading3"/>
+      </w:pPr>
+      <w:r>
+        <w:rPr>
+          <w:rFonts w:ascii="Arial" w:cs="Arial" w:eastAsia="Arial" w:hAnsi="Arial"/>
+          <w:b/>
+          <w:bCs/>
+          <w:color w:val="595959"/>
+          <w:sz w:val="24"/>
+          <w:szCs w:val="24"/>
+        </w:rPr>
+        <w:t xml:space="preserve">Step 4 — Choose the Field on the Linked Entity</w:t>
+      </w:r>
+    </w:p>
+    <w:p>
+      <w:pPr>
+        <w:spacing w:after="120"/>
+      </w:pPr>
+      <w:r>
+        <w:rPr>
+          <w:rFonts w:ascii="Arial" w:cs="Arial" w:eastAsia="Arial" w:hAnsi="Arial"/>
+          <w:sz w:val="22"/>
+          <w:szCs w:val="22"/>
+        </w:rPr>
+        <w:t xml:space="preserve">The Field dropdown lists the fields available on the related entity. Pick the field whose value should appear on this entity. Fields of type Varchar, Int, Float, Enum, Date, DateTime, Bool, and Text are all valid sources.</w:t>
+      </w:r>
+    </w:p>
+    <w:p>
+      <w:r>
+        <w:t xml:space="preserve"/>
+      </w:r>
+    </w:p>
+    <w:p>
+      <w:pPr>
+        <w:pStyle w:val="Heading3"/>
+      </w:pPr>
+      <w:r>
+        <w:rPr>
+          <w:rFonts w:ascii="Arial" w:cs="Arial" w:eastAsia="Arial" w:hAnsi="Arial"/>
+          <w:b/>
+          <w:bCs/>
+          <w:color w:val="595959"/>
+          <w:sz w:val="24"/>
+          <w:szCs w:val="24"/>
+        </w:rPr>
+        <w:t xml:space="preserve">Step 5 — Set Name and Label, then Save</w:t>
+      </w:r>
+    </w:p>
+    <w:p>
+      <w:pPr>
+        <w:spacing w:after="120"/>
+      </w:pPr>
+      <w:r>
+        <w:rPr>
+          <w:rFonts w:ascii="Arial" w:cs="Arial" w:eastAsia="Arial" w:hAnsi="Arial"/>
+          <w:sz w:val="22"/>
+          <w:szCs w:val="22"/>
+        </w:rPr>
+        <w:t xml:space="preserve">Enter an internal Name (camelCase, used in the API and formulas) and a Label (display name). Click Save. EspoCRM will populate the Foreign field on existing records during the next cache rebuild and on new records as they are created or linked.</w:t>
+      </w:r>
+    </w:p>
+    <w:p>
+      <w:r>
+        <w:t xml:space="preserve"/>
+      </w:r>
+    </w:p>
+    <w:p>
+      <w:pPr>
+        <w:pStyle w:val="Heading3"/>
+      </w:pPr>
+      <w:r>
+        <w:rPr>
+          <w:rFonts w:ascii="Arial" w:cs="Arial" w:eastAsia="Arial" w:hAnsi="Arial"/>
+          <w:b/>
+          <w:bCs/>
+          <w:color w:val="595959"/>
+          <w:sz w:val="24"/>
+          <w:szCs w:val="24"/>
+        </w:rPr>
+        <w:t xml:space="preserve">Example: Mentor Email on Engagement</w:t>
+      </w:r>
+    </w:p>
+    <w:p>
+      <w:pPr>
+        <w:spacing w:after="120"/>
+      </w:pPr>
+      <w:r>
+        <w:rPr>
+          <w:rFonts w:ascii="Arial" w:cs="Arial" w:eastAsia="Arial" w:hAnsi="Arial"/>
+          <w:sz w:val="22"/>
+          <w:szCs w:val="22"/>
+        </w:rPr>
+        <w:t xml:space="preserve">Building on the assignedMentor link created in Section 2.7, this configuration adds a Mentor Email Foreign field to the Engagement entity. The field will display the email address of whichever Contact is linked through assignedMentor, allowing the email to appear in Engagement list views and filters without joining to Contact in a report.</w:t>
+      </w:r>
+    </w:p>
+    <w:p>
+      <w:r>
+        <w:t xml:space="preserve"/>
+      </w:r>
+    </w:p>
+    <w:tbl>
+      <w:tblPr>
+        <w:tblW w:type="dxa" w:w="9360"/>
+        <w:tblBorders>
+          <w:top w:val="single" w:color="auto" w:sz="4"/>
+          <w:left w:val="single" w:color="auto" w:sz="4"/>
+          <w:bottom w:val="single" w:color="auto" w:sz="4"/>
+          <w:right w:val="single" w:color="auto" w:sz="4"/>
+          <w:insideH w:val="single" w:color="auto" w:sz="4"/>
+          <w:insideV w:val="single" w:color="auto" w:sz="4"/>
+        </w:tblBorders>
+      </w:tblPr>
+      <w:tblGrid>
+        <w:gridCol w:w="3120"/>
+        <w:gridCol w:w="6240"/>
+      </w:tblGrid>
+      <w:tr>
+        <w:tc>
+          <w:tcPr>
+            <w:tcW w:type="dxa" w:w="3120"/>
+            <w:tcBorders>
+              <w:top w:val="single" w:color="AAAAAA" w:sz="1"/>
+              <w:left w:val="single" w:color="AAAAAA" w:sz="1"/>
+              <w:bottom w:val="single" w:color="AAAAAA" w:sz="1"/>
+              <w:right w:val="single" w:color="AAAAAA" w:sz="1"/>
+            </w:tcBorders>
+            <w:shd w:fill="D5E8F0" w:val="clear"/>
+            <w:tcMar>
+              <w:top w:type="dxa" w:w="80"/>
+              <w:left w:type="dxa" w:w="160"/>
+              <w:bottom w:type="dxa" w:w="80"/>
+              <w:right w:type="dxa" w:w="160"/>
+            </w:tcMar>
+          </w:tcPr>
+          <w:p>
+            <w:r>
+              <w:rPr>
+                <w:rFonts w:ascii="Arial" w:cs="Arial" w:eastAsia="Arial" w:hAnsi="Arial"/>
+                <w:b/>
+                <w:bCs/>
+                <w:sz w:val="20"/>
+                <w:szCs w:val="20"/>
+              </w:rPr>
+              <w:t xml:space="preserve">Field</w:t>
+            </w:r>
+          </w:p>
+        </w:tc>
+        <w:tc>
+          <w:tcPr>
+            <w:tcW w:type="dxa" w:w="6240"/>
+            <w:tcBorders>
+              <w:top w:val="single" w:color="AAAAAA" w:sz="1"/>
+              <w:left w:val="single" w:color="AAAAAA" w:sz="1"/>
+              <w:bottom w:val="single" w:color="AAAAAA" w:sz="1"/>
+              <w:right w:val="single" w:color="AAAAAA" w:sz="1"/>
+            </w:tcBorders>
+            <w:shd w:fill="D5E8F0" w:val="clear"/>
+            <w:tcMar>
+              <w:top w:type="dxa" w:w="80"/>
+              <w:left w:type="dxa" w:w="160"/>
+              <w:bottom w:type="dxa" w:w="80"/>
+              <w:right w:type="dxa" w:w="160"/>
+            </w:tcMar>
+          </w:tcPr>
+          <w:p>
+            <w:r>
+              <w:rPr>
+                <w:rFonts w:ascii="Arial" w:cs="Arial" w:eastAsia="Arial" w:hAnsi="Arial"/>
+                <w:b/>
+                <w:bCs/>
+                <w:sz w:val="20"/>
+                <w:szCs w:val="20"/>
+              </w:rPr>
+              <w:t xml:space="preserve">Value</w:t>
+            </w:r>
+          </w:p>
+        </w:tc>
+      </w:tr>
+      <w:tr>
+        <w:tc>
+          <w:tcPr>
+            <w:tcW w:type="dxa" w:w="3120"/>
+            <w:tcBorders>
+              <w:top w:val="single" w:color="CCCCCC" w:sz="1"/>
+              <w:left w:val="single" w:color="CCCCCC" w:sz="1"/>
+              <w:bottom w:val="single" w:color="CCCCCC" w:sz="1"/>
+              <w:right w:val="single" w:color="CCCCCC" w:sz="1"/>
+            </w:tcBorders>
+            <w:tcMar>
+              <w:top w:type="dxa" w:w="80"/>
+              <w:left w:type="dxa" w:w="160"/>
+              <w:bottom w:type="dxa" w:w="80"/>
+              <w:right w:type="dxa" w:w="160"/>
+            </w:tcMar>
+          </w:tcPr>
+          <w:p>
+            <w:r>
+              <w:rPr>
+                <w:rFonts w:ascii="Arial" w:cs="Arial" w:eastAsia="Arial" w:hAnsi="Arial"/>
+                <w:sz w:val="20"/>
+                <w:szCs w:val="20"/>
+              </w:rPr>
+              <w:t xml:space="preserve">Type</w:t>
+            </w:r>
+          </w:p>
+        </w:tc>
+        <w:tc>
+          <w:tcPr>
+            <w:tcW w:type="dxa" w:w="6240"/>
+            <w:tcBorders>
+              <w:top w:val="single" w:color="CCCCCC" w:sz="1"/>
+              <w:left w:val="single" w:color="CCCCCC" w:sz="1"/>
+              <w:bottom w:val="single" w:color="CCCCCC" w:sz="1"/>
+              <w:right w:val="single" w:color="CCCCCC" w:sz="1"/>
+            </w:tcBorders>
+            <w:tcMar>
+              <w:top w:type="dxa" w:w="80"/>
+              <w:left w:type="dxa" w:w="160"/>
+              <w:bottom w:type="dxa" w:w="80"/>
+              <w:right w:type="dxa" w:w="160"/>
+            </w:tcMar>
+          </w:tcPr>
+          <w:p>
+            <w:r>
+              <w:rPr>
+                <w:rFonts w:ascii="Arial" w:cs="Arial" w:eastAsia="Arial" w:hAnsi="Arial"/>
+                <w:sz w:val="20"/>
+                <w:szCs w:val="20"/>
+              </w:rPr>
+              <w:t xml:space="preserve">Foreign</w:t>
+            </w:r>
+          </w:p>
+        </w:tc>
+      </w:tr>
+      <w:tr>
+        <w:tc>
+          <w:tcPr>
+            <w:tcW w:type="dxa" w:w="3120"/>
+            <w:tcBorders>
+              <w:top w:val="single" w:color="CCCCCC" w:sz="1"/>
+              <w:left w:val="single" w:color="CCCCCC" w:sz="1"/>
+              <w:bottom w:val="single" w:color="CCCCCC" w:sz="1"/>
+              <w:right w:val="single" w:color="CCCCCC" w:sz="1"/>
+            </w:tcBorders>
+            <w:tcMar>
+              <w:top w:type="dxa" w:w="80"/>
+              <w:left w:type="dxa" w:w="160"/>
+              <w:bottom w:type="dxa" w:w="80"/>
+              <w:right w:type="dxa" w:w="160"/>
+            </w:tcMar>
+          </w:tcPr>
+          <w:p>
+            <w:r>
+              <w:rPr>
+                <w:rFonts w:ascii="Arial" w:cs="Arial" w:eastAsia="Arial" w:hAnsi="Arial"/>
+                <w:sz w:val="20"/>
+                <w:szCs w:val="20"/>
+              </w:rPr>
+              <w:t xml:space="preserve">Name</w:t>
+            </w:r>
+          </w:p>
+        </w:tc>
+        <w:tc>
+          <w:tcPr>
+            <w:tcW w:type="dxa" w:w="6240"/>
+            <w:tcBorders>
+              <w:top w:val="single" w:color="CCCCCC" w:sz="1"/>
+              <w:left w:val="single" w:color="CCCCCC" w:sz="1"/>
+              <w:bottom w:val="single" w:color="CCCCCC" w:sz="1"/>
+              <w:right w:val="single" w:color="CCCCCC" w:sz="1"/>
+            </w:tcBorders>
+            <w:tcMar>
+              <w:top w:type="dxa" w:w="80"/>
+              <w:left w:type="dxa" w:w="160"/>
+              <w:bottom w:type="dxa" w:w="80"/>
+              <w:right w:type="dxa" w:w="160"/>
+            </w:tcMar>
+          </w:tcPr>
+          <w:p>
+            <w:r>
+              <w:rPr>
+                <w:rFonts w:ascii="Arial" w:cs="Arial" w:eastAsia="Arial" w:hAnsi="Arial"/>
+                <w:sz w:val="20"/>
+                <w:szCs w:val="20"/>
+              </w:rPr>
+              <w:t xml:space="preserve">assignedMentorEmailAddress</w:t>
+            </w:r>
+          </w:p>
+        </w:tc>
+      </w:tr>
+      <w:tr>
+        <w:tc>
+          <w:tcPr>
+            <w:tcW w:type="dxa" w:w="3120"/>
+            <w:tcBorders>
+              <w:top w:val="single" w:color="CCCCCC" w:sz="1"/>
+              <w:left w:val="single" w:color="CCCCCC" w:sz="1"/>
+              <w:bottom w:val="single" w:color="CCCCCC" w:sz="1"/>
+              <w:right w:val="single" w:color="CCCCCC" w:sz="1"/>
+            </w:tcBorders>
+            <w:tcMar>
+              <w:top w:type="dxa" w:w="80"/>
+              <w:left w:type="dxa" w:w="160"/>
+              <w:bottom w:type="dxa" w:w="80"/>
+              <w:right w:type="dxa" w:w="160"/>
+            </w:tcMar>
+          </w:tcPr>
+          <w:p>
+            <w:r>
+              <w:rPr>
+                <w:rFonts w:ascii="Arial" w:cs="Arial" w:eastAsia="Arial" w:hAnsi="Arial"/>
+                <w:sz w:val="20"/>
+                <w:szCs w:val="20"/>
+              </w:rPr>
+              <w:t xml:space="preserve">Label</w:t>
+            </w:r>
+          </w:p>
+        </w:tc>
+        <w:tc>
+          <w:tcPr>
+            <w:tcW w:type="dxa" w:w="6240"/>
+            <w:tcBorders>
+              <w:top w:val="single" w:color="CCCCCC" w:sz="1"/>
+              <w:left w:val="single" w:color="CCCCCC" w:sz="1"/>
+              <w:bottom w:val="single" w:color="CCCCCC" w:sz="1"/>
+              <w:right w:val="single" w:color="CCCCCC" w:sz="1"/>
+            </w:tcBorders>
+            <w:tcMar>
+              <w:top w:type="dxa" w:w="80"/>
+              <w:left w:type="dxa" w:w="160"/>
+              <w:bottom w:type="dxa" w:w="80"/>
+              <w:right w:type="dxa" w:w="160"/>
+            </w:tcMar>
+          </w:tcPr>
+          <w:p>
+            <w:r>
+              <w:rPr>
+                <w:rFonts w:ascii="Arial" w:cs="Arial" w:eastAsia="Arial" w:hAnsi="Arial"/>
+                <w:sz w:val="20"/>
+                <w:szCs w:val="20"/>
+              </w:rPr>
+              <w:t xml:space="preserve">Mentor Email</w:t>
+            </w:r>
+          </w:p>
+        </w:tc>
+      </w:tr>
+      <w:tr>
+        <w:tc>
+          <w:tcPr>
+            <w:tcW w:type="dxa" w:w="3120"/>
+            <w:tcBorders>
+              <w:top w:val="single" w:color="CCCCCC" w:sz="1"/>
+              <w:left w:val="single" w:color="CCCCCC" w:sz="1"/>
+              <w:bottom w:val="single" w:color="CCCCCC" w:sz="1"/>
+              <w:right w:val="single" w:color="CCCCCC" w:sz="1"/>
+            </w:tcBorders>
+            <w:tcMar>
+              <w:top w:type="dxa" w:w="80"/>
+              <w:left w:type="dxa" w:w="160"/>
+              <w:bottom w:type="dxa" w:w="80"/>
+              <w:right w:type="dxa" w:w="160"/>
+            </w:tcMar>
+          </w:tcPr>
+          <w:p>
+            <w:r>
+              <w:rPr>
+                <w:rFonts w:ascii="Arial" w:cs="Arial" w:eastAsia="Arial" w:hAnsi="Arial"/>
+                <w:sz w:val="20"/>
+                <w:szCs w:val="20"/>
+              </w:rPr>
+              <w:t xml:space="preserve">Link</w:t>
+            </w:r>
+          </w:p>
+        </w:tc>
+        <w:tc>
+          <w:tcPr>
+            <w:tcW w:type="dxa" w:w="6240"/>
+            <w:tcBorders>
+              <w:top w:val="single" w:color="CCCCCC" w:sz="1"/>
+              <w:left w:val="single" w:color="CCCCCC" w:sz="1"/>
+              <w:bottom w:val="single" w:color="CCCCCC" w:sz="1"/>
+              <w:right w:val="single" w:color="CCCCCC" w:sz="1"/>
+            </w:tcBorders>
+            <w:tcMar>
+              <w:top w:type="dxa" w:w="80"/>
+              <w:left w:type="dxa" w:w="160"/>
+              <w:bottom w:type="dxa" w:w="80"/>
+              <w:right w:type="dxa" w:w="160"/>
+            </w:tcMar>
+          </w:tcPr>
+          <w:p>
+            <w:r>
+              <w:rPr>
+                <w:rFonts w:ascii="Arial" w:cs="Arial" w:eastAsia="Arial" w:hAnsi="Arial"/>
+                <w:sz w:val="20"/>
+                <w:szCs w:val="20"/>
+              </w:rPr>
+              <w:t xml:space="preserve">assignedMentor</w:t>
+            </w:r>
+          </w:p>
+        </w:tc>
+      </w:tr>
+      <w:tr>
+        <w:tc>
+          <w:tcPr>
+            <w:tcW w:type="dxa" w:w="3120"/>
+            <w:tcBorders>
+              <w:top w:val="single" w:color="CCCCCC" w:sz="1"/>
+              <w:left w:val="single" w:color="CCCCCC" w:sz="1"/>
+              <w:bottom w:val="single" w:color="CCCCCC" w:sz="1"/>
+              <w:right w:val="single" w:color="CCCCCC" w:sz="1"/>
+            </w:tcBorders>
+            <w:tcMar>
+              <w:top w:type="dxa" w:w="80"/>
+              <w:left w:type="dxa" w:w="160"/>
+              <w:bottom w:type="dxa" w:w="80"/>
+              <w:right w:type="dxa" w:w="160"/>
+            </w:tcMar>
+          </w:tcPr>
+          <w:p>
+            <w:r>
+              <w:rPr>
+                <w:rFonts w:ascii="Arial" w:cs="Arial" w:eastAsia="Arial" w:hAnsi="Arial"/>
+                <w:sz w:val="20"/>
+                <w:szCs w:val="20"/>
+              </w:rPr>
+              <w:t xml:space="preserve">Field (on linked entity)</w:t>
+            </w:r>
+          </w:p>
+        </w:tc>
+        <w:tc>
+          <w:tcPr>
+            <w:tcW w:type="dxa" w:w="6240"/>
+            <w:tcBorders>
+              <w:top w:val="single" w:color="CCCCCC" w:sz="1"/>
+              <w:left w:val="single" w:color="CCCCCC" w:sz="1"/>
+              <w:bottom w:val="single" w:color="CCCCCC" w:sz="1"/>
+              <w:right w:val="single" w:color="CCCCCC" w:sz="1"/>
+            </w:tcBorders>
+            <w:tcMar>
+              <w:top w:type="dxa" w:w="80"/>
+              <w:left w:type="dxa" w:w="160"/>
+              <w:bottom w:type="dxa" w:w="80"/>
+              <w:right w:type="dxa" w:w="160"/>
+            </w:tcMar>
+          </w:tcPr>
+          <w:p>
+            <w:r>
+              <w:rPr>
+                <w:rFonts w:ascii="Arial" w:cs="Arial" w:eastAsia="Arial" w:hAnsi="Arial"/>
+                <w:sz w:val="20"/>
+                <w:szCs w:val="20"/>
+              </w:rPr>
+              <w:t xml:space="preserve">emailAddress</w:t>
+            </w:r>
+          </w:p>
+        </w:tc>
+      </w:tr>
+    </w:tbl>
+    <w:p>
+      <w:r>
+        <w:t xml:space="preserve"/>
+      </w:r>
+    </w:p>
+    <w:p>
+      <w:pPr>
+        <w:spacing w:after="120"/>
+      </w:pPr>
+      <w:r>
+        <w:rPr>
+          <w:rFonts w:ascii="Arial" w:cs="Arial" w:eastAsia="Arial" w:hAnsi="Arial"/>
+          <w:sz w:val="22"/>
+          <w:szCs w:val="22"/>
+        </w:rPr>
+        <w:t xml:space="preserve">After saving, every Engagement record will show the linked mentor’s email address as a read-only field. The field can be added to the Engagement list view, used as a search filter, and included in reports without any additional join configuration.</w:t>
+      </w:r>
+    </w:p>
+    <w:p>
+      <w:r>
+        <w:t xml:space="preserve"/>
+      </w:r>
+    </w:p>
+    <w:p>
+      <w:pPr>
+        <w:pStyle w:val="Heading3"/>
+      </w:pPr>
+      <w:r>
+        <w:rPr>
+          <w:rFonts w:ascii="Arial" w:cs="Arial" w:eastAsia="Arial" w:hAnsi="Arial"/>
+          <w:b/>
+          <w:bCs/>
+          <w:color w:val="595959"/>
+          <w:sz w:val="24"/>
+          <w:szCs w:val="24"/>
+        </w:rPr>
+        <w:t xml:space="preserve">Important Constraints</w:t>
+      </w:r>
+    </w:p>
+    <w:p>
+      <w:pPr>
+        <w:pStyle w:val="ListParagraph"/>
+        <w:numPr>
+          <w:ilvl w:val="0"/>
+          <w:numId w:val="3"/>
+        </w:numPr>
+        <w:spacing w:after="100"/>
+      </w:pPr>
+      <w:r>
+        <w:rPr>
+          <w:rFonts w:ascii="Arial" w:cs="Arial" w:eastAsia="Arial" w:hAnsi="Arial"/>
+          <w:sz w:val="22"/>
+          <w:szCs w:val="22"/>
+        </w:rPr>
+        <w:t xml:space="preserve">Foreign fields are read-only on the host entity. To change the value, edit the source field on the related record (in the example above, edit the Contact’s email address) or change which related record is linked.</w:t>
+      </w:r>
+    </w:p>
+    <w:p>
+      <w:pPr>
+        <w:pStyle w:val="ListParagraph"/>
+        <w:numPr>
+          <w:ilvl w:val="0"/>
+          <w:numId w:val="3"/>
+        </w:numPr>
+        <w:spacing w:after="100"/>
+      </w:pPr>
+      <w:r>
+        <w:rPr>
+          <w:rFonts w:ascii="Arial" w:cs="Arial" w:eastAsia="Arial" w:hAnsi="Arial"/>
+          <w:sz w:val="22"/>
+          <w:szCs w:val="22"/>
+        </w:rPr>
+        <w:t xml:space="preserve">A Foreign field requires the link to exist before the field can be created. If the link is later removed, the Foreign field will become invalid and must be removed as well.</w:t>
+      </w:r>
+    </w:p>
+    <w:p>
+      <w:pPr>
+        <w:pStyle w:val="ListParagraph"/>
+        <w:numPr>
+          <w:ilvl w:val="0"/>
+          <w:numId w:val="3"/>
+        </w:numPr>
+        <w:spacing w:after="100"/>
+      </w:pPr>
+      <w:r>
+        <w:rPr>
+          <w:rFonts w:ascii="Arial" w:cs="Arial" w:eastAsia="Arial" w:hAnsi="Arial"/>
+          <w:sz w:val="22"/>
+          <w:szCs w:val="22"/>
+        </w:rPr>
+        <w:t xml:space="preserve">When the source record changes, the displayed value updates, but workflow triggers should still be configured on the source entity rather than the host entity. Workflow conditions evaluating a Foreign field on the host entity may not always fire on source-record changes.</w:t>
+      </w:r>
+    </w:p>
+    <w:p>
+      <w:pPr>
+        <w:pStyle w:val="ListParagraph"/>
+        <w:numPr>
+          <w:ilvl w:val="0"/>
+          <w:numId w:val="3"/>
+        </w:numPr>
+        <w:spacing w:after="100"/>
+      </w:pPr>
+      <w:r>
+        <w:rPr>
+          <w:rFonts w:ascii="Arial" w:cs="Arial" w:eastAsia="Arial" w:hAnsi="Arial"/>
+          <w:sz w:val="22"/>
+          <w:szCs w:val="22"/>
+        </w:rPr>
+        <w:t xml:space="preserve">Foreign fields should be used with Many-to-One and One-to-One links. Use with Many-to-Many links is not recommended — when the host record is linked to multiple related records, the displayed value is undefined.</w:t>
+      </w:r>
+    </w:p>
+    <w:p>
+      <w:r>
+        <w:t xml:space="preserve"/>
+      </w:r>
+    </w:p>
+    <w:p>
+      <w:pPr>
         <w:pStyle w:val="Heading1"/>
       </w:pPr>
       <w:r>
@@ -14387,6 +15181,116 @@
                 <w:szCs w:val="20"/>
               </w:rPr>
               <w:t xml:space="preserve">Added Section 1.2 "Entity Types"; renumbered subsequent subsections in Section 1; updated Type-field note in the entity-creation procedure.</w:t>
+            </w:r>
+          </w:p>
+        </w:tc>
+      </w:tr>
+      <w:tr>
+        <w:tc>
+          <w:tcPr>
+            <w:tcW w:type="dxa" w:w="1200"/>
+            <w:tcBorders>
+              <w:top w:val="single" w:color="CCCCCC" w:sz="1"/>
+              <w:left w:val="single" w:color="CCCCCC" w:sz="1"/>
+              <w:bottom w:val="single" w:color="CCCCCC" w:sz="1"/>
+              <w:right w:val="single" w:color="CCCCCC" w:sz="1"/>
+            </w:tcBorders>
+            <w:tcMar>
+              <w:top w:type="dxa" w:w="80"/>
+              <w:left w:type="dxa" w:w="160"/>
+              <w:bottom w:type="dxa" w:w="80"/>
+              <w:right w:type="dxa" w:w="160"/>
+            </w:tcMar>
+          </w:tcPr>
+          <w:p>
+            <w:r>
+              <w:rPr>
+                <w:rFonts w:ascii="Arial" w:cs="Arial" w:eastAsia="Arial" w:hAnsi="Arial"/>
+                <w:sz w:val="20"/>
+                <w:szCs w:val="20"/>
+              </w:rPr>
+              <w:t xml:space="preserve">1.2</w:t>
+            </w:r>
+          </w:p>
+        </w:tc>
+        <w:tc>
+          <w:tcPr>
+            <w:tcW w:type="dxa" w:w="1700"/>
+            <w:tcBorders>
+              <w:top w:val="single" w:color="CCCCCC" w:sz="1"/>
+              <w:left w:val="single" w:color="CCCCCC" w:sz="1"/>
+              <w:bottom w:val="single" w:color="CCCCCC" w:sz="1"/>
+              <w:right w:val="single" w:color="CCCCCC" w:sz="1"/>
+            </w:tcBorders>
+            <w:tcMar>
+              <w:top w:type="dxa" w:w="80"/>
+              <w:left w:type="dxa" w:w="160"/>
+              <w:bottom w:type="dxa" w:w="80"/>
+              <w:right w:type="dxa" w:w="160"/>
+            </w:tcMar>
+          </w:tcPr>
+          <w:p>
+            <w:r>
+              <w:rPr>
+                <w:rFonts w:ascii="Arial" w:cs="Arial" w:eastAsia="Arial" w:hAnsi="Arial"/>
+                <w:sz w:val="20"/>
+                <w:szCs w:val="20"/>
+              </w:rPr>
+              <w:t xml:space="preserve">05-10-26 04:27</w:t>
+            </w:r>
+          </w:p>
+        </w:tc>
+        <w:tc>
+          <w:tcPr>
+            <w:tcW w:type="dxa" w:w="2200"/>
+            <w:tcBorders>
+              <w:top w:val="single" w:color="CCCCCC" w:sz="1"/>
+              <w:left w:val="single" w:color="CCCCCC" w:sz="1"/>
+              <w:bottom w:val="single" w:color="CCCCCC" w:sz="1"/>
+              <w:right w:val="single" w:color="CCCCCC" w:sz="1"/>
+            </w:tcBorders>
+            <w:tcMar>
+              <w:top w:type="dxa" w:w="80"/>
+              <w:left w:type="dxa" w:w="160"/>
+              <w:bottom w:type="dxa" w:w="80"/>
+              <w:right w:type="dxa" w:w="160"/>
+            </w:tcMar>
+          </w:tcPr>
+          <w:p>
+            <w:r>
+              <w:rPr>
+                <w:rFonts w:ascii="Arial" w:cs="Arial" w:eastAsia="Arial" w:hAnsi="Arial"/>
+                <w:sz w:val="20"/>
+                <w:szCs w:val="20"/>
+              </w:rPr>
+              <w:t xml:space="preserve">Doug Bower</w:t>
+            </w:r>
+          </w:p>
+        </w:tc>
+        <w:tc>
+          <w:tcPr>
+            <w:tcW w:type="dxa" w:w="4260"/>
+            <w:tcBorders>
+              <w:top w:val="single" w:color="CCCCCC" w:sz="1"/>
+              <w:left w:val="single" w:color="CCCCCC" w:sz="1"/>
+              <w:bottom w:val="single" w:color="CCCCCC" w:sz="1"/>
+              <w:right w:val="single" w:color="CCCCCC" w:sz="1"/>
+            </w:tcBorders>
+            <w:tcMar>
+              <w:top w:type="dxa" w:w="80"/>
+              <w:left w:type="dxa" w:w="160"/>
+              <w:bottom w:type="dxa" w:w="80"/>
+              <w:right w:type="dxa" w:w="160"/>
+            </w:tcMar>
+          </w:tcPr>
+          <w:p>
+            <w:r>
+              <w:rPr>
+                <w:rFonts w:ascii="Arial" w:cs="Arial" w:eastAsia="Arial" w:hAnsi="Arial"/>
+                <w:sz w:val="20"/>
+                <w:szCs w:val="20"/>
+              </w:rPr>
+              <w:t xml:space="preserve">Added Section 2.8 "Foreign Fields — Displaying Linked Entity Data" covering concept, configuration steps, an Engagement-to-Mentor example, and operational constraints.</w:t>
             </w:r>
           </w:p>
         </w:tc>

</xml_diff>

<commit_message>
Update on one-toone relationships
</commit_message>
<xml_diff>
--- a/PRDs/CBM-EspoCRM-HowTo.docx
+++ b/PRDs/CBM-EspoCRM-HowTo.docx
@@ -307,7 +307,7 @@
                 <w:sz w:val="20"/>
                 <w:szCs w:val="20"/>
               </w:rPr>
-              <w:t xml:space="preserve">1.2</w:t>
+              <w:t xml:space="preserve">1.3</w:t>
             </w:r>
           </w:p>
         </w:tc>
@@ -363,7 +363,7 @@
                 <w:sz w:val="20"/>
                 <w:szCs w:val="20"/>
               </w:rPr>
-              <w:t xml:space="preserve">05-10-26 04:27</w:t>
+              <w:t xml:space="preserve">05-11-26 19:21</w:t>
             </w:r>
           </w:p>
         </w:tc>
@@ -8277,6 +8277,2406 @@
     </w:p>
     <w:p>
       <w:pPr>
+        <w:pStyle w:val="Heading3"/>
+      </w:pPr>
+      <w:r>
+        <w:rPr>
+          <w:rFonts w:ascii="Arial" w:cs="Arial" w:eastAsia="Arial" w:hAnsi="Arial"/>
+          <w:b/>
+          <w:bCs/>
+          <w:color w:val="595959"/>
+          <w:sz w:val="24"/>
+          <w:szCs w:val="24"/>
+        </w:rPr>
+        <w:t xml:space="preserve">2.9 One-to-One Relationships — In Depth</w:t>
+      </w:r>
+    </w:p>
+    <w:p>
+      <w:pPr>
+        <w:pStyle w:val="Heading3"/>
+      </w:pPr>
+      <w:r>
+        <w:rPr>
+          <w:rFonts w:ascii="Arial" w:cs="Arial" w:eastAsia="Arial" w:hAnsi="Arial"/>
+          <w:b/>
+          <w:bCs/>
+          <w:color w:val="595959"/>
+          <w:sz w:val="24"/>
+          <w:szCs w:val="24"/>
+        </w:rPr>
+        <w:t xml:space="preserve">2.9.1 Overview</w:t>
+      </w:r>
+    </w:p>
+    <w:p>
+      <w:pPr>
+        <w:spacing w:after="120"/>
+      </w:pPr>
+      <w:r>
+        <w:rPr>
+          <w:rFonts w:ascii="Arial" w:cs="Arial" w:eastAsia="Arial" w:hAnsi="Arial"/>
+          <w:sz w:val="22"/>
+          <w:szCs w:val="22"/>
+        </w:rPr>
+        <w:t xml:space="preserve">A one-to-one relationship links exactly one record on one side to exactly one record on the other side. Where many-to-one says “many engagements share one mentor” and many-to-many says “any contact can attend any session,” one-to-one says “this record corresponds to that record, and to no other on either side.”</w:t>
+      </w:r>
+    </w:p>
+    <w:p>
+      <w:pPr>
+        <w:spacing w:after="120"/>
+      </w:pPr>
+      <w:r>
+        <w:rPr>
+          <w:rFonts w:ascii="Arial" w:cs="Arial" w:eastAsia="Arial" w:hAnsi="Arial"/>
+          <w:sz w:val="22"/>
+          <w:szCs w:val="22"/>
+        </w:rPr>
+        <w:t xml:space="preserve">One-to-one is the least common relationship type in practice. The CBM model uses many-to-many and many-to-one extensively but has no one-to-one relationships in production today. This is not unusual. Most data that initially looks like it calls for one-to-one is better modeled as fields directly on the parent entity (when the data is small and shares the parent’s lifecycle) or as a shared entity with a discriminator field (when several entity concepts overlap in most of their fields — Contact is CBM’s example, with contactType distinguishing Mentor, Client, Donor, and so on).</w:t>
+      </w:r>
+    </w:p>
+    <w:p>
+      <w:pPr>
+        <w:spacing w:after="120"/>
+      </w:pPr>
+      <w:r>
+        <w:rPr>
+          <w:rFonts w:ascii="Arial" w:cs="Arial" w:eastAsia="Arial" w:hAnsi="Arial"/>
+          <w:sz w:val="22"/>
+          <w:szCs w:val="22"/>
+        </w:rPr>
+        <w:t xml:space="preserve">One-to-one earns its complexity when at least one of the following is true:</w:t>
+      </w:r>
+    </w:p>
+    <w:p>
+      <w:pPr>
+        <w:pStyle w:val="ListParagraph"/>
+        <w:numPr>
+          <w:ilvl w:val="0"/>
+          <w:numId w:val="2"/>
+        </w:numPr>
+        <w:spacing w:after="80"/>
+      </w:pPr>
+      <w:r>
+        <w:rPr>
+          <w:rFonts w:ascii="Arial" w:cs="Arial" w:eastAsia="Arial" w:hAnsi="Arial"/>
+          <w:sz w:val="22"/>
+          <w:szCs w:val="22"/>
+        </w:rPr>
+        <w:t xml:space="preserve">The “child” data has an independent lifecycle from the parent (created, updated, or deleted on its own cadence).</w:t>
+      </w:r>
+    </w:p>
+    <w:p>
+      <w:pPr>
+        <w:pStyle w:val="ListParagraph"/>
+        <w:numPr>
+          <w:ilvl w:val="0"/>
+          <w:numId w:val="2"/>
+        </w:numPr>
+        <w:spacing w:after="80"/>
+      </w:pPr>
+      <w:r>
+        <w:rPr>
+          <w:rFonts w:ascii="Arial" w:cs="Arial" w:eastAsia="Arial" w:hAnsi="Arial"/>
+          <w:sz w:val="22"/>
+          <w:szCs w:val="22"/>
+        </w:rPr>
+        <w:t xml:space="preserve">The child data is optional — most parent records have no child at all.</w:t>
+      </w:r>
+    </w:p>
+    <w:p>
+      <w:pPr>
+        <w:pStyle w:val="ListParagraph"/>
+        <w:numPr>
+          <w:ilvl w:val="0"/>
+          <w:numId w:val="2"/>
+        </w:numPr>
+        <w:spacing w:after="80"/>
+      </w:pPr>
+      <w:r>
+        <w:rPr>
+          <w:rFonts w:ascii="Arial" w:cs="Arial" w:eastAsia="Arial" w:hAnsi="Arial"/>
+          <w:sz w:val="22"/>
+          <w:szCs w:val="22"/>
+        </w:rPr>
+        <w:t xml:space="preserve">The child is the CRM’s reflection of a record owned by an external system (an email platform profile, a payment gateway customer record, a third-party identity object).</w:t>
+      </w:r>
+    </w:p>
+    <w:p>
+      <w:pPr>
+        <w:pStyle w:val="ListParagraph"/>
+        <w:numPr>
+          <w:ilvl w:val="0"/>
+          <w:numId w:val="2"/>
+        </w:numPr>
+        <w:spacing w:after="80"/>
+      </w:pPr>
+      <w:r>
+        <w:rPr>
+          <w:rFonts w:ascii="Arial" w:cs="Arial" w:eastAsia="Arial" w:hAnsi="Arial"/>
+          <w:sz w:val="22"/>
+          <w:szCs w:val="22"/>
+        </w:rPr>
+        <w:t xml:space="preserve">The child holds sensitive data that needs its own access control independent of the parent.</w:t>
+      </w:r>
+    </w:p>
+    <w:p>
+      <w:pPr>
+        <w:pStyle w:val="ListParagraph"/>
+        <w:numPr>
+          <w:ilvl w:val="0"/>
+          <w:numId w:val="2"/>
+        </w:numPr>
+        <w:spacing w:after="80"/>
+      </w:pPr>
+      <w:r>
+        <w:rPr>
+          <w:rFonts w:ascii="Arial" w:cs="Arial" w:eastAsia="Arial" w:hAnsi="Arial"/>
+          <w:sz w:val="22"/>
+          <w:szCs w:val="22"/>
+        </w:rPr>
+        <w:t xml:space="preserve">The child is large enough that loading it on every read of the parent would be wasteful.</w:t>
+      </w:r>
+    </w:p>
+    <w:p>
+      <w:pPr>
+        <w:spacing w:after="120"/>
+      </w:pPr>
+      <w:r>
+        <w:rPr>
+          <w:rFonts w:ascii="Arial" w:cs="Arial" w:eastAsia="Arial" w:hAnsi="Arial"/>
+          <w:sz w:val="22"/>
+          <w:szCs w:val="22"/>
+        </w:rPr>
+        <w:t xml:space="preserve">If none of these apply, prefer fields on the parent. If several apply, one-to-one is the right tool.</w:t>
+      </w:r>
+    </w:p>
+    <w:p>
+      <w:r>
+        <w:t xml:space="preserve"/>
+      </w:r>
+    </w:p>
+    <w:p>
+      <w:pPr>
+        <w:pStyle w:val="Heading3"/>
+      </w:pPr>
+      <w:r>
+        <w:rPr>
+          <w:rFonts w:ascii="Arial" w:cs="Arial" w:eastAsia="Arial" w:hAnsi="Arial"/>
+          <w:b/>
+          <w:bCs/>
+          <w:color w:val="595959"/>
+          <w:sz w:val="24"/>
+          <w:szCs w:val="24"/>
+        </w:rPr>
+        <w:t xml:space="preserve">2.9.2 One-to-One Right vs One-to-One Left</w:t>
+      </w:r>
+    </w:p>
+    <w:p>
+      <w:pPr>
+        <w:spacing w:after="120"/>
+      </w:pPr>
+      <w:r>
+        <w:rPr>
+          <w:rFonts w:ascii="Arial" w:cs="Arial" w:eastAsia="Arial" w:hAnsi="Arial"/>
+          <w:sz w:val="22"/>
+          <w:szCs w:val="22"/>
+        </w:rPr>
+        <w:t xml:space="preserve">EspoCRM offers two flavors of one-to-one, distinguished by which side holds the foreign key column in the underlying database table:</w:t>
+      </w:r>
+    </w:p>
+    <w:p>
+      <w:pPr>
+        <w:pStyle w:val="ListParagraph"/>
+        <w:numPr>
+          <w:ilvl w:val="0"/>
+          <w:numId w:val="2"/>
+        </w:numPr>
+        <w:spacing w:after="80"/>
+      </w:pPr>
+      <w:r>
+        <w:rPr>
+          <w:rFonts w:ascii="Arial" w:cs="Arial" w:eastAsia="Arial" w:hAnsi="Arial"/>
+          <w:sz w:val="22"/>
+          <w:szCs w:val="22"/>
+        </w:rPr>
+        <w:t xml:space="preserve">One-to-One Right — the foreign key lives on the right (foreign) entity. The left (source) entity has no FK column; it reaches the right side via the link.</w:t>
+      </w:r>
+    </w:p>
+    <w:p>
+      <w:pPr>
+        <w:pStyle w:val="ListParagraph"/>
+        <w:numPr>
+          <w:ilvl w:val="0"/>
+          <w:numId w:val="2"/>
+        </w:numPr>
+        <w:spacing w:after="80"/>
+      </w:pPr>
+      <w:r>
+        <w:rPr>
+          <w:rFonts w:ascii="Arial" w:cs="Arial" w:eastAsia="Arial" w:hAnsi="Arial"/>
+          <w:sz w:val="22"/>
+          <w:szCs w:val="22"/>
+        </w:rPr>
+        <w:t xml:space="preserve">One-to-One Left — the foreign key lives on the left (source) entity. The right entity has no FK column; it reaches the left side via the link.</w:t>
+      </w:r>
+    </w:p>
+    <w:p>
+      <w:pPr>
+        <w:spacing w:after="120"/>
+      </w:pPr>
+      <w:r>
+        <w:rPr>
+          <w:rFonts w:ascii="Arial" w:cs="Arial" w:eastAsia="Arial" w:hAnsi="Arial"/>
+          <w:sz w:val="22"/>
+          <w:szCs w:val="22"/>
+        </w:rPr>
+        <w:t xml:space="preserve">Choosing between Right and Left is the single most consequential decision when defining a one-to-one relationship. The decision is not about which side “owns” the relationship conceptually — both sides can see and traverse the link in the UI either way. It is about where the FK column physically lives, which has three practical consequences.</w:t>
+      </w:r>
+    </w:p>
+    <w:p>
+      <w:r>
+        <w:t xml:space="preserve"/>
+      </w:r>
+    </w:p>
+    <w:tbl>
+      <w:tblPr>
+        <w:tblW w:type="dxa" w:w="9360"/>
+        <w:tblBorders>
+          <w:top w:val="single" w:color="auto" w:sz="4"/>
+          <w:left w:val="single" w:color="auto" w:sz="4"/>
+          <w:bottom w:val="single" w:color="auto" w:sz="4"/>
+          <w:right w:val="single" w:color="auto" w:sz="4"/>
+          <w:insideH w:val="single" w:color="auto" w:sz="4"/>
+          <w:insideV w:val="single" w:color="auto" w:sz="4"/>
+        </w:tblBorders>
+      </w:tblPr>
+      <w:tblGrid>
+        <w:gridCol w:w="2340"/>
+        <w:gridCol w:w="3510"/>
+        <w:gridCol w:w="3510"/>
+      </w:tblGrid>
+      <w:tr>
+        <w:tc>
+          <w:tcPr>
+            <w:tcW w:type="dxa" w:w="2340"/>
+            <w:tcBorders>
+              <w:top w:val="single" w:color="AAAAAA" w:sz="1"/>
+              <w:left w:val="single" w:color="AAAAAA" w:sz="1"/>
+              <w:bottom w:val="single" w:color="AAAAAA" w:sz="1"/>
+              <w:right w:val="single" w:color="AAAAAA" w:sz="1"/>
+            </w:tcBorders>
+            <w:shd w:fill="D5E8F0" w:val="clear"/>
+            <w:tcMar>
+              <w:top w:type="dxa" w:w="80"/>
+              <w:left w:type="dxa" w:w="160"/>
+              <w:bottom w:type="dxa" w:w="80"/>
+              <w:right w:type="dxa" w:w="160"/>
+            </w:tcMar>
+          </w:tcPr>
+          <w:p>
+            <w:r>
+              <w:rPr>
+                <w:rFonts w:ascii="Arial" w:cs="Arial" w:eastAsia="Arial" w:hAnsi="Arial"/>
+                <w:b/>
+                <w:bCs/>
+                <w:sz w:val="20"/>
+                <w:szCs w:val="20"/>
+              </w:rPr>
+              <w:t xml:space="preserve">Aspect</w:t>
+            </w:r>
+          </w:p>
+        </w:tc>
+        <w:tc>
+          <w:tcPr>
+            <w:tcW w:type="dxa" w:w="3510"/>
+            <w:tcBorders>
+              <w:top w:val="single" w:color="AAAAAA" w:sz="1"/>
+              <w:left w:val="single" w:color="AAAAAA" w:sz="1"/>
+              <w:bottom w:val="single" w:color="AAAAAA" w:sz="1"/>
+              <w:right w:val="single" w:color="AAAAAA" w:sz="1"/>
+            </w:tcBorders>
+            <w:shd w:fill="D5E8F0" w:val="clear"/>
+            <w:tcMar>
+              <w:top w:type="dxa" w:w="80"/>
+              <w:left w:type="dxa" w:w="160"/>
+              <w:bottom w:type="dxa" w:w="80"/>
+              <w:right w:type="dxa" w:w="160"/>
+            </w:tcMar>
+          </w:tcPr>
+          <w:p>
+            <w:r>
+              <w:rPr>
+                <w:rFonts w:ascii="Arial" w:cs="Arial" w:eastAsia="Arial" w:hAnsi="Arial"/>
+                <w:b/>
+                <w:bCs/>
+                <w:sz w:val="20"/>
+                <w:szCs w:val="20"/>
+              </w:rPr>
+              <w:t xml:space="preserve">One-to-One Right</w:t>
+            </w:r>
+          </w:p>
+        </w:tc>
+        <w:tc>
+          <w:tcPr>
+            <w:tcW w:type="dxa" w:w="3510"/>
+            <w:tcBorders>
+              <w:top w:val="single" w:color="AAAAAA" w:sz="1"/>
+              <w:left w:val="single" w:color="AAAAAA" w:sz="1"/>
+              <w:bottom w:val="single" w:color="AAAAAA" w:sz="1"/>
+              <w:right w:val="single" w:color="AAAAAA" w:sz="1"/>
+            </w:tcBorders>
+            <w:shd w:fill="D5E8F0" w:val="clear"/>
+            <w:tcMar>
+              <w:top w:type="dxa" w:w="80"/>
+              <w:left w:type="dxa" w:w="160"/>
+              <w:bottom w:type="dxa" w:w="80"/>
+              <w:right w:type="dxa" w:w="160"/>
+            </w:tcMar>
+          </w:tcPr>
+          <w:p>
+            <w:r>
+              <w:rPr>
+                <w:rFonts w:ascii="Arial" w:cs="Arial" w:eastAsia="Arial" w:hAnsi="Arial"/>
+                <w:b/>
+                <w:bCs/>
+                <w:sz w:val="20"/>
+                <w:szCs w:val="20"/>
+              </w:rPr>
+              <w:t xml:space="preserve">One-to-One Left</w:t>
+            </w:r>
+          </w:p>
+        </w:tc>
+      </w:tr>
+      <w:tr>
+        <w:tc>
+          <w:tcPr>
+            <w:tcW w:type="dxa" w:w="2340"/>
+            <w:tcBorders>
+              <w:top w:val="single" w:color="AAAAAA" w:sz="1"/>
+              <w:left w:val="single" w:color="AAAAAA" w:sz="1"/>
+              <w:bottom w:val="single" w:color="AAAAAA" w:sz="1"/>
+              <w:right w:val="single" w:color="AAAAAA" w:sz="1"/>
+            </w:tcBorders>
+            <w:tcMar>
+              <w:top w:type="dxa" w:w="80"/>
+              <w:left w:type="dxa" w:w="160"/>
+              <w:bottom w:type="dxa" w:w="80"/>
+              <w:right w:type="dxa" w:w="160"/>
+            </w:tcMar>
+          </w:tcPr>
+          <w:p>
+            <w:r>
+              <w:rPr>
+                <w:rFonts w:ascii="Arial" w:cs="Arial" w:eastAsia="Arial" w:hAnsi="Arial"/>
+                <w:sz w:val="20"/>
+                <w:szCs w:val="20"/>
+              </w:rPr>
+              <w:t xml:space="preserve">FK column location</w:t>
+            </w:r>
+          </w:p>
+        </w:tc>
+        <w:tc>
+          <w:tcPr>
+            <w:tcW w:type="dxa" w:w="3510"/>
+            <w:tcBorders>
+              <w:top w:val="single" w:color="AAAAAA" w:sz="1"/>
+              <w:left w:val="single" w:color="AAAAAA" w:sz="1"/>
+              <w:bottom w:val="single" w:color="AAAAAA" w:sz="1"/>
+              <w:right w:val="single" w:color="AAAAAA" w:sz="1"/>
+            </w:tcBorders>
+            <w:tcMar>
+              <w:top w:type="dxa" w:w="80"/>
+              <w:left w:type="dxa" w:w="160"/>
+              <w:bottom w:type="dxa" w:w="80"/>
+              <w:right w:type="dxa" w:w="160"/>
+            </w:tcMar>
+          </w:tcPr>
+          <w:p>
+            <w:r>
+              <w:rPr>
+                <w:rFonts w:ascii="Arial" w:cs="Arial" w:eastAsia="Arial" w:hAnsi="Arial"/>
+                <w:sz w:val="20"/>
+                <w:szCs w:val="20"/>
+              </w:rPr>
+              <w:t xml:space="preserve">Right (foreign) entity</w:t>
+            </w:r>
+          </w:p>
+        </w:tc>
+        <w:tc>
+          <w:tcPr>
+            <w:tcW w:type="dxa" w:w="3510"/>
+            <w:tcBorders>
+              <w:top w:val="single" w:color="AAAAAA" w:sz="1"/>
+              <w:left w:val="single" w:color="AAAAAA" w:sz="1"/>
+              <w:bottom w:val="single" w:color="AAAAAA" w:sz="1"/>
+              <w:right w:val="single" w:color="AAAAAA" w:sz="1"/>
+            </w:tcBorders>
+            <w:tcMar>
+              <w:top w:type="dxa" w:w="80"/>
+              <w:left w:type="dxa" w:w="160"/>
+              <w:bottom w:type="dxa" w:w="80"/>
+              <w:right w:type="dxa" w:w="160"/>
+            </w:tcMar>
+          </w:tcPr>
+          <w:p>
+            <w:r>
+              <w:rPr>
+                <w:rFonts w:ascii="Arial" w:cs="Arial" w:eastAsia="Arial" w:hAnsi="Arial"/>
+                <w:sz w:val="20"/>
+                <w:szCs w:val="20"/>
+              </w:rPr>
+              <w:t xml:space="preserve">Left (source) entity</w:t>
+            </w:r>
+          </w:p>
+        </w:tc>
+      </w:tr>
+      <w:tr>
+        <w:tc>
+          <w:tcPr>
+            <w:tcW w:type="dxa" w:w="2340"/>
+            <w:tcBorders>
+              <w:top w:val="single" w:color="AAAAAA" w:sz="1"/>
+              <w:left w:val="single" w:color="AAAAAA" w:sz="1"/>
+              <w:bottom w:val="single" w:color="AAAAAA" w:sz="1"/>
+              <w:right w:val="single" w:color="AAAAAA" w:sz="1"/>
+            </w:tcBorders>
+            <w:tcMar>
+              <w:top w:type="dxa" w:w="80"/>
+              <w:left w:type="dxa" w:w="160"/>
+              <w:bottom w:type="dxa" w:w="80"/>
+              <w:right w:type="dxa" w:w="160"/>
+            </w:tcMar>
+          </w:tcPr>
+          <w:p>
+            <w:r>
+              <w:rPr>
+                <w:rFonts w:ascii="Arial" w:cs="Arial" w:eastAsia="Arial" w:hAnsi="Arial"/>
+                <w:sz w:val="20"/>
+                <w:szCs w:val="20"/>
+              </w:rPr>
+              <w:t xml:space="preserve">Faster joins from</w:t>
+            </w:r>
+          </w:p>
+        </w:tc>
+        <w:tc>
+          <w:tcPr>
+            <w:tcW w:type="dxa" w:w="3510"/>
+            <w:tcBorders>
+              <w:top w:val="single" w:color="AAAAAA" w:sz="1"/>
+              <w:left w:val="single" w:color="AAAAAA" w:sz="1"/>
+              <w:bottom w:val="single" w:color="AAAAAA" w:sz="1"/>
+              <w:right w:val="single" w:color="AAAAAA" w:sz="1"/>
+            </w:tcBorders>
+            <w:tcMar>
+              <w:top w:type="dxa" w:w="80"/>
+              <w:left w:type="dxa" w:w="160"/>
+              <w:bottom w:type="dxa" w:w="80"/>
+              <w:right w:type="dxa" w:w="160"/>
+            </w:tcMar>
+          </w:tcPr>
+          <w:p>
+            <w:r>
+              <w:rPr>
+                <w:rFonts w:ascii="Arial" w:cs="Arial" w:eastAsia="Arial" w:hAnsi="Arial"/>
+                <w:sz w:val="20"/>
+                <w:szCs w:val="20"/>
+              </w:rPr>
+              <w:t xml:space="preserve">The right side (which carries the index)</w:t>
+            </w:r>
+          </w:p>
+        </w:tc>
+        <w:tc>
+          <w:tcPr>
+            <w:tcW w:type="dxa" w:w="3510"/>
+            <w:tcBorders>
+              <w:top w:val="single" w:color="AAAAAA" w:sz="1"/>
+              <w:left w:val="single" w:color="AAAAAA" w:sz="1"/>
+              <w:bottom w:val="single" w:color="AAAAAA" w:sz="1"/>
+              <w:right w:val="single" w:color="AAAAAA" w:sz="1"/>
+            </w:tcBorders>
+            <w:tcMar>
+              <w:top w:type="dxa" w:w="80"/>
+              <w:left w:type="dxa" w:w="160"/>
+              <w:bottom w:type="dxa" w:w="80"/>
+              <w:right w:type="dxa" w:w="160"/>
+            </w:tcMar>
+          </w:tcPr>
+          <w:p>
+            <w:r>
+              <w:rPr>
+                <w:rFonts w:ascii="Arial" w:cs="Arial" w:eastAsia="Arial" w:hAnsi="Arial"/>
+                <w:sz w:val="20"/>
+                <w:szCs w:val="20"/>
+              </w:rPr>
+              <w:t xml:space="preserve">The left side (which carries the index)</w:t>
+            </w:r>
+          </w:p>
+        </w:tc>
+      </w:tr>
+      <w:tr>
+        <w:tc>
+          <w:tcPr>
+            <w:tcW w:type="dxa" w:w="2340"/>
+            <w:tcBorders>
+              <w:top w:val="single" w:color="AAAAAA" w:sz="1"/>
+              <w:left w:val="single" w:color="AAAAAA" w:sz="1"/>
+              <w:bottom w:val="single" w:color="AAAAAA" w:sz="1"/>
+              <w:right w:val="single" w:color="AAAAAA" w:sz="1"/>
+            </w:tcBorders>
+            <w:tcMar>
+              <w:top w:type="dxa" w:w="80"/>
+              <w:left w:type="dxa" w:w="160"/>
+              <w:bottom w:type="dxa" w:w="80"/>
+              <w:right w:type="dxa" w:w="160"/>
+            </w:tcMar>
+          </w:tcPr>
+          <w:p>
+            <w:r>
+              <w:rPr>
+                <w:rFonts w:ascii="Arial" w:cs="Arial" w:eastAsia="Arial" w:hAnsi="Arial"/>
+                <w:sz w:val="20"/>
+                <w:szCs w:val="20"/>
+              </w:rPr>
+              <w:t xml:space="preserve">Best when</w:t>
+            </w:r>
+          </w:p>
+        </w:tc>
+        <w:tc>
+          <w:tcPr>
+            <w:tcW w:type="dxa" w:w="3510"/>
+            <w:tcBorders>
+              <w:top w:val="single" w:color="AAAAAA" w:sz="1"/>
+              <w:left w:val="single" w:color="AAAAAA" w:sz="1"/>
+              <w:bottom w:val="single" w:color="AAAAAA" w:sz="1"/>
+              <w:right w:val="single" w:color="AAAAAA" w:sz="1"/>
+            </w:tcBorders>
+            <w:tcMar>
+              <w:top w:type="dxa" w:w="80"/>
+              <w:left w:type="dxa" w:w="160"/>
+              <w:bottom w:type="dxa" w:w="80"/>
+              <w:right w:type="dxa" w:w="160"/>
+            </w:tcMar>
+          </w:tcPr>
+          <w:p>
+            <w:r>
+              <w:rPr>
+                <w:rFonts w:ascii="Arial" w:cs="Arial" w:eastAsia="Arial" w:hAnsi="Arial"/>
+                <w:sz w:val="20"/>
+                <w:szCs w:val="20"/>
+              </w:rPr>
+              <w:t xml:space="preserve">The right side is queried often; most lefts have no right counterpart so a null column on the left would be wasted</w:t>
+            </w:r>
+          </w:p>
+        </w:tc>
+        <w:tc>
+          <w:tcPr>
+            <w:tcW w:type="dxa" w:w="3510"/>
+            <w:tcBorders>
+              <w:top w:val="single" w:color="AAAAAA" w:sz="1"/>
+              <w:left w:val="single" w:color="AAAAAA" w:sz="1"/>
+              <w:bottom w:val="single" w:color="AAAAAA" w:sz="1"/>
+              <w:right w:val="single" w:color="AAAAAA" w:sz="1"/>
+            </w:tcBorders>
+            <w:tcMar>
+              <w:top w:type="dxa" w:w="80"/>
+              <w:left w:type="dxa" w:w="160"/>
+              <w:bottom w:type="dxa" w:w="80"/>
+              <w:right w:type="dxa" w:w="160"/>
+            </w:tcMar>
+          </w:tcPr>
+          <w:p>
+            <w:r>
+              <w:rPr>
+                <w:rFonts w:ascii="Arial" w:cs="Arial" w:eastAsia="Arial" w:hAnsi="Arial"/>
+                <w:sz w:val="20"/>
+                <w:szCs w:val="20"/>
+              </w:rPr>
+              <w:t xml:space="preserve">The left side is queried often; most lefts do have a right counterpart</w:t>
+            </w:r>
+          </w:p>
+        </w:tc>
+      </w:tr>
+      <w:tr>
+        <w:tc>
+          <w:tcPr>
+            <w:tcW w:type="dxa" w:w="2340"/>
+            <w:tcBorders>
+              <w:top w:val="single" w:color="AAAAAA" w:sz="1"/>
+              <w:left w:val="single" w:color="AAAAAA" w:sz="1"/>
+              <w:bottom w:val="single" w:color="AAAAAA" w:sz="1"/>
+              <w:right w:val="single" w:color="AAAAAA" w:sz="1"/>
+            </w:tcBorders>
+            <w:tcMar>
+              <w:top w:type="dxa" w:w="80"/>
+              <w:left w:type="dxa" w:w="160"/>
+              <w:bottom w:type="dxa" w:w="80"/>
+              <w:right w:type="dxa" w:w="160"/>
+            </w:tcMar>
+          </w:tcPr>
+          <w:p>
+            <w:r>
+              <w:rPr>
+                <w:rFonts w:ascii="Arial" w:cs="Arial" w:eastAsia="Arial" w:hAnsi="Arial"/>
+                <w:sz w:val="20"/>
+                <w:szCs w:val="20"/>
+              </w:rPr>
+              <w:t xml:space="preserve">External-system mirrors</w:t>
+            </w:r>
+          </w:p>
+        </w:tc>
+        <w:tc>
+          <w:tcPr>
+            <w:tcW w:type="dxa" w:w="3510"/>
+            <w:tcBorders>
+              <w:top w:val="single" w:color="AAAAAA" w:sz="1"/>
+              <w:left w:val="single" w:color="AAAAAA" w:sz="1"/>
+              <w:bottom w:val="single" w:color="AAAAAA" w:sz="1"/>
+              <w:right w:val="single" w:color="AAAAAA" w:sz="1"/>
+            </w:tcBorders>
+            <w:tcMar>
+              <w:top w:type="dxa" w:w="80"/>
+              <w:left w:type="dxa" w:w="160"/>
+              <w:bottom w:type="dxa" w:w="80"/>
+              <w:right w:type="dxa" w:w="160"/>
+            </w:tcMar>
+          </w:tcPr>
+          <w:p>
+            <w:r>
+              <w:rPr>
+                <w:rFonts w:ascii="Arial" w:cs="Arial" w:eastAsia="Arial" w:hAnsi="Arial"/>
+                <w:sz w:val="20"/>
+                <w:szCs w:val="20"/>
+              </w:rPr>
+              <w:t xml:space="preserve">Conventional. FK on the mirror keeps the system-of-record side clean.</w:t>
+            </w:r>
+          </w:p>
+        </w:tc>
+        <w:tc>
+          <w:tcPr>
+            <w:tcW w:type="dxa" w:w="3510"/>
+            <w:tcBorders>
+              <w:top w:val="single" w:color="AAAAAA" w:sz="1"/>
+              <w:left w:val="single" w:color="AAAAAA" w:sz="1"/>
+              <w:bottom w:val="single" w:color="AAAAAA" w:sz="1"/>
+              <w:right w:val="single" w:color="AAAAAA" w:sz="1"/>
+            </w:tcBorders>
+            <w:tcMar>
+              <w:top w:type="dxa" w:w="80"/>
+              <w:left w:type="dxa" w:w="160"/>
+              <w:bottom w:type="dxa" w:w="80"/>
+              <w:right w:type="dxa" w:w="160"/>
+            </w:tcMar>
+          </w:tcPr>
+          <w:p>
+            <w:r>
+              <w:rPr>
+                <w:rFonts w:ascii="Arial" w:cs="Arial" w:eastAsia="Arial" w:hAnsi="Arial"/>
+                <w:sz w:val="20"/>
+                <w:szCs w:val="20"/>
+              </w:rPr>
+              <w:t xml:space="preserve">Less common.</w:t>
+            </w:r>
+          </w:p>
+        </w:tc>
+      </w:tr>
+      <w:tr>
+        <w:tc>
+          <w:tcPr>
+            <w:tcW w:type="dxa" w:w="2340"/>
+            <w:tcBorders>
+              <w:top w:val="single" w:color="AAAAAA" w:sz="1"/>
+              <w:left w:val="single" w:color="AAAAAA" w:sz="1"/>
+              <w:bottom w:val="single" w:color="AAAAAA" w:sz="1"/>
+              <w:right w:val="single" w:color="AAAAAA" w:sz="1"/>
+            </w:tcBorders>
+            <w:tcMar>
+              <w:top w:type="dxa" w:w="80"/>
+              <w:left w:type="dxa" w:w="160"/>
+              <w:bottom w:type="dxa" w:w="80"/>
+              <w:right w:type="dxa" w:w="160"/>
+            </w:tcMar>
+          </w:tcPr>
+          <w:p>
+            <w:r>
+              <w:rPr>
+                <w:rFonts w:ascii="Arial" w:cs="Arial" w:eastAsia="Arial" w:hAnsi="Arial"/>
+                <w:sz w:val="20"/>
+                <w:szCs w:val="20"/>
+              </w:rPr>
+              <w:t xml:space="preserve">Changeable after save</w:t>
+            </w:r>
+          </w:p>
+        </w:tc>
+        <w:tc>
+          <w:tcPr>
+            <w:tcW w:type="dxa" w:w="3510"/>
+            <w:tcBorders>
+              <w:top w:val="single" w:color="AAAAAA" w:sz="1"/>
+              <w:left w:val="single" w:color="AAAAAA" w:sz="1"/>
+              <w:bottom w:val="single" w:color="AAAAAA" w:sz="1"/>
+              <w:right w:val="single" w:color="AAAAAA" w:sz="1"/>
+            </w:tcBorders>
+            <w:tcMar>
+              <w:top w:type="dxa" w:w="80"/>
+              <w:left w:type="dxa" w:w="160"/>
+              <w:bottom w:type="dxa" w:w="80"/>
+              <w:right w:type="dxa" w:w="160"/>
+            </w:tcMar>
+          </w:tcPr>
+          <w:p>
+            <w:r>
+              <w:rPr>
+                <w:rFonts w:ascii="Arial" w:cs="Arial" w:eastAsia="Arial" w:hAnsi="Arial"/>
+                <w:sz w:val="20"/>
+                <w:szCs w:val="20"/>
+              </w:rPr>
+              <w:t xml:space="preserve">No (server-side metadata edits required)</w:t>
+            </w:r>
+          </w:p>
+        </w:tc>
+        <w:tc>
+          <w:tcPr>
+            <w:tcW w:type="dxa" w:w="3510"/>
+            <w:tcBorders>
+              <w:top w:val="single" w:color="AAAAAA" w:sz="1"/>
+              <w:left w:val="single" w:color="AAAAAA" w:sz="1"/>
+              <w:bottom w:val="single" w:color="AAAAAA" w:sz="1"/>
+              <w:right w:val="single" w:color="AAAAAA" w:sz="1"/>
+            </w:tcBorders>
+            <w:tcMar>
+              <w:top w:type="dxa" w:w="80"/>
+              <w:left w:type="dxa" w:w="160"/>
+              <w:bottom w:type="dxa" w:w="80"/>
+              <w:right w:type="dxa" w:w="160"/>
+            </w:tcMar>
+          </w:tcPr>
+          <w:p>
+            <w:r>
+              <w:rPr>
+                <w:rFonts w:ascii="Arial" w:cs="Arial" w:eastAsia="Arial" w:hAnsi="Arial"/>
+                <w:sz w:val="20"/>
+                <w:szCs w:val="20"/>
+              </w:rPr>
+              <w:t xml:space="preserve">No (server-side metadata edits required)</w:t>
+            </w:r>
+          </w:p>
+        </w:tc>
+      </w:tr>
+    </w:tbl>
+    <w:p>
+      <w:r>
+        <w:t xml:space="preserve"/>
+      </w:r>
+    </w:p>
+    <w:p>
+      <w:pPr>
+        <w:spacing w:after="120"/>
+      </w:pPr>
+      <w:r>
+        <w:rPr>
+          <w:rFonts w:ascii="Arial" w:cs="Arial" w:eastAsia="Arial" w:hAnsi="Arial"/>
+          <w:b/>
+          <w:bCs/>
+          <w:sz w:val="22"/>
+          <w:szCs w:val="22"/>
+        </w:rPr>
+        <w:t xml:space="preserve">Query performance. </w:t>
+      </w:r>
+      <w:r>
+        <w:rPr>
+          <w:rFonts w:ascii="Arial" w:cs="Arial" w:eastAsia="Arial" w:hAnsi="Arial"/>
+          <w:sz w:val="22"/>
+          <w:szCs w:val="22"/>
+        </w:rPr>
+        <w:t xml:space="preserve">Joins from the side that holds the FK are faster than joins from the side that does not, because the FK side carries the index. If one side is queried far more often than the other (in list views, reports, or formulas), put the FK on that side.</w:t>
+      </w:r>
+    </w:p>
+    <w:p>
+      <w:pPr>
+        <w:spacing w:after="120"/>
+      </w:pPr>
+      <w:r>
+        <w:rPr>
+          <w:rFonts w:ascii="Arial" w:cs="Arial" w:eastAsia="Arial" w:hAnsi="Arial"/>
+          <w:b/>
+          <w:bCs/>
+          <w:sz w:val="22"/>
+          <w:szCs w:val="22"/>
+        </w:rPr>
+        <w:t xml:space="preserve">Optional vs mandatory shape. </w:t>
+      </w:r>
+      <w:r>
+        <w:rPr>
+          <w:rFonts w:ascii="Arial" w:cs="Arial" w:eastAsia="Arial" w:hAnsi="Arial"/>
+          <w:sz w:val="22"/>
+          <w:szCs w:val="22"/>
+        </w:rPr>
+        <w:t xml:space="preserve">If most records on one side have no counterpart on the other, putting the FK on the side that is usually present keeps the side that is usually empty free of null columns. Putting the FK on the always-empty side would waste storage.</w:t>
+      </w:r>
+    </w:p>
+    <w:p>
+      <w:pPr>
+        <w:spacing w:after="120"/>
+      </w:pPr>
+      <w:r>
+        <w:rPr>
+          <w:rFonts w:ascii="Arial" w:cs="Arial" w:eastAsia="Arial" w:hAnsi="Arial"/>
+          <w:b/>
+          <w:bCs/>
+          <w:sz w:val="22"/>
+          <w:szCs w:val="22"/>
+        </w:rPr>
+        <w:t xml:space="preserve">Data ownership boundaries. </w:t>
+      </w:r>
+      <w:r>
+        <w:rPr>
+          <w:rFonts w:ascii="Arial" w:cs="Arial" w:eastAsia="Arial" w:hAnsi="Arial"/>
+          <w:sz w:val="22"/>
+          <w:szCs w:val="22"/>
+        </w:rPr>
+        <w:t xml:space="preserve">When the child entity represents data from an external system (an external profile, a payment customer, an identity provider record), the FK conventionally lives on the child. This makes it visible in the data model that the child is “the mirror” and the parent is the system of record on the CRM side.</w:t>
+      </w:r>
+    </w:p>
+    <w:p>
+      <w:pPr>
+        <w:spacing w:after="120"/>
+      </w:pPr>
+      <w:r>
+        <w:rPr>
+          <w:rFonts w:ascii="Arial" w:cs="Arial" w:eastAsia="Arial" w:hAnsi="Arial"/>
+          <w:sz w:val="22"/>
+          <w:szCs w:val="22"/>
+        </w:rPr>
+        <w:t xml:space="preserve">When you create a one-to-one relationship through Entity Manager, the dialog presents the two options. There is no UI affordance to switch between them after the relationship is saved — converting Right to Left, or vice versa, requires manual edits to PHP class definitions and JSON metadata on the server. Decide before saving.</w:t>
+      </w:r>
+    </w:p>
+    <w:p>
+      <w:r>
+        <w:t xml:space="preserve"/>
+      </w:r>
+    </w:p>
+    <w:p>
+      <w:pPr>
+        <w:pStyle w:val="Heading3"/>
+      </w:pPr>
+      <w:r>
+        <w:rPr>
+          <w:rFonts w:ascii="Arial" w:cs="Arial" w:eastAsia="Arial" w:hAnsi="Arial"/>
+          <w:b/>
+          <w:bCs/>
+          <w:color w:val="595959"/>
+          <w:sz w:val="24"/>
+          <w:szCs w:val="24"/>
+        </w:rPr>
+        <w:t xml:space="preserve">2.9.3 What EspoCRM Creates Under the Hood</w:t>
+      </w:r>
+    </w:p>
+    <w:p>
+      <w:pPr>
+        <w:spacing w:after="120"/>
+      </w:pPr>
+      <w:r>
+        <w:rPr>
+          <w:rFonts w:ascii="Arial" w:cs="Arial" w:eastAsia="Arial" w:hAnsi="Arial"/>
+          <w:sz w:val="22"/>
+          <w:szCs w:val="22"/>
+        </w:rPr>
+        <w:t xml:space="preserve">When you save a one-to-one relationship, EspoCRM performs the following actions:</w:t>
+      </w:r>
+    </w:p>
+    <w:p>
+      <w:pPr>
+        <w:pStyle w:val="ListParagraph"/>
+        <w:numPr>
+          <w:ilvl w:val="0"/>
+          <w:numId w:val="2"/>
+        </w:numPr>
+        <w:spacing w:after="80"/>
+      </w:pPr>
+      <w:r>
+        <w:rPr>
+          <w:rFonts w:ascii="Arial" w:cs="Arial" w:eastAsia="Arial" w:hAnsi="Arial"/>
+          <w:sz w:val="22"/>
+          <w:szCs w:val="22"/>
+        </w:rPr>
+        <w:t xml:space="preserve">Adds a link field on each side. The side opposite the FK gets a virtual link (resolved via reverse traversal of the FK); the side holding the FK gets a real link backed by the FK column.</w:t>
+      </w:r>
+    </w:p>
+    <w:p>
+      <w:pPr>
+        <w:pStyle w:val="ListParagraph"/>
+        <w:numPr>
+          <w:ilvl w:val="0"/>
+          <w:numId w:val="2"/>
+        </w:numPr>
+        <w:spacing w:after="80"/>
+      </w:pPr>
+      <w:r>
+        <w:rPr>
+          <w:rFonts w:ascii="Arial" w:cs="Arial" w:eastAsia="Arial" w:hAnsi="Arial"/>
+          <w:sz w:val="22"/>
+          <w:szCs w:val="22"/>
+        </w:rPr>
+        <w:t xml:space="preserve">Adds the FK column to the underlying database table on the chosen side. The column is named after the link with “Id” appended (e.g., contactId, mailingPlatformProfileId).</w:t>
+      </w:r>
+    </w:p>
+    <w:p>
+      <w:pPr>
+        <w:pStyle w:val="ListParagraph"/>
+        <w:numPr>
+          <w:ilvl w:val="0"/>
+          <w:numId w:val="2"/>
+        </w:numPr>
+        <w:spacing w:after="80"/>
+      </w:pPr>
+      <w:r>
+        <w:rPr>
+          <w:rFonts w:ascii="Arial" w:cs="Arial" w:eastAsia="Arial" w:hAnsi="Arial"/>
+          <w:sz w:val="22"/>
+          <w:szCs w:val="22"/>
+        </w:rPr>
+        <w:t xml:space="preserve">Adds a unique index on the FK column. This is the mechanism that enforces one-to-one at the database layer — without the unique index, the relationship would behave as many-to-one.</w:t>
+      </w:r>
+    </w:p>
+    <w:p>
+      <w:pPr>
+        <w:pStyle w:val="ListParagraph"/>
+        <w:numPr>
+          <w:ilvl w:val="0"/>
+          <w:numId w:val="2"/>
+        </w:numPr>
+        <w:spacing w:after="80"/>
+      </w:pPr>
+      <w:r>
+        <w:rPr>
+          <w:rFonts w:ascii="Arial" w:cs="Arial" w:eastAsia="Arial" w:hAnsi="Arial"/>
+          <w:sz w:val="22"/>
+          <w:szCs w:val="22"/>
+        </w:rPr>
+        <w:t xml:space="preserve">Registers the link in the entity’s metadata definitions so that the API, list views, the layout manager, and the formula engine can read and write through it.</w:t>
+      </w:r>
+    </w:p>
+    <w:p>
+      <w:pPr>
+        <w:spacing w:after="120"/>
+      </w:pPr>
+      <w:r>
+        <w:rPr>
+          <w:rFonts w:ascii="Arial" w:cs="Arial" w:eastAsia="Arial" w:hAnsi="Arial"/>
+          <w:sz w:val="22"/>
+          <w:szCs w:val="22"/>
+        </w:rPr>
+        <w:t xml:space="preserve">The link field appears in the Fields tab of each entity after creation, where it can be added to detail and edit layouts like any other field. The FK column itself does not appear in the Fields tab — it is managed entirely through the link.</w:t>
+      </w:r>
+    </w:p>
+    <w:p>
+      <w:r>
+        <w:t xml:space="preserve"/>
+      </w:r>
+    </w:p>
+    <w:p>
+      <w:pPr>
+        <w:pStyle w:val="Heading3"/>
+      </w:pPr>
+      <w:r>
+        <w:rPr>
+          <w:rFonts w:ascii="Arial" w:cs="Arial" w:eastAsia="Arial" w:hAnsi="Arial"/>
+          <w:b/>
+          <w:bCs/>
+          <w:color w:val="595959"/>
+          <w:sz w:val="24"/>
+          <w:szCs w:val="24"/>
+        </w:rPr>
+        <w:t xml:space="preserve">2.9.4 Uniqueness Constraint and Cardinality Enforcement</w:t>
+      </w:r>
+    </w:p>
+    <w:p>
+      <w:pPr>
+        <w:spacing w:after="120"/>
+      </w:pPr>
+      <w:r>
+        <w:rPr>
+          <w:rFonts w:ascii="Arial" w:cs="Arial" w:eastAsia="Arial" w:hAnsi="Arial"/>
+          <w:sz w:val="22"/>
+          <w:szCs w:val="22"/>
+        </w:rPr>
+        <w:t xml:space="preserve">The unique index on the FK column means that any attempt to link a target record that is already linked to another host record will be rejected at the database layer. This applies whether the link is set through the UI, the API, the formula engine, or a workflow rule. The constraint is what distinguishes one-to-one from many-to-one structurally.</w:t>
+      </w:r>
+    </w:p>
+    <w:p>
+      <w:pPr>
+        <w:spacing w:after="120"/>
+      </w:pPr>
+      <w:r>
+        <w:rPr>
+          <w:rFonts w:ascii="Arial" w:cs="Arial" w:eastAsia="Arial" w:hAnsi="Arial"/>
+          <w:sz w:val="22"/>
+          <w:szCs w:val="22"/>
+        </w:rPr>
+        <w:t xml:space="preserve">The practical consequence is that to re-link a target to a different host, you must first unlink it from its current host, then link it to the new host. There is no atomic swap. The order matters: if you try to link the target to a new host before unlinking the old one, the operation fails with a unique-constraint violation and the original link remains in place.</w:t>
+      </w:r>
+    </w:p>
+    <w:p>
+      <w:pPr>
+        <w:spacing w:after="120"/>
+      </w:pPr>
+      <w:r>
+        <w:rPr>
+          <w:rFonts w:ascii="Arial" w:cs="Arial" w:eastAsia="Arial" w:hAnsi="Arial"/>
+          <w:sz w:val="22"/>
+          <w:szCs w:val="22"/>
+        </w:rPr>
+        <w:t xml:space="preserve">This is the correct behavior for one-to-one, but it does surprise users who expect “link” to be a single-step operation. If your operational workflow involves frequently re-pointing the same target to different hosts, that is a strong signal that many-to-one is the correct model, not one-to-one.</w:t>
+      </w:r>
+    </w:p>
+    <w:p>
+      <w:r>
+        <w:t xml:space="preserve"/>
+      </w:r>
+    </w:p>
+    <w:p>
+      <w:pPr>
+        <w:pStyle w:val="Heading3"/>
+      </w:pPr>
+      <w:r>
+        <w:rPr>
+          <w:rFonts w:ascii="Arial" w:cs="Arial" w:eastAsia="Arial" w:hAnsi="Arial"/>
+          <w:b/>
+          <w:bCs/>
+          <w:color w:val="595959"/>
+          <w:sz w:val="24"/>
+          <w:szCs w:val="24"/>
+        </w:rPr>
+        <w:t xml:space="preserve">2.9.5 Step-by-Step: Creating a One-to-One Relationship</w:t>
+      </w:r>
+    </w:p>
+    <w:p>
+      <w:pPr>
+        <w:pStyle w:val="Heading3"/>
+      </w:pPr>
+      <w:r>
+        <w:rPr>
+          <w:rFonts w:ascii="Arial" w:cs="Arial" w:eastAsia="Arial" w:hAnsi="Arial"/>
+          <w:b/>
+          <w:bCs/>
+          <w:color w:val="595959"/>
+          <w:sz w:val="24"/>
+          <w:szCs w:val="24"/>
+        </w:rPr>
+        <w:t xml:space="preserve">Step 1 — Open Entity Manager</w:t>
+      </w:r>
+    </w:p>
+    <w:p>
+      <w:pPr>
+        <w:spacing w:after="120"/>
+      </w:pPr>
+      <w:r>
+        <w:rPr>
+          <w:rFonts w:ascii="Arial" w:cs="Arial" w:eastAsia="Arial" w:hAnsi="Arial"/>
+          <w:sz w:val="22"/>
+          <w:szCs w:val="22"/>
+        </w:rPr>
+        <w:t xml:space="preserve">Navigate to: Admin — Entity Manager — [Your Entity] — Relationships — Add Relationship.</w:t>
+      </w:r>
+    </w:p>
+    <w:p>
+      <w:pPr>
+        <w:pStyle w:val="Heading3"/>
+      </w:pPr>
+      <w:r>
+        <w:rPr>
+          <w:rFonts w:ascii="Arial" w:cs="Arial" w:eastAsia="Arial" w:hAnsi="Arial"/>
+          <w:b/>
+          <w:bCs/>
+          <w:color w:val="595959"/>
+          <w:sz w:val="24"/>
+          <w:szCs w:val="24"/>
+        </w:rPr>
+        <w:t xml:space="preserve">Step 2 — Select Relationship Type</w:t>
+      </w:r>
+    </w:p>
+    <w:p>
+      <w:pPr>
+        <w:spacing w:after="120"/>
+      </w:pPr>
+      <w:r>
+        <w:rPr>
+          <w:rFonts w:ascii="Arial" w:cs="Arial" w:eastAsia="Arial" w:hAnsi="Arial"/>
+          <w:sz w:val="22"/>
+          <w:szCs w:val="22"/>
+        </w:rPr>
+        <w:t xml:space="preserve">In the Type dropdown, select either One-to-One Right or One-to-One Left. Refer to Section 2.9.2 for guidance on choosing. The decision cannot be reversed through the UI after saving, so make it deliberately.</w:t>
+      </w:r>
+    </w:p>
+    <w:p>
+      <w:pPr>
+        <w:pStyle w:val="Heading3"/>
+      </w:pPr>
+      <w:r>
+        <w:rPr>
+          <w:rFonts w:ascii="Arial" w:cs="Arial" w:eastAsia="Arial" w:hAnsi="Arial"/>
+          <w:b/>
+          <w:bCs/>
+          <w:color w:val="595959"/>
+          <w:sz w:val="24"/>
+          <w:szCs w:val="24"/>
+        </w:rPr>
+        <w:t xml:space="preserve">Step 3 — Configure Both Sides</w:t>
+      </w:r>
+    </w:p>
+    <w:p>
+      <w:pPr>
+        <w:spacing w:after="120"/>
+      </w:pPr>
+      <w:r>
+        <w:rPr>
+          <w:rFonts w:ascii="Arial" w:cs="Arial" w:eastAsia="Arial" w:hAnsi="Arial"/>
+          <w:sz w:val="22"/>
+          <w:szCs w:val="22"/>
+        </w:rPr>
+        <w:t xml:space="preserve">Configure each side’s Name and Label fields. As with all relationships in EspoCRM, both sides are configured in the same dialog — see Section 2.4 for the bi-directional behavior these fields produce on the foreign entity.</w:t>
+      </w:r>
+    </w:p>
+    <w:p>
+      <w:pPr>
+        <w:pStyle w:val="Heading3"/>
+      </w:pPr>
+      <w:r>
+        <w:rPr>
+          <w:rFonts w:ascii="Arial" w:cs="Arial" w:eastAsia="Arial" w:hAnsi="Arial"/>
+          <w:b/>
+          <w:bCs/>
+          <w:color w:val="595959"/>
+          <w:sz w:val="24"/>
+          <w:szCs w:val="24"/>
+        </w:rPr>
+        <w:t xml:space="preserve">Step 4 — Save</w:t>
+      </w:r>
+    </w:p>
+    <w:p>
+      <w:pPr>
+        <w:spacing w:after="120"/>
+      </w:pPr>
+      <w:r>
+        <w:rPr>
+          <w:rFonts w:ascii="Arial" w:cs="Arial" w:eastAsia="Arial" w:hAnsi="Arial"/>
+          <w:sz w:val="22"/>
+          <w:szCs w:val="22"/>
+        </w:rPr>
+        <w:t xml:space="preserve">Click Save. EspoCRM creates the link field on each side, adds the FK column with its unique index to the underlying database table, and registers the relationship in the entity metadata. Both link fields are now available to be added to layouts via the Fields tab and the Detail/Edit layout editors.</w:t>
+      </w:r>
+    </w:p>
+    <w:p>
+      <w:pPr>
+        <w:pStyle w:val="Heading3"/>
+      </w:pPr>
+      <w:r>
+        <w:rPr>
+          <w:rFonts w:ascii="Arial" w:cs="Arial" w:eastAsia="Arial" w:hAnsi="Arial"/>
+          <w:b/>
+          <w:bCs/>
+          <w:color w:val="595959"/>
+          <w:sz w:val="24"/>
+          <w:szCs w:val="24"/>
+        </w:rPr>
+        <w:t xml:space="preserve">Step 5 — Add the Link Fields to Layouts</w:t>
+      </w:r>
+    </w:p>
+    <w:p>
+      <w:pPr>
+        <w:spacing w:after="120"/>
+      </w:pPr>
+      <w:r>
+        <w:rPr>
+          <w:rFonts w:ascii="Arial" w:cs="Arial" w:eastAsia="Arial" w:hAnsi="Arial"/>
+          <w:sz w:val="22"/>
+          <w:szCs w:val="22"/>
+        </w:rPr>
+        <w:t xml:space="preserve">By default, neither link field appears in the detail or edit view of either entity even after the relationship is saved. To make the link visible and editable in the UI, add the appropriate link field to each entity’s Detail View and Edit View layouts (Admin — Entity Manager — [Entity] — Layouts — Detail / Edit). To show the linked record as its own panel rather than a single inline field, follow Section 3 (Adding a Related Panel to an Entity Detail View) for either side.</w:t>
+      </w:r>
+    </w:p>
+    <w:p>
+      <w:r>
+        <w:t xml:space="preserve"/>
+      </w:r>
+    </w:p>
+    <w:p>
+      <w:pPr>
+        <w:pStyle w:val="Heading3"/>
+      </w:pPr>
+      <w:r>
+        <w:rPr>
+          <w:rFonts w:ascii="Arial" w:cs="Arial" w:eastAsia="Arial" w:hAnsi="Arial"/>
+          <w:b/>
+          <w:bCs/>
+          <w:color w:val="595959"/>
+          <w:sz w:val="24"/>
+          <w:szCs w:val="24"/>
+        </w:rPr>
+        <w:t xml:space="preserve">2.9.6 Example: Mailing Platform Profile on Contact</w:t>
+      </w:r>
+    </w:p>
+    <w:p>
+      <w:pPr>
+        <w:spacing w:after="120"/>
+      </w:pPr>
+      <w:r>
+        <w:rPr>
+          <w:rFonts w:ascii="Arial" w:cs="Arial" w:eastAsia="Arial" w:hAnsi="Arial"/>
+          <w:sz w:val="22"/>
+          <w:szCs w:val="22"/>
+        </w:rPr>
+        <w:t xml:space="preserve">Consider this scenario: CBM integrates with an external email marketing platform. Each Contact who has subscribed to CBM’s email communications has exactly one profile record in the external platform; Contacts who have never subscribed have no profile at all. The profile holds platform-side state — the external system’s contact identifier, the current subscription status, the timestamp of the last sync, and the set of email lists the Contact belongs to.</w:t>
+      </w:r>
+    </w:p>
+    <w:p>
+      <w:pPr>
+        <w:spacing w:after="120"/>
+      </w:pPr>
+      <w:r>
+        <w:rPr>
+          <w:rFonts w:ascii="Arial" w:cs="Arial" w:eastAsia="Arial" w:hAnsi="Arial"/>
+          <w:sz w:val="22"/>
+          <w:szCs w:val="22"/>
+        </w:rPr>
+        <w:t xml:space="preserve">This is a candidate for one-to-one because:</w:t>
+      </w:r>
+    </w:p>
+    <w:p>
+      <w:pPr>
+        <w:pStyle w:val="ListParagraph"/>
+        <w:numPr>
+          <w:ilvl w:val="0"/>
+          <w:numId w:val="2"/>
+        </w:numPr>
+        <w:spacing w:after="80"/>
+      </w:pPr>
+      <w:r>
+        <w:rPr>
+          <w:rFonts w:ascii="Arial" w:cs="Arial" w:eastAsia="Arial" w:hAnsi="Arial"/>
+          <w:sz w:val="22"/>
+          <w:szCs w:val="22"/>
+        </w:rPr>
+        <w:t xml:space="preserve">The profile data has its own lifecycle (created on first subscribe, removed on hard unsubscribe, possibly re-created later).</w:t>
+      </w:r>
+    </w:p>
+    <w:p>
+      <w:pPr>
+        <w:pStyle w:val="ListParagraph"/>
+        <w:numPr>
+          <w:ilvl w:val="0"/>
+          <w:numId w:val="2"/>
+        </w:numPr>
+        <w:spacing w:after="80"/>
+      </w:pPr>
+      <w:r>
+        <w:rPr>
+          <w:rFonts w:ascii="Arial" w:cs="Arial" w:eastAsia="Arial" w:hAnsi="Arial"/>
+          <w:sz w:val="22"/>
+          <w:szCs w:val="22"/>
+        </w:rPr>
+        <w:t xml:space="preserve">Most Contacts will have no profile, so the relationship is optional on the Contact side.</w:t>
+      </w:r>
+    </w:p>
+    <w:p>
+      <w:pPr>
+        <w:pStyle w:val="ListParagraph"/>
+        <w:numPr>
+          <w:ilvl w:val="0"/>
+          <w:numId w:val="2"/>
+        </w:numPr>
+        <w:spacing w:after="80"/>
+      </w:pPr>
+      <w:r>
+        <w:rPr>
+          <w:rFonts w:ascii="Arial" w:cs="Arial" w:eastAsia="Arial" w:hAnsi="Arial"/>
+          <w:sz w:val="22"/>
+          <w:szCs w:val="22"/>
+        </w:rPr>
+        <w:t xml:space="preserve">The profile represents data owned by an external system, not by CBM.</w:t>
+      </w:r>
+    </w:p>
+    <w:p>
+      <w:pPr>
+        <w:pStyle w:val="ListParagraph"/>
+        <w:numPr>
+          <w:ilvl w:val="0"/>
+          <w:numId w:val="2"/>
+        </w:numPr>
+        <w:spacing w:after="80"/>
+      </w:pPr>
+      <w:r>
+        <w:rPr>
+          <w:rFonts w:ascii="Arial" w:cs="Arial" w:eastAsia="Arial" w:hAnsi="Arial"/>
+          <w:sz w:val="22"/>
+          <w:szCs w:val="22"/>
+        </w:rPr>
+        <w:t xml:space="preserve">If CBM ever switches email platforms, the profile entity can be swapped out without changing the Contact entity itself.</w:t>
+      </w:r>
+    </w:p>
+    <w:p>
+      <w:pPr>
+        <w:spacing w:after="120"/>
+      </w:pPr>
+      <w:r>
+        <w:rPr>
+          <w:rFonts w:ascii="Arial" w:cs="Arial" w:eastAsia="Arial" w:hAnsi="Arial"/>
+          <w:sz w:val="22"/>
+          <w:szCs w:val="22"/>
+        </w:rPr>
+        <w:t xml:space="preserve">The alternative — adding mailingPlatformContactId, mailingPlatformSubscriptionStatus, mailingPlatformLastSyncedAt, and a multi-enum mailingPlatformLists directly to Contact — also works, and is simpler. Reasonable people would choose either way. This example chooses one-to-one to illustrate the pattern; in a real implementation the platform-swappability and independent-lifecycle arguments would need to be weighed against the simplicity of fields-on-Contact.</w:t>
+      </w:r>
+    </w:p>
+    <w:p>
+      <w:pPr>
+        <w:spacing w:after="120"/>
+      </w:pPr>
+      <w:r>
+        <w:rPr>
+          <w:rFonts w:ascii="Arial" w:cs="Arial" w:eastAsia="Arial" w:hAnsi="Arial"/>
+          <w:b/>
+          <w:bCs/>
+          <w:sz w:val="22"/>
+          <w:szCs w:val="22"/>
+        </w:rPr>
+        <w:t xml:space="preserve">Configuration:</w:t>
+      </w:r>
+    </w:p>
+    <w:p>
+      <w:r>
+        <w:t xml:space="preserve"/>
+      </w:r>
+    </w:p>
+    <w:tbl>
+      <w:tblPr>
+        <w:tblW w:type="dxa" w:w="9360"/>
+        <w:tblBorders>
+          <w:top w:val="single" w:color="auto" w:sz="4"/>
+          <w:left w:val="single" w:color="auto" w:sz="4"/>
+          <w:bottom w:val="single" w:color="auto" w:sz="4"/>
+          <w:right w:val="single" w:color="auto" w:sz="4"/>
+          <w:insideH w:val="single" w:color="auto" w:sz="4"/>
+          <w:insideV w:val="single" w:color="auto" w:sz="4"/>
+        </w:tblBorders>
+      </w:tblPr>
+      <w:tblGrid>
+        <w:gridCol w:w="2880"/>
+        <w:gridCol w:w="3120"/>
+        <w:gridCol w:w="3360"/>
+      </w:tblGrid>
+      <w:tr>
+        <w:tc>
+          <w:tcPr>
+            <w:tcW w:type="dxa" w:w="2880"/>
+            <w:tcBorders>
+              <w:top w:val="single" w:color="AAAAAA" w:sz="1"/>
+              <w:left w:val="single" w:color="AAAAAA" w:sz="1"/>
+              <w:bottom w:val="single" w:color="AAAAAA" w:sz="1"/>
+              <w:right w:val="single" w:color="AAAAAA" w:sz="1"/>
+            </w:tcBorders>
+            <w:shd w:fill="D5E8F0" w:val="clear"/>
+            <w:tcMar>
+              <w:top w:type="dxa" w:w="80"/>
+              <w:left w:type="dxa" w:w="160"/>
+              <w:bottom w:type="dxa" w:w="80"/>
+              <w:right w:type="dxa" w:w="160"/>
+            </w:tcMar>
+          </w:tcPr>
+          <w:p>
+            <w:r>
+              <w:rPr>
+                <w:rFonts w:ascii="Arial" w:cs="Arial" w:eastAsia="Arial" w:hAnsi="Arial"/>
+                <w:b/>
+                <w:bCs/>
+                <w:sz w:val="20"/>
+                <w:szCs w:val="20"/>
+              </w:rPr>
+              <w:t xml:space="preserve">Field</w:t>
+            </w:r>
+          </w:p>
+        </w:tc>
+        <w:tc>
+          <w:tcPr>
+            <w:tcW w:type="dxa" w:w="3120"/>
+            <w:tcBorders>
+              <w:top w:val="single" w:color="AAAAAA" w:sz="1"/>
+              <w:left w:val="single" w:color="AAAAAA" w:sz="1"/>
+              <w:bottom w:val="single" w:color="AAAAAA" w:sz="1"/>
+              <w:right w:val="single" w:color="AAAAAA" w:sz="1"/>
+            </w:tcBorders>
+            <w:shd w:fill="D5E8F0" w:val="clear"/>
+            <w:tcMar>
+              <w:top w:type="dxa" w:w="80"/>
+              <w:left w:type="dxa" w:w="160"/>
+              <w:bottom w:type="dxa" w:w="80"/>
+              <w:right w:type="dxa" w:w="160"/>
+            </w:tcMar>
+          </w:tcPr>
+          <w:p>
+            <w:r>
+              <w:rPr>
+                <w:rFonts w:ascii="Arial" w:cs="Arial" w:eastAsia="Arial" w:hAnsi="Arial"/>
+                <w:b/>
+                <w:bCs/>
+                <w:sz w:val="20"/>
+                <w:szCs w:val="20"/>
+              </w:rPr>
+              <w:t xml:space="preserve">Value</w:t>
+            </w:r>
+          </w:p>
+        </w:tc>
+        <w:tc>
+          <w:tcPr>
+            <w:tcW w:type="dxa" w:w="3360"/>
+            <w:tcBorders>
+              <w:top w:val="single" w:color="AAAAAA" w:sz="1"/>
+              <w:left w:val="single" w:color="AAAAAA" w:sz="1"/>
+              <w:bottom w:val="single" w:color="AAAAAA" w:sz="1"/>
+              <w:right w:val="single" w:color="AAAAAA" w:sz="1"/>
+            </w:tcBorders>
+            <w:shd w:fill="D5E8F0" w:val="clear"/>
+            <w:tcMar>
+              <w:top w:type="dxa" w:w="80"/>
+              <w:left w:type="dxa" w:w="160"/>
+              <w:bottom w:type="dxa" w:w="80"/>
+              <w:right w:type="dxa" w:w="160"/>
+            </w:tcMar>
+          </w:tcPr>
+          <w:p>
+            <w:r>
+              <w:rPr>
+                <w:rFonts w:ascii="Arial" w:cs="Arial" w:eastAsia="Arial" w:hAnsi="Arial"/>
+                <w:b/>
+                <w:bCs/>
+                <w:sz w:val="20"/>
+                <w:szCs w:val="20"/>
+              </w:rPr>
+              <w:t xml:space="preserve">Notes</w:t>
+            </w:r>
+          </w:p>
+        </w:tc>
+      </w:tr>
+      <w:tr>
+        <w:tc>
+          <w:tcPr>
+            <w:tcW w:type="dxa" w:w="2880"/>
+            <w:tcBorders>
+              <w:top w:val="single" w:color="AAAAAA" w:sz="1"/>
+              <w:left w:val="single" w:color="AAAAAA" w:sz="1"/>
+              <w:bottom w:val="single" w:color="AAAAAA" w:sz="1"/>
+              <w:right w:val="single" w:color="AAAAAA" w:sz="1"/>
+            </w:tcBorders>
+            <w:tcMar>
+              <w:top w:type="dxa" w:w="80"/>
+              <w:left w:type="dxa" w:w="160"/>
+              <w:bottom w:type="dxa" w:w="80"/>
+              <w:right w:type="dxa" w:w="160"/>
+            </w:tcMar>
+          </w:tcPr>
+          <w:p>
+            <w:r>
+              <w:rPr>
+                <w:rFonts w:ascii="Arial" w:cs="Arial" w:eastAsia="Arial" w:hAnsi="Arial"/>
+                <w:sz w:val="20"/>
+                <w:szCs w:val="20"/>
+              </w:rPr>
+              <w:t xml:space="preserve">Type</w:t>
+            </w:r>
+          </w:p>
+        </w:tc>
+        <w:tc>
+          <w:tcPr>
+            <w:tcW w:type="dxa" w:w="3120"/>
+            <w:tcBorders>
+              <w:top w:val="single" w:color="AAAAAA" w:sz="1"/>
+              <w:left w:val="single" w:color="AAAAAA" w:sz="1"/>
+              <w:bottom w:val="single" w:color="AAAAAA" w:sz="1"/>
+              <w:right w:val="single" w:color="AAAAAA" w:sz="1"/>
+            </w:tcBorders>
+            <w:tcMar>
+              <w:top w:type="dxa" w:w="80"/>
+              <w:left w:type="dxa" w:w="160"/>
+              <w:bottom w:type="dxa" w:w="80"/>
+              <w:right w:type="dxa" w:w="160"/>
+            </w:tcMar>
+          </w:tcPr>
+          <w:p>
+            <w:r>
+              <w:rPr>
+                <w:rFonts w:ascii="Arial" w:cs="Arial" w:eastAsia="Arial" w:hAnsi="Arial"/>
+                <w:sz w:val="20"/>
+                <w:szCs w:val="20"/>
+              </w:rPr>
+              <w:t xml:space="preserve">One-to-One Right</w:t>
+            </w:r>
+          </w:p>
+        </w:tc>
+        <w:tc>
+          <w:tcPr>
+            <w:tcW w:type="dxa" w:w="3360"/>
+            <w:tcBorders>
+              <w:top w:val="single" w:color="AAAAAA" w:sz="1"/>
+              <w:left w:val="single" w:color="AAAAAA" w:sz="1"/>
+              <w:bottom w:val="single" w:color="AAAAAA" w:sz="1"/>
+              <w:right w:val="single" w:color="AAAAAA" w:sz="1"/>
+            </w:tcBorders>
+            <w:tcMar>
+              <w:top w:type="dxa" w:w="80"/>
+              <w:left w:type="dxa" w:w="160"/>
+              <w:bottom w:type="dxa" w:w="80"/>
+              <w:right w:type="dxa" w:w="160"/>
+            </w:tcMar>
+          </w:tcPr>
+          <w:p>
+            <w:r>
+              <w:rPr>
+                <w:rFonts w:ascii="Arial" w:cs="Arial" w:eastAsia="Arial" w:hAnsi="Arial"/>
+                <w:sz w:val="20"/>
+                <w:szCs w:val="20"/>
+              </w:rPr>
+              <w:t xml:space="preserve">FK lives on MailingPlatformProfile (the external-system mirror); Contact has no FK column.</w:t>
+            </w:r>
+          </w:p>
+        </w:tc>
+      </w:tr>
+      <w:tr>
+        <w:tc>
+          <w:tcPr>
+            <w:tcW w:type="dxa" w:w="2880"/>
+            <w:tcBorders>
+              <w:top w:val="single" w:color="AAAAAA" w:sz="1"/>
+              <w:left w:val="single" w:color="AAAAAA" w:sz="1"/>
+              <w:bottom w:val="single" w:color="AAAAAA" w:sz="1"/>
+              <w:right w:val="single" w:color="AAAAAA" w:sz="1"/>
+            </w:tcBorders>
+            <w:tcMar>
+              <w:top w:type="dxa" w:w="80"/>
+              <w:left w:type="dxa" w:w="160"/>
+              <w:bottom w:type="dxa" w:w="80"/>
+              <w:right w:type="dxa" w:w="160"/>
+            </w:tcMar>
+          </w:tcPr>
+          <w:p>
+            <w:r>
+              <w:rPr>
+                <w:rFonts w:ascii="Arial" w:cs="Arial" w:eastAsia="Arial" w:hAnsi="Arial"/>
+                <w:sz w:val="20"/>
+                <w:szCs w:val="20"/>
+              </w:rPr>
+              <w:t xml:space="preserve">Left Entity (host)</w:t>
+            </w:r>
+          </w:p>
+        </w:tc>
+        <w:tc>
+          <w:tcPr>
+            <w:tcW w:type="dxa" w:w="3120"/>
+            <w:tcBorders>
+              <w:top w:val="single" w:color="AAAAAA" w:sz="1"/>
+              <w:left w:val="single" w:color="AAAAAA" w:sz="1"/>
+              <w:bottom w:val="single" w:color="AAAAAA" w:sz="1"/>
+              <w:right w:val="single" w:color="AAAAAA" w:sz="1"/>
+            </w:tcBorders>
+            <w:tcMar>
+              <w:top w:type="dxa" w:w="80"/>
+              <w:left w:type="dxa" w:w="160"/>
+              <w:bottom w:type="dxa" w:w="80"/>
+              <w:right w:type="dxa" w:w="160"/>
+            </w:tcMar>
+          </w:tcPr>
+          <w:p>
+            <w:r>
+              <w:rPr>
+                <w:rFonts w:ascii="Arial" w:cs="Arial" w:eastAsia="Arial" w:hAnsi="Arial"/>
+                <w:sz w:val="20"/>
+                <w:szCs w:val="20"/>
+              </w:rPr>
+              <w:t xml:space="preserve">Contact</w:t>
+            </w:r>
+          </w:p>
+        </w:tc>
+        <w:tc>
+          <w:tcPr>
+            <w:tcW w:type="dxa" w:w="3360"/>
+            <w:tcBorders>
+              <w:top w:val="single" w:color="AAAAAA" w:sz="1"/>
+              <w:left w:val="single" w:color="AAAAAA" w:sz="1"/>
+              <w:bottom w:val="single" w:color="AAAAAA" w:sz="1"/>
+              <w:right w:val="single" w:color="AAAAAA" w:sz="1"/>
+            </w:tcBorders>
+            <w:tcMar>
+              <w:top w:type="dxa" w:w="80"/>
+              <w:left w:type="dxa" w:w="160"/>
+              <w:bottom w:type="dxa" w:w="80"/>
+              <w:right w:type="dxa" w:w="160"/>
+            </w:tcMar>
+          </w:tcPr>
+          <w:p>
+            <w:r>
+              <w:rPr>
+                <w:rFonts w:ascii="Arial" w:cs="Arial" w:eastAsia="Arial" w:hAnsi="Arial"/>
+                <w:sz w:val="20"/>
+                <w:szCs w:val="20"/>
+              </w:rPr>
+              <w:t xml:space="preserve">The CRM-owned record. Reaches the profile via the link.</w:t>
+            </w:r>
+          </w:p>
+        </w:tc>
+      </w:tr>
+      <w:tr>
+        <w:tc>
+          <w:tcPr>
+            <w:tcW w:type="dxa" w:w="2880"/>
+            <w:tcBorders>
+              <w:top w:val="single" w:color="AAAAAA" w:sz="1"/>
+              <w:left w:val="single" w:color="AAAAAA" w:sz="1"/>
+              <w:bottom w:val="single" w:color="AAAAAA" w:sz="1"/>
+              <w:right w:val="single" w:color="AAAAAA" w:sz="1"/>
+            </w:tcBorders>
+            <w:tcMar>
+              <w:top w:type="dxa" w:w="80"/>
+              <w:left w:type="dxa" w:w="160"/>
+              <w:bottom w:type="dxa" w:w="80"/>
+              <w:right w:type="dxa" w:w="160"/>
+            </w:tcMar>
+          </w:tcPr>
+          <w:p>
+            <w:r>
+              <w:rPr>
+                <w:rFonts w:ascii="Arial" w:cs="Arial" w:eastAsia="Arial" w:hAnsi="Arial"/>
+                <w:sz w:val="20"/>
+                <w:szCs w:val="20"/>
+              </w:rPr>
+              <w:t xml:space="preserve">Right Entity (foreign)</w:t>
+            </w:r>
+          </w:p>
+        </w:tc>
+        <w:tc>
+          <w:tcPr>
+            <w:tcW w:type="dxa" w:w="3120"/>
+            <w:tcBorders>
+              <w:top w:val="single" w:color="AAAAAA" w:sz="1"/>
+              <w:left w:val="single" w:color="AAAAAA" w:sz="1"/>
+              <w:bottom w:val="single" w:color="AAAAAA" w:sz="1"/>
+              <w:right w:val="single" w:color="AAAAAA" w:sz="1"/>
+            </w:tcBorders>
+            <w:tcMar>
+              <w:top w:type="dxa" w:w="80"/>
+              <w:left w:type="dxa" w:w="160"/>
+              <w:bottom w:type="dxa" w:w="80"/>
+              <w:right w:type="dxa" w:w="160"/>
+            </w:tcMar>
+          </w:tcPr>
+          <w:p>
+            <w:r>
+              <w:rPr>
+                <w:rFonts w:ascii="Arial" w:cs="Arial" w:eastAsia="Arial" w:hAnsi="Arial"/>
+                <w:sz w:val="20"/>
+                <w:szCs w:val="20"/>
+              </w:rPr>
+              <w:t xml:space="preserve">MailingPlatformProfile</w:t>
+            </w:r>
+          </w:p>
+        </w:tc>
+        <w:tc>
+          <w:tcPr>
+            <w:tcW w:type="dxa" w:w="3360"/>
+            <w:tcBorders>
+              <w:top w:val="single" w:color="AAAAAA" w:sz="1"/>
+              <w:left w:val="single" w:color="AAAAAA" w:sz="1"/>
+              <w:bottom w:val="single" w:color="AAAAAA" w:sz="1"/>
+              <w:right w:val="single" w:color="AAAAAA" w:sz="1"/>
+            </w:tcBorders>
+            <w:tcMar>
+              <w:top w:type="dxa" w:w="80"/>
+              <w:left w:type="dxa" w:w="160"/>
+              <w:bottom w:type="dxa" w:w="80"/>
+              <w:right w:type="dxa" w:w="160"/>
+            </w:tcMar>
+          </w:tcPr>
+          <w:p>
+            <w:r>
+              <w:rPr>
+                <w:rFonts w:ascii="Arial" w:cs="Arial" w:eastAsia="Arial" w:hAnsi="Arial"/>
+                <w:sz w:val="20"/>
+                <w:szCs w:val="20"/>
+              </w:rPr>
+              <w:t xml:space="preserve">The external-system mirror. Holds the FK column contactId.</w:t>
+            </w:r>
+          </w:p>
+        </w:tc>
+      </w:tr>
+      <w:tr>
+        <w:tc>
+          <w:tcPr>
+            <w:tcW w:type="dxa" w:w="2880"/>
+            <w:tcBorders>
+              <w:top w:val="single" w:color="AAAAAA" w:sz="1"/>
+              <w:left w:val="single" w:color="AAAAAA" w:sz="1"/>
+              <w:bottom w:val="single" w:color="AAAAAA" w:sz="1"/>
+              <w:right w:val="single" w:color="AAAAAA" w:sz="1"/>
+            </w:tcBorders>
+            <w:tcMar>
+              <w:top w:type="dxa" w:w="80"/>
+              <w:left w:type="dxa" w:w="160"/>
+              <w:bottom w:type="dxa" w:w="80"/>
+              <w:right w:type="dxa" w:w="160"/>
+            </w:tcMar>
+          </w:tcPr>
+          <w:p>
+            <w:r>
+              <w:rPr>
+                <w:rFonts w:ascii="Arial" w:cs="Arial" w:eastAsia="Arial" w:hAnsi="Arial"/>
+                <w:sz w:val="20"/>
+                <w:szCs w:val="20"/>
+              </w:rPr>
+              <w:t xml:space="preserve">Left Name</w:t>
+            </w:r>
+          </w:p>
+        </w:tc>
+        <w:tc>
+          <w:tcPr>
+            <w:tcW w:type="dxa" w:w="3120"/>
+            <w:tcBorders>
+              <w:top w:val="single" w:color="AAAAAA" w:sz="1"/>
+              <w:left w:val="single" w:color="AAAAAA" w:sz="1"/>
+              <w:bottom w:val="single" w:color="AAAAAA" w:sz="1"/>
+              <w:right w:val="single" w:color="AAAAAA" w:sz="1"/>
+            </w:tcBorders>
+            <w:tcMar>
+              <w:top w:type="dxa" w:w="80"/>
+              <w:left w:type="dxa" w:w="160"/>
+              <w:bottom w:type="dxa" w:w="80"/>
+              <w:right w:type="dxa" w:w="160"/>
+            </w:tcMar>
+          </w:tcPr>
+          <w:p>
+            <w:r>
+              <w:rPr>
+                <w:rFonts w:ascii="Arial" w:cs="Arial" w:eastAsia="Arial" w:hAnsi="Arial"/>
+                <w:sz w:val="20"/>
+                <w:szCs w:val="20"/>
+              </w:rPr>
+              <w:t xml:space="preserve">mailingPlatformProfile</w:t>
+            </w:r>
+          </w:p>
+        </w:tc>
+        <w:tc>
+          <w:tcPr>
+            <w:tcW w:type="dxa" w:w="3360"/>
+            <w:tcBorders>
+              <w:top w:val="single" w:color="AAAAAA" w:sz="1"/>
+              <w:left w:val="single" w:color="AAAAAA" w:sz="1"/>
+              <w:bottom w:val="single" w:color="AAAAAA" w:sz="1"/>
+              <w:right w:val="single" w:color="AAAAAA" w:sz="1"/>
+            </w:tcBorders>
+            <w:tcMar>
+              <w:top w:type="dxa" w:w="80"/>
+              <w:left w:type="dxa" w:w="160"/>
+              <w:bottom w:type="dxa" w:w="80"/>
+              <w:right w:type="dxa" w:w="160"/>
+            </w:tcMar>
+          </w:tcPr>
+          <w:p>
+            <w:r>
+              <w:rPr>
+                <w:rFonts w:ascii="Arial" w:cs="Arial" w:eastAsia="Arial" w:hAnsi="Arial"/>
+                <w:sz w:val="20"/>
+                <w:szCs w:val="20"/>
+              </w:rPr>
+              <w:t xml:space="preserve">Singular. The link field that appears on Contact.</w:t>
+            </w:r>
+          </w:p>
+        </w:tc>
+      </w:tr>
+      <w:tr>
+        <w:tc>
+          <w:tcPr>
+            <w:tcW w:type="dxa" w:w="2880"/>
+            <w:tcBorders>
+              <w:top w:val="single" w:color="AAAAAA" w:sz="1"/>
+              <w:left w:val="single" w:color="AAAAAA" w:sz="1"/>
+              <w:bottom w:val="single" w:color="AAAAAA" w:sz="1"/>
+              <w:right w:val="single" w:color="AAAAAA" w:sz="1"/>
+            </w:tcBorders>
+            <w:tcMar>
+              <w:top w:type="dxa" w:w="80"/>
+              <w:left w:type="dxa" w:w="160"/>
+              <w:bottom w:type="dxa" w:w="80"/>
+              <w:right w:type="dxa" w:w="160"/>
+            </w:tcMar>
+          </w:tcPr>
+          <w:p>
+            <w:r>
+              <w:rPr>
+                <w:rFonts w:ascii="Arial" w:cs="Arial" w:eastAsia="Arial" w:hAnsi="Arial"/>
+                <w:sz w:val="20"/>
+                <w:szCs w:val="20"/>
+              </w:rPr>
+              <w:t xml:space="preserve">Left Label</w:t>
+            </w:r>
+          </w:p>
+        </w:tc>
+        <w:tc>
+          <w:tcPr>
+            <w:tcW w:type="dxa" w:w="3120"/>
+            <w:tcBorders>
+              <w:top w:val="single" w:color="AAAAAA" w:sz="1"/>
+              <w:left w:val="single" w:color="AAAAAA" w:sz="1"/>
+              <w:bottom w:val="single" w:color="AAAAAA" w:sz="1"/>
+              <w:right w:val="single" w:color="AAAAAA" w:sz="1"/>
+            </w:tcBorders>
+            <w:tcMar>
+              <w:top w:type="dxa" w:w="80"/>
+              <w:left w:type="dxa" w:w="160"/>
+              <w:bottom w:type="dxa" w:w="80"/>
+              <w:right w:type="dxa" w:w="160"/>
+            </w:tcMar>
+          </w:tcPr>
+          <w:p>
+            <w:r>
+              <w:rPr>
+                <w:rFonts w:ascii="Arial" w:cs="Arial" w:eastAsia="Arial" w:hAnsi="Arial"/>
+                <w:sz w:val="20"/>
+                <w:szCs w:val="20"/>
+              </w:rPr>
+              <w:t xml:space="preserve">Mailing Platform Profile</w:t>
+            </w:r>
+          </w:p>
+        </w:tc>
+        <w:tc>
+          <w:tcPr>
+            <w:tcW w:type="dxa" w:w="3360"/>
+            <w:tcBorders>
+              <w:top w:val="single" w:color="AAAAAA" w:sz="1"/>
+              <w:left w:val="single" w:color="AAAAAA" w:sz="1"/>
+              <w:bottom w:val="single" w:color="AAAAAA" w:sz="1"/>
+              <w:right w:val="single" w:color="AAAAAA" w:sz="1"/>
+            </w:tcBorders>
+            <w:tcMar>
+              <w:top w:type="dxa" w:w="80"/>
+              <w:left w:type="dxa" w:w="160"/>
+              <w:bottom w:type="dxa" w:w="80"/>
+              <w:right w:type="dxa" w:w="160"/>
+            </w:tcMar>
+          </w:tcPr>
+          <w:p>
+            <w:r>
+              <w:rPr>
+                <w:rFonts w:ascii="Arial" w:cs="Arial" w:eastAsia="Arial" w:hAnsi="Arial"/>
+                <w:sz w:val="20"/>
+                <w:szCs w:val="20"/>
+              </w:rPr>
+              <w:t xml:space="preserve">Display label of the link field on Contact.</w:t>
+            </w:r>
+          </w:p>
+        </w:tc>
+      </w:tr>
+      <w:tr>
+        <w:tc>
+          <w:tcPr>
+            <w:tcW w:type="dxa" w:w="2880"/>
+            <w:tcBorders>
+              <w:top w:val="single" w:color="AAAAAA" w:sz="1"/>
+              <w:left w:val="single" w:color="AAAAAA" w:sz="1"/>
+              <w:bottom w:val="single" w:color="AAAAAA" w:sz="1"/>
+              <w:right w:val="single" w:color="AAAAAA" w:sz="1"/>
+            </w:tcBorders>
+            <w:tcMar>
+              <w:top w:type="dxa" w:w="80"/>
+              <w:left w:type="dxa" w:w="160"/>
+              <w:bottom w:type="dxa" w:w="80"/>
+              <w:right w:type="dxa" w:w="160"/>
+            </w:tcMar>
+          </w:tcPr>
+          <w:p>
+            <w:r>
+              <w:rPr>
+                <w:rFonts w:ascii="Arial" w:cs="Arial" w:eastAsia="Arial" w:hAnsi="Arial"/>
+                <w:sz w:val="20"/>
+                <w:szCs w:val="20"/>
+              </w:rPr>
+              <w:t xml:space="preserve">Right Name</w:t>
+            </w:r>
+          </w:p>
+        </w:tc>
+        <w:tc>
+          <w:tcPr>
+            <w:tcW w:type="dxa" w:w="3120"/>
+            <w:tcBorders>
+              <w:top w:val="single" w:color="AAAAAA" w:sz="1"/>
+              <w:left w:val="single" w:color="AAAAAA" w:sz="1"/>
+              <w:bottom w:val="single" w:color="AAAAAA" w:sz="1"/>
+              <w:right w:val="single" w:color="AAAAAA" w:sz="1"/>
+            </w:tcBorders>
+            <w:tcMar>
+              <w:top w:type="dxa" w:w="80"/>
+              <w:left w:type="dxa" w:w="160"/>
+              <w:bottom w:type="dxa" w:w="80"/>
+              <w:right w:type="dxa" w:w="160"/>
+            </w:tcMar>
+          </w:tcPr>
+          <w:p>
+            <w:r>
+              <w:rPr>
+                <w:rFonts w:ascii="Arial" w:cs="Arial" w:eastAsia="Arial" w:hAnsi="Arial"/>
+                <w:sz w:val="20"/>
+                <w:szCs w:val="20"/>
+              </w:rPr>
+              <w:t xml:space="preserve">contact</w:t>
+            </w:r>
+          </w:p>
+        </w:tc>
+        <w:tc>
+          <w:tcPr>
+            <w:tcW w:type="dxa" w:w="3360"/>
+            <w:tcBorders>
+              <w:top w:val="single" w:color="AAAAAA" w:sz="1"/>
+              <w:left w:val="single" w:color="AAAAAA" w:sz="1"/>
+              <w:bottom w:val="single" w:color="AAAAAA" w:sz="1"/>
+              <w:right w:val="single" w:color="AAAAAA" w:sz="1"/>
+            </w:tcBorders>
+            <w:tcMar>
+              <w:top w:type="dxa" w:w="80"/>
+              <w:left w:type="dxa" w:w="160"/>
+              <w:bottom w:type="dxa" w:w="80"/>
+              <w:right w:type="dxa" w:w="160"/>
+            </w:tcMar>
+          </w:tcPr>
+          <w:p>
+            <w:r>
+              <w:rPr>
+                <w:rFonts w:ascii="Arial" w:cs="Arial" w:eastAsia="Arial" w:hAnsi="Arial"/>
+                <w:sz w:val="20"/>
+                <w:szCs w:val="20"/>
+              </w:rPr>
+              <w:t xml:space="preserve">Singular. The link field that appears on MailingPlatformProfile.</w:t>
+            </w:r>
+          </w:p>
+        </w:tc>
+      </w:tr>
+      <w:tr>
+        <w:tc>
+          <w:tcPr>
+            <w:tcW w:type="dxa" w:w="2880"/>
+            <w:tcBorders>
+              <w:top w:val="single" w:color="AAAAAA" w:sz="1"/>
+              <w:left w:val="single" w:color="AAAAAA" w:sz="1"/>
+              <w:bottom w:val="single" w:color="AAAAAA" w:sz="1"/>
+              <w:right w:val="single" w:color="AAAAAA" w:sz="1"/>
+            </w:tcBorders>
+            <w:tcMar>
+              <w:top w:type="dxa" w:w="80"/>
+              <w:left w:type="dxa" w:w="160"/>
+              <w:bottom w:type="dxa" w:w="80"/>
+              <w:right w:type="dxa" w:w="160"/>
+            </w:tcMar>
+          </w:tcPr>
+          <w:p>
+            <w:r>
+              <w:rPr>
+                <w:rFonts w:ascii="Arial" w:cs="Arial" w:eastAsia="Arial" w:hAnsi="Arial"/>
+                <w:sz w:val="20"/>
+                <w:szCs w:val="20"/>
+              </w:rPr>
+              <w:t xml:space="preserve">Right Label</w:t>
+            </w:r>
+          </w:p>
+        </w:tc>
+        <w:tc>
+          <w:tcPr>
+            <w:tcW w:type="dxa" w:w="3120"/>
+            <w:tcBorders>
+              <w:top w:val="single" w:color="AAAAAA" w:sz="1"/>
+              <w:left w:val="single" w:color="AAAAAA" w:sz="1"/>
+              <w:bottom w:val="single" w:color="AAAAAA" w:sz="1"/>
+              <w:right w:val="single" w:color="AAAAAA" w:sz="1"/>
+            </w:tcBorders>
+            <w:tcMar>
+              <w:top w:type="dxa" w:w="80"/>
+              <w:left w:type="dxa" w:w="160"/>
+              <w:bottom w:type="dxa" w:w="80"/>
+              <w:right w:type="dxa" w:w="160"/>
+            </w:tcMar>
+          </w:tcPr>
+          <w:p>
+            <w:r>
+              <w:rPr>
+                <w:rFonts w:ascii="Arial" w:cs="Arial" w:eastAsia="Arial" w:hAnsi="Arial"/>
+                <w:sz w:val="20"/>
+                <w:szCs w:val="20"/>
+              </w:rPr>
+              <w:t xml:space="preserve">Contact</w:t>
+            </w:r>
+          </w:p>
+        </w:tc>
+        <w:tc>
+          <w:tcPr>
+            <w:tcW w:type="dxa" w:w="3360"/>
+            <w:tcBorders>
+              <w:top w:val="single" w:color="AAAAAA" w:sz="1"/>
+              <w:left w:val="single" w:color="AAAAAA" w:sz="1"/>
+              <w:bottom w:val="single" w:color="AAAAAA" w:sz="1"/>
+              <w:right w:val="single" w:color="AAAAAA" w:sz="1"/>
+            </w:tcBorders>
+            <w:tcMar>
+              <w:top w:type="dxa" w:w="80"/>
+              <w:left w:type="dxa" w:w="160"/>
+              <w:bottom w:type="dxa" w:w="80"/>
+              <w:right w:type="dxa" w:w="160"/>
+            </w:tcMar>
+          </w:tcPr>
+          <w:p>
+            <w:r>
+              <w:rPr>
+                <w:rFonts w:ascii="Arial" w:cs="Arial" w:eastAsia="Arial" w:hAnsi="Arial"/>
+                <w:sz w:val="20"/>
+                <w:szCs w:val="20"/>
+              </w:rPr>
+              <w:t xml:space="preserve">Display label of the link field on MailingPlatformProfile.</w:t>
+            </w:r>
+          </w:p>
+        </w:tc>
+      </w:tr>
+      <w:tr>
+        <w:tc>
+          <w:tcPr>
+            <w:tcW w:type="dxa" w:w="2880"/>
+            <w:tcBorders>
+              <w:top w:val="single" w:color="AAAAAA" w:sz="1"/>
+              <w:left w:val="single" w:color="AAAAAA" w:sz="1"/>
+              <w:bottom w:val="single" w:color="AAAAAA" w:sz="1"/>
+              <w:right w:val="single" w:color="AAAAAA" w:sz="1"/>
+            </w:tcBorders>
+            <w:tcMar>
+              <w:top w:type="dxa" w:w="80"/>
+              <w:left w:type="dxa" w:w="160"/>
+              <w:bottom w:type="dxa" w:w="80"/>
+              <w:right w:type="dxa" w:w="160"/>
+            </w:tcMar>
+          </w:tcPr>
+          <w:p>
+            <w:r>
+              <w:rPr>
+                <w:rFonts w:ascii="Arial" w:cs="Arial" w:eastAsia="Arial" w:hAnsi="Arial"/>
+                <w:sz w:val="20"/>
+                <w:szCs w:val="20"/>
+              </w:rPr>
+              <w:t xml:space="preserve">Audited</w:t>
+            </w:r>
+          </w:p>
+        </w:tc>
+        <w:tc>
+          <w:tcPr>
+            <w:tcW w:type="dxa" w:w="3120"/>
+            <w:tcBorders>
+              <w:top w:val="single" w:color="AAAAAA" w:sz="1"/>
+              <w:left w:val="single" w:color="AAAAAA" w:sz="1"/>
+              <w:bottom w:val="single" w:color="AAAAAA" w:sz="1"/>
+              <w:right w:val="single" w:color="AAAAAA" w:sz="1"/>
+            </w:tcBorders>
+            <w:tcMar>
+              <w:top w:type="dxa" w:w="80"/>
+              <w:left w:type="dxa" w:w="160"/>
+              <w:bottom w:type="dxa" w:w="80"/>
+              <w:right w:type="dxa" w:w="160"/>
+            </w:tcMar>
+          </w:tcPr>
+          <w:p>
+            <w:r>
+              <w:rPr>
+                <w:rFonts w:ascii="Arial" w:cs="Arial" w:eastAsia="Arial" w:hAnsi="Arial"/>
+                <w:sz w:val="20"/>
+                <w:szCs w:val="20"/>
+              </w:rPr>
+              <w:t xml:space="preserve">Yes (both sides)</w:t>
+            </w:r>
+          </w:p>
+        </w:tc>
+        <w:tc>
+          <w:tcPr>
+            <w:tcW w:type="dxa" w:w="3360"/>
+            <w:tcBorders>
+              <w:top w:val="single" w:color="AAAAAA" w:sz="1"/>
+              <w:left w:val="single" w:color="AAAAAA" w:sz="1"/>
+              <w:bottom w:val="single" w:color="AAAAAA" w:sz="1"/>
+              <w:right w:val="single" w:color="AAAAAA" w:sz="1"/>
+            </w:tcBorders>
+            <w:tcMar>
+              <w:top w:type="dxa" w:w="80"/>
+              <w:left w:type="dxa" w:w="160"/>
+              <w:bottom w:type="dxa" w:w="80"/>
+              <w:right w:type="dxa" w:w="160"/>
+            </w:tcMar>
+          </w:tcPr>
+          <w:p>
+            <w:r>
+              <w:rPr>
+                <w:rFonts w:ascii="Arial" w:cs="Arial" w:eastAsia="Arial" w:hAnsi="Arial"/>
+                <w:sz w:val="20"/>
+                <w:szCs w:val="20"/>
+              </w:rPr>
+              <w:t xml:space="preserve">Logs link and unlink events to the activity stream of both entities.</w:t>
+            </w:r>
+          </w:p>
+        </w:tc>
+      </w:tr>
+    </w:tbl>
+    <w:p>
+      <w:r>
+        <w:t xml:space="preserve"/>
+      </w:r>
+    </w:p>
+    <w:p>
+      <w:pPr>
+        <w:spacing w:after="120"/>
+      </w:pPr>
+      <w:r>
+        <w:rPr>
+          <w:rFonts w:ascii="Arial" w:cs="Arial" w:eastAsia="Arial" w:hAnsi="Arial"/>
+          <w:sz w:val="22"/>
+          <w:szCs w:val="22"/>
+        </w:rPr>
+        <w:t xml:space="preserve">After saving, EspoCRM creates the mailingPlatformProfile link on Contact and the contact link on MailingPlatformProfile, adds a contactId column with a unique index to the mailing_platform_profile table, and registers both link fields in entity metadata. Either link field can then be added to its entity’s Detail View and Edit View layouts to make the link visible in the UI.</w:t>
+      </w:r>
+    </w:p>
+    <w:p>
+      <w:pPr>
+        <w:spacing w:after="120"/>
+      </w:pPr>
+      <w:r>
+        <w:rPr>
+          <w:rFonts w:ascii="Arial" w:cs="Arial" w:eastAsia="Arial" w:hAnsi="Arial"/>
+          <w:b/>
+          <w:bCs/>
+          <w:sz w:val="22"/>
+          <w:szCs w:val="22"/>
+        </w:rPr>
+        <w:t xml:space="preserve">In use. </w:t>
+      </w:r>
+      <w:r>
+        <w:rPr>
+          <w:rFonts w:ascii="Arial" w:cs="Arial" w:eastAsia="Arial" w:hAnsi="Arial"/>
+          <w:sz w:val="22"/>
+          <w:szCs w:val="22"/>
+        </w:rPr>
+        <w:t xml:space="preserve">A staff user opening a Contact detail page sees the linked MailingPlatformProfile through the link field on Contact (or through a related panel on the Contact detail view, configured per Section 3). A staff user opening a MailingPlatformProfile detail page sees the linked Contact through the link field on MailingPlatformProfile. Attempting to link a MailingPlatformProfile that is already linked to a different Contact will fail with a unique-constraint violation; the existing link must be removed first.</w:t>
+      </w:r>
+    </w:p>
+    <w:p>
+      <w:r>
+        <w:t xml:space="preserve"/>
+      </w:r>
+    </w:p>
+    <w:p>
+      <w:pPr>
+        <w:pStyle w:val="Heading3"/>
+      </w:pPr>
+      <w:r>
+        <w:rPr>
+          <w:rFonts w:ascii="Arial" w:cs="Arial" w:eastAsia="Arial" w:hAnsi="Arial"/>
+          <w:b/>
+          <w:bCs/>
+          <w:color w:val="595959"/>
+          <w:sz w:val="24"/>
+          <w:szCs w:val="24"/>
+        </w:rPr>
+        <w:t xml:space="preserve">2.9.7 Foreign Fields Across a One-to-One Link</w:t>
+      </w:r>
+    </w:p>
+    <w:p>
+      <w:pPr>
+        <w:spacing w:after="120"/>
+      </w:pPr>
+      <w:r>
+        <w:rPr>
+          <w:rFonts w:ascii="Arial" w:cs="Arial" w:eastAsia="Arial" w:hAnsi="Arial"/>
+          <w:sz w:val="22"/>
+          <w:szCs w:val="22"/>
+        </w:rPr>
+        <w:t xml:space="preserve">Foreign fields (Section 2.8) work the same way across a one-to-one link as they do across a many-to-one link. From either side of the link, you can reach across to the linked entity and pull a field through as a read-only mirror on the host entity.</w:t>
+      </w:r>
+    </w:p>
+    <w:p>
+      <w:pPr>
+        <w:spacing w:after="120"/>
+      </w:pPr>
+      <w:r>
+        <w:rPr>
+          <w:rFonts w:ascii="Arial" w:cs="Arial" w:eastAsia="Arial" w:hAnsi="Arial"/>
+          <w:sz w:val="22"/>
+          <w:szCs w:val="22"/>
+        </w:rPr>
+        <w:t xml:space="preserve">For the example above, useful Foreign fields might include:</w:t>
+      </w:r>
+    </w:p>
+    <w:p>
+      <w:pPr>
+        <w:pStyle w:val="ListParagraph"/>
+        <w:numPr>
+          <w:ilvl w:val="0"/>
+          <w:numId w:val="2"/>
+        </w:numPr>
+        <w:spacing w:after="80"/>
+      </w:pPr>
+      <w:r>
+        <w:rPr>
+          <w:rFonts w:ascii="Arial" w:cs="Arial" w:eastAsia="Arial" w:hAnsi="Arial"/>
+          <w:sz w:val="22"/>
+          <w:szCs w:val="22"/>
+        </w:rPr>
+        <w:t xml:space="preserve">On Contact: mailingPlatformSubscriptionStatus, read-through from the linked MailingPlatformProfile. This allows list views and filters on Contact to show subscription status directly without joining to the profile entity in a report.</w:t>
+      </w:r>
+    </w:p>
+    <w:p>
+      <w:pPr>
+        <w:pStyle w:val="ListParagraph"/>
+        <w:numPr>
+          <w:ilvl w:val="0"/>
+          <w:numId w:val="2"/>
+        </w:numPr>
+        <w:spacing w:after="80"/>
+      </w:pPr>
+      <w:r>
+        <w:rPr>
+          <w:rFonts w:ascii="Arial" w:cs="Arial" w:eastAsia="Arial" w:hAnsi="Arial"/>
+          <w:sz w:val="22"/>
+          <w:szCs w:val="22"/>
+        </w:rPr>
+        <w:t xml:space="preserve">On MailingPlatformProfile: contactEmailAddress, read-through from the linked Contact. This allows list views of profile records to show the corresponding email address without joining to Contact.</w:t>
+      </w:r>
+    </w:p>
+    <w:p>
+      <w:pPr>
+        <w:spacing w:after="120"/>
+      </w:pPr>
+      <w:r>
+        <w:rPr>
+          <w:rFonts w:ascii="Arial" w:cs="Arial" w:eastAsia="Arial" w:hAnsi="Arial"/>
+          <w:sz w:val="22"/>
+          <w:szCs w:val="22"/>
+        </w:rPr>
+        <w:t xml:space="preserve">Unlike many-to-many relationships — where Foreign fields can return undefined values when the host is linked to multiple targets — one-to-one Foreign fields are always well-defined, because the linked target is always either exactly one record or none.</w:t>
+      </w:r>
+    </w:p>
+    <w:p>
+      <w:r>
+        <w:t xml:space="preserve"/>
+      </w:r>
+    </w:p>
+    <w:p>
+      <w:pPr>
+        <w:pStyle w:val="Heading3"/>
+      </w:pPr>
+      <w:r>
+        <w:rPr>
+          <w:rFonts w:ascii="Arial" w:cs="Arial" w:eastAsia="Arial" w:hAnsi="Arial"/>
+          <w:b/>
+          <w:bCs/>
+          <w:color w:val="595959"/>
+          <w:sz w:val="24"/>
+          <w:szCs w:val="24"/>
+        </w:rPr>
+        <w:t xml:space="preserve">2.9.8 Common Pitfalls and When NOT to Use One-to-One</w:t>
+      </w:r>
+    </w:p>
+    <w:p>
+      <w:pPr>
+        <w:spacing w:after="120"/>
+      </w:pPr>
+      <w:r>
+        <w:rPr>
+          <w:rFonts w:ascii="Arial" w:cs="Arial" w:eastAsia="Arial" w:hAnsi="Arial"/>
+          <w:b/>
+          <w:bCs/>
+          <w:sz w:val="22"/>
+          <w:szCs w:val="22"/>
+        </w:rPr>
+        <w:t xml:space="preserve">Re-pointing is two-step, not atomic. </w:t>
+      </w:r>
+      <w:r>
+        <w:rPr>
+          <w:rFonts w:ascii="Arial" w:cs="Arial" w:eastAsia="Arial" w:hAnsi="Arial"/>
+          <w:sz w:val="22"/>
+          <w:szCs w:val="22"/>
+        </w:rPr>
+        <w:t xml:space="preserve">The unique constraint means moving a target from one host to another requires unlinking first, then linking. Workflows or formulas that “swap” the target between hosts must perform both steps in sequence. If frequent re-pointing is required by the operational workflow, many-to-one is the better fit.</w:t>
+      </w:r>
+    </w:p>
+    <w:p>
+      <w:pPr>
+        <w:spacing w:after="120"/>
+      </w:pPr>
+      <w:r>
+        <w:rPr>
+          <w:rFonts w:ascii="Arial" w:cs="Arial" w:eastAsia="Arial" w:hAnsi="Arial"/>
+          <w:b/>
+          <w:bCs/>
+          <w:sz w:val="22"/>
+          <w:szCs w:val="22"/>
+        </w:rPr>
+        <w:t xml:space="preserve">Right vs Left cannot be changed through the UI. </w:t>
+      </w:r>
+      <w:r>
+        <w:rPr>
+          <w:rFonts w:ascii="Arial" w:cs="Arial" w:eastAsia="Arial" w:hAnsi="Arial"/>
+          <w:sz w:val="22"/>
+          <w:szCs w:val="22"/>
+        </w:rPr>
+        <w:t xml:space="preserve">Once saved, switching the FK side requires server-side metadata edits to PHP class definitions and JSON files. Decide deliberately before saving — see Section 2.9.2.</w:t>
+      </w:r>
+    </w:p>
+    <w:p>
+      <w:pPr>
+        <w:spacing w:after="120"/>
+      </w:pPr>
+      <w:r>
+        <w:rPr>
+          <w:rFonts w:ascii="Arial" w:cs="Arial" w:eastAsia="Arial" w:hAnsi="Arial"/>
+          <w:b/>
+          <w:bCs/>
+          <w:sz w:val="22"/>
+          <w:szCs w:val="22"/>
+        </w:rPr>
+        <w:t xml:space="preserve">Optional vs mandatory on each side is configured separately. </w:t>
+      </w:r>
+      <w:r>
+        <w:rPr>
+          <w:rFonts w:ascii="Arial" w:cs="Arial" w:eastAsia="Arial" w:hAnsi="Arial"/>
+          <w:sz w:val="22"/>
+          <w:szCs w:val="22"/>
+        </w:rPr>
+        <w:t xml:space="preserve">A one-to-one link can be optional on both sides (the most common case), mandatory on one side, or mandatory on both. Making the link mandatory on both sides creates a “no orphans” rule that is difficult to satisfy at record-creation time, because the second-created record cannot save without the first existing first, and the first cannot save without a link to a record that does not yet exist. Mandatory-on-both is rare and usually wrong.</w:t>
+      </w:r>
+    </w:p>
+    <w:p>
+      <w:pPr>
+        <w:spacing w:after="120"/>
+      </w:pPr>
+      <w:r>
+        <w:rPr>
+          <w:rFonts w:ascii="Arial" w:cs="Arial" w:eastAsia="Arial" w:hAnsi="Arial"/>
+          <w:b/>
+          <w:bCs/>
+          <w:sz w:val="22"/>
+          <w:szCs w:val="22"/>
+        </w:rPr>
+        <w:t xml:space="preserve">Reconsider before reaching for one-to-one. </w:t>
+      </w:r>
+      <w:r>
+        <w:rPr>
+          <w:rFonts w:ascii="Arial" w:cs="Arial" w:eastAsia="Arial" w:hAnsi="Arial"/>
+          <w:sz w:val="22"/>
+          <w:szCs w:val="22"/>
+        </w:rPr>
+        <w:t xml:space="preserve">Most apparent one-to-one cases are better modeled as fields on the parent entity (when the data is small and shares the parent’s lifecycle) or as a shared entity with a discriminator field (when several entity concepts overlap in most of their fields, as Contact does for Mentor, Client, Donor, and so on in CBM — see the Entity Inventory). One-to-one is the right answer when the child has an independent lifecycle, optional cardinality, external-system ownership, or independent access control. If none of those apply, the simpler design is almost always better.</w:t>
+      </w:r>
+    </w:p>
+    <w:p>
+      <w:r>
+        <w:t xml:space="preserve"/>
+      </w:r>
+    </w:p>
+    <w:p>
+      <w:pPr>
         <w:pStyle w:val="Heading1"/>
       </w:pPr>
       <w:r>
@@ -15291,6 +17691,116 @@
                 <w:szCs w:val="20"/>
               </w:rPr>
               <w:t xml:space="preserve">Added Section 2.8 "Foreign Fields — Displaying Linked Entity Data" covering concept, configuration steps, an Engagement-to-Mentor example, and operational constraints.</w:t>
+            </w:r>
+          </w:p>
+        </w:tc>
+      </w:tr>
+      <w:tr>
+        <w:tc>
+          <w:tcPr>
+            <w:tcW w:type="dxa" w:w="1200"/>
+            <w:tcBorders>
+              <w:top w:val="single" w:color="CCCCCC" w:sz="1"/>
+              <w:left w:val="single" w:color="CCCCCC" w:sz="1"/>
+              <w:bottom w:val="single" w:color="CCCCCC" w:sz="1"/>
+              <w:right w:val="single" w:color="CCCCCC" w:sz="1"/>
+            </w:tcBorders>
+            <w:tcMar>
+              <w:top w:type="dxa" w:w="80"/>
+              <w:left w:type="dxa" w:w="160"/>
+              <w:bottom w:type="dxa" w:w="80"/>
+              <w:right w:type="dxa" w:w="160"/>
+            </w:tcMar>
+          </w:tcPr>
+          <w:p>
+            <w:r>
+              <w:rPr>
+                <w:rFonts w:ascii="Arial" w:cs="Arial" w:eastAsia="Arial" w:hAnsi="Arial"/>
+                <w:sz w:val="20"/>
+                <w:szCs w:val="20"/>
+              </w:rPr>
+              <w:t xml:space="preserve">1.3</w:t>
+            </w:r>
+          </w:p>
+        </w:tc>
+        <w:tc>
+          <w:tcPr>
+            <w:tcW w:type="dxa" w:w="1700"/>
+            <w:tcBorders>
+              <w:top w:val="single" w:color="CCCCCC" w:sz="1"/>
+              <w:left w:val="single" w:color="CCCCCC" w:sz="1"/>
+              <w:bottom w:val="single" w:color="CCCCCC" w:sz="1"/>
+              <w:right w:val="single" w:color="CCCCCC" w:sz="1"/>
+            </w:tcBorders>
+            <w:tcMar>
+              <w:top w:type="dxa" w:w="80"/>
+              <w:left w:type="dxa" w:w="160"/>
+              <w:bottom w:type="dxa" w:w="80"/>
+              <w:right w:type="dxa" w:w="160"/>
+            </w:tcMar>
+          </w:tcPr>
+          <w:p>
+            <w:r>
+              <w:rPr>
+                <w:rFonts w:ascii="Arial" w:cs="Arial" w:eastAsia="Arial" w:hAnsi="Arial"/>
+                <w:sz w:val="20"/>
+                <w:szCs w:val="20"/>
+              </w:rPr>
+              <w:t xml:space="preserve">05-11-26 19:21</w:t>
+            </w:r>
+          </w:p>
+        </w:tc>
+        <w:tc>
+          <w:tcPr>
+            <w:tcW w:type="dxa" w:w="2200"/>
+            <w:tcBorders>
+              <w:top w:val="single" w:color="CCCCCC" w:sz="1"/>
+              <w:left w:val="single" w:color="CCCCCC" w:sz="1"/>
+              <w:bottom w:val="single" w:color="CCCCCC" w:sz="1"/>
+              <w:right w:val="single" w:color="CCCCCC" w:sz="1"/>
+            </w:tcBorders>
+            <w:tcMar>
+              <w:top w:type="dxa" w:w="80"/>
+              <w:left w:type="dxa" w:w="160"/>
+              <w:bottom w:type="dxa" w:w="80"/>
+              <w:right w:type="dxa" w:w="160"/>
+            </w:tcMar>
+          </w:tcPr>
+          <w:p>
+            <w:r>
+              <w:rPr>
+                <w:rFonts w:ascii="Arial" w:cs="Arial" w:eastAsia="Arial" w:hAnsi="Arial"/>
+                <w:sz w:val="20"/>
+                <w:szCs w:val="20"/>
+              </w:rPr>
+              <w:t xml:space="preserve">Doug Bower</w:t>
+            </w:r>
+          </w:p>
+        </w:tc>
+        <w:tc>
+          <w:tcPr>
+            <w:tcW w:type="dxa" w:w="4260"/>
+            <w:tcBorders>
+              <w:top w:val="single" w:color="CCCCCC" w:sz="1"/>
+              <w:left w:val="single" w:color="CCCCCC" w:sz="1"/>
+              <w:bottom w:val="single" w:color="CCCCCC" w:sz="1"/>
+              <w:right w:val="single" w:color="CCCCCC" w:sz="1"/>
+            </w:tcBorders>
+            <w:tcMar>
+              <w:top w:type="dxa" w:w="80"/>
+              <w:left w:type="dxa" w:w="160"/>
+              <w:bottom w:type="dxa" w:w="80"/>
+              <w:right w:type="dxa" w:w="160"/>
+            </w:tcMar>
+          </w:tcPr>
+          <w:p>
+            <w:r>
+              <w:rPr>
+                <w:rFonts w:ascii="Arial" w:cs="Arial" w:eastAsia="Arial" w:hAnsi="Arial"/>
+                <w:sz w:val="20"/>
+                <w:szCs w:val="20"/>
+              </w:rPr>
+              <w:t xml:space="preserve">Added Section 2.9 "One-to-One Relationships — In Depth" covering definition, the One-to-One Right vs One-to-One Left decision, what EspoCRM creates under the hood, uniqueness enforcement, step-by-step creation, a Contact-to-Mailing-Platform-Profile example, foreign fields across the link, and pitfalls including when NOT to use one-to-one.</w:t>
             </w:r>
           </w:p>
         </w:tc>

</xml_diff>